<commit_message>
added data analytics and processing parts to the document
</commit_message>
<xml_diff>
--- a/documents/Assignment 2.docx
+++ b/documents/Assignment 2.docx
@@ -1,6 +1,6 @@
 
 <file path=word/document.xml><?xml version="1.0" encoding="utf-8"?>
-<w:document xmlns:wpc="http://schemas.microsoft.com/office/word/2010/wordprocessingCanvas" xmlns:cx="http://schemas.microsoft.com/office/drawing/2014/chartex" xmlns:cx1="http://schemas.microsoft.com/office/drawing/2015/9/8/chartex" xmlns:cx2="http://schemas.microsoft.com/office/drawing/2015/10/21/chartex" xmlns:cx3="http://schemas.microsoft.com/office/drawing/2016/5/9/chartex" xmlns:cx4="http://schemas.microsoft.com/office/drawing/2016/5/10/chartex" xmlns:cx5="http://schemas.microsoft.com/office/drawing/2016/5/11/chartex" xmlns:cx6="http://schemas.microsoft.com/office/drawing/2016/5/12/chartex" xmlns:cx7="http://schemas.microsoft.com/office/drawing/2016/5/13/chartex" xmlns:cx8="http://schemas.microsoft.com/office/drawing/2016/5/14/chartex" xmlns:mc="http://schemas.openxmlformats.org/markup-compatibility/2006" xmlns:aink="http://schemas.microsoft.com/office/drawing/2016/ink" xmlns:am3d="http://schemas.microsoft.com/office/drawing/2017/model3d" xmlns:o="urn:schemas-microsoft-com:office:office" xmlns:oel="http://schemas.microsoft.com/office/2019/extlst" xmlns:r="http://schemas.openxmlformats.org/officeDocument/2006/relationships" xmlns:m="http://schemas.openxmlformats.org/officeDocument/2006/math" xmlns:v="urn:schemas-microsoft-com:vml" xmlns:wp14="http://schemas.microsoft.com/office/word/2010/wordprocessingDrawing" xmlns:wp="http://schemas.openxmlformats.org/drawingml/2006/wordprocessingDrawing" xmlns:w10="urn:schemas-microsoft-com:office:word" xmlns:w="http://schemas.openxmlformats.org/wordprocessingml/2006/main" xmlns:w14="http://schemas.microsoft.com/office/word/2010/wordml" xmlns:w15="http://schemas.microsoft.com/office/word/2012/wordml" xmlns:w16cei="http://schemas.microsoft.com/office/word/2026/wordml/cei" xmlns:w16cex="http://schemas.microsoft.com/office/word/2018/wordml/cex" xmlns:w16cid="http://schemas.microsoft.com/office/word/2016/wordml/cid" xmlns:w16="http://schemas.microsoft.com/office/word/2018/wordml" xmlns:w16du="http://schemas.microsoft.com/office/word/2023/wordml/word16du" xmlns:w16sdtdh="http://schemas.microsoft.com/office/word/2020/wordml/sdtdatahash" xmlns:w16sdtfl="http://schemas.microsoft.com/office/word/2024/wordml/sdtformatlock" xmlns:w16se="http://schemas.microsoft.com/office/word/2015/wordml/symex" xmlns:wpg="http://schemas.microsoft.com/office/word/2010/wordprocessingGroup" xmlns:wpi="http://schemas.microsoft.com/office/word/2010/wordprocessingInk" xmlns:wne="http://schemas.microsoft.com/office/word/2006/wordml" xmlns:wps="http://schemas.microsoft.com/office/word/2010/wordprocessingShape" mc:Ignorable="w14 w15 w16se w16cid w16 w16cex w16sdtdh w16sdtfl w16du wp14">
+<w:document xmlns:wpc="http://schemas.microsoft.com/office/word/2010/wordprocessingCanvas" xmlns:cx="http://schemas.microsoft.com/office/drawing/2014/chartex" xmlns:cx1="http://schemas.microsoft.com/office/drawing/2015/9/8/chartex" xmlns:cx2="http://schemas.microsoft.com/office/drawing/2015/10/21/chartex" xmlns:cx3="http://schemas.microsoft.com/office/drawing/2016/5/9/chartex" xmlns:cx4="http://schemas.microsoft.com/office/drawing/2016/5/10/chartex" xmlns:cx5="http://schemas.microsoft.com/office/drawing/2016/5/11/chartex" xmlns:cx6="http://schemas.microsoft.com/office/drawing/2016/5/12/chartex" xmlns:cx7="http://schemas.microsoft.com/office/drawing/2016/5/13/chartex" xmlns:cx8="http://schemas.microsoft.com/office/drawing/2016/5/14/chartex" xmlns:mc="http://schemas.openxmlformats.org/markup-compatibility/2006" xmlns:aink="http://schemas.microsoft.com/office/drawing/2016/ink" xmlns:am3d="http://schemas.microsoft.com/office/drawing/2017/model3d" xmlns:o="urn:schemas-microsoft-com:office:office" xmlns:oel="http://schemas.microsoft.com/office/2019/extlst" xmlns:r="http://schemas.openxmlformats.org/officeDocument/2006/relationships" xmlns:m="http://schemas.openxmlformats.org/officeDocument/2006/math" xmlns:v="urn:schemas-microsoft-com:vml" xmlns:wp14="http://schemas.microsoft.com/office/word/2010/wordprocessingDrawing" xmlns:wp="http://schemas.openxmlformats.org/drawingml/2006/wordprocessingDrawing" xmlns:w10="urn:schemas-microsoft-com:office:word" xmlns:w="http://schemas.openxmlformats.org/wordprocessingml/2006/main" xmlns:w14="http://schemas.microsoft.com/office/word/2010/wordml" xmlns:w15="http://schemas.microsoft.com/office/word/2012/wordml" xmlns:w16cex="http://schemas.microsoft.com/office/word/2018/wordml/cex" xmlns:w16cid="http://schemas.microsoft.com/office/word/2016/wordml/cid" xmlns:w16="http://schemas.microsoft.com/office/word/2018/wordml" xmlns:w16du="http://schemas.microsoft.com/office/word/2023/wordml/word16du" xmlns:w16sdtdh="http://schemas.microsoft.com/office/word/2020/wordml/sdtdatahash" xmlns:w16sdtfl="http://schemas.microsoft.com/office/word/2024/wordml/sdtformatlock" xmlns:w16se="http://schemas.microsoft.com/office/word/2015/wordml/symex" xmlns:wpg="http://schemas.microsoft.com/office/word/2010/wordprocessingGroup" xmlns:wpi="http://schemas.microsoft.com/office/word/2010/wordprocessingInk" xmlns:wne="http://schemas.microsoft.com/office/word/2006/wordml" xmlns:wps="http://schemas.microsoft.com/office/word/2010/wordprocessingShape" mc:Ignorable="w14 w15 w16se w16cid w16 w16cex w16sdtdh w16sdtfl w16du wp14">
   <w:body>
     <w:sdt>
       <w:sdtPr>
@@ -541,6 +541,7 @@
               <w:szCs w:val="24"/>
             </w:rPr>
           </w:pPr>
+          <w:proofErr w:type="gramStart"/>
           <w:r>
             <w:rPr>
               <w:rFonts w:ascii="Times New Roman" w:eastAsia="Aptos" w:hAnsi="Times New Roman"/>
@@ -581,6 +582,7 @@
             </w:rPr>
             <w:t>September</w:t>
           </w:r>
+          <w:proofErr w:type="gramEnd"/>
           <w:r>
             <w:rPr>
               <w:rFonts w:ascii="Times New Roman" w:eastAsia="Aptos" w:hAnsi="Times New Roman"/>
@@ -6294,7 +6296,29 @@
                 <w:szCs w:val="24"/>
                 <w:lang w:val="en-AU"/>
               </w:rPr>
-              <w:t>Cleans, merges and engineers features (lagged indicators, cyclical month encoding, per-capita normalisation) across the three sources.</w:t>
+              <w:t xml:space="preserve">Cleans, merges and </w:t>
+            </w:r>
+            <w:proofErr w:type="gramStart"/>
+            <w:r>
+              <w:rPr>
+                <w:rFonts w:ascii="Times New Roman" w:eastAsia="Times New Roman" w:hAnsi="Times New Roman"/>
+                <w:color w:val="000000" w:themeColor="text1"/>
+                <w:sz w:val="24"/>
+                <w:szCs w:val="24"/>
+                <w:lang w:val="en-AU"/>
+              </w:rPr>
+              <w:t>engineers</w:t>
+            </w:r>
+            <w:proofErr w:type="gramEnd"/>
+            <w:r>
+              <w:rPr>
+                <w:rFonts w:ascii="Times New Roman" w:eastAsia="Times New Roman" w:hAnsi="Times New Roman"/>
+                <w:color w:val="000000" w:themeColor="text1"/>
+                <w:sz w:val="24"/>
+                <w:szCs w:val="24"/>
+                <w:lang w:val="en-AU"/>
+              </w:rPr>
+              <w:t xml:space="preserve"> features (lagged indicators, cyclical month encoding, per-capita normalisation) across the three sources.</w:t>
             </w:r>
           </w:p>
         </w:tc>
@@ -7076,6 +7100,7 @@
         </w:rPr>
         <w:t xml:space="preserve"> </w:t>
       </w:r>
+      <w:proofErr w:type="gramStart"/>
       <w:r>
         <w:rPr>
           <w:rFonts w:ascii="Wingdings" w:eastAsia="Wingdings" w:hAnsi="Wingdings" w:cs="Wingdings"/>
@@ -7090,7 +7115,16 @@
           <w:sz w:val="24"/>
           <w:szCs w:val="24"/>
         </w:rPr>
-        <w:t xml:space="preserve">  Glue Data </w:t>
+        <w:t xml:space="preserve">  Glue</w:t>
+      </w:r>
+      <w:proofErr w:type="gramEnd"/>
+      <w:r>
+        <w:rPr>
+          <w:rFonts w:ascii="Times New Roman" w:eastAsia="Times New Roman" w:hAnsi="Times New Roman"/>
+          <w:sz w:val="24"/>
+          <w:szCs w:val="24"/>
+        </w:rPr>
+        <w:t xml:space="preserve"> Data </w:t>
       </w:r>
       <w:proofErr w:type="spellStart"/>
       <w:r>
@@ -7198,7 +7232,16 @@
           <w:sz w:val="24"/>
           <w:szCs w:val="24"/>
         </w:rPr>
-        <w:t xml:space="preserve">), the group project implements each stage using open-source, non-AWS tools, consistent with the module's guidance to rely on open-source </w:t>
+        <w:t>), the group project implements each stage using open-source, non-AWS tools, consistent with the module's guidance to rely on open-</w:t>
+      </w:r>
+      <w:proofErr w:type="gramStart"/>
+      <w:r>
+        <w:rPr>
+          <w:rFonts w:ascii="Times New Roman" w:eastAsia="Times New Roman" w:hAnsi="Times New Roman"/>
+          <w:sz w:val="24"/>
+          <w:szCs w:val="24"/>
+        </w:rPr>
+        <w:t xml:space="preserve">source </w:t>
       </w:r>
       <w:r>
         <w:rPr>
@@ -7215,7 +7258,16 @@
           <w:sz w:val="24"/>
           <w:szCs w:val="24"/>
         </w:rPr>
-        <w:t>tools for the group deliverable.</w:t>
+        <w:t>tools</w:t>
+      </w:r>
+      <w:proofErr w:type="gramEnd"/>
+      <w:r>
+        <w:rPr>
+          <w:rFonts w:ascii="Times New Roman" w:eastAsia="Times New Roman" w:hAnsi="Times New Roman"/>
+          <w:sz w:val="24"/>
+          <w:szCs w:val="24"/>
+        </w:rPr>
+        <w:t xml:space="preserve"> for the group deliverable.</w:t>
       </w:r>
     </w:p>
     <w:p>
@@ -9209,6 +9261,7 @@
               </w:rPr>
               <w:t xml:space="preserve">Incorporate feedback; finalise </w:t>
             </w:r>
+            <w:proofErr w:type="gramStart"/>
             <w:r>
               <w:rPr>
                 <w:rFonts w:ascii="Times New Roman" w:eastAsia="Times New Roman" w:hAnsi="Times New Roman" w:cs="Times New Roman"/>
@@ -9234,7 +9287,17 @@
                 <w:szCs w:val="24"/>
                 <w:lang w:val="en-AU"/>
               </w:rPr>
-              <w:t xml:space="preserve"> deploy to </w:t>
+              <w:t xml:space="preserve"> deploy</w:t>
+            </w:r>
+            <w:proofErr w:type="gramEnd"/>
+            <w:r>
+              <w:rPr>
+                <w:rFonts w:ascii="Times New Roman" w:eastAsia="Times New Roman" w:hAnsi="Times New Roman" w:cs="Times New Roman"/>
+                <w:sz w:val="24"/>
+                <w:szCs w:val="24"/>
+                <w:lang w:val="en-AU"/>
+              </w:rPr>
+              <w:t xml:space="preserve"> to </w:t>
             </w:r>
             <w:proofErr w:type="spellStart"/>
             <w:r>
@@ -10129,6 +10192,7 @@
               </w:rPr>
               <w:t xml:space="preserve">Cleans, merges and </w:t>
             </w:r>
+            <w:proofErr w:type="gramStart"/>
             <w:r>
               <w:rPr>
                 <w:rFonts w:ascii="Times New Roman" w:eastAsia="Times New Roman" w:hAnsi="Times New Roman" w:cs="Times New Roman"/>
@@ -10138,6 +10202,7 @@
               </w:rPr>
               <w:t>engineers</w:t>
             </w:r>
+            <w:proofErr w:type="gramEnd"/>
             <w:r>
               <w:rPr>
                 <w:rFonts w:ascii="Times New Roman" w:eastAsia="Times New Roman" w:hAnsi="Times New Roman" w:cs="Times New Roman"/>
@@ -10312,8 +10377,19 @@
                 <w:szCs w:val="24"/>
                 <w:lang w:val="en-AU"/>
               </w:rPr>
-              <w:t>Dashboard &amp; Deploy</w:t>
-            </w:r>
+              <w:t xml:space="preserve">Dashboard &amp; </w:t>
+            </w:r>
+            <w:proofErr w:type="gramStart"/>
+            <w:r>
+              <w:rPr>
+                <w:rFonts w:ascii="Times New Roman" w:eastAsia="Times New Roman" w:hAnsi="Times New Roman" w:cs="Times New Roman"/>
+                <w:sz w:val="24"/>
+                <w:szCs w:val="24"/>
+                <w:lang w:val="en-AU"/>
+              </w:rPr>
+              <w:t>Deploy</w:t>
+            </w:r>
+            <w:proofErr w:type="gramEnd"/>
           </w:p>
         </w:tc>
         <w:tc>
@@ -10953,7 +11029,25 @@
           <w:sz w:val="24"/>
           <w:szCs w:val="24"/>
         </w:rPr>
-        <w:t>And the final risk is misuse or misinterpretation of the forecasts. If predictions are read as statements about particular communities, the system could cause harm rather than support safety. Small counts in low-population regions could also make incidents identifiable. Forecasts will therefore be shown only at region and month level, with uncertainty ranges, and small values will be suppressed.</w:t>
+        <w:t xml:space="preserve">And the final risk is misuse or misinterpretation of the forecasts. If predictions are read as statements about </w:t>
+      </w:r>
+      <w:proofErr w:type="gramStart"/>
+      <w:r>
+        <w:rPr>
+          <w:rFonts w:ascii="Times New Roman" w:eastAsia="Times New Roman" w:hAnsi="Times New Roman"/>
+          <w:sz w:val="24"/>
+          <w:szCs w:val="24"/>
+        </w:rPr>
+        <w:t>particular communities</w:t>
+      </w:r>
+      <w:proofErr w:type="gramEnd"/>
+      <w:r>
+        <w:rPr>
+          <w:rFonts w:ascii="Times New Roman" w:eastAsia="Times New Roman" w:hAnsi="Times New Roman"/>
+          <w:sz w:val="24"/>
+          <w:szCs w:val="24"/>
+        </w:rPr>
+        <w:t>, the system could cause harm rather than support safety. Small counts in low-population regions could also make incidents identifiable. Forecasts will therefore be shown only at region and month level, with uncertainty ranges, and small values will be suppressed.</w:t>
       </w:r>
     </w:p>
     <w:p>
@@ -11659,7 +11753,29 @@
           <w:sz w:val="24"/>
           <w:szCs w:val="24"/>
         </w:rPr>
-        <w:t>NT crime statistics march 2026 - NTG open data portal</w:t>
+        <w:t xml:space="preserve">NT crime </w:t>
+      </w:r>
+      <w:proofErr w:type="gramStart"/>
+      <w:r>
+        <w:rPr>
+          <w:rFonts w:ascii="Times New Roman" w:eastAsia="Times New Roman" w:hAnsi="Times New Roman"/>
+          <w:i/>
+          <w:iCs/>
+          <w:sz w:val="24"/>
+          <w:szCs w:val="24"/>
+        </w:rPr>
+        <w:t>statistics march</w:t>
+      </w:r>
+      <w:proofErr w:type="gramEnd"/>
+      <w:r>
+        <w:rPr>
+          <w:rFonts w:ascii="Times New Roman" w:eastAsia="Times New Roman" w:hAnsi="Times New Roman"/>
+          <w:i/>
+          <w:iCs/>
+          <w:sz w:val="24"/>
+          <w:szCs w:val="24"/>
+        </w:rPr>
+        <w:t xml:space="preserve"> 2026 - NTG open data portal</w:t>
       </w:r>
       <w:r>
         <w:rPr>
@@ -11670,6 +11786,7 @@
         <w:t xml:space="preserve">. </w:t>
       </w:r>
       <w:proofErr w:type="spellStart"/>
+      <w:proofErr w:type="gramStart"/>
       <w:r>
         <w:rPr>
           <w:rFonts w:ascii="Times New Roman" w:eastAsia="Times New Roman" w:hAnsi="Times New Roman"/>
@@ -11679,6 +11796,7 @@
         <w:t>Nt.Gov.Au</w:t>
       </w:r>
       <w:proofErr w:type="spellEnd"/>
+      <w:proofErr w:type="gramEnd"/>
       <w:r>
         <w:rPr>
           <w:rFonts w:ascii="Times New Roman" w:eastAsia="Times New Roman" w:hAnsi="Times New Roman"/>
@@ -16449,7 +16567,29 @@
                 <w:szCs w:val="24"/>
                 <w:lang w:val="en-AU"/>
               </w:rPr>
-              <w:t>Cleans, merges and engineers features (lagged indicators, cyclical month encoding, per-capita normalisation) across the three sources.</w:t>
+              <w:t xml:space="preserve">Cleans, merges and </w:t>
+            </w:r>
+            <w:proofErr w:type="gramStart"/>
+            <w:r>
+              <w:rPr>
+                <w:rFonts w:ascii="Times New Roman" w:eastAsia="Times New Roman" w:hAnsi="Times New Roman"/>
+                <w:color w:val="000000" w:themeColor="text1"/>
+                <w:sz w:val="24"/>
+                <w:szCs w:val="24"/>
+                <w:lang w:val="en-AU"/>
+              </w:rPr>
+              <w:t>engineers</w:t>
+            </w:r>
+            <w:proofErr w:type="gramEnd"/>
+            <w:r>
+              <w:rPr>
+                <w:rFonts w:ascii="Times New Roman" w:eastAsia="Times New Roman" w:hAnsi="Times New Roman"/>
+                <w:color w:val="000000" w:themeColor="text1"/>
+                <w:sz w:val="24"/>
+                <w:szCs w:val="24"/>
+                <w:lang w:val="en-AU"/>
+              </w:rPr>
+              <w:t xml:space="preserve"> features (lagged indicators, cyclical month encoding, per-capita normalisation) across the three sources.</w:t>
             </w:r>
           </w:p>
         </w:tc>
@@ -17205,6 +17345,7 @@
         </w:rPr>
         <w:t xml:space="preserve"> </w:t>
       </w:r>
+      <w:proofErr w:type="gramStart"/>
       <w:r>
         <w:rPr>
           <w:rFonts w:ascii="Wingdings" w:eastAsia="Wingdings" w:hAnsi="Wingdings" w:cs="Wingdings"/>
@@ -17219,7 +17360,16 @@
           <w:sz w:val="24"/>
           <w:szCs w:val="24"/>
         </w:rPr>
-        <w:t xml:space="preserve">  Glue Data </w:t>
+        <w:t xml:space="preserve">  Glue</w:t>
+      </w:r>
+      <w:proofErr w:type="gramEnd"/>
+      <w:r>
+        <w:rPr>
+          <w:rFonts w:ascii="Times New Roman" w:eastAsia="Times New Roman" w:hAnsi="Times New Roman"/>
+          <w:sz w:val="24"/>
+          <w:szCs w:val="24"/>
+        </w:rPr>
+        <w:t xml:space="preserve"> Data </w:t>
       </w:r>
       <w:proofErr w:type="spellStart"/>
       <w:r>
@@ -17327,7 +17477,16 @@
           <w:sz w:val="24"/>
           <w:szCs w:val="24"/>
         </w:rPr>
-        <w:t xml:space="preserve">), the group project implements each stage using open-source, non-AWS tools, consistent with the module's guidance to rely on open-source </w:t>
+        <w:t>), the group project implements each stage using open-source, non-AWS tools, consistent with the module's guidance to rely on open-</w:t>
+      </w:r>
+      <w:proofErr w:type="gramStart"/>
+      <w:r>
+        <w:rPr>
+          <w:rFonts w:ascii="Times New Roman" w:eastAsia="Times New Roman" w:hAnsi="Times New Roman"/>
+          <w:sz w:val="24"/>
+          <w:szCs w:val="24"/>
+        </w:rPr>
+        <w:t xml:space="preserve">source </w:t>
       </w:r>
       <w:r>
         <w:rPr>
@@ -17344,7 +17503,16 @@
           <w:sz w:val="24"/>
           <w:szCs w:val="24"/>
         </w:rPr>
-        <w:t>tools for the group deliverable.</w:t>
+        <w:t>tools</w:t>
+      </w:r>
+      <w:proofErr w:type="gramEnd"/>
+      <w:r>
+        <w:rPr>
+          <w:rFonts w:ascii="Times New Roman" w:eastAsia="Times New Roman" w:hAnsi="Times New Roman"/>
+          <w:sz w:val="24"/>
+          <w:szCs w:val="24"/>
+        </w:rPr>
+        <w:t xml:space="preserve"> for the group deliverable.</w:t>
       </w:r>
     </w:p>
     <w:p>
@@ -19947,9 +20115,402 @@
     </w:p>
     <w:p>
       <w:pPr>
-        <w:spacing w:before="120" w:after="120"/>
+        <w:pStyle w:val="paragraph"/>
+        <w:spacing w:before="0" w:beforeAutospacing="0" w:after="0" w:afterAutospacing="0"/>
         <w:jc w:val="both"/>
-      </w:pPr>
+        <w:textAlignment w:val="baseline"/>
+        <w:rPr>
+          <w:rFonts w:ascii="Segoe UI" w:hAnsi="Segoe UI" w:cs="Segoe UI"/>
+          <w:sz w:val="18"/>
+          <w:szCs w:val="18"/>
+        </w:rPr>
+      </w:pPr>
+      <w:r>
+        <w:rPr>
+          <w:rStyle w:val="normaltextrun"/>
+        </w:rPr>
+        <w:t>A series of new features have been constructed from existing features to capture a holistic view of the crime situation in the Northern Territory. The features and reasons behind them are demonstrated below</w:t>
+      </w:r>
+    </w:p>
+    <w:p>
+      <w:pPr>
+        <w:pStyle w:val="paragraph"/>
+        <w:spacing w:before="0" w:beforeAutospacing="0" w:after="0" w:afterAutospacing="0"/>
+        <w:jc w:val="both"/>
+        <w:textAlignment w:val="baseline"/>
+        <w:rPr>
+          <w:rFonts w:ascii="Segoe UI" w:hAnsi="Segoe UI" w:cs="Segoe UI"/>
+          <w:sz w:val="18"/>
+          <w:szCs w:val="18"/>
+        </w:rPr>
+      </w:pPr>
+      <w:proofErr w:type="spellStart"/>
+      <w:r>
+        <w:rPr>
+          <w:rStyle w:val="normaltextrun"/>
+        </w:rPr>
+        <w:t>Log_</w:t>
+      </w:r>
+      <w:r>
+        <w:rPr>
+          <w:rStyle w:val="normaltextrun"/>
+          <w:i/>
+          <w:iCs/>
+        </w:rPr>
+        <w:t>assault</w:t>
+      </w:r>
+      <w:r>
+        <w:rPr>
+          <w:rStyle w:val="normaltextrun"/>
+        </w:rPr>
+        <w:t>_rate</w:t>
+      </w:r>
+      <w:proofErr w:type="spellEnd"/>
+      <w:r>
+        <w:rPr>
+          <w:rStyle w:val="normaltextrun"/>
+        </w:rPr>
+        <w:t>:</w:t>
+      </w:r>
+    </w:p>
+    <w:p>
+      <w:pPr>
+        <w:pStyle w:val="paragraph"/>
+        <w:spacing w:before="0" w:beforeAutospacing="0" w:after="0" w:afterAutospacing="0"/>
+        <w:jc w:val="both"/>
+        <w:textAlignment w:val="baseline"/>
+        <w:rPr>
+          <w:rFonts w:ascii="Segoe UI" w:hAnsi="Segoe UI" w:cs="Segoe UI"/>
+          <w:sz w:val="18"/>
+          <w:szCs w:val="18"/>
+        </w:rPr>
+      </w:pPr>
+      <w:r>
+        <w:rPr>
+          <w:rStyle w:val="normaltextrun"/>
+        </w:rPr>
+        <w:t xml:space="preserve">Since the crime rate is not normally distributed but rather follows a </w:t>
+      </w:r>
+      <w:proofErr w:type="gramStart"/>
+      <w:r>
+        <w:rPr>
+          <w:rStyle w:val="normaltextrun"/>
+        </w:rPr>
+        <w:t>log</w:t>
+      </w:r>
+      <w:proofErr w:type="gramEnd"/>
+      <w:r>
+        <w:rPr>
+          <w:rStyle w:val="normaltextrun"/>
+        </w:rPr>
+        <w:t>-normal distribution (heavily right-skewed) due to seasonality characteristics. By transforming the assault rate logarithmically, we aim to </w:t>
+      </w:r>
+      <w:proofErr w:type="spellStart"/>
+      <w:r>
+        <w:rPr>
+          <w:rStyle w:val="normaltextrun"/>
+        </w:rPr>
+        <w:t>stabilise</w:t>
+      </w:r>
+      <w:proofErr w:type="spellEnd"/>
+      <w:r>
+        <w:rPr>
+          <w:rStyle w:val="normaltextrun"/>
+        </w:rPr>
+        <w:t> the distribution, making it symmetrical which is essential for good performance of linear regression </w:t>
+      </w:r>
+      <w:proofErr w:type="gramStart"/>
+      <w:r>
+        <w:rPr>
+          <w:rStyle w:val="normaltextrun"/>
+        </w:rPr>
+        <w:t>models(</w:t>
+      </w:r>
+      <w:proofErr w:type="gramEnd"/>
+      <w:r>
+        <w:rPr>
+          <w:rStyle w:val="normaltextrun"/>
+        </w:rPr>
+        <w:t>Limpert et al., 2001)</w:t>
+      </w:r>
+    </w:p>
+    <w:p>
+      <w:pPr>
+        <w:pStyle w:val="paragraph"/>
+        <w:spacing w:before="0" w:beforeAutospacing="0" w:after="0" w:afterAutospacing="0"/>
+        <w:jc w:val="both"/>
+        <w:textAlignment w:val="baseline"/>
+        <w:rPr>
+          <w:rFonts w:ascii="Segoe UI" w:hAnsi="Segoe UI" w:cs="Segoe UI"/>
+          <w:sz w:val="18"/>
+          <w:szCs w:val="18"/>
+        </w:rPr>
+      </w:pPr>
+      <w:proofErr w:type="spellStart"/>
+      <w:r>
+        <w:rPr>
+          <w:rStyle w:val="normaltextrun"/>
+        </w:rPr>
+        <w:t>Sin_</w:t>
+      </w:r>
+      <w:r>
+        <w:rPr>
+          <w:rStyle w:val="normaltextrun"/>
+          <w:i/>
+          <w:iCs/>
+        </w:rPr>
+        <w:t>month</w:t>
+      </w:r>
+      <w:proofErr w:type="spellEnd"/>
+      <w:r>
+        <w:rPr>
+          <w:rStyle w:val="normaltextrun"/>
+          <w:i/>
+          <w:iCs/>
+        </w:rPr>
+        <w:t> and </w:t>
+      </w:r>
+      <w:proofErr w:type="spellStart"/>
+      <w:r>
+        <w:rPr>
+          <w:rStyle w:val="normaltextrun"/>
+          <w:i/>
+          <w:iCs/>
+        </w:rPr>
+        <w:t>cos_month</w:t>
+      </w:r>
+      <w:proofErr w:type="spellEnd"/>
+      <w:r>
+        <w:rPr>
+          <w:rStyle w:val="normaltextrun"/>
+          <w:i/>
+          <w:iCs/>
+        </w:rPr>
+        <w:t>:</w:t>
+      </w:r>
+    </w:p>
+    <w:p>
+      <w:pPr>
+        <w:pStyle w:val="paragraph"/>
+        <w:spacing w:before="0" w:beforeAutospacing="0" w:after="0" w:afterAutospacing="0"/>
+        <w:jc w:val="both"/>
+        <w:textAlignment w:val="baseline"/>
+        <w:rPr>
+          <w:rFonts w:ascii="Segoe UI" w:hAnsi="Segoe UI" w:cs="Segoe UI"/>
+          <w:sz w:val="18"/>
+          <w:szCs w:val="18"/>
+        </w:rPr>
+      </w:pPr>
+      <w:r>
+        <w:rPr>
+          <w:rStyle w:val="normaltextrun"/>
+        </w:rPr>
+        <w:t>To preserve the cyclic </w:t>
+      </w:r>
+      <w:proofErr w:type="spellStart"/>
+      <w:r>
+        <w:rPr>
+          <w:rStyle w:val="normaltextrun"/>
+        </w:rPr>
+        <w:t>behaviours</w:t>
+      </w:r>
+      <w:proofErr w:type="spellEnd"/>
+      <w:r>
+        <w:rPr>
+          <w:rStyle w:val="normaltextrun"/>
+        </w:rPr>
+        <w:t> of months, sine and cosine functions are applied to represent time since these trigonometric functions pursue cycles between “top” and “bottom” and have a settled cycle length which is perfect for modelling regular cycles such as months (Lindsey and Pavur, 2005)</w:t>
+      </w:r>
+    </w:p>
+    <w:p>
+      <w:pPr>
+        <w:pStyle w:val="paragraph"/>
+        <w:spacing w:before="0" w:beforeAutospacing="0" w:after="0" w:afterAutospacing="0"/>
+        <w:jc w:val="both"/>
+        <w:textAlignment w:val="baseline"/>
+        <w:rPr>
+          <w:rFonts w:ascii="Segoe UI" w:hAnsi="Segoe UI" w:cs="Segoe UI"/>
+          <w:sz w:val="18"/>
+          <w:szCs w:val="18"/>
+        </w:rPr>
+      </w:pPr>
+      <w:r>
+        <w:rPr>
+          <w:rStyle w:val="normaltextrun"/>
+        </w:rPr>
+        <w:lastRenderedPageBreak/>
+        <w:t>Season:</w:t>
+      </w:r>
+    </w:p>
+    <w:p>
+      <w:pPr>
+        <w:pStyle w:val="paragraph"/>
+        <w:spacing w:before="0" w:beforeAutospacing="0" w:after="0" w:afterAutospacing="0"/>
+        <w:jc w:val="both"/>
+        <w:textAlignment w:val="baseline"/>
+        <w:rPr>
+          <w:rFonts w:ascii="Segoe UI" w:hAnsi="Segoe UI" w:cs="Segoe UI"/>
+          <w:sz w:val="18"/>
+          <w:szCs w:val="18"/>
+        </w:rPr>
+      </w:pPr>
+      <w:r>
+        <w:rPr>
+          <w:rStyle w:val="normaltextrun"/>
+        </w:rPr>
+        <w:t>This feature serves as an indicator for wet and dry seasons, which according to research by Blakeslee et al. (2018), have a statistically significant relationship with crime incidence.</w:t>
+      </w:r>
+    </w:p>
+    <w:p>
+      <w:pPr>
+        <w:pStyle w:val="paragraph"/>
+        <w:spacing w:before="0" w:beforeAutospacing="0" w:after="0" w:afterAutospacing="0"/>
+        <w:jc w:val="both"/>
+        <w:textAlignment w:val="baseline"/>
+        <w:rPr>
+          <w:rFonts w:ascii="Segoe UI" w:hAnsi="Segoe UI" w:cs="Segoe UI"/>
+          <w:sz w:val="18"/>
+          <w:szCs w:val="18"/>
+        </w:rPr>
+      </w:pPr>
+      <w:proofErr w:type="spellStart"/>
+      <w:r>
+        <w:rPr>
+          <w:rStyle w:val="normaltextrun"/>
+        </w:rPr>
+        <w:t>is_new_year</w:t>
+      </w:r>
+      <w:proofErr w:type="spellEnd"/>
+      <w:r>
+        <w:rPr>
+          <w:rStyle w:val="normaltextrun"/>
+        </w:rPr>
+        <w:t>:</w:t>
+      </w:r>
+    </w:p>
+    <w:p>
+      <w:pPr>
+        <w:pStyle w:val="paragraph"/>
+        <w:spacing w:before="0" w:beforeAutospacing="0" w:after="0" w:afterAutospacing="0"/>
+        <w:jc w:val="both"/>
+        <w:textAlignment w:val="baseline"/>
+        <w:rPr>
+          <w:rFonts w:ascii="Segoe UI" w:hAnsi="Segoe UI" w:cs="Segoe UI"/>
+          <w:sz w:val="18"/>
+          <w:szCs w:val="18"/>
+        </w:rPr>
+      </w:pPr>
+      <w:r>
+        <w:rPr>
+          <w:rStyle w:val="normaltextrun"/>
+        </w:rPr>
+        <w:t>According to research by Baird </w:t>
+      </w:r>
+      <w:proofErr w:type="gramStart"/>
+      <w:r>
+        <w:rPr>
+          <w:rStyle w:val="normaltextrun"/>
+        </w:rPr>
+        <w:t>et al. ,</w:t>
+      </w:r>
+      <w:proofErr w:type="gramEnd"/>
+      <w:r>
+        <w:rPr>
+          <w:rStyle w:val="normaltextrun"/>
+        </w:rPr>
+        <w:t> (2019), the homicide rate experiences a significant spike on New Year’s Day. Therefore, this feature is added to capture this valuable information.</w:t>
+      </w:r>
+    </w:p>
+    <w:p>
+      <w:pPr>
+        <w:pStyle w:val="paragraph"/>
+        <w:spacing w:before="0" w:beforeAutospacing="0" w:after="0" w:afterAutospacing="0"/>
+        <w:jc w:val="both"/>
+        <w:textAlignment w:val="baseline"/>
+        <w:rPr>
+          <w:rFonts w:ascii="Segoe UI" w:hAnsi="Segoe UI" w:cs="Segoe UI"/>
+          <w:sz w:val="18"/>
+          <w:szCs w:val="18"/>
+        </w:rPr>
+      </w:pPr>
+      <w:r>
+        <w:rPr>
+          <w:rStyle w:val="eop"/>
+          <w:bdr w:val="none" w:sz="0" w:space="0" w:color="auto" w:frame="1"/>
+          <w:shd w:val="clear" w:color="auto" w:fill="606060"/>
+        </w:rPr>
+        <w:t> </w:t>
+      </w:r>
+    </w:p>
+    <w:p>
+      <w:pPr>
+        <w:pStyle w:val="paragraph"/>
+        <w:spacing w:before="0" w:beforeAutospacing="0" w:after="0" w:afterAutospacing="0"/>
+        <w:jc w:val="both"/>
+        <w:textAlignment w:val="baseline"/>
+        <w:rPr>
+          <w:rFonts w:ascii="Segoe UI" w:hAnsi="Segoe UI" w:cs="Segoe UI"/>
+          <w:sz w:val="18"/>
+          <w:szCs w:val="18"/>
+        </w:rPr>
+      </w:pPr>
+      <w:r>
+        <w:rPr>
+          <w:rStyle w:val="wacimagecontainer"/>
+          <w:rFonts w:ascii="Segoe UI" w:hAnsi="Segoe UI" w:cs="Segoe UI"/>
+          <w:noProof/>
+          <w:sz w:val="18"/>
+          <w:szCs w:val="18"/>
+        </w:rPr>
+        <w:drawing>
+          <wp:inline distT="0" distB="0" distL="0" distR="0" wp14:anchorId="6A6BD81A" wp14:editId="102C6B2D">
+            <wp:extent cx="5722620" cy="867410"/>
+            <wp:effectExtent l="0" t="0" r="0" b="8890"/>
+            <wp:docPr id="1676785060" name="Picture 2"/>
+            <wp:cNvGraphicFramePr>
+              <a:graphicFrameLocks xmlns:a="http://schemas.openxmlformats.org/drawingml/2006/main" noChangeAspect="1"/>
+            </wp:cNvGraphicFramePr>
+            <a:graphic xmlns:a="http://schemas.openxmlformats.org/drawingml/2006/main">
+              <a:graphicData uri="http://schemas.openxmlformats.org/drawingml/2006/picture">
+                <pic:pic xmlns:pic="http://schemas.openxmlformats.org/drawingml/2006/picture">
+                  <pic:nvPicPr>
+                    <pic:cNvPr id="0" name="Picture 1"/>
+                    <pic:cNvPicPr>
+                      <a:picLocks noChangeAspect="1" noChangeArrowheads="1"/>
+                    </pic:cNvPicPr>
+                  </pic:nvPicPr>
+                  <pic:blipFill>
+                    <a:blip r:embed="rId36">
+                      <a:extLst>
+                        <a:ext uri="{28A0092B-C50C-407E-A947-70E740481C1C}">
+                          <a14:useLocalDpi xmlns:a14="http://schemas.microsoft.com/office/drawing/2010/main" val="0"/>
+                        </a:ext>
+                      </a:extLst>
+                    </a:blip>
+                    <a:srcRect/>
+                    <a:stretch>
+                      <a:fillRect/>
+                    </a:stretch>
+                  </pic:blipFill>
+                  <pic:spPr bwMode="auto">
+                    <a:xfrm>
+                      <a:off x="0" y="0"/>
+                      <a:ext cx="5722620" cy="867410"/>
+                    </a:xfrm>
+                    <a:prstGeom prst="rect">
+                      <a:avLst/>
+                    </a:prstGeom>
+                    <a:noFill/>
+                    <a:ln>
+                      <a:noFill/>
+                    </a:ln>
+                  </pic:spPr>
+                </pic:pic>
+              </a:graphicData>
+            </a:graphic>
+          </wp:inline>
+        </w:drawing>
+      </w:r>
     </w:p>
     <w:p>
       <w:pPr>
@@ -19960,7 +20521,7 @@
           <w:rFonts w:ascii="Times New Roman" w:eastAsia="Times New Roman" w:hAnsi="Times New Roman"/>
           <w:sz w:val="24"/>
           <w:szCs w:val="24"/>
-          <w:lang w:val="vi-VN"/>
+          <w:lang w:val="en-US"/>
         </w:rPr>
       </w:pPr>
     </w:p>
@@ -20000,19 +20561,92 @@
     </w:p>
     <w:p>
       <w:pPr>
-        <w:spacing w:before="120" w:after="120"/>
+        <w:pStyle w:val="paragraph"/>
+        <w:spacing w:before="0" w:beforeAutospacing="0" w:after="0" w:afterAutospacing="0"/>
         <w:jc w:val="both"/>
-        <w:outlineLvl w:val="1"/>
-        <w:rPr>
-          <w:rFonts w:ascii="Times New Roman" w:eastAsia="Times New Roman" w:hAnsi="Times New Roman"/>
-          <w:b/>
-          <w:bCs/>
-          <w:sz w:val="24"/>
-          <w:szCs w:val="24"/>
-          <w:highlight w:val="yellow"/>
-          <w:lang w:val="vi-VN"/>
-        </w:rPr>
-      </w:pPr>
+        <w:textAlignment w:val="baseline"/>
+        <w:rPr>
+          <w:rFonts w:ascii="Segoe UI" w:hAnsi="Segoe UI" w:cs="Segoe UI"/>
+          <w:sz w:val="18"/>
+          <w:szCs w:val="18"/>
+        </w:rPr>
+      </w:pPr>
+      <w:r>
+        <w:rPr>
+          <w:rStyle w:val="normaltextrun"/>
+        </w:rPr>
+        <w:t>Because of the nature of time-series data, results are susceptible to previous information. The dataset needs to be split into train and test using a temporal cut-off, ensuring that training data only contains observations prior to the test period to avoid any leakage of future information (Hasanov et al., 2022).</w:t>
+      </w:r>
+    </w:p>
+    <w:p>
+      <w:pPr>
+        <w:pStyle w:val="paragraph"/>
+        <w:spacing w:before="0" w:beforeAutospacing="0" w:after="0" w:afterAutospacing="0"/>
+        <w:jc w:val="both"/>
+        <w:textAlignment w:val="baseline"/>
+        <w:rPr>
+          <w:rFonts w:ascii="Segoe UI" w:hAnsi="Segoe UI" w:cs="Segoe UI"/>
+          <w:sz w:val="18"/>
+          <w:szCs w:val="18"/>
+        </w:rPr>
+      </w:pPr>
+      <w:r>
+        <w:rPr>
+          <w:rStyle w:val="wacimagecontainer"/>
+          <w:rFonts w:ascii="Segoe UI" w:hAnsi="Segoe UI" w:cs="Segoe UI"/>
+          <w:noProof/>
+          <w:sz w:val="18"/>
+          <w:szCs w:val="18"/>
+        </w:rPr>
+        <w:drawing>
+          <wp:inline distT="0" distB="0" distL="0" distR="0" wp14:anchorId="06A163DA" wp14:editId="78E95347">
+            <wp:extent cx="3108960" cy="495300"/>
+            <wp:effectExtent l="0" t="0" r="0" b="0"/>
+            <wp:docPr id="1600726179" name="Picture 3"/>
+            <wp:cNvGraphicFramePr>
+              <a:graphicFrameLocks xmlns:a="http://schemas.openxmlformats.org/drawingml/2006/main" noChangeAspect="1"/>
+            </wp:cNvGraphicFramePr>
+            <a:graphic xmlns:a="http://schemas.openxmlformats.org/drawingml/2006/main">
+              <a:graphicData uri="http://schemas.openxmlformats.org/drawingml/2006/picture">
+                <pic:pic xmlns:pic="http://schemas.openxmlformats.org/drawingml/2006/picture">
+                  <pic:nvPicPr>
+                    <pic:cNvPr id="0" name="Picture 3"/>
+                    <pic:cNvPicPr>
+                      <a:picLocks noChangeAspect="1" noChangeArrowheads="1"/>
+                    </pic:cNvPicPr>
+                  </pic:nvPicPr>
+                  <pic:blipFill>
+                    <a:blip r:embed="rId37">
+                      <a:extLst>
+                        <a:ext uri="{28A0092B-C50C-407E-A947-70E740481C1C}">
+                          <a14:useLocalDpi xmlns:a14="http://schemas.microsoft.com/office/drawing/2010/main" val="0"/>
+                        </a:ext>
+                      </a:extLst>
+                    </a:blip>
+                    <a:srcRect/>
+                    <a:stretch>
+                      <a:fillRect/>
+                    </a:stretch>
+                  </pic:blipFill>
+                  <pic:spPr bwMode="auto">
+                    <a:xfrm>
+                      <a:off x="0" y="0"/>
+                      <a:ext cx="3108960" cy="495300"/>
+                    </a:xfrm>
+                    <a:prstGeom prst="rect">
+                      <a:avLst/>
+                    </a:prstGeom>
+                    <a:noFill/>
+                    <a:ln>
+                      <a:noFill/>
+                    </a:ln>
+                  </pic:spPr>
+                </pic:pic>
+              </a:graphicData>
+            </a:graphic>
+          </wp:inline>
+        </w:drawing>
+      </w:r>
     </w:p>
     <w:p>
       <w:pPr>
@@ -20133,6 +20767,102 @@
     </w:p>
     <w:p>
       <w:pPr>
+        <w:pStyle w:val="paragraph"/>
+        <w:spacing w:before="0" w:beforeAutospacing="0" w:after="0" w:afterAutospacing="0"/>
+        <w:jc w:val="both"/>
+        <w:textAlignment w:val="baseline"/>
+        <w:rPr>
+          <w:rFonts w:ascii="Segoe UI" w:hAnsi="Segoe UI" w:cs="Segoe UI"/>
+          <w:sz w:val="18"/>
+          <w:szCs w:val="18"/>
+        </w:rPr>
+      </w:pPr>
+      <w:r>
+        <w:rPr>
+          <w:rStyle w:val="normaltextrun"/>
+          <w:lang w:val="en-AU"/>
+        </w:rPr>
+        <w:t>DA serves as an important step after data ingestion and pre-processing by enabling the inspection of data for distribution, outliers and anomalies (Komorowski et al., 2016). Furthermore, EDA guides and informs effective feature engineering (Mao, 2015), an important step in this pipeline to ensure meaningful patterns are captured.</w:t>
+      </w:r>
+      <w:r>
+        <w:rPr>
+          <w:rStyle w:val="eop"/>
+        </w:rPr>
+        <w:t> </w:t>
+      </w:r>
+    </w:p>
+    <w:p>
+      <w:pPr>
+        <w:pStyle w:val="paragraph"/>
+        <w:spacing w:before="0" w:beforeAutospacing="0" w:after="0" w:afterAutospacing="0"/>
+        <w:jc w:val="both"/>
+        <w:textAlignment w:val="baseline"/>
+        <w:rPr>
+          <w:rFonts w:ascii="Segoe UI" w:hAnsi="Segoe UI" w:cs="Segoe UI"/>
+          <w:sz w:val="18"/>
+          <w:szCs w:val="18"/>
+        </w:rPr>
+      </w:pPr>
+      <w:r>
+        <w:rPr>
+          <w:rStyle w:val="wacimagecontainer"/>
+          <w:rFonts w:ascii="Segoe UI" w:hAnsi="Segoe UI" w:cs="Segoe UI"/>
+          <w:noProof/>
+          <w:sz w:val="18"/>
+          <w:szCs w:val="18"/>
+        </w:rPr>
+        <w:drawing>
+          <wp:inline distT="0" distB="0" distL="0" distR="0" wp14:anchorId="7EB05901" wp14:editId="59FB0062">
+            <wp:extent cx="3067685" cy="2990850"/>
+            <wp:effectExtent l="0" t="0" r="0" b="0"/>
+            <wp:docPr id="1372446449" name="Picture 4"/>
+            <wp:cNvGraphicFramePr>
+              <a:graphicFrameLocks xmlns:a="http://schemas.openxmlformats.org/drawingml/2006/main" noChangeAspect="1"/>
+            </wp:cNvGraphicFramePr>
+            <a:graphic xmlns:a="http://schemas.openxmlformats.org/drawingml/2006/main">
+              <a:graphicData uri="http://schemas.openxmlformats.org/drawingml/2006/picture">
+                <pic:pic xmlns:pic="http://schemas.openxmlformats.org/drawingml/2006/picture">
+                  <pic:nvPicPr>
+                    <pic:cNvPr id="0" name="Picture 5"/>
+                    <pic:cNvPicPr>
+                      <a:picLocks noChangeAspect="1" noChangeArrowheads="1"/>
+                    </pic:cNvPicPr>
+                  </pic:nvPicPr>
+                  <pic:blipFill>
+                    <a:blip r:embed="rId38">
+                      <a:extLst>
+                        <a:ext uri="{28A0092B-C50C-407E-A947-70E740481C1C}">
+                          <a14:useLocalDpi xmlns:a14="http://schemas.microsoft.com/office/drawing/2010/main" val="0"/>
+                        </a:ext>
+                      </a:extLst>
+                    </a:blip>
+                    <a:srcRect/>
+                    <a:stretch>
+                      <a:fillRect/>
+                    </a:stretch>
+                  </pic:blipFill>
+                  <pic:spPr bwMode="auto">
+                    <a:xfrm>
+                      <a:off x="0" y="0"/>
+                      <a:ext cx="3067685" cy="2990850"/>
+                    </a:xfrm>
+                    <a:prstGeom prst="rect">
+                      <a:avLst/>
+                    </a:prstGeom>
+                    <a:noFill/>
+                    <a:ln>
+                      <a:noFill/>
+                    </a:ln>
+                  </pic:spPr>
+                </pic:pic>
+              </a:graphicData>
+            </a:graphic>
+          </wp:inline>
+        </w:drawing>
+      </w:r>
+    </w:p>
+    <w:p>
+      <w:pPr>
         <w:spacing w:before="120" w:after="120"/>
         <w:jc w:val="both"/>
         <w:outlineLvl w:val="1"/>
@@ -20178,7 +20908,42 @@
           <w:highlight w:val="yellow"/>
           <w:lang w:val="en-AU"/>
         </w:rPr>
-        <w:t>PCA of regional Age Structure</w:t>
+        <w:t>PCA of regional Age Structur</w:t>
+      </w:r>
+      <w:r>
+        <w:rPr>
+          <w:rFonts w:ascii="Times New Roman" w:eastAsia="Times New Roman" w:hAnsi="Times New Roman" w:cs="Times New Roman"/>
+          <w:b/>
+          <w:bCs/>
+          <w:sz w:val="24"/>
+          <w:szCs w:val="24"/>
+          <w:highlight w:val="yellow"/>
+          <w:lang w:val="en-AU"/>
+        </w:rPr>
+        <w:t>e</w:t>
+      </w:r>
+    </w:p>
+    <w:p>
+      <w:pPr>
+        <w:spacing w:before="120" w:after="120"/>
+        <w:ind w:left="360"/>
+        <w:jc w:val="both"/>
+        <w:outlineLvl w:val="1"/>
+        <w:rPr>
+          <w:rFonts w:ascii="Times New Roman" w:eastAsia="Times New Roman" w:hAnsi="Times New Roman"/>
+          <w:sz w:val="24"/>
+          <w:szCs w:val="24"/>
+          <w:highlight w:val="yellow"/>
+        </w:rPr>
+      </w:pPr>
+      <w:r>
+        <w:rPr>
+          <w:rFonts w:ascii="Times New Roman" w:eastAsia="Times New Roman" w:hAnsi="Times New Roman"/>
+          <w:sz w:val="24"/>
+          <w:szCs w:val="24"/>
+        </w:rPr>
+        <w:lastRenderedPageBreak/>
+        <w:t xml:space="preserve">Applying PCA to the regional age structure allows the compression of data size, leading to a more efficient and quicker model training while keeping most of the information from the data (Mishra et al., 2017) </w:t>
       </w:r>
     </w:p>
     <w:p>
@@ -20247,6 +21012,112 @@
     </w:p>
     <w:p>
       <w:pPr>
+        <w:pStyle w:val="paragraph"/>
+        <w:spacing w:before="0" w:beforeAutospacing="0" w:after="0" w:afterAutospacing="0"/>
+        <w:jc w:val="both"/>
+        <w:textAlignment w:val="baseline"/>
+        <w:rPr>
+          <w:rFonts w:ascii="Segoe UI" w:hAnsi="Segoe UI" w:cs="Segoe UI"/>
+          <w:sz w:val="18"/>
+          <w:szCs w:val="18"/>
+        </w:rPr>
+      </w:pPr>
+      <w:r>
+        <w:rPr>
+          <w:rStyle w:val="normaltextrun"/>
+          <w:lang w:val="en-AU"/>
+        </w:rPr>
+        <w:t>Our strategy to capture the best combination of features through testing them on a linear regression model and determine the winner by comparing their Root Mean Square Error (RMSE)</w:t>
+      </w:r>
+    </w:p>
+    <w:p>
+      <w:pPr>
+        <w:pStyle w:val="paragraph"/>
+        <w:spacing w:before="0" w:beforeAutospacing="0" w:after="0" w:afterAutospacing="0"/>
+        <w:jc w:val="both"/>
+        <w:textAlignment w:val="baseline"/>
+        <w:rPr>
+          <w:rFonts w:ascii="Segoe UI" w:hAnsi="Segoe UI" w:cs="Segoe UI"/>
+          <w:sz w:val="18"/>
+          <w:szCs w:val="18"/>
+        </w:rPr>
+      </w:pPr>
+      <w:r>
+        <w:rPr>
+          <w:rStyle w:val="wacimagecontainer"/>
+          <w:rFonts w:ascii="Segoe UI" w:hAnsi="Segoe UI" w:cs="Segoe UI"/>
+          <w:noProof/>
+          <w:sz w:val="18"/>
+          <w:szCs w:val="18"/>
+        </w:rPr>
+        <w:drawing>
+          <wp:inline distT="0" distB="0" distL="0" distR="0" wp14:anchorId="10852B92" wp14:editId="442D1F29">
+            <wp:extent cx="4595495" cy="3256280"/>
+            <wp:effectExtent l="0" t="0" r="0" b="1270"/>
+            <wp:docPr id="976174724" name="Picture 5"/>
+            <wp:cNvGraphicFramePr>
+              <a:graphicFrameLocks xmlns:a="http://schemas.openxmlformats.org/drawingml/2006/main" noChangeAspect="1"/>
+            </wp:cNvGraphicFramePr>
+            <a:graphic xmlns:a="http://schemas.openxmlformats.org/drawingml/2006/main">
+              <a:graphicData uri="http://schemas.openxmlformats.org/drawingml/2006/picture">
+                <pic:pic xmlns:pic="http://schemas.openxmlformats.org/drawingml/2006/picture">
+                  <pic:nvPicPr>
+                    <pic:cNvPr id="0" name="Picture 7"/>
+                    <pic:cNvPicPr>
+                      <a:picLocks noChangeAspect="1" noChangeArrowheads="1"/>
+                    </pic:cNvPicPr>
+                  </pic:nvPicPr>
+                  <pic:blipFill>
+                    <a:blip r:embed="rId39">
+                      <a:extLst>
+                        <a:ext uri="{28A0092B-C50C-407E-A947-70E740481C1C}">
+                          <a14:useLocalDpi xmlns:a14="http://schemas.microsoft.com/office/drawing/2010/main" val="0"/>
+                        </a:ext>
+                      </a:extLst>
+                    </a:blip>
+                    <a:srcRect/>
+                    <a:stretch>
+                      <a:fillRect/>
+                    </a:stretch>
+                  </pic:blipFill>
+                  <pic:spPr bwMode="auto">
+                    <a:xfrm>
+                      <a:off x="0" y="0"/>
+                      <a:ext cx="4595495" cy="3256280"/>
+                    </a:xfrm>
+                    <a:prstGeom prst="rect">
+                      <a:avLst/>
+                    </a:prstGeom>
+                    <a:noFill/>
+                    <a:ln>
+                      <a:noFill/>
+                    </a:ln>
+                  </pic:spPr>
+                </pic:pic>
+              </a:graphicData>
+            </a:graphic>
+          </wp:inline>
+        </w:drawing>
+      </w:r>
+    </w:p>
+    <w:p>
+      <w:pPr>
+        <w:spacing w:before="120" w:after="120"/>
+        <w:ind w:left="360"/>
+        <w:jc w:val="both"/>
+        <w:outlineLvl w:val="1"/>
+        <w:rPr>
+          <w:rFonts w:ascii="Times New Roman" w:eastAsia="Times New Roman" w:hAnsi="Times New Roman"/>
+          <w:b/>
+          <w:bCs/>
+          <w:sz w:val="24"/>
+          <w:szCs w:val="24"/>
+          <w:highlight w:val="yellow"/>
+        </w:rPr>
+      </w:pPr>
+    </w:p>
+    <w:p>
+      <w:pPr>
         <w:spacing w:before="120" w:after="120"/>
         <w:ind w:left="720"/>
         <w:jc w:val="both"/>
@@ -20284,6 +21155,70 @@
           <w:lang w:val="en-AU"/>
         </w:rPr>
         <w:t>Multicollinearity Check and Hyperparameter Tuning</w:t>
+      </w:r>
+    </w:p>
+    <w:p>
+      <w:pPr>
+        <w:pStyle w:val="paragraph"/>
+        <w:spacing w:before="0" w:beforeAutospacing="0" w:after="0" w:afterAutospacing="0"/>
+        <w:jc w:val="both"/>
+        <w:textAlignment w:val="baseline"/>
+        <w:rPr>
+          <w:rFonts w:ascii="Segoe UI" w:hAnsi="Segoe UI" w:cs="Segoe UI"/>
+          <w:sz w:val="18"/>
+          <w:szCs w:val="18"/>
+        </w:rPr>
+      </w:pPr>
+      <w:r>
+        <w:rPr>
+          <w:rStyle w:val="normaltextrun"/>
+          <w:lang w:val="en-AU"/>
+        </w:rPr>
+        <w:t>With an aim to maximise the model performance, a multicollinearity check was carried out by calculating the Variance Inflation Factor (VIF) of each feature and removing the ones with VIF &gt; 30. High multicollinear features are known to have a negative effect on the regression model by hampering the interpretability of model predictors and resulting in highly volatile coefficient estimates (</w:t>
+      </w:r>
+      <w:proofErr w:type="spellStart"/>
+      <w:r>
+        <w:rPr>
+          <w:rStyle w:val="normaltextrun"/>
+          <w:lang w:val="en-AU"/>
+        </w:rPr>
+        <w:t>Dertli</w:t>
+      </w:r>
+      <w:proofErr w:type="spellEnd"/>
+      <w:r>
+        <w:rPr>
+          <w:rStyle w:val="normaltextrun"/>
+          <w:lang w:val="en-AU"/>
+        </w:rPr>
+        <w:t> et al., 2024).</w:t>
+      </w:r>
+      <w:r>
+        <w:rPr>
+          <w:rStyle w:val="eop"/>
+          <w:bdr w:val="none" w:sz="0" w:space="0" w:color="auto" w:frame="1"/>
+          <w:shd w:val="clear" w:color="auto" w:fill="606060"/>
+        </w:rPr>
+        <w:t> </w:t>
+      </w:r>
+    </w:p>
+    <w:p>
+      <w:pPr>
+        <w:pStyle w:val="paragraph"/>
+        <w:spacing w:before="0" w:beforeAutospacing="0" w:after="0" w:afterAutospacing="0"/>
+        <w:jc w:val="both"/>
+        <w:textAlignment w:val="baseline"/>
+        <w:rPr>
+          <w:rFonts w:ascii="Segoe UI" w:hAnsi="Segoe UI" w:cs="Segoe UI"/>
+          <w:sz w:val="18"/>
+          <w:szCs w:val="18"/>
+        </w:rPr>
+      </w:pPr>
+      <w:r>
+        <w:rPr>
+          <w:rStyle w:val="normaltextrun"/>
+          <w:lang w:val="en-AU"/>
+        </w:rPr>
+        <w:t>Another approach to optimising model performance is hyperparameter tuning. In this pipeline, tuning for linear models (Ridge and Lasso) is performed using alpha tuning with is to choose the most favourable alpha parameter that minimises the models' error in cross-validation (Deb, 2025)</w:t>
       </w:r>
     </w:p>
     <w:p>
@@ -20416,6 +21351,7 @@
           <w:szCs w:val="24"/>
           <w:lang w:val="en-AU"/>
         </w:rPr>
+        <w:lastRenderedPageBreak/>
         <w:t>The workflow plan spans the full 12-week semester and is aligned to the four assessment milestones (Table 3). Weeks immediately preceding each submission are used for consolidation and reporting, other weeks are allocated to the team members responsible for the relevant pipeline stage</w:t>
       </w:r>
       <w:r>
@@ -21466,17 +22402,7 @@
                 <w:szCs w:val="24"/>
                 <w:lang w:val="en-AU"/>
               </w:rPr>
-              <w:t xml:space="preserve">Finalise ingest and storage structure in GitHub; complete data processing scripts; </w:t>
-            </w:r>
-            <w:r>
-              <w:rPr>
-                <w:rFonts w:ascii="Times New Roman" w:eastAsia="Times New Roman" w:hAnsi="Times New Roman" w:cs="Times New Roman"/>
-                <w:sz w:val="24"/>
-                <w:szCs w:val="24"/>
-                <w:lang w:val="en-AU"/>
-              </w:rPr>
-              <w:lastRenderedPageBreak/>
-              <w:t>preliminary exploratory analysis</w:t>
+              <w:t>Finalise ingest and storage structure in GitHub; complete data processing scripts; preliminary exploratory analysis</w:t>
             </w:r>
           </w:p>
         </w:tc>
@@ -21505,18 +22431,7 @@
                 <w:szCs w:val="24"/>
                 <w:lang w:val="en-AU"/>
               </w:rPr>
-              <w:lastRenderedPageBreak/>
-              <w:t xml:space="preserve">Working ingest/ store/ processing </w:t>
-            </w:r>
-            <w:r>
-              <w:rPr>
-                <w:rFonts w:ascii="Times New Roman" w:eastAsia="Times New Roman" w:hAnsi="Times New Roman" w:cs="Times New Roman"/>
-                <w:sz w:val="24"/>
-                <w:szCs w:val="24"/>
-                <w:lang w:val="en-AU"/>
-              </w:rPr>
-              <w:lastRenderedPageBreak/>
-              <w:t>stages; EDA notebook</w:t>
+              <w:t>Working ingest/ store/ processing stages; EDA notebook</w:t>
             </w:r>
           </w:p>
         </w:tc>
@@ -21545,7 +22460,6 @@
                 <w:szCs w:val="24"/>
                 <w:lang w:val="en-AU"/>
               </w:rPr>
-              <w:lastRenderedPageBreak/>
               <w:t>Will (Ingest, Data store)</w:t>
             </w:r>
           </w:p>
@@ -21570,7 +22484,6 @@
                 <w:szCs w:val="24"/>
                 <w:lang w:val="en-AU"/>
               </w:rPr>
-              <w:lastRenderedPageBreak/>
               <w:t>Emma (Data processing)</w:t>
             </w:r>
           </w:p>
@@ -21600,7 +22513,6 @@
                 <w:szCs w:val="24"/>
                 <w:lang w:val="en-AU"/>
               </w:rPr>
-              <w:lastRenderedPageBreak/>
               <w:t>Done</w:t>
             </w:r>
           </w:p>
@@ -21931,6 +22843,7 @@
                 <w:szCs w:val="24"/>
                 <w:lang w:val="en-AU"/>
               </w:rPr>
+              <w:lastRenderedPageBreak/>
               <w:t>8</w:t>
             </w:r>
           </w:p>
@@ -22283,7 +23196,27 @@
                 <w:szCs w:val="24"/>
                 <w:lang w:val="en-AU"/>
               </w:rPr>
-              <w:t xml:space="preserve">Incorporate feedback; finalise dashboard;  deploy to </w:t>
+              <w:t xml:space="preserve">Incorporate feedback; finalise </w:t>
+            </w:r>
+            <w:proofErr w:type="gramStart"/>
+            <w:r>
+              <w:rPr>
+                <w:rFonts w:ascii="Times New Roman" w:eastAsia="Times New Roman" w:hAnsi="Times New Roman" w:cs="Times New Roman"/>
+                <w:sz w:val="24"/>
+                <w:szCs w:val="24"/>
+                <w:lang w:val="en-AU"/>
+              </w:rPr>
+              <w:t>dashboard;  deploy</w:t>
+            </w:r>
+            <w:proofErr w:type="gramEnd"/>
+            <w:r>
+              <w:rPr>
+                <w:rFonts w:ascii="Times New Roman" w:eastAsia="Times New Roman" w:hAnsi="Times New Roman" w:cs="Times New Roman"/>
+                <w:sz w:val="24"/>
+                <w:szCs w:val="24"/>
+                <w:lang w:val="en-AU"/>
+              </w:rPr>
+              <w:t xml:space="preserve"> to </w:t>
             </w:r>
             <w:proofErr w:type="spellStart"/>
             <w:r>
@@ -22998,7 +23931,6 @@
                 <w:szCs w:val="24"/>
                 <w:lang w:val="en-AU"/>
               </w:rPr>
-              <w:lastRenderedPageBreak/>
               <w:t>Will Nguyen</w:t>
             </w:r>
           </w:p>
@@ -23146,7 +24078,27 @@
                 <w:szCs w:val="24"/>
                 <w:lang w:val="en-AU"/>
               </w:rPr>
-              <w:t>Cleans, merges and engineers features across the three data sources; implements post-deployment drift-checking scripts</w:t>
+              <w:t xml:space="preserve">Cleans, merges and </w:t>
+            </w:r>
+            <w:proofErr w:type="gramStart"/>
+            <w:r>
+              <w:rPr>
+                <w:rFonts w:ascii="Times New Roman" w:eastAsia="Times New Roman" w:hAnsi="Times New Roman" w:cs="Times New Roman"/>
+                <w:sz w:val="24"/>
+                <w:szCs w:val="24"/>
+                <w:lang w:val="en-AU"/>
+              </w:rPr>
+              <w:t>engineers</w:t>
+            </w:r>
+            <w:proofErr w:type="gramEnd"/>
+            <w:r>
+              <w:rPr>
+                <w:rFonts w:ascii="Times New Roman" w:eastAsia="Times New Roman" w:hAnsi="Times New Roman" w:cs="Times New Roman"/>
+                <w:sz w:val="24"/>
+                <w:szCs w:val="24"/>
+                <w:lang w:val="en-AU"/>
+              </w:rPr>
+              <w:t xml:space="preserve"> features across the three data sources; implements post-deployment drift-checking scripts</w:t>
             </w:r>
           </w:p>
         </w:tc>
@@ -23269,6 +24221,7 @@
                 <w:szCs w:val="24"/>
                 <w:lang w:val="en-AU"/>
               </w:rPr>
+              <w:lastRenderedPageBreak/>
               <w:t>Thomas Tran</w:t>
             </w:r>
           </w:p>
@@ -23298,8 +24251,19 @@
                 <w:szCs w:val="24"/>
                 <w:lang w:val="en-AU"/>
               </w:rPr>
-              <w:t>Dashboard &amp; Deploy</w:t>
-            </w:r>
+              <w:t xml:space="preserve">Dashboard &amp; </w:t>
+            </w:r>
+            <w:proofErr w:type="gramStart"/>
+            <w:r>
+              <w:rPr>
+                <w:rFonts w:ascii="Times New Roman" w:eastAsia="Times New Roman" w:hAnsi="Times New Roman" w:cs="Times New Roman"/>
+                <w:sz w:val="24"/>
+                <w:szCs w:val="24"/>
+                <w:lang w:val="en-AU"/>
+              </w:rPr>
+              <w:t>Deploy</w:t>
+            </w:r>
+            <w:proofErr w:type="gramEnd"/>
           </w:p>
         </w:tc>
         <w:tc>
@@ -23461,7 +24425,7 @@
       </w:r>
     </w:p>
     <w:p>
-      <w:hyperlink r:id="rId36">
+      <w:hyperlink r:id="rId40">
         <w:r>
           <w:rPr>
             <w:rStyle w:val="Hyperlink"/>
@@ -23502,7 +24466,7 @@
         </w:rPr>
         <w:t xml:space="preserve">Project management board (JIRA): </w:t>
       </w:r>
-      <w:hyperlink r:id="rId37">
+      <w:hyperlink r:id="rId41">
         <w:r>
           <w:rPr>
             <w:rStyle w:val="Hyperlink"/>
@@ -23942,16 +24906,25 @@
           <w:sz w:val="24"/>
           <w:szCs w:val="24"/>
         </w:rPr>
-        <w:t xml:space="preserve">And the final risk is misuse or misinterpretation of the forecasts. If predictions are read as statements about particular communities, the system could cause harm rather than support safety. Small counts in low-population regions could also make incidents identifiable. </w:t>
-      </w:r>
-      <w:r>
-        <w:rPr>
-          <w:rFonts w:ascii="Times New Roman" w:eastAsia="Times New Roman" w:hAnsi="Times New Roman"/>
-          <w:sz w:val="24"/>
-          <w:szCs w:val="24"/>
-        </w:rPr>
-        <w:lastRenderedPageBreak/>
-        <w:t>Forecasts will therefore be shown only at region and month level, with uncertainty ranges, and small values will be suppressed.</w:t>
+        <w:t xml:space="preserve">And the final risk is misuse or misinterpretation of the forecasts. If predictions are read as statements about </w:t>
+      </w:r>
+      <w:proofErr w:type="gramStart"/>
+      <w:r>
+        <w:rPr>
+          <w:rFonts w:ascii="Times New Roman" w:eastAsia="Times New Roman" w:hAnsi="Times New Roman"/>
+          <w:sz w:val="24"/>
+          <w:szCs w:val="24"/>
+        </w:rPr>
+        <w:t>particular communities</w:t>
+      </w:r>
+      <w:proofErr w:type="gramEnd"/>
+      <w:r>
+        <w:rPr>
+          <w:rFonts w:ascii="Times New Roman" w:eastAsia="Times New Roman" w:hAnsi="Times New Roman"/>
+          <w:sz w:val="24"/>
+          <w:szCs w:val="24"/>
+        </w:rPr>
+        <w:t>, the system could cause harm rather than support safety. Small counts in low-population regions could also make incidents identifiable. Forecasts will therefore be shown only at region and month level, with uncertainty ranges, and small values will be suppressed.</w:t>
       </w:r>
     </w:p>
     <w:p>
@@ -24054,6 +25027,7 @@
           <w:sz w:val="24"/>
           <w:szCs w:val="24"/>
         </w:rPr>
+        <w:lastRenderedPageBreak/>
         <w:t>Aboriginal people are strongly represented in NT crime statistics</w:t>
       </w:r>
       <w:r>
@@ -24397,7 +25371,7 @@
         </w:rPr>
         <w:t xml:space="preserve">. </w:t>
       </w:r>
-      <w:hyperlink r:id="rId38">
+      <w:hyperlink r:id="rId42">
         <w:r>
           <w:rPr>
             <w:rStyle w:val="Hyperlink"/>
@@ -24454,7 +25428,7 @@
         </w:rPr>
         <w:t xml:space="preserve">. ABS. </w:t>
       </w:r>
-      <w:hyperlink r:id="rId39">
+      <w:hyperlink r:id="rId43">
         <w:r>
           <w:rPr>
             <w:rStyle w:val="Hyperlink"/>
@@ -24493,7 +25467,7 @@
         </w:rPr>
         <w:t xml:space="preserve">Australian Institute of Aboriginal and Torres Strait Islander Studies. (2020). AIATSIS Code of Ethics for Aboriginal and Torres Strait Islander Research. AIATSIS. </w:t>
       </w:r>
-      <w:hyperlink r:id="rId40">
+      <w:hyperlink r:id="rId44">
         <w:r>
           <w:rPr>
             <w:rStyle w:val="Hyperlink"/>
@@ -24522,7 +25496,6 @@
           <w:sz w:val="24"/>
           <w:szCs w:val="24"/>
         </w:rPr>
-        <w:lastRenderedPageBreak/>
         <w:t xml:space="preserve">Carroll, S. R., Garba, I., Figueroa-Rodríguez, O. L., Holbrook, J., Lovett, R., </w:t>
       </w:r>
       <w:proofErr w:type="spellStart"/>
@@ -24561,7 +25534,7 @@
         </w:rPr>
         <w:t xml:space="preserve">, K., Rodriguez-Lonebear, D., Rowe, R., Sara, R., Walker, J. D., Anderson, J., &amp; Hudson, M. (2020). The CARE Principles for Indigenous Data Governance. Data Science Journal, 19(1), 1–12. </w:t>
       </w:r>
-      <w:hyperlink r:id="rId41">
+      <w:hyperlink r:id="rId45">
         <w:r>
           <w:rPr>
             <w:rStyle w:val="Hyperlink"/>
@@ -24610,7 +25583,7 @@
         </w:rPr>
         <w:t xml:space="preserve">. Abc.net.au; ABC News. </w:t>
       </w:r>
-      <w:hyperlink r:id="rId42">
+      <w:hyperlink r:id="rId46">
         <w:r>
           <w:rPr>
             <w:rStyle w:val="Hyperlink"/>
@@ -24634,6 +25607,7 @@
           <w:sz w:val="24"/>
           <w:szCs w:val="24"/>
         </w:rPr>
+        <w:lastRenderedPageBreak/>
         <w:t xml:space="preserve">Northern Territory Government. (2026). </w:t>
       </w:r>
       <w:r>
@@ -24642,7 +25616,25 @@
           <w:sz w:val="24"/>
           <w:szCs w:val="24"/>
         </w:rPr>
-        <w:t>NT crime statistics march 2026 - NTG open data portal</w:t>
+        <w:t xml:space="preserve">NT crime </w:t>
+      </w:r>
+      <w:proofErr w:type="gramStart"/>
+      <w:r>
+        <w:rPr>
+          <w:rFonts w:ascii="Times New Roman" w:eastAsia="Times New Roman" w:hAnsi="Times New Roman"/>
+          <w:sz w:val="24"/>
+          <w:szCs w:val="24"/>
+        </w:rPr>
+        <w:t>statistics march</w:t>
+      </w:r>
+      <w:proofErr w:type="gramEnd"/>
+      <w:r>
+        <w:rPr>
+          <w:rFonts w:ascii="Times New Roman" w:eastAsia="Times New Roman" w:hAnsi="Times New Roman"/>
+          <w:sz w:val="24"/>
+          <w:szCs w:val="24"/>
+        </w:rPr>
+        <w:t xml:space="preserve"> 2026 - NTG open data portal</w:t>
       </w:r>
       <w:r>
         <w:rPr>
@@ -24652,7 +25644,7 @@
         </w:rPr>
         <w:t xml:space="preserve">. </w:t>
       </w:r>
-      <w:hyperlink r:id="rId43" w:history="1">
+      <w:hyperlink r:id="rId47" w:history="1">
         <w:r>
           <w:rPr>
             <w:rStyle w:val="Hyperlink"/>
@@ -24704,7 +25696,7 @@
         </w:rPr>
         <w:t xml:space="preserve">. </w:t>
       </w:r>
-      <w:hyperlink r:id="rId44">
+      <w:hyperlink r:id="rId48">
         <w:r>
           <w:rPr>
             <w:rStyle w:val="Hyperlink"/>
@@ -24770,7 +25762,7 @@
         </w:rPr>
         <w:t xml:space="preserve">. NT Police, Fire &amp; Emergency Services. </w:t>
       </w:r>
-      <w:hyperlink r:id="rId45">
+      <w:hyperlink r:id="rId49">
         <w:r>
           <w:rPr>
             <w:rStyle w:val="Hyperlink"/>
@@ -24819,7 +25811,7 @@
         </w:rPr>
         <w:t xml:space="preserve">  </w:t>
       </w:r>
-      <w:hyperlink r:id="rId46">
+      <w:hyperlink r:id="rId50">
         <w:r>
           <w:rPr>
             <w:rStyle w:val="Hyperlink"/>
@@ -25059,7 +26051,7 @@
                     <pic:cNvPicPr/>
                   </pic:nvPicPr>
                   <pic:blipFill>
-                    <a:blip r:embed="rId47"/>
+                    <a:blip r:embed="rId51"/>
                     <a:stretch>
                       <a:fillRect/>
                     </a:stretch>
@@ -25118,7 +26110,7 @@
           <w:szCs w:val="24"/>
         </w:rPr>
       </w:pPr>
-      <w:hyperlink r:id="rId48" w:history="1">
+      <w:hyperlink r:id="rId52" w:history="1">
         <w:r>
           <w:rPr>
             <w:rStyle w:val="Hyperlink"/>
@@ -26057,8 +27049,8 @@
       </w:pPr>
     </w:p>
     <w:sectPr>
-      <w:headerReference w:type="default" r:id="rId49"/>
-      <w:footerReference w:type="default" r:id="rId50"/>
+      <w:headerReference w:type="default" r:id="rId53"/>
+      <w:footerReference w:type="default" r:id="rId54"/>
       <w:pgSz w:w="11906" w:h="16838" w:code="9"/>
       <w:pgMar w:top="1440" w:right="1440" w:bottom="1440" w:left="1440" w:header="709" w:footer="709" w:gutter="0"/>
       <w:pgNumType w:start="0"/>
@@ -26071,7 +27063,7 @@
 </file>
 
 <file path=word/endnotes.xml><?xml version="1.0" encoding="utf-8"?>
-<w:endnotes xmlns:wpc="http://schemas.microsoft.com/office/word/2010/wordprocessingCanvas" xmlns:cx="http://schemas.microsoft.com/office/drawing/2014/chartex" xmlns:cx1="http://schemas.microsoft.com/office/drawing/2015/9/8/chartex" xmlns:cx2="http://schemas.microsoft.com/office/drawing/2015/10/21/chartex" xmlns:cx3="http://schemas.microsoft.com/office/drawing/2016/5/9/chartex" xmlns:cx4="http://schemas.microsoft.com/office/drawing/2016/5/10/chartex" xmlns:cx5="http://schemas.microsoft.com/office/drawing/2016/5/11/chartex" xmlns:cx6="http://schemas.microsoft.com/office/drawing/2016/5/12/chartex" xmlns:cx7="http://schemas.microsoft.com/office/drawing/2016/5/13/chartex" xmlns:cx8="http://schemas.microsoft.com/office/drawing/2016/5/14/chartex" xmlns:mc="http://schemas.openxmlformats.org/markup-compatibility/2006" xmlns:aink="http://schemas.microsoft.com/office/drawing/2016/ink" xmlns:am3d="http://schemas.microsoft.com/office/drawing/2017/model3d" xmlns:o="urn:schemas-microsoft-com:office:office" xmlns:oel="http://schemas.microsoft.com/office/2019/extlst" xmlns:r="http://schemas.openxmlformats.org/officeDocument/2006/relationships" xmlns:m="http://schemas.openxmlformats.org/officeDocument/2006/math" xmlns:v="urn:schemas-microsoft-com:vml" xmlns:wp14="http://schemas.microsoft.com/office/word/2010/wordprocessingDrawing" xmlns:wp="http://schemas.openxmlformats.org/drawingml/2006/wordprocessingDrawing" xmlns:w10="urn:schemas-microsoft-com:office:word" xmlns:w="http://schemas.openxmlformats.org/wordprocessingml/2006/main" xmlns:w14="http://schemas.microsoft.com/office/word/2010/wordml" xmlns:w15="http://schemas.microsoft.com/office/word/2012/wordml" xmlns:w16cei="http://schemas.microsoft.com/office/word/2026/wordml/cei" xmlns:w16cex="http://schemas.microsoft.com/office/word/2018/wordml/cex" xmlns:w16cid="http://schemas.microsoft.com/office/word/2016/wordml/cid" xmlns:w16="http://schemas.microsoft.com/office/word/2018/wordml" xmlns:w16du="http://schemas.microsoft.com/office/word/2023/wordml/word16du" xmlns:w16sdtdh="http://schemas.microsoft.com/office/word/2020/wordml/sdtdatahash" xmlns:w16sdtfl="http://schemas.microsoft.com/office/word/2024/wordml/sdtformatlock" xmlns:w16se="http://schemas.microsoft.com/office/word/2015/wordml/symex" xmlns:wpg="http://schemas.microsoft.com/office/word/2010/wordprocessingGroup" xmlns:wpi="http://schemas.microsoft.com/office/word/2010/wordprocessingInk" xmlns:wne="http://schemas.microsoft.com/office/word/2006/wordml" xmlns:wps="http://schemas.microsoft.com/office/word/2010/wordprocessingShape" mc:Ignorable="w14 w15 w16se w16cid w16 w16cex w16sdtdh w16sdtfl w16du wp14">
+<w:endnotes xmlns:wpc="http://schemas.microsoft.com/office/word/2010/wordprocessingCanvas" xmlns:cx="http://schemas.microsoft.com/office/drawing/2014/chartex" xmlns:cx1="http://schemas.microsoft.com/office/drawing/2015/9/8/chartex" xmlns:cx2="http://schemas.microsoft.com/office/drawing/2015/10/21/chartex" xmlns:cx3="http://schemas.microsoft.com/office/drawing/2016/5/9/chartex" xmlns:cx4="http://schemas.microsoft.com/office/drawing/2016/5/10/chartex" xmlns:cx5="http://schemas.microsoft.com/office/drawing/2016/5/11/chartex" xmlns:cx6="http://schemas.microsoft.com/office/drawing/2016/5/12/chartex" xmlns:cx7="http://schemas.microsoft.com/office/drawing/2016/5/13/chartex" xmlns:cx8="http://schemas.microsoft.com/office/drawing/2016/5/14/chartex" xmlns:mc="http://schemas.openxmlformats.org/markup-compatibility/2006" xmlns:aink="http://schemas.microsoft.com/office/drawing/2016/ink" xmlns:am3d="http://schemas.microsoft.com/office/drawing/2017/model3d" xmlns:o="urn:schemas-microsoft-com:office:office" xmlns:oel="http://schemas.microsoft.com/office/2019/extlst" xmlns:r="http://schemas.openxmlformats.org/officeDocument/2006/relationships" xmlns:m="http://schemas.openxmlformats.org/officeDocument/2006/math" xmlns:v="urn:schemas-microsoft-com:vml" xmlns:wp14="http://schemas.microsoft.com/office/word/2010/wordprocessingDrawing" xmlns:wp="http://schemas.openxmlformats.org/drawingml/2006/wordprocessingDrawing" xmlns:w10="urn:schemas-microsoft-com:office:word" xmlns:w="http://schemas.openxmlformats.org/wordprocessingml/2006/main" xmlns:w14="http://schemas.microsoft.com/office/word/2010/wordml" xmlns:w15="http://schemas.microsoft.com/office/word/2012/wordml" xmlns:w16cex="http://schemas.microsoft.com/office/word/2018/wordml/cex" xmlns:w16cid="http://schemas.microsoft.com/office/word/2016/wordml/cid" xmlns:w16="http://schemas.microsoft.com/office/word/2018/wordml" xmlns:w16du="http://schemas.microsoft.com/office/word/2023/wordml/word16du" xmlns:w16sdtdh="http://schemas.microsoft.com/office/word/2020/wordml/sdtdatahash" xmlns:w16sdtfl="http://schemas.microsoft.com/office/word/2024/wordml/sdtformatlock" xmlns:w16se="http://schemas.microsoft.com/office/word/2015/wordml/symex" xmlns:wpg="http://schemas.microsoft.com/office/word/2010/wordprocessingGroup" xmlns:wpi="http://schemas.microsoft.com/office/word/2010/wordprocessingInk" xmlns:wne="http://schemas.microsoft.com/office/word/2006/wordml" xmlns:wps="http://schemas.microsoft.com/office/word/2010/wordprocessingShape" mc:Ignorable="w14 w15 w16se w16cid w16 w16cex w16sdtdh w16sdtfl w16du wp14">
   <w:endnote w:type="separator" w:id="-1">
     <w:p>
       <w:r>
@@ -26090,7 +27082,7 @@
 </file>
 
 <file path=word/footer1.xml><?xml version="1.0" encoding="utf-8"?>
-<w:ftr xmlns:wpc="http://schemas.microsoft.com/office/word/2010/wordprocessingCanvas" xmlns:cx="http://schemas.microsoft.com/office/drawing/2014/chartex" xmlns:cx1="http://schemas.microsoft.com/office/drawing/2015/9/8/chartex" xmlns:cx2="http://schemas.microsoft.com/office/drawing/2015/10/21/chartex" xmlns:cx3="http://schemas.microsoft.com/office/drawing/2016/5/9/chartex" xmlns:cx4="http://schemas.microsoft.com/office/drawing/2016/5/10/chartex" xmlns:cx5="http://schemas.microsoft.com/office/drawing/2016/5/11/chartex" xmlns:cx6="http://schemas.microsoft.com/office/drawing/2016/5/12/chartex" xmlns:cx7="http://schemas.microsoft.com/office/drawing/2016/5/13/chartex" xmlns:cx8="http://schemas.microsoft.com/office/drawing/2016/5/14/chartex" xmlns:mc="http://schemas.openxmlformats.org/markup-compatibility/2006" xmlns:aink="http://schemas.microsoft.com/office/drawing/2016/ink" xmlns:am3d="http://schemas.microsoft.com/office/drawing/2017/model3d" xmlns:o="urn:schemas-microsoft-com:office:office" xmlns:oel="http://schemas.microsoft.com/office/2019/extlst" xmlns:r="http://schemas.openxmlformats.org/officeDocument/2006/relationships" xmlns:m="http://schemas.openxmlformats.org/officeDocument/2006/math" xmlns:v="urn:schemas-microsoft-com:vml" xmlns:wp14="http://schemas.microsoft.com/office/word/2010/wordprocessingDrawing" xmlns:wp="http://schemas.openxmlformats.org/drawingml/2006/wordprocessingDrawing" xmlns:w10="urn:schemas-microsoft-com:office:word" xmlns:w="http://schemas.openxmlformats.org/wordprocessingml/2006/main" xmlns:w14="http://schemas.microsoft.com/office/word/2010/wordml" xmlns:w15="http://schemas.microsoft.com/office/word/2012/wordml" xmlns:w16cei="http://schemas.microsoft.com/office/word/2026/wordml/cei" xmlns:w16cex="http://schemas.microsoft.com/office/word/2018/wordml/cex" xmlns:w16cid="http://schemas.microsoft.com/office/word/2016/wordml/cid" xmlns:w16="http://schemas.microsoft.com/office/word/2018/wordml" xmlns:w16du="http://schemas.microsoft.com/office/word/2023/wordml/word16du" xmlns:w16sdtdh="http://schemas.microsoft.com/office/word/2020/wordml/sdtdatahash" xmlns:w16sdtfl="http://schemas.microsoft.com/office/word/2024/wordml/sdtformatlock" xmlns:w16se="http://schemas.microsoft.com/office/word/2015/wordml/symex" xmlns:wpg="http://schemas.microsoft.com/office/word/2010/wordprocessingGroup" xmlns:wpi="http://schemas.microsoft.com/office/word/2010/wordprocessingInk" xmlns:wne="http://schemas.microsoft.com/office/word/2006/wordml" xmlns:wps="http://schemas.microsoft.com/office/word/2010/wordprocessingShape" mc:Ignorable="w14 w15 w16se w16cid w16 w16cex w16sdtdh w16sdtfl w16du wp14">
+<w:ftr xmlns:wpc="http://schemas.microsoft.com/office/word/2010/wordprocessingCanvas" xmlns:cx="http://schemas.microsoft.com/office/drawing/2014/chartex" xmlns:cx1="http://schemas.microsoft.com/office/drawing/2015/9/8/chartex" xmlns:cx2="http://schemas.microsoft.com/office/drawing/2015/10/21/chartex" xmlns:cx3="http://schemas.microsoft.com/office/drawing/2016/5/9/chartex" xmlns:cx4="http://schemas.microsoft.com/office/drawing/2016/5/10/chartex" xmlns:cx5="http://schemas.microsoft.com/office/drawing/2016/5/11/chartex" xmlns:cx6="http://schemas.microsoft.com/office/drawing/2016/5/12/chartex" xmlns:cx7="http://schemas.microsoft.com/office/drawing/2016/5/13/chartex" xmlns:cx8="http://schemas.microsoft.com/office/drawing/2016/5/14/chartex" xmlns:mc="http://schemas.openxmlformats.org/markup-compatibility/2006" xmlns:aink="http://schemas.microsoft.com/office/drawing/2016/ink" xmlns:am3d="http://schemas.microsoft.com/office/drawing/2017/model3d" xmlns:o="urn:schemas-microsoft-com:office:office" xmlns:oel="http://schemas.microsoft.com/office/2019/extlst" xmlns:r="http://schemas.openxmlformats.org/officeDocument/2006/relationships" xmlns:m="http://schemas.openxmlformats.org/officeDocument/2006/math" xmlns:v="urn:schemas-microsoft-com:vml" xmlns:wp14="http://schemas.microsoft.com/office/word/2010/wordprocessingDrawing" xmlns:wp="http://schemas.openxmlformats.org/drawingml/2006/wordprocessingDrawing" xmlns:w10="urn:schemas-microsoft-com:office:word" xmlns:w="http://schemas.openxmlformats.org/wordprocessingml/2006/main" xmlns:w14="http://schemas.microsoft.com/office/word/2010/wordml" xmlns:w15="http://schemas.microsoft.com/office/word/2012/wordml" xmlns:w16cex="http://schemas.microsoft.com/office/word/2018/wordml/cex" xmlns:w16cid="http://schemas.microsoft.com/office/word/2016/wordml/cid" xmlns:w16="http://schemas.microsoft.com/office/word/2018/wordml" xmlns:w16du="http://schemas.microsoft.com/office/word/2023/wordml/word16du" xmlns:w16sdtdh="http://schemas.microsoft.com/office/word/2020/wordml/sdtdatahash" xmlns:w16sdtfl="http://schemas.microsoft.com/office/word/2024/wordml/sdtformatlock" xmlns:w16se="http://schemas.microsoft.com/office/word/2015/wordml/symex" xmlns:wpg="http://schemas.microsoft.com/office/word/2010/wordprocessingGroup" xmlns:wpi="http://schemas.microsoft.com/office/word/2010/wordprocessingInk" xmlns:wne="http://schemas.microsoft.com/office/word/2006/wordml" xmlns:wps="http://schemas.microsoft.com/office/word/2010/wordprocessingShape" mc:Ignorable="w14 w15 w16se w16cid w16 w16cex w16sdtdh w16sdtfl w16du wp14">
   <w:p>
     <w:pPr>
       <w:pStyle w:val="Footer"/>
@@ -26121,7 +27113,7 @@
 </file>
 
 <file path=word/footnotes.xml><?xml version="1.0" encoding="utf-8"?>
-<w:footnotes xmlns:wpc="http://schemas.microsoft.com/office/word/2010/wordprocessingCanvas" xmlns:cx="http://schemas.microsoft.com/office/drawing/2014/chartex" xmlns:cx1="http://schemas.microsoft.com/office/drawing/2015/9/8/chartex" xmlns:cx2="http://schemas.microsoft.com/office/drawing/2015/10/21/chartex" xmlns:cx3="http://schemas.microsoft.com/office/drawing/2016/5/9/chartex" xmlns:cx4="http://schemas.microsoft.com/office/drawing/2016/5/10/chartex" xmlns:cx5="http://schemas.microsoft.com/office/drawing/2016/5/11/chartex" xmlns:cx6="http://schemas.microsoft.com/office/drawing/2016/5/12/chartex" xmlns:cx7="http://schemas.microsoft.com/office/drawing/2016/5/13/chartex" xmlns:cx8="http://schemas.microsoft.com/office/drawing/2016/5/14/chartex" xmlns:mc="http://schemas.openxmlformats.org/markup-compatibility/2006" xmlns:aink="http://schemas.microsoft.com/office/drawing/2016/ink" xmlns:am3d="http://schemas.microsoft.com/office/drawing/2017/model3d" xmlns:o="urn:schemas-microsoft-com:office:office" xmlns:oel="http://schemas.microsoft.com/office/2019/extlst" xmlns:r="http://schemas.openxmlformats.org/officeDocument/2006/relationships" xmlns:m="http://schemas.openxmlformats.org/officeDocument/2006/math" xmlns:v="urn:schemas-microsoft-com:vml" xmlns:wp14="http://schemas.microsoft.com/office/word/2010/wordprocessingDrawing" xmlns:wp="http://schemas.openxmlformats.org/drawingml/2006/wordprocessingDrawing" xmlns:w10="urn:schemas-microsoft-com:office:word" xmlns:w="http://schemas.openxmlformats.org/wordprocessingml/2006/main" xmlns:w14="http://schemas.microsoft.com/office/word/2010/wordml" xmlns:w15="http://schemas.microsoft.com/office/word/2012/wordml" xmlns:w16cei="http://schemas.microsoft.com/office/word/2026/wordml/cei" xmlns:w16cex="http://schemas.microsoft.com/office/word/2018/wordml/cex" xmlns:w16cid="http://schemas.microsoft.com/office/word/2016/wordml/cid" xmlns:w16="http://schemas.microsoft.com/office/word/2018/wordml" xmlns:w16du="http://schemas.microsoft.com/office/word/2023/wordml/word16du" xmlns:w16sdtdh="http://schemas.microsoft.com/office/word/2020/wordml/sdtdatahash" xmlns:w16sdtfl="http://schemas.microsoft.com/office/word/2024/wordml/sdtformatlock" xmlns:w16se="http://schemas.microsoft.com/office/word/2015/wordml/symex" xmlns:wpg="http://schemas.microsoft.com/office/word/2010/wordprocessingGroup" xmlns:wpi="http://schemas.microsoft.com/office/word/2010/wordprocessingInk" xmlns:wne="http://schemas.microsoft.com/office/word/2006/wordml" xmlns:wps="http://schemas.microsoft.com/office/word/2010/wordprocessingShape" mc:Ignorable="w14 w15 w16se w16cid w16 w16cex w16sdtdh w16sdtfl w16du wp14">
+<w:footnotes xmlns:wpc="http://schemas.microsoft.com/office/word/2010/wordprocessingCanvas" xmlns:cx="http://schemas.microsoft.com/office/drawing/2014/chartex" xmlns:cx1="http://schemas.microsoft.com/office/drawing/2015/9/8/chartex" xmlns:cx2="http://schemas.microsoft.com/office/drawing/2015/10/21/chartex" xmlns:cx3="http://schemas.microsoft.com/office/drawing/2016/5/9/chartex" xmlns:cx4="http://schemas.microsoft.com/office/drawing/2016/5/10/chartex" xmlns:cx5="http://schemas.microsoft.com/office/drawing/2016/5/11/chartex" xmlns:cx6="http://schemas.microsoft.com/office/drawing/2016/5/12/chartex" xmlns:cx7="http://schemas.microsoft.com/office/drawing/2016/5/13/chartex" xmlns:cx8="http://schemas.microsoft.com/office/drawing/2016/5/14/chartex" xmlns:mc="http://schemas.openxmlformats.org/markup-compatibility/2006" xmlns:aink="http://schemas.microsoft.com/office/drawing/2016/ink" xmlns:am3d="http://schemas.microsoft.com/office/drawing/2017/model3d" xmlns:o="urn:schemas-microsoft-com:office:office" xmlns:oel="http://schemas.microsoft.com/office/2019/extlst" xmlns:r="http://schemas.openxmlformats.org/officeDocument/2006/relationships" xmlns:m="http://schemas.openxmlformats.org/officeDocument/2006/math" xmlns:v="urn:schemas-microsoft-com:vml" xmlns:wp14="http://schemas.microsoft.com/office/word/2010/wordprocessingDrawing" xmlns:wp="http://schemas.openxmlformats.org/drawingml/2006/wordprocessingDrawing" xmlns:w10="urn:schemas-microsoft-com:office:word" xmlns:w="http://schemas.openxmlformats.org/wordprocessingml/2006/main" xmlns:w14="http://schemas.microsoft.com/office/word/2010/wordml" xmlns:w15="http://schemas.microsoft.com/office/word/2012/wordml" xmlns:w16cex="http://schemas.microsoft.com/office/word/2018/wordml/cex" xmlns:w16cid="http://schemas.microsoft.com/office/word/2016/wordml/cid" xmlns:w16="http://schemas.microsoft.com/office/word/2018/wordml" xmlns:w16du="http://schemas.microsoft.com/office/word/2023/wordml/word16du" xmlns:w16sdtdh="http://schemas.microsoft.com/office/word/2020/wordml/sdtdatahash" xmlns:w16sdtfl="http://schemas.microsoft.com/office/word/2024/wordml/sdtformatlock" xmlns:w16se="http://schemas.microsoft.com/office/word/2015/wordml/symex" xmlns:wpg="http://schemas.microsoft.com/office/word/2010/wordprocessingGroup" xmlns:wpi="http://schemas.microsoft.com/office/word/2010/wordprocessingInk" xmlns:wne="http://schemas.microsoft.com/office/word/2006/wordml" xmlns:wps="http://schemas.microsoft.com/office/word/2010/wordprocessingShape" mc:Ignorable="w14 w15 w16se w16cid w16 w16cex w16sdtdh w16sdtfl w16du wp14">
   <w:footnote w:type="separator" w:id="-1">
     <w:p>
       <w:r>
@@ -26140,7 +27132,7 @@
 </file>
 
 <file path=word/header1.xml><?xml version="1.0" encoding="utf-8"?>
-<w:hdr xmlns:wpc="http://schemas.microsoft.com/office/word/2010/wordprocessingCanvas" xmlns:cx="http://schemas.microsoft.com/office/drawing/2014/chartex" xmlns:cx1="http://schemas.microsoft.com/office/drawing/2015/9/8/chartex" xmlns:cx2="http://schemas.microsoft.com/office/drawing/2015/10/21/chartex" xmlns:cx3="http://schemas.microsoft.com/office/drawing/2016/5/9/chartex" xmlns:cx4="http://schemas.microsoft.com/office/drawing/2016/5/10/chartex" xmlns:cx5="http://schemas.microsoft.com/office/drawing/2016/5/11/chartex" xmlns:cx6="http://schemas.microsoft.com/office/drawing/2016/5/12/chartex" xmlns:cx7="http://schemas.microsoft.com/office/drawing/2016/5/13/chartex" xmlns:cx8="http://schemas.microsoft.com/office/drawing/2016/5/14/chartex" xmlns:mc="http://schemas.openxmlformats.org/markup-compatibility/2006" xmlns:aink="http://schemas.microsoft.com/office/drawing/2016/ink" xmlns:am3d="http://schemas.microsoft.com/office/drawing/2017/model3d" xmlns:o="urn:schemas-microsoft-com:office:office" xmlns:oel="http://schemas.microsoft.com/office/2019/extlst" xmlns:r="http://schemas.openxmlformats.org/officeDocument/2006/relationships" xmlns:m="http://schemas.openxmlformats.org/officeDocument/2006/math" xmlns:v="urn:schemas-microsoft-com:vml" xmlns:wp14="http://schemas.microsoft.com/office/word/2010/wordprocessingDrawing" xmlns:wp="http://schemas.openxmlformats.org/drawingml/2006/wordprocessingDrawing" xmlns:w10="urn:schemas-microsoft-com:office:word" xmlns:w="http://schemas.openxmlformats.org/wordprocessingml/2006/main" xmlns:w14="http://schemas.microsoft.com/office/word/2010/wordml" xmlns:w15="http://schemas.microsoft.com/office/word/2012/wordml" xmlns:w16cei="http://schemas.microsoft.com/office/word/2026/wordml/cei" xmlns:w16cex="http://schemas.microsoft.com/office/word/2018/wordml/cex" xmlns:w16cid="http://schemas.microsoft.com/office/word/2016/wordml/cid" xmlns:w16="http://schemas.microsoft.com/office/word/2018/wordml" xmlns:w16du="http://schemas.microsoft.com/office/word/2023/wordml/word16du" xmlns:w16sdtdh="http://schemas.microsoft.com/office/word/2020/wordml/sdtdatahash" xmlns:w16sdtfl="http://schemas.microsoft.com/office/word/2024/wordml/sdtformatlock" xmlns:w16se="http://schemas.microsoft.com/office/word/2015/wordml/symex" xmlns:wpg="http://schemas.microsoft.com/office/word/2010/wordprocessingGroup" xmlns:wpi="http://schemas.microsoft.com/office/word/2010/wordprocessingInk" xmlns:wne="http://schemas.microsoft.com/office/word/2006/wordml" xmlns:wps="http://schemas.microsoft.com/office/word/2010/wordprocessingShape" mc:Ignorable="w14 w15 w16se w16cid w16 w16cex w16sdtdh w16sdtfl w16du wp14">
+<w:hdr xmlns:wpc="http://schemas.microsoft.com/office/word/2010/wordprocessingCanvas" xmlns:cx="http://schemas.microsoft.com/office/drawing/2014/chartex" xmlns:cx1="http://schemas.microsoft.com/office/drawing/2015/9/8/chartex" xmlns:cx2="http://schemas.microsoft.com/office/drawing/2015/10/21/chartex" xmlns:cx3="http://schemas.microsoft.com/office/drawing/2016/5/9/chartex" xmlns:cx4="http://schemas.microsoft.com/office/drawing/2016/5/10/chartex" xmlns:cx5="http://schemas.microsoft.com/office/drawing/2016/5/11/chartex" xmlns:cx6="http://schemas.microsoft.com/office/drawing/2016/5/12/chartex" xmlns:cx7="http://schemas.microsoft.com/office/drawing/2016/5/13/chartex" xmlns:cx8="http://schemas.microsoft.com/office/drawing/2016/5/14/chartex" xmlns:mc="http://schemas.openxmlformats.org/markup-compatibility/2006" xmlns:aink="http://schemas.microsoft.com/office/drawing/2016/ink" xmlns:am3d="http://schemas.microsoft.com/office/drawing/2017/model3d" xmlns:o="urn:schemas-microsoft-com:office:office" xmlns:oel="http://schemas.microsoft.com/office/2019/extlst" xmlns:r="http://schemas.openxmlformats.org/officeDocument/2006/relationships" xmlns:m="http://schemas.openxmlformats.org/officeDocument/2006/math" xmlns:v="urn:schemas-microsoft-com:vml" xmlns:wp14="http://schemas.microsoft.com/office/word/2010/wordprocessingDrawing" xmlns:wp="http://schemas.openxmlformats.org/drawingml/2006/wordprocessingDrawing" xmlns:w10="urn:schemas-microsoft-com:office:word" xmlns:w="http://schemas.openxmlformats.org/wordprocessingml/2006/main" xmlns:w14="http://schemas.microsoft.com/office/word/2010/wordml" xmlns:w15="http://schemas.microsoft.com/office/word/2012/wordml" xmlns:w16cex="http://schemas.microsoft.com/office/word/2018/wordml/cex" xmlns:w16cid="http://schemas.microsoft.com/office/word/2016/wordml/cid" xmlns:w16="http://schemas.microsoft.com/office/word/2018/wordml" xmlns:w16du="http://schemas.microsoft.com/office/word/2023/wordml/word16du" xmlns:w16sdtdh="http://schemas.microsoft.com/office/word/2020/wordml/sdtdatahash" xmlns:w16sdtfl="http://schemas.microsoft.com/office/word/2024/wordml/sdtformatlock" xmlns:w16se="http://schemas.microsoft.com/office/word/2015/wordml/symex" xmlns:wpg="http://schemas.microsoft.com/office/word/2010/wordprocessingGroup" xmlns:wpi="http://schemas.microsoft.com/office/word/2010/wordprocessingInk" xmlns:wne="http://schemas.microsoft.com/office/word/2006/wordml" xmlns:wps="http://schemas.microsoft.com/office/word/2010/wordprocessingShape" mc:Ignorable="w14 w15 w16se w16cid w16 w16cex w16sdtdh w16sdtfl w16du wp14">
   <w:p>
     <w:pPr>
       <w:pStyle w:val="Header"/>
@@ -26251,7 +27243,7 @@
             </wp:anchor>
           </w:drawing>
         </mc:Choice>
-        <mc:Fallback>
+        <mc:Fallback xmlns:w16cei="http://schemas.microsoft.com/office/word/2026/wordml/cei">
           <w:pict>
             <v:line w14:anchorId="304E0020" id="Line 1" o:spid="_x0000_s1026" style="position:absolute;z-index:251658240;visibility:visible;mso-wrap-style:square;mso-width-percent:0;mso-height-percent:0;mso-wrap-distance-left:9pt;mso-wrap-distance-top:0;mso-wrap-distance-right:9pt;mso-wrap-distance-bottom:0;mso-position-horizontal:absolute;mso-position-horizontal-relative:text;mso-position-vertical:absolute;mso-position-vertical-relative:text;mso-width-percent:0;mso-height-percent:0;mso-width-relative:page;mso-height-relative:page" from="-33.75pt,8.05pt" to="453pt,8.05pt" o:gfxdata="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"/>
           </w:pict>
@@ -26275,7 +27267,7 @@
 </file>
 
 <file path=word/numbering.xml><?xml version="1.0" encoding="utf-8"?>
-<w:numbering xmlns:wpc="http://schemas.microsoft.com/office/word/2010/wordprocessingCanvas" xmlns:cx="http://schemas.microsoft.com/office/drawing/2014/chartex" xmlns:cx1="http://schemas.microsoft.com/office/drawing/2015/9/8/chartex" xmlns:cx2="http://schemas.microsoft.com/office/drawing/2015/10/21/chartex" xmlns:cx3="http://schemas.microsoft.com/office/drawing/2016/5/9/chartex" xmlns:cx4="http://schemas.microsoft.com/office/drawing/2016/5/10/chartex" xmlns:cx5="http://schemas.microsoft.com/office/drawing/2016/5/11/chartex" xmlns:cx6="http://schemas.microsoft.com/office/drawing/2016/5/12/chartex" xmlns:cx7="http://schemas.microsoft.com/office/drawing/2016/5/13/chartex" xmlns:cx8="http://schemas.microsoft.com/office/drawing/2016/5/14/chartex" xmlns:mc="http://schemas.openxmlformats.org/markup-compatibility/2006" xmlns:aink="http://schemas.microsoft.com/office/drawing/2016/ink" xmlns:am3d="http://schemas.microsoft.com/office/drawing/2017/model3d" xmlns:o="urn:schemas-microsoft-com:office:office" xmlns:oel="http://schemas.microsoft.com/office/2019/extlst" xmlns:r="http://schemas.openxmlformats.org/officeDocument/2006/relationships" xmlns:m="http://schemas.openxmlformats.org/officeDocument/2006/math" xmlns:v="urn:schemas-microsoft-com:vml" xmlns:wp14="http://schemas.microsoft.com/office/word/2010/wordprocessingDrawing" xmlns:wp="http://schemas.openxmlformats.org/drawingml/2006/wordprocessingDrawing" xmlns:w10="urn:schemas-microsoft-com:office:word" xmlns:w="http://schemas.openxmlformats.org/wordprocessingml/2006/main" xmlns:w14="http://schemas.microsoft.com/office/word/2010/wordml" xmlns:w15="http://schemas.microsoft.com/office/word/2012/wordml" xmlns:w16cei="http://schemas.microsoft.com/office/word/2026/wordml/cei" xmlns:w16cex="http://schemas.microsoft.com/office/word/2018/wordml/cex" xmlns:w16cid="http://schemas.microsoft.com/office/word/2016/wordml/cid" xmlns:w16="http://schemas.microsoft.com/office/word/2018/wordml" xmlns:w16du="http://schemas.microsoft.com/office/word/2023/wordml/word16du" xmlns:w16sdtdh="http://schemas.microsoft.com/office/word/2020/wordml/sdtdatahash" xmlns:w16sdtfl="http://schemas.microsoft.com/office/word/2024/wordml/sdtformatlock" xmlns:w16se="http://schemas.microsoft.com/office/word/2015/wordml/symex" xmlns:wpg="http://schemas.microsoft.com/office/word/2010/wordprocessingGroup" xmlns:wpi="http://schemas.microsoft.com/office/word/2010/wordprocessingInk" xmlns:wne="http://schemas.microsoft.com/office/word/2006/wordml" xmlns:wps="http://schemas.microsoft.com/office/word/2010/wordprocessingShape" mc:Ignorable="w14 w15 w16se w16cid w16 w16cex w16sdtdh w16sdtfl w16du wp14">
+<w:numbering xmlns:wpc="http://schemas.microsoft.com/office/word/2010/wordprocessingCanvas" xmlns:cx="http://schemas.microsoft.com/office/drawing/2014/chartex" xmlns:cx1="http://schemas.microsoft.com/office/drawing/2015/9/8/chartex" xmlns:cx2="http://schemas.microsoft.com/office/drawing/2015/10/21/chartex" xmlns:cx3="http://schemas.microsoft.com/office/drawing/2016/5/9/chartex" xmlns:cx4="http://schemas.microsoft.com/office/drawing/2016/5/10/chartex" xmlns:cx5="http://schemas.microsoft.com/office/drawing/2016/5/11/chartex" xmlns:cx6="http://schemas.microsoft.com/office/drawing/2016/5/12/chartex" xmlns:cx7="http://schemas.microsoft.com/office/drawing/2016/5/13/chartex" xmlns:cx8="http://schemas.microsoft.com/office/drawing/2016/5/14/chartex" xmlns:mc="http://schemas.openxmlformats.org/markup-compatibility/2006" xmlns:aink="http://schemas.microsoft.com/office/drawing/2016/ink" xmlns:am3d="http://schemas.microsoft.com/office/drawing/2017/model3d" xmlns:o="urn:schemas-microsoft-com:office:office" xmlns:oel="http://schemas.microsoft.com/office/2019/extlst" xmlns:r="http://schemas.openxmlformats.org/officeDocument/2006/relationships" xmlns:m="http://schemas.openxmlformats.org/officeDocument/2006/math" xmlns:v="urn:schemas-microsoft-com:vml" xmlns:wp14="http://schemas.microsoft.com/office/word/2010/wordprocessingDrawing" xmlns:wp="http://schemas.openxmlformats.org/drawingml/2006/wordprocessingDrawing" xmlns:w10="urn:schemas-microsoft-com:office:word" xmlns:w="http://schemas.openxmlformats.org/wordprocessingml/2006/main" xmlns:w14="http://schemas.microsoft.com/office/word/2010/wordml" xmlns:w15="http://schemas.microsoft.com/office/word/2012/wordml" xmlns:w16cex="http://schemas.microsoft.com/office/word/2018/wordml/cex" xmlns:w16cid="http://schemas.microsoft.com/office/word/2016/wordml/cid" xmlns:w16="http://schemas.microsoft.com/office/word/2018/wordml" xmlns:w16du="http://schemas.microsoft.com/office/word/2023/wordml/word16du" xmlns:w16sdtdh="http://schemas.microsoft.com/office/word/2020/wordml/sdtdatahash" xmlns:w16sdtfl="http://schemas.microsoft.com/office/word/2024/wordml/sdtformatlock" xmlns:w16se="http://schemas.microsoft.com/office/word/2015/wordml/symex" xmlns:wpg="http://schemas.microsoft.com/office/word/2010/wordprocessingGroup" xmlns:wpi="http://schemas.microsoft.com/office/word/2010/wordprocessingInk" xmlns:wne="http://schemas.microsoft.com/office/word/2006/wordml" xmlns:wps="http://schemas.microsoft.com/office/word/2010/wordprocessingShape" mc:Ignorable="w14 w15 w16se w16cid w16 w16cex w16sdtdh w16sdtfl w16du wp14">
   <w:abstractNum w:abstractNumId="0" w15:restartNumberingAfterBreak="0">
     <w:nsid w:val="00FF922E"/>
     <w:multiLevelType w:val="hybridMultilevel"/>
@@ -32039,7 +33031,6 @@
   <w:style w:type="character" w:default="1" w:styleId="DefaultParagraphFont">
     <w:name w:val="Default Paragraph Font"/>
     <w:uiPriority w:val="1"/>
-    <w:semiHidden/>
     <w:unhideWhenUsed/>
   </w:style>
   <w:style w:type="table" w:default="1" w:styleId="TableNormal">
@@ -32465,6 +33456,35 @@
     <w:unhideWhenUsed/>
     <w:rsid w:val="00581AB0"/>
   </w:style>
+  <w:style w:type="paragraph" w:customStyle="1" w:styleId="paragraph">
+    <w:name w:val="paragraph"/>
+    <w:basedOn w:val="Normal"/>
+    <w:rsid w:val="00BD07C3"/>
+    <w:pPr>
+      <w:spacing w:before="100" w:beforeAutospacing="1" w:after="100" w:afterAutospacing="1"/>
+    </w:pPr>
+    <w:rPr>
+      <w:rFonts w:ascii="Times New Roman" w:eastAsia="Times New Roman" w:hAnsi="Times New Roman"/>
+      <w:sz w:val="24"/>
+      <w:szCs w:val="24"/>
+      <w:lang w:val="en-US" w:eastAsia="en-US"/>
+    </w:rPr>
+  </w:style>
+  <w:style w:type="character" w:customStyle="1" w:styleId="normaltextrun">
+    <w:name w:val="normaltextrun"/>
+    <w:basedOn w:val="DefaultParagraphFont"/>
+    <w:rsid w:val="00BD07C3"/>
+  </w:style>
+  <w:style w:type="character" w:customStyle="1" w:styleId="eop">
+    <w:name w:val="eop"/>
+    <w:basedOn w:val="DefaultParagraphFont"/>
+    <w:rsid w:val="00BD07C3"/>
+  </w:style>
+  <w:style w:type="character" w:customStyle="1" w:styleId="wacimagecontainer">
+    <w:name w:val="wacimagecontainer"/>
+    <w:basedOn w:val="DefaultParagraphFont"/>
+    <w:rsid w:val="00BD07C3"/>
+  </w:style>
 </w:styles>
 </file>
 
@@ -32754,6 +33774,25 @@
 </file>
 
 <file path=customXml/item1.xml><?xml version="1.0" encoding="utf-8"?>
+<b:Sources xmlns:b="http://schemas.openxmlformats.org/officeDocument/2006/bibliography" xmlns="http://schemas.openxmlformats.org/officeDocument/2006/bibliography" SelectedStyle="\APASixthEditionOfficeOnline.xsl" StyleName="APA" Version="6"/>
+</file>
+
+<file path=customXml/item2.xml><?xml version="1.0" encoding="utf-8"?>
+<?mso-contentType ?>
+<FormTemplates xmlns="http://schemas.microsoft.com/sharepoint/v3/contenttype/forms">
+  <Display>DocumentLibraryForm</Display>
+  <Edit>DocumentLibraryForm</Edit>
+  <New>DocumentLibraryForm</New>
+</FormTemplates>
+</file>
+
+<file path=customXml/item3.xml><?xml version="1.0" encoding="utf-8"?>
+<p:properties xmlns:p="http://schemas.microsoft.com/office/2006/metadata/properties" xmlns:xsi="http://www.w3.org/2001/XMLSchema-instance" xmlns:pc="http://schemas.microsoft.com/office/infopath/2007/PartnerControls">
+  <documentManagement/>
+</p:properties>
+</file>
+
+<file path=customXml/item4.xml><?xml version="1.0" encoding="utf-8"?>
 <ct:contentTypeSchema xmlns:ct="http://schemas.microsoft.com/office/2006/metadata/contentType" xmlns:ma="http://schemas.microsoft.com/office/2006/metadata/properties/metaAttributes" ct:_="" ma:_="" ma:contentTypeName="Document" ma:contentTypeID="0x010100922A3CA1EE6E4B44833A16005451862E" ma:contentTypeVersion="3" ma:contentTypeDescription="Create a new document." ma:contentTypeScope="" ma:versionID="b712dade4bf8bf57d4a0cdac4d020ae4">
   <xsd:schema xmlns:xsd="http://www.w3.org/2001/XMLSchema" xmlns:xs="http://www.w3.org/2001/XMLSchema" xmlns:p="http://schemas.microsoft.com/office/2006/metadata/properties" xmlns:ns2="92f6da62-8f25-40d3-824c-47c5f6f94bd6" targetNamespace="http://schemas.microsoft.com/office/2006/metadata/properties" ma:root="true" ma:fieldsID="f6f8642a0533a95cbf7fc7bbc8c1e153" ns2:_="">
     <xsd:import namespace="92f6da62-8f25-40d3-824c-47c5f6f94bd6"/>
@@ -32891,26 +33930,32 @@
 </ct:contentTypeSchema>
 </file>
 
-<file path=customXml/item2.xml><?xml version="1.0" encoding="utf-8"?>
-<b:Sources xmlns:b="http://schemas.openxmlformats.org/officeDocument/2006/bibliography" xmlns="http://schemas.openxmlformats.org/officeDocument/2006/bibliography" SelectedStyle="\APASixthEditionOfficeOnline.xsl" StyleName="APA" Version="6"/>
+<file path=customXml/itemProps1.xml><?xml version="1.0" encoding="utf-8"?>
+<ds:datastoreItem xmlns:ds="http://schemas.openxmlformats.org/officeDocument/2006/customXml" ds:itemID="{E3DA75CE-018A-4AF1-8B5C-BF0FBFE76924}">
+  <ds:schemaRefs>
+    <ds:schemaRef ds:uri="http://schemas.openxmlformats.org/officeDocument/2006/bibliography"/>
+  </ds:schemaRefs>
+</ds:datastoreItem>
 </file>
 
-<file path=customXml/item3.xml><?xml version="1.0" encoding="utf-8"?>
-<p:properties xmlns:p="http://schemas.microsoft.com/office/2006/metadata/properties" xmlns:xsi="http://www.w3.org/2001/XMLSchema-instance" xmlns:pc="http://schemas.microsoft.com/office/infopath/2007/PartnerControls">
-  <documentManagement/>
-</p:properties>
+<file path=customXml/itemProps2.xml><?xml version="1.0" encoding="utf-8"?>
+<ds:datastoreItem xmlns:ds="http://schemas.openxmlformats.org/officeDocument/2006/customXml" ds:itemID="{82A9BB68-56B4-4822-B6B7-DB471576EB1F}">
+  <ds:schemaRefs>
+    <ds:schemaRef ds:uri="http://schemas.microsoft.com/sharepoint/v3/contenttype/forms"/>
+  </ds:schemaRefs>
+</ds:datastoreItem>
 </file>
 
-<file path=customXml/item4.xml><?xml version="1.0" encoding="utf-8"?>
-<?mso-contentType ?>
-<FormTemplates xmlns="http://schemas.microsoft.com/sharepoint/v3/contenttype/forms">
-  <Display>DocumentLibraryForm</Display>
-  <Edit>DocumentLibraryForm</Edit>
-  <New>DocumentLibraryForm</New>
-</FormTemplates>
+<file path=customXml/itemProps3.xml><?xml version="1.0" encoding="utf-8"?>
+<ds:datastoreItem xmlns:ds="http://schemas.openxmlformats.org/officeDocument/2006/customXml" ds:itemID="{B2E31085-3E06-4A9F-9730-20A04C85DF24}">
+  <ds:schemaRefs>
+    <ds:schemaRef ds:uri="http://schemas.microsoft.com/office/2006/metadata/properties"/>
+    <ds:schemaRef ds:uri="http://schemas.microsoft.com/office/infopath/2007/PartnerControls"/>
+  </ds:schemaRefs>
+</ds:datastoreItem>
 </file>
 
-<file path=customXml/itemProps1.xml><?xml version="1.0" encoding="utf-8"?>
+<file path=customXml/itemProps4.xml><?xml version="1.0" encoding="utf-8"?>
 <ds:datastoreItem xmlns:ds="http://schemas.openxmlformats.org/officeDocument/2006/customXml" ds:itemID="{69960CE0-24F5-4ADF-A12F-FE193FFA9C43}">
   <ds:schemaRefs>
     <ds:schemaRef ds:uri="http://schemas.microsoft.com/office/2006/metadata/contentType"/>
@@ -32926,29 +33971,4 @@
     <ds:schemaRef ds:uri="http://schemas.microsoft.com/internal/obd"/>
   </ds:schemaRefs>
 </ds:datastoreItem>
-</file>
-
-<file path=customXml/itemProps2.xml><?xml version="1.0" encoding="utf-8"?>
-<ds:datastoreItem xmlns:ds="http://schemas.openxmlformats.org/officeDocument/2006/customXml" ds:itemID="{E3DA75CE-018A-4AF1-8B5C-BF0FBFE76924}">
-  <ds:schemaRefs>
-    <ds:schemaRef ds:uri="http://schemas.openxmlformats.org/officeDocument/2006/bibliography"/>
-  </ds:schemaRefs>
-</ds:datastoreItem>
-</file>
-
-<file path=customXml/itemProps3.xml><?xml version="1.0" encoding="utf-8"?>
-<ds:datastoreItem xmlns:ds="http://schemas.openxmlformats.org/officeDocument/2006/customXml" ds:itemID="{B2E31085-3E06-4A9F-9730-20A04C85DF24}">
-  <ds:schemaRefs>
-    <ds:schemaRef ds:uri="http://schemas.microsoft.com/office/2006/metadata/properties"/>
-    <ds:schemaRef ds:uri="http://schemas.microsoft.com/office/infopath/2007/PartnerControls"/>
-  </ds:schemaRefs>
-</ds:datastoreItem>
-</file>
-
-<file path=customXml/itemProps4.xml><?xml version="1.0" encoding="utf-8"?>
-<ds:datastoreItem xmlns:ds="http://schemas.openxmlformats.org/officeDocument/2006/customXml" ds:itemID="{82A9BB68-56B4-4822-B6B7-DB471576EB1F}">
-  <ds:schemaRefs>
-    <ds:schemaRef ds:uri="http://schemas.microsoft.com/sharepoint/v3/contenttype/forms"/>
-  </ds:schemaRefs>
-</ds:datastoreItem>
 </file>
</xml_diff>

<commit_message>
A2: add model evaluation and backtesting section
</commit_message>
<xml_diff>
--- a/documents/Assignment 2.docx
+++ b/documents/Assignment 2.docx
@@ -316,29 +316,7 @@
               <w:sz w:val="28"/>
               <w:szCs w:val="28"/>
             </w:rPr>
-            <w:t xml:space="preserve">Lecturer: Dr </w:t>
-          </w:r>
-          <w:proofErr w:type="spellStart"/>
-          <w:r>
-            <w:rPr>
-              <w:rFonts w:ascii="Times New Roman" w:hAnsi="Times New Roman"/>
-              <w:b/>
-              <w:bCs/>
-              <w:sz w:val="28"/>
-              <w:szCs w:val="28"/>
-            </w:rPr>
-            <w:t>Thuseethan</w:t>
-          </w:r>
-          <w:proofErr w:type="spellEnd"/>
-          <w:r>
-            <w:rPr>
-              <w:rFonts w:ascii="Times New Roman" w:hAnsi="Times New Roman"/>
-              <w:b/>
-              <w:bCs/>
-              <w:sz w:val="28"/>
-              <w:szCs w:val="28"/>
-            </w:rPr>
-            <w:t xml:space="preserve"> Selvarajah</w:t>
+            <w:t>Lecturer: Dr Thuseethan Selvarajah</w:t>
           </w:r>
         </w:p>
         <w:p>
@@ -541,7 +519,6 @@
               <w:szCs w:val="24"/>
             </w:rPr>
           </w:pPr>
-          <w:proofErr w:type="gramStart"/>
           <w:r>
             <w:rPr>
               <w:rFonts w:ascii="Times New Roman" w:eastAsia="Aptos" w:hAnsi="Times New Roman"/>
@@ -582,7 +559,6 @@
             </w:rPr>
             <w:t>September</w:t>
           </w:r>
-          <w:proofErr w:type="gramEnd"/>
           <w:r>
             <w:rPr>
               <w:rFonts w:ascii="Times New Roman" w:eastAsia="Aptos" w:hAnsi="Times New Roman"/>
@@ -2305,7 +2281,6 @@
         <w:lastRenderedPageBreak/>
         <w:t>SECTION 1 – A</w:t>
       </w:r>
-      <w:proofErr w:type="spellStart"/>
       <w:r>
         <w:rPr>
           <w:rFonts w:ascii="Times New Roman" w:eastAsia="Times New Roman" w:hAnsi="Times New Roman" w:cs="Times New Roman"/>
@@ -2316,20 +2291,7 @@
           <w:szCs w:val="24"/>
           <w:lang w:val="en-AU"/>
         </w:rPr>
-        <w:t>ssessment</w:t>
-      </w:r>
-      <w:proofErr w:type="spellEnd"/>
-      <w:r>
-        <w:rPr>
-          <w:rFonts w:ascii="Times New Roman" w:eastAsia="Times New Roman" w:hAnsi="Times New Roman" w:cs="Times New Roman"/>
-          <w:b/>
-          <w:bCs/>
-          <w:color w:val="1F497D" w:themeColor="text2"/>
-          <w:sz w:val="24"/>
-          <w:szCs w:val="24"/>
-          <w:lang w:val="en-AU"/>
-        </w:rPr>
-        <w:t xml:space="preserve"> 1 Report</w:t>
+        <w:t>ssessment 1 Report</w:t>
       </w:r>
     </w:p>
     <w:p>
@@ -6296,29 +6258,7 @@
                 <w:szCs w:val="24"/>
                 <w:lang w:val="en-AU"/>
               </w:rPr>
-              <w:t xml:space="preserve">Cleans, merges and </w:t>
-            </w:r>
-            <w:proofErr w:type="gramStart"/>
-            <w:r>
-              <w:rPr>
-                <w:rFonts w:ascii="Times New Roman" w:eastAsia="Times New Roman" w:hAnsi="Times New Roman"/>
-                <w:color w:val="000000" w:themeColor="text1"/>
-                <w:sz w:val="24"/>
-                <w:szCs w:val="24"/>
-                <w:lang w:val="en-AU"/>
-              </w:rPr>
-              <w:t>engineers</w:t>
-            </w:r>
-            <w:proofErr w:type="gramEnd"/>
-            <w:r>
-              <w:rPr>
-                <w:rFonts w:ascii="Times New Roman" w:eastAsia="Times New Roman" w:hAnsi="Times New Roman"/>
-                <w:color w:val="000000" w:themeColor="text1"/>
-                <w:sz w:val="24"/>
-                <w:szCs w:val="24"/>
-                <w:lang w:val="en-AU"/>
-              </w:rPr>
-              <w:t xml:space="preserve"> features (lagged indicators, cyclical month encoding, per-capita normalisation) across the three sources.</w:t>
+              <w:t>Cleans, merges and engineers features (lagged indicators, cyclical month encoding, per-capita normalisation) across the three sources.</w:t>
             </w:r>
           </w:p>
         </w:tc>
@@ -6544,7 +6484,6 @@
               </w:rPr>
               <w:t>Python (</w:t>
             </w:r>
-            <w:proofErr w:type="spellStart"/>
             <w:r>
               <w:rPr>
                 <w:rFonts w:ascii="Times New Roman" w:eastAsia="Times New Roman" w:hAnsi="Times New Roman" w:cs="Times New Roman"/>
@@ -6555,7 +6494,6 @@
               </w:rPr>
               <w:t>Streamlit</w:t>
             </w:r>
-            <w:proofErr w:type="spellEnd"/>
             <w:r>
               <w:rPr>
                 <w:rFonts w:ascii="Times New Roman" w:eastAsia="Times New Roman" w:hAnsi="Times New Roman" w:cs="Times New Roman"/>
@@ -6702,7 +6640,6 @@
                 <w:lang w:val="en-AU"/>
               </w:rPr>
             </w:pPr>
-            <w:proofErr w:type="spellStart"/>
             <w:r>
               <w:rPr>
                 <w:rFonts w:ascii="Times New Roman" w:eastAsia="Times New Roman" w:hAnsi="Times New Roman" w:cs="Times New Roman"/>
@@ -6713,7 +6650,6 @@
               </w:rPr>
               <w:t>Streamlit</w:t>
             </w:r>
-            <w:proofErr w:type="spellEnd"/>
             <w:r>
               <w:rPr>
                 <w:rFonts w:ascii="Times New Roman" w:eastAsia="Times New Roman" w:hAnsi="Times New Roman" w:cs="Times New Roman"/>
@@ -7100,7 +7036,6 @@
         </w:rPr>
         <w:t xml:space="preserve"> </w:t>
       </w:r>
-      <w:proofErr w:type="gramStart"/>
       <w:r>
         <w:rPr>
           <w:rFonts w:ascii="Wingdings" w:eastAsia="Wingdings" w:hAnsi="Wingdings" w:cs="Wingdings"/>
@@ -7115,27 +7050,8 @@
           <w:sz w:val="24"/>
           <w:szCs w:val="24"/>
         </w:rPr>
-        <w:t xml:space="preserve">  Glue</w:t>
-      </w:r>
-      <w:proofErr w:type="gramEnd"/>
-      <w:r>
-        <w:rPr>
-          <w:rFonts w:ascii="Times New Roman" w:eastAsia="Times New Roman" w:hAnsi="Times New Roman"/>
-          <w:sz w:val="24"/>
-          <w:szCs w:val="24"/>
-        </w:rPr>
-        <w:t xml:space="preserve"> Data </w:t>
-      </w:r>
-      <w:proofErr w:type="spellStart"/>
-      <w:r>
-        <w:rPr>
-          <w:rFonts w:ascii="Times New Roman" w:eastAsia="Times New Roman" w:hAnsi="Times New Roman"/>
-          <w:sz w:val="24"/>
-          <w:szCs w:val="24"/>
-        </w:rPr>
-        <w:t>Catalog</w:t>
-      </w:r>
-      <w:proofErr w:type="spellEnd"/>
+        <w:t xml:space="preserve">  Glue Data Catalog</w:t>
+      </w:r>
       <w:r>
         <w:rPr>
           <w:rFonts w:ascii="Times New Roman" w:eastAsia="Times New Roman" w:hAnsi="Times New Roman"/>
@@ -7200,23 +7116,13 @@
         </w:rPr>
         <w:t xml:space="preserve"> </w:t>
       </w:r>
-      <w:proofErr w:type="spellStart"/>
-      <w:r>
-        <w:rPr>
-          <w:rFonts w:ascii="Times New Roman" w:eastAsia="Times New Roman" w:hAnsi="Times New Roman"/>
-          <w:sz w:val="24"/>
-          <w:szCs w:val="24"/>
-        </w:rPr>
-        <w:t>QuickSight</w:t>
-      </w:r>
-      <w:proofErr w:type="spellEnd"/>
-      <w:r>
-        <w:rPr>
-          <w:rFonts w:ascii="Times New Roman" w:eastAsia="Times New Roman" w:hAnsi="Times New Roman"/>
-          <w:sz w:val="24"/>
-          <w:szCs w:val="24"/>
-        </w:rPr>
-        <w:t>, with SageMaker Model Monitor for post-deployment monitoring</w:t>
+      <w:r>
+        <w:rPr>
+          <w:rFonts w:ascii="Times New Roman" w:eastAsia="Times New Roman" w:hAnsi="Times New Roman"/>
+          <w:sz w:val="24"/>
+          <w:szCs w:val="24"/>
+        </w:rPr>
+        <w:t>QuickSight, with SageMaker Model Monitor for post-deployment monitoring</w:t>
       </w:r>
       <w:r>
         <w:rPr>
@@ -7232,16 +7138,7 @@
           <w:sz w:val="24"/>
           <w:szCs w:val="24"/>
         </w:rPr>
-        <w:t>), the group project implements each stage using open-source, non-AWS tools, consistent with the module's guidance to rely on open-</w:t>
-      </w:r>
-      <w:proofErr w:type="gramStart"/>
-      <w:r>
-        <w:rPr>
-          <w:rFonts w:ascii="Times New Roman" w:eastAsia="Times New Roman" w:hAnsi="Times New Roman"/>
-          <w:sz w:val="24"/>
-          <w:szCs w:val="24"/>
-        </w:rPr>
-        <w:t xml:space="preserve">source </w:t>
+        <w:t xml:space="preserve">), the group project implements each stage using open-source, non-AWS tools, consistent with the module's guidance to rely on open-source </w:t>
       </w:r>
       <w:r>
         <w:rPr>
@@ -7258,16 +7155,7 @@
           <w:sz w:val="24"/>
           <w:szCs w:val="24"/>
         </w:rPr>
-        <w:t>tools</w:t>
-      </w:r>
-      <w:proofErr w:type="gramEnd"/>
-      <w:r>
-        <w:rPr>
-          <w:rFonts w:ascii="Times New Roman" w:eastAsia="Times New Roman" w:hAnsi="Times New Roman"/>
-          <w:sz w:val="24"/>
-          <w:szCs w:val="24"/>
-        </w:rPr>
-        <w:t xml:space="preserve"> for the group deliverable.</w:t>
+        <w:t>tools for the group deliverable.</w:t>
       </w:r>
     </w:p>
     <w:p>
@@ -7312,18 +7200,8 @@
           <w:sz w:val="24"/>
           <w:szCs w:val="24"/>
         </w:rPr>
-        <w:t xml:space="preserve"> </w:t>
-      </w:r>
-      <w:proofErr w:type="spellStart"/>
-      <w:r>
-        <w:rPr>
-          <w:rFonts w:ascii="Times New Roman" w:eastAsia="Times New Roman" w:hAnsi="Times New Roman"/>
-          <w:sz w:val="24"/>
-          <w:szCs w:val="24"/>
-        </w:rPr>
-        <w:t>Streamlit</w:t>
-      </w:r>
-      <w:proofErr w:type="spellEnd"/>
+        <w:t xml:space="preserve"> Streamlit</w:t>
+      </w:r>
       <w:r>
         <w:rPr>
           <w:rFonts w:ascii="Times New Roman" w:eastAsia="Times New Roman" w:hAnsi="Times New Roman"/>
@@ -7404,43 +7282,7 @@
           <w:sz w:val="24"/>
           <w:szCs w:val="24"/>
         </w:rPr>
-        <w:t xml:space="preserve">the GitHub-based data store to Amazon S3, pandas-based data processing to AWS Glue ETL, the Analytics/ML stage to Amazon SageMaker for managed training and scheduled deployment, the </w:t>
-      </w:r>
-      <w:proofErr w:type="spellStart"/>
-      <w:r>
-        <w:rPr>
-          <w:rFonts w:ascii="Times New Roman" w:eastAsia="Times New Roman" w:hAnsi="Times New Roman"/>
-          <w:sz w:val="24"/>
-          <w:szCs w:val="24"/>
-        </w:rPr>
-        <w:t>Streamlit</w:t>
-      </w:r>
-      <w:proofErr w:type="spellEnd"/>
-      <w:r>
-        <w:rPr>
-          <w:rFonts w:ascii="Times New Roman" w:eastAsia="Times New Roman" w:hAnsi="Times New Roman"/>
-          <w:sz w:val="24"/>
-          <w:szCs w:val="24"/>
-        </w:rPr>
-        <w:t xml:space="preserve"> dashboard to Amazon </w:t>
-      </w:r>
-      <w:proofErr w:type="spellStart"/>
-      <w:r>
-        <w:rPr>
-          <w:rFonts w:ascii="Times New Roman" w:eastAsia="Times New Roman" w:hAnsi="Times New Roman"/>
-          <w:sz w:val="24"/>
-          <w:szCs w:val="24"/>
-        </w:rPr>
-        <w:t>QuickSight</w:t>
-      </w:r>
-      <w:proofErr w:type="spellEnd"/>
-      <w:r>
-        <w:rPr>
-          <w:rFonts w:ascii="Times New Roman" w:eastAsia="Times New Roman" w:hAnsi="Times New Roman"/>
-          <w:sz w:val="24"/>
-          <w:szCs w:val="24"/>
-        </w:rPr>
-        <w:t>, the Monitor stage to Amazon SageMaker Model Monitor, and the Incremental learning stage to SageMaker's built-in incremental (continuous) training capability. Future enhancements under consideration include real-time or near-real-time data ingestion (replacing manual/batch downloads) and integration with additional predictors such as weather or event-calendar data to improve forecast accuracy.</w:t>
+        <w:t>the GitHub-based data store to Amazon S3, pandas-based data processing to AWS Glue ETL, the Analytics/ML stage to Amazon SageMaker for managed training and scheduled deployment, the Streamlit dashboard to Amazon QuickSight, the Monitor stage to Amazon SageMaker Model Monitor, and the Incremental learning stage to SageMaker's built-in incremental (continuous) training capability. Future enhancements under consideration include real-time or near-real-time data ingestion (replacing manual/batch downloads) and integration with additional predictors such as weather or event-calendar data to improve forecast accuracy.</w:t>
       </w:r>
     </w:p>
     <w:p>
@@ -7904,25 +7746,14 @@
               </w:rPr>
               <w:t xml:space="preserve">GitHub repository with README; </w:t>
             </w:r>
-            <w:proofErr w:type="spellStart"/>
-            <w:r>
-              <w:rPr>
-                <w:rFonts w:ascii="Times New Roman" w:eastAsia="Times New Roman" w:hAnsi="Times New Roman" w:cs="Times New Roman"/>
-                <w:sz w:val="24"/>
-                <w:szCs w:val="24"/>
-                <w:lang w:val="en-AU"/>
-              </w:rPr>
-              <w:t>Streamlit</w:t>
-            </w:r>
-            <w:proofErr w:type="spellEnd"/>
-            <w:r>
-              <w:rPr>
-                <w:rFonts w:ascii="Times New Roman" w:eastAsia="Times New Roman" w:hAnsi="Times New Roman" w:cs="Times New Roman"/>
-                <w:sz w:val="24"/>
-                <w:szCs w:val="24"/>
-                <w:lang w:val="en-AU"/>
-              </w:rPr>
-              <w:t xml:space="preserve"> account set up</w:t>
+            <w:r>
+              <w:rPr>
+                <w:rFonts w:ascii="Times New Roman" w:eastAsia="Times New Roman" w:hAnsi="Times New Roman" w:cs="Times New Roman"/>
+                <w:sz w:val="24"/>
+                <w:szCs w:val="24"/>
+                <w:lang w:val="en-AU"/>
+              </w:rPr>
+              <w:t>Streamlit account set up</w:t>
             </w:r>
             <w:r>
               <w:rPr>
@@ -9261,7 +9092,6 @@
               </w:rPr>
               <w:t xml:space="preserve">Incorporate feedback; finalise </w:t>
             </w:r>
-            <w:proofErr w:type="gramStart"/>
             <w:r>
               <w:rPr>
                 <w:rFonts w:ascii="Times New Roman" w:eastAsia="Times New Roman" w:hAnsi="Times New Roman" w:cs="Times New Roman"/>
@@ -9287,37 +9117,7 @@
                 <w:szCs w:val="24"/>
                 <w:lang w:val="en-AU"/>
               </w:rPr>
-              <w:t xml:space="preserve"> deploy</w:t>
-            </w:r>
-            <w:proofErr w:type="gramEnd"/>
-            <w:r>
-              <w:rPr>
-                <w:rFonts w:ascii="Times New Roman" w:eastAsia="Times New Roman" w:hAnsi="Times New Roman" w:cs="Times New Roman"/>
-                <w:sz w:val="24"/>
-                <w:szCs w:val="24"/>
-                <w:lang w:val="en-AU"/>
-              </w:rPr>
-              <w:t xml:space="preserve"> to </w:t>
-            </w:r>
-            <w:proofErr w:type="spellStart"/>
-            <w:r>
-              <w:rPr>
-                <w:rFonts w:ascii="Times New Roman" w:eastAsia="Times New Roman" w:hAnsi="Times New Roman" w:cs="Times New Roman"/>
-                <w:sz w:val="24"/>
-                <w:szCs w:val="24"/>
-                <w:lang w:val="en-AU"/>
-              </w:rPr>
-              <w:t>Streamlit</w:t>
-            </w:r>
-            <w:proofErr w:type="spellEnd"/>
-            <w:r>
-              <w:rPr>
-                <w:rFonts w:ascii="Times New Roman" w:eastAsia="Times New Roman" w:hAnsi="Times New Roman" w:cs="Times New Roman"/>
-                <w:sz w:val="24"/>
-                <w:szCs w:val="24"/>
-                <w:lang w:val="en-AU"/>
-              </w:rPr>
-              <w:t xml:space="preserve"> Community Cloud; </w:t>
+              <w:t xml:space="preserve"> deploy to Streamlit Community Cloud; </w:t>
             </w:r>
             <w:r>
               <w:rPr>
@@ -10192,7 +9992,6 @@
               </w:rPr>
               <w:t xml:space="preserve">Cleans, merges and </w:t>
             </w:r>
-            <w:proofErr w:type="gramStart"/>
             <w:r>
               <w:rPr>
                 <w:rFonts w:ascii="Times New Roman" w:eastAsia="Times New Roman" w:hAnsi="Times New Roman" w:cs="Times New Roman"/>
@@ -10202,7 +10001,6 @@
               </w:rPr>
               <w:t>engineers</w:t>
             </w:r>
-            <w:proofErr w:type="gramEnd"/>
             <w:r>
               <w:rPr>
                 <w:rFonts w:ascii="Times New Roman" w:eastAsia="Times New Roman" w:hAnsi="Times New Roman" w:cs="Times New Roman"/>
@@ -10377,19 +10175,8 @@
                 <w:szCs w:val="24"/>
                 <w:lang w:val="en-AU"/>
               </w:rPr>
-              <w:t xml:space="preserve">Dashboard &amp; </w:t>
-            </w:r>
-            <w:proofErr w:type="gramStart"/>
-            <w:r>
-              <w:rPr>
-                <w:rFonts w:ascii="Times New Roman" w:eastAsia="Times New Roman" w:hAnsi="Times New Roman" w:cs="Times New Roman"/>
-                <w:sz w:val="24"/>
-                <w:szCs w:val="24"/>
-                <w:lang w:val="en-AU"/>
-              </w:rPr>
-              <w:t>Deploy</w:t>
-            </w:r>
-            <w:proofErr w:type="gramEnd"/>
+              <w:t>Dashboard &amp; Deploy</w:t>
+            </w:r>
           </w:p>
         </w:tc>
         <w:tc>
@@ -10417,47 +10204,7 @@
                 <w:szCs w:val="24"/>
                 <w:lang w:val="en-AU"/>
               </w:rPr>
-              <w:t xml:space="preserve">Builds the </w:t>
-            </w:r>
-            <w:proofErr w:type="spellStart"/>
-            <w:r>
-              <w:rPr>
-                <w:rFonts w:ascii="Times New Roman" w:eastAsia="Times New Roman" w:hAnsi="Times New Roman" w:cs="Times New Roman"/>
-                <w:sz w:val="24"/>
-                <w:szCs w:val="24"/>
-                <w:lang w:val="en-AU"/>
-              </w:rPr>
-              <w:t>Streamlit</w:t>
-            </w:r>
-            <w:proofErr w:type="spellEnd"/>
-            <w:r>
-              <w:rPr>
-                <w:rFonts w:ascii="Times New Roman" w:eastAsia="Times New Roman" w:hAnsi="Times New Roman" w:cs="Times New Roman"/>
-                <w:sz w:val="24"/>
-                <w:szCs w:val="24"/>
-                <w:lang w:val="en-AU"/>
-              </w:rPr>
-              <w:t xml:space="preserve"> dashboard and manages its deployment and redeployment via </w:t>
-            </w:r>
-            <w:proofErr w:type="spellStart"/>
-            <w:r>
-              <w:rPr>
-                <w:rFonts w:ascii="Times New Roman" w:eastAsia="Times New Roman" w:hAnsi="Times New Roman" w:cs="Times New Roman"/>
-                <w:sz w:val="24"/>
-                <w:szCs w:val="24"/>
-                <w:lang w:val="en-AU"/>
-              </w:rPr>
-              <w:t>Streamlit</w:t>
-            </w:r>
-            <w:proofErr w:type="spellEnd"/>
-            <w:r>
-              <w:rPr>
-                <w:rFonts w:ascii="Times New Roman" w:eastAsia="Times New Roman" w:hAnsi="Times New Roman" w:cs="Times New Roman"/>
-                <w:sz w:val="24"/>
-                <w:szCs w:val="24"/>
-                <w:lang w:val="en-AU"/>
-              </w:rPr>
-              <w:t xml:space="preserve"> Community Cloud.</w:t>
+              <w:t>Builds the Streamlit dashboard and manages its deployment and redeployment via Streamlit Community Cloud.</w:t>
             </w:r>
           </w:p>
         </w:tc>
@@ -10574,25 +10321,7 @@
           <w:sz w:val="24"/>
           <w:szCs w:val="24"/>
         </w:rPr>
-        <w:t xml:space="preserve"> from PROMIS to </w:t>
-      </w:r>
-      <w:proofErr w:type="spellStart"/>
-      <w:r>
-        <w:rPr>
-          <w:rFonts w:ascii="Times New Roman" w:eastAsia="Times New Roman" w:hAnsi="Times New Roman"/>
-          <w:sz w:val="24"/>
-          <w:szCs w:val="24"/>
-        </w:rPr>
-        <w:t>SerPro</w:t>
-      </w:r>
-      <w:proofErr w:type="spellEnd"/>
-      <w:r>
-        <w:rPr>
-          <w:rFonts w:ascii="Times New Roman" w:eastAsia="Times New Roman" w:hAnsi="Times New Roman"/>
-          <w:sz w:val="24"/>
-          <w:szCs w:val="24"/>
-        </w:rPr>
-        <w:t xml:space="preserve"> in November 2023 and </w:t>
+        <w:t xml:space="preserve"> from PROMIS to SerPro in November 2023 and </w:t>
       </w:r>
       <w:r>
         <w:rPr>
@@ -11029,25 +10758,7 @@
           <w:sz w:val="24"/>
           <w:szCs w:val="24"/>
         </w:rPr>
-        <w:t xml:space="preserve">And the final risk is misuse or misinterpretation of the forecasts. If predictions are read as statements about </w:t>
-      </w:r>
-      <w:proofErr w:type="gramStart"/>
-      <w:r>
-        <w:rPr>
-          <w:rFonts w:ascii="Times New Roman" w:eastAsia="Times New Roman" w:hAnsi="Times New Roman"/>
-          <w:sz w:val="24"/>
-          <w:szCs w:val="24"/>
-        </w:rPr>
-        <w:t>particular communities</w:t>
-      </w:r>
-      <w:proofErr w:type="gramEnd"/>
-      <w:r>
-        <w:rPr>
-          <w:rFonts w:ascii="Times New Roman" w:eastAsia="Times New Roman" w:hAnsi="Times New Roman"/>
-          <w:sz w:val="24"/>
-          <w:szCs w:val="24"/>
-        </w:rPr>
-        <w:t>, the system could cause harm rather than support safety. Small counts in low-population regions could also make incidents identifiable. Forecasts will therefore be shown only at region and month level, with uncertainty ranges, and small values will be suppressed.</w:t>
+        <w:t>And the final risk is misuse or misinterpretation of the forecasts. If predictions are read as statements about particular communities, the system could cause harm rather than support safety. Small counts in low-population regions could also make incidents identifiable. Forecasts will therefore be shown only at region and month level, with uncertainty ranges, and small values will be suppressed.</w:t>
       </w:r>
     </w:p>
     <w:p>
@@ -11632,43 +11343,7 @@
           <w:sz w:val="24"/>
           <w:szCs w:val="24"/>
         </w:rPr>
-        <w:t xml:space="preserve">Carroll, S. R., Garba, I., Figueroa-Rodríguez, O. L., Holbrook, J., Lovett, R., </w:t>
-      </w:r>
-      <w:proofErr w:type="spellStart"/>
-      <w:r>
-        <w:rPr>
-          <w:rFonts w:ascii="Times New Roman" w:eastAsia="Times New Roman" w:hAnsi="Times New Roman"/>
-          <w:sz w:val="24"/>
-          <w:szCs w:val="24"/>
-        </w:rPr>
-        <w:t>Materechera</w:t>
-      </w:r>
-      <w:proofErr w:type="spellEnd"/>
-      <w:r>
-        <w:rPr>
-          <w:rFonts w:ascii="Times New Roman" w:eastAsia="Times New Roman" w:hAnsi="Times New Roman"/>
-          <w:sz w:val="24"/>
-          <w:szCs w:val="24"/>
-        </w:rPr>
-        <w:t xml:space="preserve">, S., Parsons, M., </w:t>
-      </w:r>
-      <w:proofErr w:type="spellStart"/>
-      <w:r>
-        <w:rPr>
-          <w:rFonts w:ascii="Times New Roman" w:eastAsia="Times New Roman" w:hAnsi="Times New Roman"/>
-          <w:sz w:val="24"/>
-          <w:szCs w:val="24"/>
-        </w:rPr>
-        <w:t>Raseroka</w:t>
-      </w:r>
-      <w:proofErr w:type="spellEnd"/>
-      <w:r>
-        <w:rPr>
-          <w:rFonts w:ascii="Times New Roman" w:eastAsia="Times New Roman" w:hAnsi="Times New Roman"/>
-          <w:sz w:val="24"/>
-          <w:szCs w:val="24"/>
-        </w:rPr>
-        <w:t xml:space="preserve">, K., Rodriguez-Lonebear, D., Rowe, R., Sara, R., Walker, J. D., Anderson, J., &amp; Hudson, M. (2020). The CARE Principles for Indigenous Data Governance. Data Science Journal, 19(1), 1–12. </w:t>
+        <w:t xml:space="preserve">Carroll, S. R., Garba, I., Figueroa-Rodríguez, O. L., Holbrook, J., Lovett, R., Materechera, S., Parsons, M., Raseroka, K., Rodriguez-Lonebear, D., Rowe, R., Sara, R., Walker, J. D., Anderson, J., &amp; Hudson, M. (2020). The CARE Principles for Indigenous Data Governance. Data Science Journal, 19(1), 1–12. </w:t>
       </w:r>
       <w:hyperlink r:id="rId23">
         <w:r>
@@ -11753,57 +11428,15 @@
           <w:sz w:val="24"/>
           <w:szCs w:val="24"/>
         </w:rPr>
-        <w:t xml:space="preserve">NT crime </w:t>
-      </w:r>
-      <w:proofErr w:type="gramStart"/>
-      <w:r>
-        <w:rPr>
-          <w:rFonts w:ascii="Times New Roman" w:eastAsia="Times New Roman" w:hAnsi="Times New Roman"/>
-          <w:i/>
-          <w:iCs/>
-          <w:sz w:val="24"/>
-          <w:szCs w:val="24"/>
-        </w:rPr>
-        <w:t>statistics march</w:t>
-      </w:r>
-      <w:proofErr w:type="gramEnd"/>
-      <w:r>
-        <w:rPr>
-          <w:rFonts w:ascii="Times New Roman" w:eastAsia="Times New Roman" w:hAnsi="Times New Roman"/>
-          <w:i/>
-          <w:iCs/>
-          <w:sz w:val="24"/>
-          <w:szCs w:val="24"/>
-        </w:rPr>
-        <w:t xml:space="preserve"> 2026 - NTG open data portal</w:t>
-      </w:r>
-      <w:r>
-        <w:rPr>
-          <w:rFonts w:ascii="Times New Roman" w:eastAsia="Times New Roman" w:hAnsi="Times New Roman"/>
-          <w:sz w:val="24"/>
-          <w:szCs w:val="24"/>
-        </w:rPr>
-        <w:t xml:space="preserve">. </w:t>
-      </w:r>
-      <w:proofErr w:type="spellStart"/>
-      <w:proofErr w:type="gramStart"/>
-      <w:r>
-        <w:rPr>
-          <w:rFonts w:ascii="Times New Roman" w:eastAsia="Times New Roman" w:hAnsi="Times New Roman"/>
-          <w:sz w:val="24"/>
-          <w:szCs w:val="24"/>
-        </w:rPr>
-        <w:t>Nt.Gov.Au</w:t>
-      </w:r>
-      <w:proofErr w:type="spellEnd"/>
-      <w:proofErr w:type="gramEnd"/>
-      <w:r>
-        <w:rPr>
-          <w:rFonts w:ascii="Times New Roman" w:eastAsia="Times New Roman" w:hAnsi="Times New Roman"/>
-          <w:sz w:val="24"/>
-          <w:szCs w:val="24"/>
-        </w:rPr>
-        <w:t xml:space="preserve">. </w:t>
+        <w:t>NT crime statistics march 2026 - NTG open data portal</w:t>
+      </w:r>
+      <w:r>
+        <w:rPr>
+          <w:rFonts w:ascii="Times New Roman" w:eastAsia="Times New Roman" w:hAnsi="Times New Roman"/>
+          <w:sz w:val="24"/>
+          <w:szCs w:val="24"/>
+        </w:rPr>
+        <w:t xml:space="preserve">. Nt.Gov.Au. </w:t>
       </w:r>
       <w:hyperlink r:id="rId25">
         <w:r>
@@ -11883,29 +11516,7 @@
           <w:sz w:val="24"/>
           <w:szCs w:val="24"/>
         </w:rPr>
-        <w:t xml:space="preserve">Operation </w:t>
-      </w:r>
-      <w:proofErr w:type="spellStart"/>
-      <w:r>
-        <w:rPr>
-          <w:rFonts w:ascii="Times New Roman" w:eastAsia="Times New Roman" w:hAnsi="Times New Roman"/>
-          <w:i/>
-          <w:iCs/>
-          <w:sz w:val="24"/>
-          <w:szCs w:val="24"/>
-        </w:rPr>
-        <w:t>ventura</w:t>
-      </w:r>
-      <w:proofErr w:type="spellEnd"/>
-      <w:r>
-        <w:rPr>
-          <w:rFonts w:ascii="Times New Roman" w:eastAsia="Times New Roman" w:hAnsi="Times New Roman"/>
-          <w:i/>
-          <w:iCs/>
-          <w:sz w:val="24"/>
-          <w:szCs w:val="24"/>
-        </w:rPr>
-        <w:t xml:space="preserve"> | NT police, fire &amp; emergency services</w:t>
+        <w:t>Operation ventura | NT police, fire &amp; emergency services</w:t>
       </w:r>
       <w:r>
         <w:rPr>
@@ -15556,25 +15167,7 @@
           <w:sz w:val="24"/>
           <w:szCs w:val="24"/>
         </w:rPr>
-        <w:t xml:space="preserve"> to </w:t>
-      </w:r>
-      <w:proofErr w:type="spellStart"/>
-      <w:r>
-        <w:rPr>
-          <w:rFonts w:ascii="Times New Roman" w:eastAsia="Times New Roman" w:hAnsi="Times New Roman"/>
-          <w:sz w:val="24"/>
-          <w:szCs w:val="24"/>
-        </w:rPr>
-        <w:t>standardise</w:t>
-      </w:r>
-      <w:proofErr w:type="spellEnd"/>
-      <w:r>
-        <w:rPr>
-          <w:rFonts w:ascii="Times New Roman" w:eastAsia="Times New Roman" w:hAnsi="Times New Roman"/>
-          <w:sz w:val="24"/>
-          <w:szCs w:val="24"/>
-        </w:rPr>
-        <w:t xml:space="preserve"> crime rates per 100,000 population, enabling fair comparisons across regions with different population sizes.</w:t>
+        <w:t xml:space="preserve"> to standardise crime rates per 100,000 population, enabling fair comparisons across regions with different population sizes.</w:t>
       </w:r>
     </w:p>
     <w:p>
@@ -16567,29 +16160,7 @@
                 <w:szCs w:val="24"/>
                 <w:lang w:val="en-AU"/>
               </w:rPr>
-              <w:t xml:space="preserve">Cleans, merges and </w:t>
-            </w:r>
-            <w:proofErr w:type="gramStart"/>
-            <w:r>
-              <w:rPr>
-                <w:rFonts w:ascii="Times New Roman" w:eastAsia="Times New Roman" w:hAnsi="Times New Roman"/>
-                <w:color w:val="000000" w:themeColor="text1"/>
-                <w:sz w:val="24"/>
-                <w:szCs w:val="24"/>
-                <w:lang w:val="en-AU"/>
-              </w:rPr>
-              <w:t>engineers</w:t>
-            </w:r>
-            <w:proofErr w:type="gramEnd"/>
-            <w:r>
-              <w:rPr>
-                <w:rFonts w:ascii="Times New Roman" w:eastAsia="Times New Roman" w:hAnsi="Times New Roman"/>
-                <w:color w:val="000000" w:themeColor="text1"/>
-                <w:sz w:val="24"/>
-                <w:szCs w:val="24"/>
-                <w:lang w:val="en-AU"/>
-              </w:rPr>
-              <w:t xml:space="preserve"> features (lagged indicators, cyclical month encoding, per-capita normalisation) across the three sources.</w:t>
+              <w:t>Cleans, merges and engineers features (lagged indicators, cyclical month encoding, per-capita normalisation) across the three sources.</w:t>
             </w:r>
           </w:p>
         </w:tc>
@@ -16813,29 +16384,7 @@
                 <w:szCs w:val="24"/>
                 <w:lang w:val="en-AU"/>
               </w:rPr>
-              <w:t>Python (</w:t>
-            </w:r>
-            <w:proofErr w:type="spellStart"/>
-            <w:r>
-              <w:rPr>
-                <w:rFonts w:ascii="Times New Roman" w:eastAsia="Times New Roman" w:hAnsi="Times New Roman" w:cs="Times New Roman"/>
-                <w:color w:val="000000" w:themeColor="text1"/>
-                <w:sz w:val="24"/>
-                <w:szCs w:val="24"/>
-                <w:lang w:val="en-AU"/>
-              </w:rPr>
-              <w:t>Streamlit</w:t>
-            </w:r>
-            <w:proofErr w:type="spellEnd"/>
-            <w:r>
-              <w:rPr>
-                <w:rFonts w:ascii="Times New Roman" w:eastAsia="Times New Roman" w:hAnsi="Times New Roman" w:cs="Times New Roman"/>
-                <w:color w:val="000000" w:themeColor="text1"/>
-                <w:sz w:val="24"/>
-                <w:szCs w:val="24"/>
-                <w:lang w:val="en-AU"/>
-              </w:rPr>
-              <w:t>)</w:t>
+              <w:t>Python (Streamlit)</w:t>
             </w:r>
           </w:p>
         </w:tc>
@@ -16961,7 +16510,6 @@
                 <w:lang w:val="en-AU"/>
               </w:rPr>
             </w:pPr>
-            <w:proofErr w:type="spellStart"/>
             <w:r>
               <w:rPr>
                 <w:rFonts w:ascii="Times New Roman" w:eastAsia="Times New Roman" w:hAnsi="Times New Roman" w:cs="Times New Roman"/>
@@ -16970,18 +16518,7 @@
                 <w:szCs w:val="24"/>
                 <w:lang w:val="en-AU"/>
               </w:rPr>
-              <w:t>Streamlit</w:t>
-            </w:r>
-            <w:proofErr w:type="spellEnd"/>
-            <w:r>
-              <w:rPr>
-                <w:rFonts w:ascii="Times New Roman" w:eastAsia="Times New Roman" w:hAnsi="Times New Roman" w:cs="Times New Roman"/>
-                <w:color w:val="000000" w:themeColor="text1"/>
-                <w:sz w:val="24"/>
-                <w:szCs w:val="24"/>
-                <w:lang w:val="en-AU"/>
-              </w:rPr>
-              <w:t xml:space="preserve"> Community Cloud (via GitHub)</w:t>
+              <w:t>Streamlit Community Cloud (via GitHub)</w:t>
             </w:r>
           </w:p>
         </w:tc>
@@ -17345,7 +16882,6 @@
         </w:rPr>
         <w:t xml:space="preserve"> </w:t>
       </w:r>
-      <w:proofErr w:type="gramStart"/>
       <w:r>
         <w:rPr>
           <w:rFonts w:ascii="Wingdings" w:eastAsia="Wingdings" w:hAnsi="Wingdings" w:cs="Wingdings"/>
@@ -17360,27 +16896,8 @@
           <w:sz w:val="24"/>
           <w:szCs w:val="24"/>
         </w:rPr>
-        <w:t xml:space="preserve">  Glue</w:t>
-      </w:r>
-      <w:proofErr w:type="gramEnd"/>
-      <w:r>
-        <w:rPr>
-          <w:rFonts w:ascii="Times New Roman" w:eastAsia="Times New Roman" w:hAnsi="Times New Roman"/>
-          <w:sz w:val="24"/>
-          <w:szCs w:val="24"/>
-        </w:rPr>
-        <w:t xml:space="preserve"> Data </w:t>
-      </w:r>
-      <w:proofErr w:type="spellStart"/>
-      <w:r>
-        <w:rPr>
-          <w:rFonts w:ascii="Times New Roman" w:eastAsia="Times New Roman" w:hAnsi="Times New Roman"/>
-          <w:sz w:val="24"/>
-          <w:szCs w:val="24"/>
-        </w:rPr>
-        <w:t>Catalog</w:t>
-      </w:r>
-      <w:proofErr w:type="spellEnd"/>
+        <w:t xml:space="preserve">  Glue Data Catalog</w:t>
+      </w:r>
       <w:r>
         <w:rPr>
           <w:rFonts w:ascii="Times New Roman" w:eastAsia="Times New Roman" w:hAnsi="Times New Roman"/>
@@ -17445,23 +16962,13 @@
         </w:rPr>
         <w:t xml:space="preserve"> </w:t>
       </w:r>
-      <w:proofErr w:type="spellStart"/>
-      <w:r>
-        <w:rPr>
-          <w:rFonts w:ascii="Times New Roman" w:eastAsia="Times New Roman" w:hAnsi="Times New Roman"/>
-          <w:sz w:val="24"/>
-          <w:szCs w:val="24"/>
-        </w:rPr>
-        <w:t>QuickSight</w:t>
-      </w:r>
-      <w:proofErr w:type="spellEnd"/>
-      <w:r>
-        <w:rPr>
-          <w:rFonts w:ascii="Times New Roman" w:eastAsia="Times New Roman" w:hAnsi="Times New Roman"/>
-          <w:sz w:val="24"/>
-          <w:szCs w:val="24"/>
-        </w:rPr>
-        <w:t>, with SageMaker Model Monitor for post-deployment monitoring</w:t>
+      <w:r>
+        <w:rPr>
+          <w:rFonts w:ascii="Times New Roman" w:eastAsia="Times New Roman" w:hAnsi="Times New Roman"/>
+          <w:sz w:val="24"/>
+          <w:szCs w:val="24"/>
+        </w:rPr>
+        <w:t>QuickSight, with SageMaker Model Monitor for post-deployment monitoring</w:t>
       </w:r>
       <w:r>
         <w:rPr>
@@ -17477,16 +16984,7 @@
           <w:sz w:val="24"/>
           <w:szCs w:val="24"/>
         </w:rPr>
-        <w:t>), the group project implements each stage using open-source, non-AWS tools, consistent with the module's guidance to rely on open-</w:t>
-      </w:r>
-      <w:proofErr w:type="gramStart"/>
-      <w:r>
-        <w:rPr>
-          <w:rFonts w:ascii="Times New Roman" w:eastAsia="Times New Roman" w:hAnsi="Times New Roman"/>
-          <w:sz w:val="24"/>
-          <w:szCs w:val="24"/>
-        </w:rPr>
-        <w:t xml:space="preserve">source </w:t>
+        <w:t xml:space="preserve">), the group project implements each stage using open-source, non-AWS tools, consistent with the module's guidance to rely on open-source </w:t>
       </w:r>
       <w:r>
         <w:rPr>
@@ -17503,16 +17001,7 @@
           <w:sz w:val="24"/>
           <w:szCs w:val="24"/>
         </w:rPr>
-        <w:t>tools</w:t>
-      </w:r>
-      <w:proofErr w:type="gramEnd"/>
-      <w:r>
-        <w:rPr>
-          <w:rFonts w:ascii="Times New Roman" w:eastAsia="Times New Roman" w:hAnsi="Times New Roman"/>
-          <w:sz w:val="24"/>
-          <w:szCs w:val="24"/>
-        </w:rPr>
-        <w:t xml:space="preserve"> for the group deliverable.</w:t>
+        <w:t>tools for the group deliverable.</w:t>
       </w:r>
     </w:p>
     <w:p>
@@ -17557,18 +17046,8 @@
           <w:sz w:val="24"/>
           <w:szCs w:val="24"/>
         </w:rPr>
-        <w:t xml:space="preserve"> </w:t>
-      </w:r>
-      <w:proofErr w:type="spellStart"/>
-      <w:r>
-        <w:rPr>
-          <w:rFonts w:ascii="Times New Roman" w:eastAsia="Times New Roman" w:hAnsi="Times New Roman"/>
-          <w:sz w:val="24"/>
-          <w:szCs w:val="24"/>
-        </w:rPr>
-        <w:t>Streamlit</w:t>
-      </w:r>
-      <w:proofErr w:type="spellEnd"/>
+        <w:t xml:space="preserve"> Streamlit</w:t>
+      </w:r>
       <w:r>
         <w:rPr>
           <w:rFonts w:ascii="Times New Roman" w:eastAsia="Times New Roman" w:hAnsi="Times New Roman"/>
@@ -17649,43 +17128,7 @@
           <w:sz w:val="24"/>
           <w:szCs w:val="24"/>
         </w:rPr>
-        <w:t xml:space="preserve">the GitHub-based data store to Amazon S3, pandas-based data processing to AWS Glue ETL, the Analytics/ML stage to Amazon SageMaker for managed training and scheduled deployment, the </w:t>
-      </w:r>
-      <w:proofErr w:type="spellStart"/>
-      <w:r>
-        <w:rPr>
-          <w:rFonts w:ascii="Times New Roman" w:eastAsia="Times New Roman" w:hAnsi="Times New Roman"/>
-          <w:sz w:val="24"/>
-          <w:szCs w:val="24"/>
-        </w:rPr>
-        <w:t>Streamlit</w:t>
-      </w:r>
-      <w:proofErr w:type="spellEnd"/>
-      <w:r>
-        <w:rPr>
-          <w:rFonts w:ascii="Times New Roman" w:eastAsia="Times New Roman" w:hAnsi="Times New Roman"/>
-          <w:sz w:val="24"/>
-          <w:szCs w:val="24"/>
-        </w:rPr>
-        <w:t xml:space="preserve"> dashboard to Amazon </w:t>
-      </w:r>
-      <w:proofErr w:type="spellStart"/>
-      <w:r>
-        <w:rPr>
-          <w:rFonts w:ascii="Times New Roman" w:eastAsia="Times New Roman" w:hAnsi="Times New Roman"/>
-          <w:sz w:val="24"/>
-          <w:szCs w:val="24"/>
-        </w:rPr>
-        <w:t>QuickSight</w:t>
-      </w:r>
-      <w:proofErr w:type="spellEnd"/>
-      <w:r>
-        <w:rPr>
-          <w:rFonts w:ascii="Times New Roman" w:eastAsia="Times New Roman" w:hAnsi="Times New Roman"/>
-          <w:sz w:val="24"/>
-          <w:szCs w:val="24"/>
-        </w:rPr>
-        <w:t>, the Monitor stage to Amazon SageMaker Model Monitor, and the Incremental learning stage to SageMaker's built-in incremental (continuous) training capability. Future enhancements under consideration include real-time or near-real-time data ingestion (replacing manual/batch downloads) and integration with additional predictors such as weather or event-calendar data to improve forecast accuracy.</w:t>
+        <w:t>the GitHub-based data store to Amazon S3, pandas-based data processing to AWS Glue ETL, the Analytics/ML stage to Amazon SageMaker for managed training and scheduled deployment, the Streamlit dashboard to Amazon QuickSight, the Monitor stage to Amazon SageMaker Model Monitor, and the Incremental learning stage to SageMaker's built-in incremental (continuous) training capability. Future enhancements under consideration include real-time or near-real-time data ingestion (replacing manual/batch downloads) and integration with additional predictors such as weather or event-calendar data to improve forecast accuracy.</w:t>
       </w:r>
     </w:p>
     <w:p>
@@ -18904,25 +18347,7 @@
           <w:sz w:val="24"/>
           <w:szCs w:val="24"/>
         </w:rPr>
-        <w:t xml:space="preserve">It is retained as </w:t>
-      </w:r>
-      <w:proofErr w:type="spellStart"/>
-      <w:r>
-        <w:rPr>
-          <w:rFonts w:ascii="Times New Roman" w:eastAsia="Times New Roman" w:hAnsi="Times New Roman"/>
-          <w:sz w:val="24"/>
-          <w:szCs w:val="24"/>
-        </w:rPr>
-        <w:t>NaN</w:t>
-      </w:r>
-      <w:proofErr w:type="spellEnd"/>
-      <w:r>
-        <w:rPr>
-          <w:rFonts w:ascii="Times New Roman" w:eastAsia="Times New Roman" w:hAnsi="Times New Roman"/>
-          <w:sz w:val="24"/>
-          <w:szCs w:val="24"/>
-        </w:rPr>
-        <w:t xml:space="preserve"> and never imputed.</w:t>
+        <w:t>It is retained as NaN and never imputed.</w:t>
       </w:r>
     </w:p>
     <w:p>
@@ -19283,23 +18708,13 @@
           <w:szCs w:val="24"/>
         </w:rPr>
       </w:pPr>
-      <w:proofErr w:type="spellStart"/>
-      <w:r>
-        <w:rPr>
-          <w:rFonts w:ascii="Times New Roman" w:eastAsia="Times New Roman" w:hAnsi="Times New Roman"/>
-          <w:sz w:val="24"/>
-          <w:szCs w:val="24"/>
-        </w:rPr>
-        <w:t>Nhulunbuy</w:t>
-      </w:r>
-      <w:proofErr w:type="spellEnd"/>
-      <w:r>
-        <w:rPr>
-          <w:rFonts w:ascii="Times New Roman" w:eastAsia="Times New Roman" w:hAnsi="Times New Roman"/>
-          <w:sz w:val="24"/>
-          <w:szCs w:val="24"/>
-        </w:rPr>
-        <w:t xml:space="preserve"> </w:t>
+      <w:r>
+        <w:rPr>
+          <w:rFonts w:ascii="Times New Roman" w:eastAsia="Times New Roman" w:hAnsi="Times New Roman"/>
+          <w:sz w:val="24"/>
+          <w:szCs w:val="24"/>
+        </w:rPr>
+        <w:t xml:space="preserve">Nhulunbuy </w:t>
       </w:r>
       <w:r>
         <w:rPr>
@@ -19608,25 +19023,7 @@
           <w:sz w:val="24"/>
           <w:szCs w:val="24"/>
         </w:rPr>
-        <w:t xml:space="preserve">Any </w:t>
-      </w:r>
-      <w:proofErr w:type="spellStart"/>
-      <w:r>
-        <w:rPr>
-          <w:rFonts w:ascii="Times New Roman" w:eastAsia="Times New Roman" w:hAnsi="Times New Roman"/>
-          <w:sz w:val="24"/>
-          <w:szCs w:val="24"/>
-        </w:rPr>
-        <w:t>unrecognised</w:t>
-      </w:r>
-      <w:proofErr w:type="spellEnd"/>
-      <w:r>
-        <w:rPr>
-          <w:rFonts w:ascii="Times New Roman" w:eastAsia="Times New Roman" w:hAnsi="Times New Roman"/>
-          <w:sz w:val="24"/>
-          <w:szCs w:val="24"/>
-        </w:rPr>
-        <w:t xml:space="preserve"> SA2 </w:t>
+        <w:t xml:space="preserve">Any unrecognised SA2 </w:t>
       </w:r>
       <w:r>
         <w:rPr>
@@ -19821,23 +19218,13 @@
         </w:rPr>
         <w:t>Data trimmed to the 2015-2025 a</w:t>
       </w:r>
-      <w:proofErr w:type="spellStart"/>
-      <w:r>
-        <w:rPr>
-          <w:rFonts w:ascii="Times New Roman" w:eastAsia="Times New Roman" w:hAnsi="Times New Roman"/>
-          <w:sz w:val="24"/>
-          <w:szCs w:val="24"/>
-        </w:rPr>
-        <w:t>nalysis</w:t>
-      </w:r>
-      <w:proofErr w:type="spellEnd"/>
-      <w:r>
-        <w:rPr>
-          <w:rFonts w:ascii="Times New Roman" w:eastAsia="Times New Roman" w:hAnsi="Times New Roman"/>
-          <w:sz w:val="24"/>
-          <w:szCs w:val="24"/>
-        </w:rPr>
-        <w:t xml:space="preserve"> window </w:t>
+      <w:r>
+        <w:rPr>
+          <w:rFonts w:ascii="Times New Roman" w:eastAsia="Times New Roman" w:hAnsi="Times New Roman"/>
+          <w:sz w:val="24"/>
+          <w:szCs w:val="24"/>
+        </w:rPr>
+        <w:t xml:space="preserve">nalysis window </w:t>
       </w:r>
       <w:r>
         <w:rPr>
@@ -20108,7 +19495,6 @@
           <w:szCs w:val="18"/>
         </w:rPr>
       </w:pPr>
-      <w:proofErr w:type="spellStart"/>
       <w:r>
         <w:rPr>
           <w:rStyle w:val="normaltextrun"/>
@@ -20127,14 +19513,7 @@
         <w:rPr>
           <w:rStyle w:val="normaltextrun"/>
         </w:rPr>
-        <w:t>_rate</w:t>
-      </w:r>
-      <w:proofErr w:type="spellEnd"/>
-      <w:r>
-        <w:rPr>
-          <w:rStyle w:val="normaltextrun"/>
-        </w:rPr>
-        <w:t>:</w:t>
+        <w:t>_rate:</w:t>
       </w:r>
     </w:p>
     <w:p>
@@ -20153,49 +19532,7 @@
         <w:rPr>
           <w:rStyle w:val="normaltextrun"/>
         </w:rPr>
-        <w:t xml:space="preserve">Since the crime rate is not normally distributed but rather follows a </w:t>
-      </w:r>
-      <w:proofErr w:type="gramStart"/>
-      <w:r>
-        <w:rPr>
-          <w:rStyle w:val="normaltextrun"/>
-        </w:rPr>
-        <w:t>log</w:t>
-      </w:r>
-      <w:proofErr w:type="gramEnd"/>
-      <w:r>
-        <w:rPr>
-          <w:rStyle w:val="normaltextrun"/>
-        </w:rPr>
-        <w:t>-normal distribution (heavily right-skewed) due to seasonality characteristics. By transforming the assault rate logarithmically, we aim to </w:t>
-      </w:r>
-      <w:proofErr w:type="spellStart"/>
-      <w:r>
-        <w:rPr>
-          <w:rStyle w:val="normaltextrun"/>
-        </w:rPr>
-        <w:t>stabilise</w:t>
-      </w:r>
-      <w:proofErr w:type="spellEnd"/>
-      <w:r>
-        <w:rPr>
-          <w:rStyle w:val="normaltextrun"/>
-        </w:rPr>
-        <w:t> the distribution, making it symmetrical which is essential for good performance of linear regression </w:t>
-      </w:r>
-      <w:proofErr w:type="gramStart"/>
-      <w:r>
-        <w:rPr>
-          <w:rStyle w:val="normaltextrun"/>
-        </w:rPr>
-        <w:t>models(</w:t>
-      </w:r>
-      <w:proofErr w:type="gramEnd"/>
-      <w:r>
-        <w:rPr>
-          <w:rStyle w:val="normaltextrun"/>
-        </w:rPr>
-        <w:t>Limpert et al., 2001)</w:t>
+        <w:t>Since the crime rate is not normally distributed but rather follows a log-normal distribution (heavily right-skewed) due to seasonality characteristics. By transforming the assault rate logarithmically, we aim to stabilise the distribution, making it symmetrical which is essential for good performance of linear regression models(Limpert et al., 2001)</w:t>
       </w:r>
     </w:p>
     <w:p>
@@ -20210,7 +19547,6 @@
           <w:szCs w:val="18"/>
         </w:rPr>
       </w:pPr>
-      <w:proofErr w:type="spellStart"/>
       <w:r>
         <w:rPr>
           <w:rStyle w:val="normaltextrun"/>
@@ -20223,34 +19559,7 @@
           <w:i/>
           <w:iCs/>
         </w:rPr>
-        <w:t>month</w:t>
-      </w:r>
-      <w:proofErr w:type="spellEnd"/>
-      <w:r>
-        <w:rPr>
-          <w:rStyle w:val="normaltextrun"/>
-          <w:i/>
-          <w:iCs/>
-        </w:rPr>
-        <w:t> and </w:t>
-      </w:r>
-      <w:proofErr w:type="spellStart"/>
-      <w:r>
-        <w:rPr>
-          <w:rStyle w:val="normaltextrun"/>
-          <w:i/>
-          <w:iCs/>
-        </w:rPr>
-        <w:t>cos_month</w:t>
-      </w:r>
-      <w:proofErr w:type="spellEnd"/>
-      <w:r>
-        <w:rPr>
-          <w:rStyle w:val="normaltextrun"/>
-          <w:i/>
-          <w:iCs/>
-        </w:rPr>
-        <w:t>:</w:t>
+        <w:t>month and cos_month:</w:t>
       </w:r>
     </w:p>
     <w:p>
@@ -20269,21 +19578,7 @@
         <w:rPr>
           <w:rStyle w:val="normaltextrun"/>
         </w:rPr>
-        <w:t>To preserve the cyclic </w:t>
-      </w:r>
-      <w:proofErr w:type="spellStart"/>
-      <w:r>
-        <w:rPr>
-          <w:rStyle w:val="normaltextrun"/>
-        </w:rPr>
-        <w:t>behaviours</w:t>
-      </w:r>
-      <w:proofErr w:type="spellEnd"/>
-      <w:r>
-        <w:rPr>
-          <w:rStyle w:val="normaltextrun"/>
-        </w:rPr>
-        <w:t> of months, sine and cosine functions are applied to represent time since these trigonometric functions pursue cycles between “top” and “bottom” and have a settled cycle length which is perfect for modelling regular cycles such as months (Lindsey and Pavur, 2005)</w:t>
+        <w:t>To preserve the cyclic behaviours of months, sine and cosine functions are applied to represent time since these trigonometric functions pursue cycles between “top” and “bottom” and have a settled cycle length which is perfect for modelling regular cycles such as months (Lindsey and Pavur, 2005)</w:t>
       </w:r>
     </w:p>
     <w:p>
@@ -20337,19 +19632,11 @@
           <w:szCs w:val="18"/>
         </w:rPr>
       </w:pPr>
-      <w:proofErr w:type="spellStart"/>
       <w:r>
         <w:rPr>
           <w:rStyle w:val="normaltextrun"/>
         </w:rPr>
-        <w:t>is_new_year</w:t>
-      </w:r>
-      <w:proofErr w:type="spellEnd"/>
-      <w:r>
-        <w:rPr>
-          <w:rStyle w:val="normaltextrun"/>
-        </w:rPr>
-        <w:t>:</w:t>
+        <w:t>is_new_year:</w:t>
       </w:r>
     </w:p>
     <w:p>
@@ -20368,21 +19655,7 @@
         <w:rPr>
           <w:rStyle w:val="normaltextrun"/>
         </w:rPr>
-        <w:t>According to research by Baird </w:t>
-      </w:r>
-      <w:proofErr w:type="gramStart"/>
-      <w:r>
-        <w:rPr>
-          <w:rStyle w:val="normaltextrun"/>
-        </w:rPr>
-        <w:t>et al. ,</w:t>
-      </w:r>
-      <w:proofErr w:type="gramEnd"/>
-      <w:r>
-        <w:rPr>
-          <w:rStyle w:val="normaltextrun"/>
-        </w:rPr>
-        <w:t> (2019), the homicide rate experiences a significant spike on New Year’s Day. Therefore, this feature is added to capture this valuable information.</w:t>
+        <w:t>According to research by Baird et al. , (2019), the homicide rate experiences a significant spike on New Year’s Day. Therefore, this feature is added to capture this valuable information.</w:t>
       </w:r>
     </w:p>
     <w:p>
@@ -20910,27 +20183,7 @@
           <w:szCs w:val="24"/>
           <w:lang w:val="en-AU" w:eastAsia="ja-JP"/>
         </w:rPr>
-        <w:t xml:space="preserve">Applying PCA to the regional age structure allows the model to condense </w:t>
-      </w:r>
-      <w:proofErr w:type="gramStart"/>
-      <w:r>
-        <w:rPr>
-          <w:rFonts w:ascii="Times New Roman" w:eastAsia="Times New Roman" w:hAnsi="Times New Roman" w:cs="Times New Roman"/>
-          <w:sz w:val="24"/>
-          <w:szCs w:val="24"/>
-          <w:lang w:val="en-AU" w:eastAsia="ja-JP"/>
-        </w:rPr>
-        <w:t>a large number of</w:t>
-      </w:r>
-      <w:proofErr w:type="gramEnd"/>
-      <w:r>
-        <w:rPr>
-          <w:rFonts w:ascii="Times New Roman" w:eastAsia="Times New Roman" w:hAnsi="Times New Roman" w:cs="Times New Roman"/>
-          <w:sz w:val="24"/>
-          <w:szCs w:val="24"/>
-          <w:lang w:val="en-AU" w:eastAsia="ja-JP"/>
-        </w:rPr>
-        <w:t xml:space="preserve"> correlated demographic variables into a small set of orthogonal components that capture the dominant patterns in the data. This compression substantially reduces the dimensionality of the feature space, which in turn lowers computational cost, speeds up model training, and minimises the risk of overfitting. Importantly, PCA preserves most of the original variance, meaning that the transformed components retain the essential information needed for prediction while discarding noise and redundancy. As Mishra et al. (2017) highlight, PCA is particularly effective when dealing with demographic or socioeconomic variables that tend to move together, making it a suitable technique for simplifying age</w:t>
+        <w:t>Applying PCA to the regional age structure allows the model to condense a large number of correlated demographic variables into a small set of orthogonal components that capture the dominant patterns in the data. This compression substantially reduces the dimensionality of the feature space, which in turn lowers computational cost, speeds up model training, and minimises the risk of overfitting. Importantly, PCA preserves most of the original variance, meaning that the transformed components retain the essential information needed for prediction while discarding noise and redundancy. As Mishra et al. (2017) highlight, PCA is particularly effective when dealing with demographic or socioeconomic variables that tend to move together, making it a suitable technique for simplifying age</w:t>
       </w:r>
       <w:r>
         <w:rPr>
@@ -21158,23 +20411,7 @@
           <w:rStyle w:val="normaltextrun"/>
           <w:lang w:val="en-AU"/>
         </w:rPr>
-        <w:t>With an aim to maximise the model performance, a multicollinearity check was carried out by calculating the Variance Inflation Factor (VIF) of each feature and removing the ones with VIF &gt; 30. High multicollinear features are known to have a negative effect on the regression model by hampering the interpretability of model predictors and resulting in highly volatile coefficient estimates (</w:t>
-      </w:r>
-      <w:proofErr w:type="spellStart"/>
-      <w:r>
-        <w:rPr>
-          <w:rStyle w:val="normaltextrun"/>
-          <w:lang w:val="en-AU"/>
-        </w:rPr>
-        <w:t>Dertli</w:t>
-      </w:r>
-      <w:proofErr w:type="spellEnd"/>
-      <w:r>
-        <w:rPr>
-          <w:rStyle w:val="normaltextrun"/>
-          <w:lang w:val="en-AU"/>
-        </w:rPr>
-        <w:t> et al., 2024).</w:t>
+        <w:t>With an aim to maximise the model performance, a multicollinearity check was carried out by calculating the Variance Inflation Factor (VIF) of each feature and removing the ones with VIF &gt; 30. High multicollinear features are known to have a negative effect on the regression model by hampering the interpretability of model predictors and resulting in highly volatile coefficient estimates (Dertli et al., 2024).</w:t>
       </w:r>
       <w:r>
         <w:rPr>
@@ -21273,43 +20510,7 @@
           <w:sz w:val="24"/>
           <w:szCs w:val="24"/>
         </w:rPr>
-        <w:t xml:space="preserve">Across all models tested, Linear Regression delivered the strongest performance, achieving the lowest </w:t>
-      </w:r>
-      <w:proofErr w:type="gramStart"/>
-      <w:r>
-        <w:rPr>
-          <w:rFonts w:ascii="Times New Roman" w:eastAsia="Times New Roman" w:hAnsi="Times New Roman"/>
-          <w:sz w:val="24"/>
-          <w:szCs w:val="24"/>
-        </w:rPr>
-        <w:t>RMSE(</w:t>
-      </w:r>
-      <w:proofErr w:type="gramEnd"/>
-      <w:r>
-        <w:rPr>
-          <w:rFonts w:ascii="Times New Roman" w:eastAsia="Times New Roman" w:hAnsi="Times New Roman"/>
-          <w:sz w:val="24"/>
-          <w:szCs w:val="24"/>
-        </w:rPr>
-        <w:t xml:space="preserve">log) and RMSE on the original scale, indicating that the relationship between predictors and assault rates is predominantly linear and stable. Regularised models (Ridge and Lasso) showed slightly higher error and progressively smaller </w:t>
-      </w:r>
-      <w:proofErr w:type="spellStart"/>
-      <w:r>
-        <w:rPr>
-          <w:rFonts w:ascii="Times New Roman" w:eastAsia="Times New Roman" w:hAnsi="Times New Roman"/>
-          <w:sz w:val="24"/>
-          <w:szCs w:val="24"/>
-        </w:rPr>
-        <w:t>alcohol_per_capita</w:t>
-      </w:r>
-      <w:proofErr w:type="spellEnd"/>
-      <w:r>
-        <w:rPr>
-          <w:rFonts w:ascii="Times New Roman" w:eastAsia="Times New Roman" w:hAnsi="Times New Roman"/>
-          <w:sz w:val="24"/>
-          <w:szCs w:val="24"/>
-        </w:rPr>
-        <w:t xml:space="preserve"> coefficients, suggesting that this variable contributes only modestly once collinearity is controlled. Lasso’s near</w:t>
+        <w:t>Across all models tested, Linear Regression delivered the strongest performance, achieving the lowest RMSE(log) and RMSE on the original scale, indicating that the relationship between predictors and assault rates is predominantly linear and stable. Regularised models (Ridge and Lasso) showed slightly higher error and progressively smaller alcohol_per_capita coefficients, suggesting that this variable contributes only modestly once collinearity is controlled. Lasso’s near</w:t>
       </w:r>
       <w:r>
         <w:rPr>
@@ -21318,25 +20519,7 @@
           <w:szCs w:val="24"/>
         </w:rPr>
         <w:noBreakHyphen/>
-        <w:t xml:space="preserve">zero coefficient further implies that alcohol supply is a weak predictor relative to other socioeconomic factors. </w:t>
-      </w:r>
-      <w:proofErr w:type="spellStart"/>
-      <w:r>
-        <w:rPr>
-          <w:rFonts w:ascii="Times New Roman" w:eastAsia="Times New Roman" w:hAnsi="Times New Roman"/>
-          <w:sz w:val="24"/>
-          <w:szCs w:val="24"/>
-        </w:rPr>
-        <w:t>XGBoost</w:t>
-      </w:r>
-      <w:proofErr w:type="spellEnd"/>
-      <w:r>
-        <w:rPr>
-          <w:rFonts w:ascii="Times New Roman" w:eastAsia="Times New Roman" w:hAnsi="Times New Roman"/>
-          <w:sz w:val="24"/>
-          <w:szCs w:val="24"/>
-        </w:rPr>
-        <w:t xml:space="preserve"> performed worse than the linear models, reinforcing that the dataset does not contain strong nonlinear interactions for tree</w:t>
+        <w:t>zero coefficient further implies that alcohol supply is a weak predictor relative to other socioeconomic factors. XGBoost performed worse than the linear models, reinforcing that the dataset does not contain strong nonlinear interactions for tree</w:t>
       </w:r>
       <w:r>
         <w:rPr>
@@ -21345,25 +20528,7 @@
           <w:szCs w:val="24"/>
         </w:rPr>
         <w:noBreakHyphen/>
-        <w:t xml:space="preserve">based methods to exploit. Overall, </w:t>
-      </w:r>
-      <w:proofErr w:type="spellStart"/>
-      <w:r>
-        <w:rPr>
-          <w:rFonts w:ascii="Times New Roman" w:eastAsia="Times New Roman" w:hAnsi="Times New Roman"/>
-          <w:sz w:val="24"/>
-          <w:szCs w:val="24"/>
-        </w:rPr>
-        <w:t>alcohol_per_capita</w:t>
-      </w:r>
-      <w:proofErr w:type="spellEnd"/>
-      <w:r>
-        <w:rPr>
-          <w:rFonts w:ascii="Times New Roman" w:eastAsia="Times New Roman" w:hAnsi="Times New Roman"/>
-          <w:sz w:val="24"/>
-          <w:szCs w:val="24"/>
-        </w:rPr>
-        <w:t xml:space="preserve"> exhibits a consistent but small positive association with assault rates, and simpler linear models remain the most appropriate for this modelling context</w:t>
+        <w:t>based methods to exploit. Overall, alcohol_per_capita exhibits a consistent but small positive association with assault rates, and simpler linear models remain the most appropriate for this modelling context</w:t>
       </w:r>
     </w:p>
     <w:p>
@@ -21381,6 +20546,7 @@
       <w:r>
         <w:rPr>
           <w:rFonts w:ascii="Times New Roman" w:eastAsia="Times New Roman" w:hAnsi="Times New Roman"/>
+          <w:noProof/>
           <w:sz w:val="24"/>
           <w:szCs w:val="24"/>
         </w:rPr>
@@ -21892,27 +21058,7 @@
                 <w:szCs w:val="24"/>
                 <w:lang w:val="en-AU"/>
               </w:rPr>
-              <w:t xml:space="preserve">GitHub repository with README; </w:t>
-            </w:r>
-            <w:proofErr w:type="spellStart"/>
-            <w:r>
-              <w:rPr>
-                <w:rFonts w:ascii="Times New Roman" w:eastAsia="Times New Roman" w:hAnsi="Times New Roman" w:cs="Times New Roman"/>
-                <w:sz w:val="24"/>
-                <w:szCs w:val="24"/>
-                <w:lang w:val="en-AU"/>
-              </w:rPr>
-              <w:t>Streamlit</w:t>
-            </w:r>
-            <w:proofErr w:type="spellEnd"/>
-            <w:r>
-              <w:rPr>
-                <w:rFonts w:ascii="Times New Roman" w:eastAsia="Times New Roman" w:hAnsi="Times New Roman" w:cs="Times New Roman"/>
-                <w:sz w:val="24"/>
-                <w:szCs w:val="24"/>
-                <w:lang w:val="en-AU"/>
-              </w:rPr>
-              <w:t xml:space="preserve"> account set up; draft problem statement</w:t>
+              <w:t>GitHub repository with README; Streamlit account set up; draft problem statement</w:t>
             </w:r>
           </w:p>
         </w:tc>
@@ -23332,47 +22478,7 @@
                 <w:szCs w:val="24"/>
                 <w:lang w:val="en-AU"/>
               </w:rPr>
-              <w:t xml:space="preserve">Incorporate feedback; finalise </w:t>
-            </w:r>
-            <w:proofErr w:type="gramStart"/>
-            <w:r>
-              <w:rPr>
-                <w:rFonts w:ascii="Times New Roman" w:eastAsia="Times New Roman" w:hAnsi="Times New Roman" w:cs="Times New Roman"/>
-                <w:sz w:val="24"/>
-                <w:szCs w:val="24"/>
-                <w:lang w:val="en-AU"/>
-              </w:rPr>
-              <w:t>dashboard;  deploy</w:t>
-            </w:r>
-            <w:proofErr w:type="gramEnd"/>
-            <w:r>
-              <w:rPr>
-                <w:rFonts w:ascii="Times New Roman" w:eastAsia="Times New Roman" w:hAnsi="Times New Roman" w:cs="Times New Roman"/>
-                <w:sz w:val="24"/>
-                <w:szCs w:val="24"/>
-                <w:lang w:val="en-AU"/>
-              </w:rPr>
-              <w:t xml:space="preserve"> to </w:t>
-            </w:r>
-            <w:proofErr w:type="spellStart"/>
-            <w:r>
-              <w:rPr>
-                <w:rFonts w:ascii="Times New Roman" w:eastAsia="Times New Roman" w:hAnsi="Times New Roman" w:cs="Times New Roman"/>
-                <w:sz w:val="24"/>
-                <w:szCs w:val="24"/>
-                <w:lang w:val="en-AU"/>
-              </w:rPr>
-              <w:t>Streamlit</w:t>
-            </w:r>
-            <w:proofErr w:type="spellEnd"/>
-            <w:r>
-              <w:rPr>
-                <w:rFonts w:ascii="Times New Roman" w:eastAsia="Times New Roman" w:hAnsi="Times New Roman" w:cs="Times New Roman"/>
-                <w:sz w:val="24"/>
-                <w:szCs w:val="24"/>
-                <w:lang w:val="en-AU"/>
-              </w:rPr>
-              <w:t xml:space="preserve"> Community Cloud; implement monitoring and retraining logic</w:t>
+              <w:t>Incorporate feedback; finalise dashboard;  deploy to Streamlit Community Cloud; implement monitoring and retraining logic</w:t>
             </w:r>
           </w:p>
         </w:tc>
@@ -24215,27 +23321,7 @@
                 <w:szCs w:val="24"/>
                 <w:lang w:val="en-AU"/>
               </w:rPr>
-              <w:t xml:space="preserve">Cleans, merges and </w:t>
-            </w:r>
-            <w:proofErr w:type="gramStart"/>
-            <w:r>
-              <w:rPr>
-                <w:rFonts w:ascii="Times New Roman" w:eastAsia="Times New Roman" w:hAnsi="Times New Roman" w:cs="Times New Roman"/>
-                <w:sz w:val="24"/>
-                <w:szCs w:val="24"/>
-                <w:lang w:val="en-AU"/>
-              </w:rPr>
-              <w:t>engineers</w:t>
-            </w:r>
-            <w:proofErr w:type="gramEnd"/>
-            <w:r>
-              <w:rPr>
-                <w:rFonts w:ascii="Times New Roman" w:eastAsia="Times New Roman" w:hAnsi="Times New Roman" w:cs="Times New Roman"/>
-                <w:sz w:val="24"/>
-                <w:szCs w:val="24"/>
-                <w:lang w:val="en-AU"/>
-              </w:rPr>
-              <w:t xml:space="preserve"> features across the three data sources; implements post-deployment drift-checking scripts</w:t>
+              <w:t>Cleans, merges and engineers features across the three data sources; implements post-deployment drift-checking scripts</w:t>
             </w:r>
           </w:p>
         </w:tc>
@@ -24387,19 +23473,8 @@
                 <w:szCs w:val="24"/>
                 <w:lang w:val="en-AU"/>
               </w:rPr>
-              <w:t xml:space="preserve">Dashboard &amp; </w:t>
-            </w:r>
-            <w:proofErr w:type="gramStart"/>
-            <w:r>
-              <w:rPr>
-                <w:rFonts w:ascii="Times New Roman" w:eastAsia="Times New Roman" w:hAnsi="Times New Roman" w:cs="Times New Roman"/>
-                <w:sz w:val="24"/>
-                <w:szCs w:val="24"/>
-                <w:lang w:val="en-AU"/>
-              </w:rPr>
-              <w:t>Deploy</w:t>
-            </w:r>
-            <w:proofErr w:type="gramEnd"/>
+              <w:t>Dashboard &amp; Deploy</w:t>
+            </w:r>
           </w:p>
         </w:tc>
         <w:tc>
@@ -24427,47 +23502,7 @@
                 <w:szCs w:val="24"/>
                 <w:lang w:val="en-AU"/>
               </w:rPr>
-              <w:t xml:space="preserve">Builds the </w:t>
-            </w:r>
-            <w:proofErr w:type="spellStart"/>
-            <w:r>
-              <w:rPr>
-                <w:rFonts w:ascii="Times New Roman" w:eastAsia="Times New Roman" w:hAnsi="Times New Roman" w:cs="Times New Roman"/>
-                <w:sz w:val="24"/>
-                <w:szCs w:val="24"/>
-                <w:lang w:val="en-AU"/>
-              </w:rPr>
-              <w:t>Streamlit</w:t>
-            </w:r>
-            <w:proofErr w:type="spellEnd"/>
-            <w:r>
-              <w:rPr>
-                <w:rFonts w:ascii="Times New Roman" w:eastAsia="Times New Roman" w:hAnsi="Times New Roman" w:cs="Times New Roman"/>
-                <w:sz w:val="24"/>
-                <w:szCs w:val="24"/>
-                <w:lang w:val="en-AU"/>
-              </w:rPr>
-              <w:t xml:space="preserve"> dashboard and manages its deployment and redeployment via </w:t>
-            </w:r>
-            <w:proofErr w:type="spellStart"/>
-            <w:r>
-              <w:rPr>
-                <w:rFonts w:ascii="Times New Roman" w:eastAsia="Times New Roman" w:hAnsi="Times New Roman" w:cs="Times New Roman"/>
-                <w:sz w:val="24"/>
-                <w:szCs w:val="24"/>
-                <w:lang w:val="en-AU"/>
-              </w:rPr>
-              <w:t>Streamlit</w:t>
-            </w:r>
-            <w:proofErr w:type="spellEnd"/>
-            <w:r>
-              <w:rPr>
-                <w:rFonts w:ascii="Times New Roman" w:eastAsia="Times New Roman" w:hAnsi="Times New Roman" w:cs="Times New Roman"/>
-                <w:sz w:val="24"/>
-                <w:szCs w:val="24"/>
-                <w:lang w:val="en-AU"/>
-              </w:rPr>
-              <w:t xml:space="preserve"> Community Cloud.</w:t>
+              <w:t>Builds the Streamlit dashboard and manages its deployment and redeployment via Streamlit Community Cloud.</w:t>
             </w:r>
           </w:p>
         </w:tc>
@@ -24586,21 +23621,7 @@
         <w:rPr>
           <w:rStyle w:val="normaltextrun"/>
         </w:rPr>
-        <w:t>Potential risks, including data quality issues, ethical concerns, and technical challenges, will be continuously monitored throughout the project. Mitigation strategies such as data validation procedures, adherence to ethical guidelines, and regular system testing will be implemented to </w:t>
-      </w:r>
-      <w:proofErr w:type="spellStart"/>
-      <w:r>
-        <w:rPr>
-          <w:rStyle w:val="normaltextrun"/>
-        </w:rPr>
-        <w:t>minimise</w:t>
-      </w:r>
-      <w:proofErr w:type="spellEnd"/>
-      <w:r>
-        <w:rPr>
-          <w:rStyle w:val="normaltextrun"/>
-        </w:rPr>
-        <w:t> their impact. Risks will be reviewed periodically, and corrective actions will be taken promptly to ensure project objectives are achieved successfully.</w:t>
+        <w:t>Potential risks, including data quality issues, ethical concerns, and technical challenges, will be continuously monitored throughout the project. Mitigation strategies such as data validation procedures, adherence to ethical guidelines, and regular system testing will be implemented to minimise their impact. Risks will be reviewed periodically, and corrective actions will be taken promptly to ensure project objectives are achieved successfully.</w:t>
       </w:r>
     </w:p>
     <w:p>
@@ -24673,21 +23694,7 @@
         <w:rPr>
           <w:rStyle w:val="normaltextrun"/>
         </w:rPr>
-        <w:t>The project continues to respect Indigenous Data Sovereignty principles by </w:t>
-      </w:r>
-      <w:proofErr w:type="spellStart"/>
-      <w:r>
-        <w:rPr>
-          <w:rStyle w:val="normaltextrun"/>
-        </w:rPr>
-        <w:t>recognising</w:t>
-      </w:r>
-      <w:proofErr w:type="spellEnd"/>
-      <w:r>
-        <w:rPr>
-          <w:rStyle w:val="normaltextrun"/>
-        </w:rPr>
-        <w:t> the rights of Indigenous communities to govern the collection, ownership, and use of data relating to their people and communities.</w:t>
+        <w:t>The project continues to respect Indigenous Data Sovereignty principles by recognising the rights of Indigenous communities to govern the collection, ownership, and use of data relating to their people and communities.</w:t>
       </w:r>
     </w:p>
     <w:p>
@@ -24704,21 +23711,7 @@
         <w:rPr>
           <w:rStyle w:val="normaltextrun"/>
         </w:rPr>
-        <w:t>In addition, all predictive analytics activities seek to comply with ethical standards to </w:t>
-      </w:r>
-      <w:proofErr w:type="spellStart"/>
-      <w:r>
-        <w:rPr>
-          <w:rStyle w:val="normaltextrun"/>
-        </w:rPr>
-        <w:t>minimise</w:t>
-      </w:r>
-      <w:proofErr w:type="spellEnd"/>
-      <w:r>
-        <w:rPr>
-          <w:rStyle w:val="normaltextrun"/>
-        </w:rPr>
-        <w:t> bias, promote transparency, and support fair decision-making. Forecasting</w:t>
+        <w:t>In addition, all predictive analytics activities seek to comply with ethical standards to minimise bias, promote transparency, and support fair decision-making. Forecasting</w:t>
       </w:r>
       <w:r>
         <w:rPr>
@@ -24939,25 +23932,7 @@
           <w:sz w:val="24"/>
           <w:szCs w:val="24"/>
         </w:rPr>
-        <w:t xml:space="preserve">he transition from PROMIS to </w:t>
-      </w:r>
-      <w:proofErr w:type="spellStart"/>
-      <w:r>
-        <w:rPr>
-          <w:rFonts w:ascii="Times New Roman" w:eastAsia="Times New Roman" w:hAnsi="Times New Roman"/>
-          <w:sz w:val="24"/>
-          <w:szCs w:val="24"/>
-        </w:rPr>
-        <w:t>SerPro</w:t>
-      </w:r>
-      <w:proofErr w:type="spellEnd"/>
-      <w:r>
-        <w:rPr>
-          <w:rFonts w:ascii="Times New Roman" w:eastAsia="Times New Roman" w:hAnsi="Times New Roman"/>
-          <w:sz w:val="24"/>
-          <w:szCs w:val="24"/>
-        </w:rPr>
-        <w:t xml:space="preserve"> in November 2023 and </w:t>
+        <w:t xml:space="preserve">he transition from PROMIS to SerPro in November 2023 and </w:t>
       </w:r>
       <w:r>
         <w:rPr>
@@ -25250,25 +24225,7 @@
           <w:sz w:val="24"/>
           <w:szCs w:val="24"/>
         </w:rPr>
-        <w:t xml:space="preserve">And the final risk is misuse or misinterpretation of the forecasts. If predictions are read as statements about </w:t>
-      </w:r>
-      <w:proofErr w:type="gramStart"/>
-      <w:r>
-        <w:rPr>
-          <w:rFonts w:ascii="Times New Roman" w:eastAsia="Times New Roman" w:hAnsi="Times New Roman"/>
-          <w:sz w:val="24"/>
-          <w:szCs w:val="24"/>
-        </w:rPr>
-        <w:t>particular communities</w:t>
-      </w:r>
-      <w:proofErr w:type="gramEnd"/>
-      <w:r>
-        <w:rPr>
-          <w:rFonts w:ascii="Times New Roman" w:eastAsia="Times New Roman" w:hAnsi="Times New Roman"/>
-          <w:sz w:val="24"/>
-          <w:szCs w:val="24"/>
-        </w:rPr>
-        <w:t>, the system could cause harm rather than support safety. Small counts in low-population regions could also make incidents identifiable. Forecasts will therefore be shown only at region and month level, with uncertainty ranges, and small values will be suppressed.</w:t>
+        <w:t>And the final risk is misuse or misinterpretation of the forecasts. If predictions are read as statements about particular communities, the system could cause harm rather than support safety. Small counts in low-population regions could also make incidents identifiable. Forecasts will therefore be shown only at region and month level, with uncertainty ranges, and small values will be suppressed.</w:t>
       </w:r>
     </w:p>
     <w:p>
@@ -25840,43 +24797,7 @@
           <w:sz w:val="24"/>
           <w:szCs w:val="24"/>
         </w:rPr>
-        <w:t xml:space="preserve">Carroll, S. R., Garba, I., Figueroa-Rodríguez, O. L., Holbrook, J., Lovett, R., </w:t>
-      </w:r>
-      <w:proofErr w:type="spellStart"/>
-      <w:r>
-        <w:rPr>
-          <w:rFonts w:ascii="Times New Roman" w:eastAsia="Times New Roman" w:hAnsi="Times New Roman"/>
-          <w:sz w:val="24"/>
-          <w:szCs w:val="24"/>
-        </w:rPr>
-        <w:t>Materechera</w:t>
-      </w:r>
-      <w:proofErr w:type="spellEnd"/>
-      <w:r>
-        <w:rPr>
-          <w:rFonts w:ascii="Times New Roman" w:eastAsia="Times New Roman" w:hAnsi="Times New Roman"/>
-          <w:sz w:val="24"/>
-          <w:szCs w:val="24"/>
-        </w:rPr>
-        <w:t xml:space="preserve">, S., Parsons, M., </w:t>
-      </w:r>
-      <w:proofErr w:type="spellStart"/>
-      <w:r>
-        <w:rPr>
-          <w:rFonts w:ascii="Times New Roman" w:eastAsia="Times New Roman" w:hAnsi="Times New Roman"/>
-          <w:sz w:val="24"/>
-          <w:szCs w:val="24"/>
-        </w:rPr>
-        <w:t>Raseroka</w:t>
-      </w:r>
-      <w:proofErr w:type="spellEnd"/>
-      <w:r>
-        <w:rPr>
-          <w:rFonts w:ascii="Times New Roman" w:eastAsia="Times New Roman" w:hAnsi="Times New Roman"/>
-          <w:sz w:val="24"/>
-          <w:szCs w:val="24"/>
-        </w:rPr>
-        <w:t xml:space="preserve">, K., Rodriguez-Lonebear, D., Rowe, R., Sara, R., Walker, J. D., Anderson, J., &amp; Hudson, M. (2020). The CARE Principles for Indigenous Data Governance. Data Science Journal, 19(1), 1–12. </w:t>
+        <w:t xml:space="preserve">Carroll, S. R., Garba, I., Figueroa-Rodríguez, O. L., Holbrook, J., Lovett, R., Materechera, S., Parsons, M., Raseroka, K., Rodriguez-Lonebear, D., Rowe, R., Sara, R., Walker, J. D., Anderson, J., &amp; Hudson, M. (2020). The CARE Principles for Indigenous Data Governance. Data Science Journal, 19(1), 1–12. </w:t>
       </w:r>
       <w:hyperlink r:id="rId46">
         <w:r>
@@ -25959,25 +24880,7 @@
           <w:sz w:val="24"/>
           <w:szCs w:val="24"/>
         </w:rPr>
-        <w:t xml:space="preserve">NT crime </w:t>
-      </w:r>
-      <w:proofErr w:type="gramStart"/>
-      <w:r>
-        <w:rPr>
-          <w:rFonts w:ascii="Times New Roman" w:eastAsia="Times New Roman" w:hAnsi="Times New Roman"/>
-          <w:sz w:val="24"/>
-          <w:szCs w:val="24"/>
-        </w:rPr>
-        <w:t>statistics march</w:t>
-      </w:r>
-      <w:proofErr w:type="gramEnd"/>
-      <w:r>
-        <w:rPr>
-          <w:rFonts w:ascii="Times New Roman" w:eastAsia="Times New Roman" w:hAnsi="Times New Roman"/>
-          <w:sz w:val="24"/>
-          <w:szCs w:val="24"/>
-        </w:rPr>
-        <w:t xml:space="preserve"> 2026 - NTG open data portal</w:t>
+        <w:t>NT crime statistics march 2026 - NTG open data portal</w:t>
       </w:r>
       <w:r>
         <w:rPr>
@@ -26073,29 +24976,7 @@
           <w:sz w:val="24"/>
           <w:szCs w:val="24"/>
         </w:rPr>
-        <w:t xml:space="preserve">Operation </w:t>
-      </w:r>
-      <w:proofErr w:type="spellStart"/>
-      <w:r>
-        <w:rPr>
-          <w:rFonts w:ascii="Times New Roman" w:eastAsia="Times New Roman" w:hAnsi="Times New Roman"/>
-          <w:i/>
-          <w:iCs/>
-          <w:sz w:val="24"/>
-          <w:szCs w:val="24"/>
-        </w:rPr>
-        <w:t>ventura</w:t>
-      </w:r>
-      <w:proofErr w:type="spellEnd"/>
-      <w:r>
-        <w:rPr>
-          <w:rFonts w:ascii="Times New Roman" w:eastAsia="Times New Roman" w:hAnsi="Times New Roman"/>
-          <w:i/>
-          <w:iCs/>
-          <w:sz w:val="24"/>
-          <w:szCs w:val="24"/>
-        </w:rPr>
-        <w:t xml:space="preserve"> | NT police, fire &amp; emergency services</w:t>
+        <w:t>Operation ventura | NT police, fire &amp; emergency services</w:t>
       </w:r>
       <w:r>
         <w:rPr>
@@ -26553,78 +25434,18 @@
         </w:rPr>
         <w:t>Visualisation:</w:t>
       </w:r>
-      <w:r>
-        <w:rPr>
-          <w:rFonts w:ascii="Times New Roman" w:eastAsia="Times New Roman" w:hAnsi="Times New Roman"/>
-          <w:sz w:val="24"/>
-          <w:szCs w:val="24"/>
-          <w:lang w:val="vi-VN"/>
-        </w:rPr>
-        <w:fldChar w:fldCharType="begin"/>
-      </w:r>
-      <w:r>
-        <w:rPr>
-          <w:rFonts w:ascii="Times New Roman" w:eastAsia="Times New Roman" w:hAnsi="Times New Roman"/>
-          <w:sz w:val="24"/>
-          <w:szCs w:val="24"/>
-          <w:lang w:val="vi-VN"/>
-        </w:rPr>
-        <w:instrText>HYPERLINK "</w:instrText>
-      </w:r>
-      <w:r>
-        <w:rPr>
-          <w:rFonts w:ascii="Times New Roman" w:eastAsia="Times New Roman" w:hAnsi="Times New Roman"/>
-          <w:sz w:val="24"/>
-          <w:szCs w:val="24"/>
-          <w:lang w:val="vi-VN"/>
-        </w:rPr>
-        <w:instrText>https://github.com/HendrickDang/PRT661-DATA-SCIENCE-PRACTICE/commits/main/eda_plots</w:instrText>
-      </w:r>
-      <w:r>
-        <w:rPr>
-          <w:rFonts w:ascii="Times New Roman" w:eastAsia="Times New Roman" w:hAnsi="Times New Roman"/>
-          <w:sz w:val="24"/>
-          <w:szCs w:val="24"/>
-          <w:lang w:val="vi-VN"/>
-        </w:rPr>
-        <w:instrText>"</w:instrText>
-      </w:r>
-      <w:r>
-        <w:rPr>
-          <w:rFonts w:ascii="Times New Roman" w:eastAsia="Times New Roman" w:hAnsi="Times New Roman"/>
-          <w:sz w:val="24"/>
-          <w:szCs w:val="24"/>
-          <w:lang w:val="vi-VN"/>
-        </w:rPr>
-      </w:r>
-      <w:r>
-        <w:rPr>
-          <w:rFonts w:ascii="Times New Roman" w:eastAsia="Times New Roman" w:hAnsi="Times New Roman"/>
-          <w:sz w:val="24"/>
-          <w:szCs w:val="24"/>
-          <w:lang w:val="vi-VN"/>
-        </w:rPr>
-        <w:fldChar w:fldCharType="separate"/>
-      </w:r>
-      <w:r>
-        <w:rPr>
-          <w:rStyle w:val="Hyperlink"/>
-          <w:rFonts w:ascii="Times New Roman" w:eastAsia="Times New Roman" w:hAnsi="Times New Roman"/>
-          <w:sz w:val="24"/>
-          <w:szCs w:val="24"/>
-          <w:lang w:val="vi-VN"/>
-        </w:rPr>
-        <w:t>https://github.com/HendrickDang/PRT661-DATA-SCIENCE-PRACTICE/commits/main/eda_plots</w:t>
-      </w:r>
-      <w:r>
-        <w:rPr>
-          <w:rFonts w:ascii="Times New Roman" w:eastAsia="Times New Roman" w:hAnsi="Times New Roman"/>
-          <w:sz w:val="24"/>
-          <w:szCs w:val="24"/>
-          <w:lang w:val="vi-VN"/>
-        </w:rPr>
-        <w:fldChar w:fldCharType="end"/>
-      </w:r>
+      <w:hyperlink r:id="rId54" w:history="1">
+        <w:r>
+          <w:rPr>
+            <w:rStyle w:val="Hyperlink"/>
+            <w:rFonts w:ascii="Times New Roman" w:eastAsia="Times New Roman" w:hAnsi="Times New Roman"/>
+            <w:sz w:val="24"/>
+            <w:szCs w:val="24"/>
+            <w:lang w:val="vi-VN"/>
+          </w:rPr>
+          <w:t>https://github.com/HendrickDang/PRT661-DATA-SCIENCE-PRACTICE/commits/main/eda_plots</w:t>
+        </w:r>
+      </w:hyperlink>
     </w:p>
     <w:p>
       <w:pPr>
@@ -27106,62 +25927,7 @@
           <w:sz w:val="24"/>
           <w:szCs w:val="24"/>
         </w:rPr>
-        <w:t>Name:</w:t>
-      </w:r>
-      <w:r>
-        <w:rPr>
-          <w:rFonts w:ascii="Times New Roman" w:eastAsia="Times New Roman" w:hAnsi="Times New Roman"/>
-          <w:sz w:val="24"/>
-          <w:szCs w:val="24"/>
-        </w:rPr>
-        <w:t xml:space="preserve"> </w:t>
-      </w:r>
-      <w:r>
-        <w:rPr>
-          <w:rFonts w:ascii="Times New Roman" w:eastAsia="Times New Roman" w:hAnsi="Times New Roman"/>
-          <w:sz w:val="24"/>
-          <w:szCs w:val="24"/>
-        </w:rPr>
-        <w:t>Van Hoi Dang (Hendrick)</w:t>
-      </w:r>
-    </w:p>
-    <w:p>
-      <w:pPr>
-        <w:spacing w:after="160" w:line="276" w:lineRule="auto"/>
-        <w:ind w:left="426"/>
-        <w:jc w:val="both"/>
-      </w:pPr>
-      <w:r>
-        <w:rPr>
-          <w:rFonts w:ascii="Times New Roman" w:eastAsia="Times New Roman" w:hAnsi="Times New Roman"/>
-          <w:sz w:val="24"/>
-          <w:szCs w:val="24"/>
-        </w:rPr>
-        <w:t>Student ID:</w:t>
-      </w:r>
-      <w:r>
-        <w:rPr>
-          <w:rFonts w:ascii="Times New Roman" w:eastAsia="Times New Roman" w:hAnsi="Times New Roman"/>
-          <w:sz w:val="24"/>
-          <w:szCs w:val="24"/>
-        </w:rPr>
-        <w:t xml:space="preserve"> </w:t>
-      </w:r>
-      <w:r>
-        <w:rPr>
-          <w:rFonts w:ascii="Times New Roman" w:eastAsia="Times New Roman" w:hAnsi="Times New Roman"/>
-          <w:sz w:val="24"/>
-          <w:szCs w:val="24"/>
-        </w:rPr>
-        <w:t>S</w:t>
-      </w:r>
-      <w:r>
-        <w:rPr>
-          <w:rFonts w:ascii="Times New Roman" w:eastAsia="Times New Roman" w:hAnsi="Times New Roman"/>
-          <w:sz w:val="24"/>
-          <w:szCs w:val="24"/>
-        </w:rPr>
-        <w:t>395598</w:t>
+        <w:t xml:space="preserve">Name: Van Hoi Dang (Hendrick) - Student ID: S395598 </w:t>
       </w:r>
     </w:p>
     <w:p>
@@ -27239,6 +26005,61 @@
           <w:szCs w:val="24"/>
         </w:rPr>
       </w:pPr>
+      <w:r>
+        <w:rPr>
+          <w:rFonts w:ascii="Times New Roman" w:eastAsia="Times New Roman" w:hAnsi="Times New Roman"/>
+          <w:sz w:val="24"/>
+          <w:szCs w:val="24"/>
+        </w:rPr>
+        <w:drawing>
+          <wp:inline distT="0" distB="0" distL="0" distR="0" wp14:anchorId="3B0D6B18" wp14:editId="6ADC109A">
+            <wp:extent cx="5414010" cy="3032760"/>
+            <wp:effectExtent l="0" t="0" r="0" b="0"/>
+            <wp:docPr id="987503445" name="Picture 2"/>
+            <wp:cNvGraphicFramePr>
+              <a:graphicFrameLocks xmlns:a="http://schemas.openxmlformats.org/drawingml/2006/main" noChangeAspect="1"/>
+            </wp:cNvGraphicFramePr>
+            <a:graphic xmlns:a="http://schemas.openxmlformats.org/drawingml/2006/main">
+              <a:graphicData uri="http://schemas.openxmlformats.org/drawingml/2006/picture">
+                <pic:pic xmlns:pic="http://schemas.openxmlformats.org/drawingml/2006/picture">
+                  <pic:nvPicPr>
+                    <pic:cNvPr id="0" name="Picture 1"/>
+                    <pic:cNvPicPr>
+                      <a:picLocks noChangeAspect="1" noChangeArrowheads="1"/>
+                    </pic:cNvPicPr>
+                  </pic:nvPicPr>
+                  <pic:blipFill>
+                    <a:blip r:embed="rId55">
+                      <a:extLst>
+                        <a:ext uri="{28A0092B-C50C-407E-A947-70E740481C1C}">
+                          <a14:useLocalDpi xmlns:a14="http://schemas.microsoft.com/office/drawing/2010/main" val="0"/>
+                        </a:ext>
+                      </a:extLst>
+                    </a:blip>
+                    <a:srcRect/>
+                    <a:stretch>
+                      <a:fillRect/>
+                    </a:stretch>
+                  </pic:blipFill>
+                  <pic:spPr bwMode="auto">
+                    <a:xfrm>
+                      <a:off x="0" y="0"/>
+                      <a:ext cx="5414010" cy="3032760"/>
+                    </a:xfrm>
+                    <a:prstGeom prst="rect">
+                      <a:avLst/>
+                    </a:prstGeom>
+                    <a:noFill/>
+                    <a:ln>
+                      <a:noFill/>
+                    </a:ln>
+                  </pic:spPr>
+                </pic:pic>
+              </a:graphicData>
+            </a:graphic>
+          </wp:inline>
+        </w:drawing>
+      </w:r>
     </w:p>
     <w:p>
       <w:pPr>
@@ -27275,7 +26096,20 @@
         <w:spacing w:line="276" w:lineRule="auto"/>
         <w:ind w:left="426"/>
         <w:jc w:val="both"/>
-      </w:pPr>
+        <w:rPr>
+          <w:rFonts w:ascii="Times New Roman" w:eastAsia="Times New Roman" w:hAnsi="Times New Roman"/>
+          <w:sz w:val="24"/>
+          <w:szCs w:val="24"/>
+        </w:rPr>
+      </w:pPr>
+      <w:r>
+        <w:rPr>
+          <w:rFonts w:ascii="Times New Roman" w:eastAsia="Times New Roman" w:hAnsi="Times New Roman"/>
+          <w:sz w:val="24"/>
+          <w:szCs w:val="24"/>
+        </w:rPr>
+        <w:t xml:space="preserve">My work since Assessment 1 covered the analytics and evaluation stage, addressing the feedback on the modelling plan. </w:t>
+      </w:r>
     </w:p>
     <w:p>
       <w:pPr>
@@ -27289,6 +26123,98 @@
           <w:szCs w:val="24"/>
         </w:rPr>
       </w:pPr>
+      <w:r>
+        <w:rPr>
+          <w:rFonts w:ascii="Times New Roman" w:eastAsia="Times New Roman" w:hAnsi="Times New Roman"/>
+          <w:sz w:val="24"/>
+          <w:szCs w:val="24"/>
+        </w:rPr>
+        <w:t xml:space="preserve">Built evaluation.py: a standalone module providing naive baselines, leakage-free feature selection, rolling-origin backtesting at four horizons, prediction intervals and structural-break indicators. </w:t>
+      </w:r>
+    </w:p>
+    <w:p>
+      <w:pPr>
+        <w:pStyle w:val="ListParagraph"/>
+        <w:spacing w:line="276" w:lineRule="auto"/>
+        <w:ind w:left="426"/>
+        <w:jc w:val="both"/>
+        <w:rPr>
+          <w:rFonts w:ascii="Times New Roman" w:eastAsia="Times New Roman" w:hAnsi="Times New Roman"/>
+          <w:sz w:val="24"/>
+          <w:szCs w:val="24"/>
+        </w:rPr>
+      </w:pPr>
+      <w:r>
+        <w:rPr>
+          <w:rFonts w:ascii="Times New Roman" w:eastAsia="Times New Roman" w:hAnsi="Times New Roman"/>
+          <w:sz w:val="24"/>
+          <w:szCs w:val="24"/>
+        </w:rPr>
+        <w:t xml:space="preserve">Found and fixed two leakage sources: variant selection on the test set, and scaling fitted before the CV split. </w:t>
+      </w:r>
+    </w:p>
+    <w:p>
+      <w:pPr>
+        <w:pStyle w:val="ListParagraph"/>
+        <w:spacing w:line="276" w:lineRule="auto"/>
+        <w:ind w:left="426"/>
+        <w:jc w:val="both"/>
+        <w:rPr>
+          <w:rFonts w:ascii="Times New Roman" w:eastAsia="Times New Roman" w:hAnsi="Times New Roman"/>
+          <w:sz w:val="24"/>
+          <w:szCs w:val="24"/>
+        </w:rPr>
+      </w:pPr>
+      <w:r>
+        <w:rPr>
+          <w:rFonts w:ascii="Times New Roman" w:eastAsia="Times New Roman" w:hAnsi="Times New Roman"/>
+          <w:sz w:val="24"/>
+          <w:szCs w:val="24"/>
+        </w:rPr>
+        <w:t xml:space="preserve">Added seasonal naive and 12-month moving average benchmarks, producing the Section 3 accuracy table. </w:t>
+      </w:r>
+    </w:p>
+    <w:p>
+      <w:pPr>
+        <w:pStyle w:val="ListParagraph"/>
+        <w:spacing w:line="276" w:lineRule="auto"/>
+        <w:ind w:left="426"/>
+        <w:jc w:val="both"/>
+        <w:rPr>
+          <w:rFonts w:ascii="Times New Roman" w:eastAsia="Times New Roman" w:hAnsi="Times New Roman"/>
+          <w:sz w:val="24"/>
+          <w:szCs w:val="24"/>
+        </w:rPr>
+      </w:pPr>
+      <w:r>
+        <w:rPr>
+          <w:rFonts w:ascii="Times New Roman" w:eastAsia="Times New Roman" w:hAnsi="Times New Roman"/>
+          <w:sz w:val="24"/>
+          <w:szCs w:val="24"/>
+        </w:rPr>
+        <w:t xml:space="preserve">Defined the forecast specification, drift thresholds and retraining rules, and clarified the incremental-learning stage. </w:t>
+      </w:r>
+    </w:p>
+    <w:p>
+      <w:pPr>
+        <w:pStyle w:val="ListParagraph"/>
+        <w:spacing w:line="276" w:lineRule="auto"/>
+        <w:ind w:left="426"/>
+        <w:jc w:val="both"/>
+        <w:rPr>
+          <w:rFonts w:ascii="Times New Roman" w:eastAsia="Times New Roman" w:hAnsi="Times New Roman"/>
+          <w:sz w:val="24"/>
+          <w:szCs w:val="24"/>
+        </w:rPr>
+      </w:pPr>
+      <w:r>
+        <w:rPr>
+          <w:rFonts w:ascii="Times New Roman" w:eastAsia="Times New Roman" w:hAnsi="Times New Roman"/>
+          <w:sz w:val="24"/>
+          <w:szCs w:val="24"/>
+        </w:rPr>
+        <w:t>Wrote the Analytics and Machine Learning subsection, plus the risk and ethics sections in Assessment 1</w:t>
+      </w:r>
     </w:p>
     <w:p>
       <w:pPr>
@@ -27325,6 +26251,9 @@
         <w:ind w:left="426"/>
         <w:jc w:val="both"/>
       </w:pPr>
+      <w:r>
+        <w:t>A model comparison only means something against a benchmark. Assessment 1 compared regression models against each other; once a 12-month moving average was added, it beat every model at every horizon. Reporting that was less comfortable than reporting a win, but more defensible. The second lesson was leakage: both cases I found produced plausible output, which is why they were easy to miss.</w:t>
+      </w:r>
     </w:p>
     <w:p>
       <w:pPr>
@@ -27535,7 +26464,7 @@
                     </pic:cNvPicPr>
                   </pic:nvPicPr>
                   <pic:blipFill>
-                    <a:blip r:embed="rId54">
+                    <a:blip r:embed="rId56">
                       <a:extLst>
                         <a:ext uri="{28A0092B-C50C-407E-A947-70E740481C1C}">
                           <a14:useLocalDpi xmlns:a14="http://schemas.microsoft.com/office/drawing/2010/main" val="0"/>
@@ -27621,25 +26550,7 @@
           <w:sz w:val="24"/>
           <w:szCs w:val="24"/>
         </w:rPr>
-        <w:t xml:space="preserve">In this assessment, I maintain multiple roles, mostly with the technical side of the project. My contribution </w:t>
-      </w:r>
-      <w:proofErr w:type="gramStart"/>
-      <w:r>
-        <w:rPr>
-          <w:rFonts w:ascii="Times New Roman" w:eastAsia="Times New Roman" w:hAnsi="Times New Roman"/>
-          <w:sz w:val="24"/>
-          <w:szCs w:val="24"/>
-        </w:rPr>
-        <w:t>includes:</w:t>
-      </w:r>
-      <w:proofErr w:type="gramEnd"/>
-      <w:r>
-        <w:rPr>
-          <w:rFonts w:ascii="Times New Roman" w:eastAsia="Times New Roman" w:hAnsi="Times New Roman"/>
-          <w:sz w:val="24"/>
-          <w:szCs w:val="24"/>
-        </w:rPr>
-        <w:t xml:space="preserve"> Review the output from the ingesting and preprocessing steps, doing basic testing to see if anomalies exist and also seeking clarification when necessary, making sure that the processed data are ready for the next </w:t>
+        <w:t xml:space="preserve">In this assessment, I maintain multiple roles, mostly with the technical side of the project. My contribution includes: Review the output from the ingesting and preprocessing steps, doing basic testing to see if anomalies exist and also seeking clarification when necessary, making sure that the processed data are ready for the next </w:t>
       </w:r>
       <w:r>
         <w:rPr>
@@ -27772,15 +26683,7 @@
       </w:r>
       <w:r>
         <w:noBreakHyphen/>
-        <w:t xml:space="preserve">solving skills. Working with different machine learning models improved my understanding of model selection, evaluation, and </w:t>
-      </w:r>
-      <w:proofErr w:type="spellStart"/>
-      <w:r>
-        <w:t>optimisation</w:t>
-      </w:r>
-      <w:proofErr w:type="spellEnd"/>
-      <w:r>
-        <w:t>, giving me practical experience applying theory to a real</w:t>
+        <w:t>solving skills. Working with different machine learning models improved my understanding of model selection, evaluation, and optimisation, giving me practical experience applying theory to a real</w:t>
       </w:r>
       <w:r>
         <w:noBreakHyphen/>
@@ -27827,8 +26730,8 @@
       </w:r>
     </w:p>
     <w:sectPr>
-      <w:headerReference w:type="default" r:id="rId55"/>
-      <w:footerReference w:type="default" r:id="rId56"/>
+      <w:headerReference w:type="default" r:id="rId57"/>
+      <w:footerReference w:type="default" r:id="rId58"/>
       <w:pgSz w:w="11906" w:h="16838" w:code="9"/>
       <w:pgMar w:top="1440" w:right="1440" w:bottom="1440" w:left="1440" w:header="709" w:footer="709" w:gutter="0"/>
       <w:pgNumType w:start="0"/>
@@ -34684,6 +33587,21 @@
 </file>
 
 <file path=customXml/item1.xml><?xml version="1.0" encoding="utf-8"?>
+<p:properties xmlns:p="http://schemas.microsoft.com/office/2006/metadata/properties" xmlns:xsi="http://www.w3.org/2001/XMLSchema-instance" xmlns:pc="http://schemas.microsoft.com/office/infopath/2007/PartnerControls">
+  <documentManagement/>
+</p:properties>
+</file>
+
+<file path=customXml/item2.xml><?xml version="1.0" encoding="utf-8"?>
+<?mso-contentType ?>
+<FormTemplates xmlns="http://schemas.microsoft.com/sharepoint/v3/contenttype/forms">
+  <Display>DocumentLibraryForm</Display>
+  <Edit>DocumentLibraryForm</Edit>
+  <New>DocumentLibraryForm</New>
+</FormTemplates>
+</file>
+
+<file path=customXml/item3.xml><?xml version="1.0" encoding="utf-8"?>
 <ct:contentTypeSchema xmlns:ct="http://schemas.microsoft.com/office/2006/metadata/contentType" xmlns:ma="http://schemas.microsoft.com/office/2006/metadata/properties/metaAttributes" ct:_="" ma:_="" ma:contentTypeName="Document" ma:contentTypeID="0x010100922A3CA1EE6E4B44833A16005451862E" ma:contentTypeVersion="3" ma:contentTypeDescription="Create a new document." ma:contentTypeScope="" ma:versionID="b712dade4bf8bf57d4a0cdac4d020ae4">
   <xsd:schema xmlns:xsd="http://www.w3.org/2001/XMLSchema" xmlns:xs="http://www.w3.org/2001/XMLSchema" xmlns:p="http://schemas.microsoft.com/office/2006/metadata/properties" xmlns:ns2="92f6da62-8f25-40d3-824c-47c5f6f94bd6" targetNamespace="http://schemas.microsoft.com/office/2006/metadata/properties" ma:root="true" ma:fieldsID="f6f8642a0533a95cbf7fc7bbc8c1e153" ns2:_="">
     <xsd:import namespace="92f6da62-8f25-40d3-824c-47c5f6f94bd6"/>
@@ -34821,26 +33739,28 @@
 </ct:contentTypeSchema>
 </file>
 
-<file path=customXml/item2.xml><?xml version="1.0" encoding="utf-8"?>
+<file path=customXml/item4.xml><?xml version="1.0" encoding="utf-8"?>
 <b:Sources xmlns:b="http://schemas.openxmlformats.org/officeDocument/2006/bibliography" xmlns="http://schemas.openxmlformats.org/officeDocument/2006/bibliography" SelectedStyle="\APASixthEditionOfficeOnline.xsl" StyleName="APA" Version="6"/>
 </file>
 
-<file path=customXml/item3.xml><?xml version="1.0" encoding="utf-8"?>
-<?mso-contentType ?>
-<FormTemplates xmlns="http://schemas.microsoft.com/sharepoint/v3/contenttype/forms">
-  <Display>DocumentLibraryForm</Display>
-  <Edit>DocumentLibraryForm</Edit>
-  <New>DocumentLibraryForm</New>
-</FormTemplates>
+<file path=customXml/itemProps1.xml><?xml version="1.0" encoding="utf-8"?>
+<ds:datastoreItem xmlns:ds="http://schemas.openxmlformats.org/officeDocument/2006/customXml" ds:itemID="{B2E31085-3E06-4A9F-9730-20A04C85DF24}">
+  <ds:schemaRefs>
+    <ds:schemaRef ds:uri="http://schemas.microsoft.com/office/2006/metadata/properties"/>
+    <ds:schemaRef ds:uri="http://schemas.microsoft.com/office/infopath/2007/PartnerControls"/>
+  </ds:schemaRefs>
+</ds:datastoreItem>
 </file>
 
-<file path=customXml/item4.xml><?xml version="1.0" encoding="utf-8"?>
-<p:properties xmlns:p="http://schemas.microsoft.com/office/2006/metadata/properties" xmlns:xsi="http://www.w3.org/2001/XMLSchema-instance" xmlns:pc="http://schemas.microsoft.com/office/infopath/2007/PartnerControls">
-  <documentManagement/>
-</p:properties>
+<file path=customXml/itemProps2.xml><?xml version="1.0" encoding="utf-8"?>
+<ds:datastoreItem xmlns:ds="http://schemas.openxmlformats.org/officeDocument/2006/customXml" ds:itemID="{82A9BB68-56B4-4822-B6B7-DB471576EB1F}">
+  <ds:schemaRefs>
+    <ds:schemaRef ds:uri="http://schemas.microsoft.com/sharepoint/v3/contenttype/forms"/>
+  </ds:schemaRefs>
+</ds:datastoreItem>
 </file>
 
-<file path=customXml/itemProps1.xml><?xml version="1.0" encoding="utf-8"?>
+<file path=customXml/itemProps3.xml><?xml version="1.0" encoding="utf-8"?>
 <ds:datastoreItem xmlns:ds="http://schemas.openxmlformats.org/officeDocument/2006/customXml" ds:itemID="{69960CE0-24F5-4ADF-A12F-FE193FFA9C43}">
   <ds:schemaRefs>
     <ds:schemaRef ds:uri="http://schemas.microsoft.com/office/2006/metadata/contentType"/>
@@ -34858,27 +33778,10 @@
 </ds:datastoreItem>
 </file>
 
-<file path=customXml/itemProps2.xml><?xml version="1.0" encoding="utf-8"?>
+<file path=customXml/itemProps4.xml><?xml version="1.0" encoding="utf-8"?>
 <ds:datastoreItem xmlns:ds="http://schemas.openxmlformats.org/officeDocument/2006/customXml" ds:itemID="{E3DA75CE-018A-4AF1-8B5C-BF0FBFE76924}">
   <ds:schemaRefs>
     <ds:schemaRef ds:uri="http://schemas.openxmlformats.org/officeDocument/2006/bibliography"/>
   </ds:schemaRefs>
 </ds:datastoreItem>
-</file>
-
-<file path=customXml/itemProps3.xml><?xml version="1.0" encoding="utf-8"?>
-<ds:datastoreItem xmlns:ds="http://schemas.openxmlformats.org/officeDocument/2006/customXml" ds:itemID="{82A9BB68-56B4-4822-B6B7-DB471576EB1F}">
-  <ds:schemaRefs>
-    <ds:schemaRef ds:uri="http://schemas.microsoft.com/sharepoint/v3/contenttype/forms"/>
-  </ds:schemaRefs>
-</ds:datastoreItem>
-</file>
-
-<file path=customXml/itemProps4.xml><?xml version="1.0" encoding="utf-8"?>
-<ds:datastoreItem xmlns:ds="http://schemas.openxmlformats.org/officeDocument/2006/customXml" ds:itemID="{B2E31085-3E06-4A9F-9730-20A04C85DF24}">
-  <ds:schemaRefs>
-    <ds:schemaRef ds:uri="http://schemas.microsoft.com/office/2006/metadata/properties"/>
-    <ds:schemaRef ds:uri="http://schemas.microsoft.com/office/infopath/2007/PartnerControls"/>
-  </ds:schemaRefs>
-</ds:datastoreItem>
 </file>
</xml_diff>

<commit_message>
Update Assignment 2 report
</commit_message>
<xml_diff>
--- a/documents/Assignment 2.docx
+++ b/documents/Assignment 2.docx
@@ -1,6 +1,6 @@
 
 <file path=word/document.xml><?xml version="1.0" encoding="utf-8"?>
-<w:document xmlns:wpc="http://schemas.microsoft.com/office/word/2010/wordprocessingCanvas" xmlns:cx="http://schemas.microsoft.com/office/drawing/2014/chartex" xmlns:cx1="http://schemas.microsoft.com/office/drawing/2015/9/8/chartex" xmlns:cx2="http://schemas.microsoft.com/office/drawing/2015/10/21/chartex" xmlns:cx3="http://schemas.microsoft.com/office/drawing/2016/5/9/chartex" xmlns:cx4="http://schemas.microsoft.com/office/drawing/2016/5/10/chartex" xmlns:cx5="http://schemas.microsoft.com/office/drawing/2016/5/11/chartex" xmlns:cx6="http://schemas.microsoft.com/office/drawing/2016/5/12/chartex" xmlns:cx7="http://schemas.microsoft.com/office/drawing/2016/5/13/chartex" xmlns:cx8="http://schemas.microsoft.com/office/drawing/2016/5/14/chartex" xmlns:mc="http://schemas.openxmlformats.org/markup-compatibility/2006" xmlns:aink="http://schemas.microsoft.com/office/drawing/2016/ink" xmlns:am3d="http://schemas.microsoft.com/office/drawing/2017/model3d" xmlns:o="urn:schemas-microsoft-com:office:office" xmlns:oel="http://schemas.microsoft.com/office/2019/extlst" xmlns:r="http://schemas.openxmlformats.org/officeDocument/2006/relationships" xmlns:m="http://schemas.openxmlformats.org/officeDocument/2006/math" xmlns:v="urn:schemas-microsoft-com:vml" xmlns:wp14="http://schemas.microsoft.com/office/word/2010/wordprocessingDrawing" xmlns:wp="http://schemas.openxmlformats.org/drawingml/2006/wordprocessingDrawing" xmlns:w10="urn:schemas-microsoft-com:office:word" xmlns:w="http://schemas.openxmlformats.org/wordprocessingml/2006/main" xmlns:w14="http://schemas.microsoft.com/office/word/2010/wordml" xmlns:w15="http://schemas.microsoft.com/office/word/2012/wordml" xmlns:w16cei="http://schemas.microsoft.com/office/word/2026/wordml/cei" xmlns:w16cex="http://schemas.microsoft.com/office/word/2018/wordml/cex" xmlns:w16cid="http://schemas.microsoft.com/office/word/2016/wordml/cid" xmlns:w16="http://schemas.microsoft.com/office/word/2018/wordml" xmlns:w16du="http://schemas.microsoft.com/office/word/2023/wordml/word16du" xmlns:w16sdtdh="http://schemas.microsoft.com/office/word/2020/wordml/sdtdatahash" xmlns:w16sdtfl="http://schemas.microsoft.com/office/word/2024/wordml/sdtformatlock" xmlns:w16se="http://schemas.microsoft.com/office/word/2015/wordml/symex" xmlns:wpg="http://schemas.microsoft.com/office/word/2010/wordprocessingGroup" xmlns:wpi="http://schemas.microsoft.com/office/word/2010/wordprocessingInk" xmlns:wne="http://schemas.microsoft.com/office/word/2006/wordml" xmlns:wps="http://schemas.microsoft.com/office/word/2010/wordprocessingShape" mc:Ignorable="w14 w15 w16se w16cid w16 w16cex w16sdtdh w16sdtfl w16du wp14">
+<w:document xmlns:wpc="http://schemas.microsoft.com/office/word/2010/wordprocessingCanvas" xmlns:cx="http://schemas.microsoft.com/office/drawing/2014/chartex" xmlns:cx1="http://schemas.microsoft.com/office/drawing/2015/9/8/chartex" xmlns:cx2="http://schemas.microsoft.com/office/drawing/2015/10/21/chartex" xmlns:cx3="http://schemas.microsoft.com/office/drawing/2016/5/9/chartex" xmlns:cx4="http://schemas.microsoft.com/office/drawing/2016/5/10/chartex" xmlns:cx5="http://schemas.microsoft.com/office/drawing/2016/5/11/chartex" xmlns:cx6="http://schemas.microsoft.com/office/drawing/2016/5/12/chartex" xmlns:cx7="http://schemas.microsoft.com/office/drawing/2016/5/13/chartex" xmlns:cx8="http://schemas.microsoft.com/office/drawing/2016/5/14/chartex" xmlns:mc="http://schemas.openxmlformats.org/markup-compatibility/2006" xmlns:aink="http://schemas.microsoft.com/office/drawing/2016/ink" xmlns:am3d="http://schemas.microsoft.com/office/drawing/2017/model3d" xmlns:o="urn:schemas-microsoft-com:office:office" xmlns:oel="http://schemas.microsoft.com/office/2019/extlst" xmlns:r="http://schemas.openxmlformats.org/officeDocument/2006/relationships" xmlns:m="http://schemas.openxmlformats.org/officeDocument/2006/math" xmlns:v="urn:schemas-microsoft-com:vml" xmlns:wp14="http://schemas.microsoft.com/office/word/2010/wordprocessingDrawing" xmlns:wp="http://schemas.openxmlformats.org/drawingml/2006/wordprocessingDrawing" xmlns:w10="urn:schemas-microsoft-com:office:word" xmlns:w="http://schemas.openxmlformats.org/wordprocessingml/2006/main" xmlns:w14="http://schemas.microsoft.com/office/word/2010/wordml" xmlns:w15="http://schemas.microsoft.com/office/word/2012/wordml" xmlns:w16cex="http://schemas.microsoft.com/office/word/2018/wordml/cex" xmlns:w16cid="http://schemas.microsoft.com/office/word/2016/wordml/cid" xmlns:w16="http://schemas.microsoft.com/office/word/2018/wordml" xmlns:w16du="http://schemas.microsoft.com/office/word/2023/wordml/word16du" xmlns:w16sdtdh="http://schemas.microsoft.com/office/word/2020/wordml/sdtdatahash" xmlns:w16sdtfl="http://schemas.microsoft.com/office/word/2024/wordml/sdtformatlock" xmlns:w16se="http://schemas.microsoft.com/office/word/2015/wordml/symex" xmlns:wpg="http://schemas.microsoft.com/office/word/2010/wordprocessingGroup" xmlns:wpi="http://schemas.microsoft.com/office/word/2010/wordprocessingInk" xmlns:wne="http://schemas.microsoft.com/office/word/2006/wordml" xmlns:wps="http://schemas.microsoft.com/office/word/2010/wordprocessingShape" mc:Ignorable="w14 w15 w16se w16cid w16 w16cex w16sdtdh w16sdtfl w16du wp14">
   <w:body>
     <w:sdt>
       <w:sdtPr>
@@ -312,29 +312,7 @@
               <w:sz w:val="28"/>
               <w:szCs w:val="28"/>
             </w:rPr>
-            <w:t xml:space="preserve">Lecturer: Dr </w:t>
-          </w:r>
-          <w:proofErr w:type="spellStart"/>
-          <w:r>
-            <w:rPr>
-              <w:rFonts w:ascii="Times New Roman" w:hAnsi="Times New Roman"/>
-              <w:b/>
-              <w:bCs/>
-              <w:sz w:val="28"/>
-              <w:szCs w:val="28"/>
-            </w:rPr>
-            <w:t>Thuseethan</w:t>
-          </w:r>
-          <w:proofErr w:type="spellEnd"/>
-          <w:r>
-            <w:rPr>
-              <w:rFonts w:ascii="Times New Roman" w:hAnsi="Times New Roman"/>
-              <w:b/>
-              <w:bCs/>
-              <w:sz w:val="28"/>
-              <w:szCs w:val="28"/>
-            </w:rPr>
-            <w:t xml:space="preserve"> Selvarajah</w:t>
+            <w:t>Lecturer: Dr Thuseethan Selvarajah</w:t>
           </w:r>
         </w:p>
         <w:p>
@@ -537,7 +515,6 @@
               <w:szCs w:val="24"/>
             </w:rPr>
           </w:pPr>
-          <w:proofErr w:type="gramStart"/>
           <w:r>
             <w:rPr>
               <w:rFonts w:ascii="Times New Roman" w:eastAsia="Aptos" w:hAnsi="Times New Roman"/>
@@ -578,7 +555,6 @@
             </w:rPr>
             <w:t>September</w:t>
           </w:r>
-          <w:proofErr w:type="gramEnd"/>
           <w:r>
             <w:rPr>
               <w:rFonts w:ascii="Times New Roman" w:eastAsia="Aptos" w:hAnsi="Times New Roman"/>
@@ -2301,7 +2277,6 @@
         <w:lastRenderedPageBreak/>
         <w:t>SECTION 1 – A</w:t>
       </w:r>
-      <w:proofErr w:type="spellStart"/>
       <w:r>
         <w:rPr>
           <w:rFonts w:ascii="Times New Roman" w:eastAsia="Times New Roman" w:hAnsi="Times New Roman" w:cs="Times New Roman"/>
@@ -2312,20 +2287,7 @@
           <w:szCs w:val="24"/>
           <w:lang w:val="en-AU"/>
         </w:rPr>
-        <w:t>ssessment</w:t>
-      </w:r>
-      <w:proofErr w:type="spellEnd"/>
-      <w:r>
-        <w:rPr>
-          <w:rFonts w:ascii="Times New Roman" w:eastAsia="Times New Roman" w:hAnsi="Times New Roman" w:cs="Times New Roman"/>
-          <w:b/>
-          <w:bCs/>
-          <w:color w:val="1F497D" w:themeColor="text2"/>
-          <w:sz w:val="24"/>
-          <w:szCs w:val="24"/>
-          <w:lang w:val="en-AU"/>
-        </w:rPr>
-        <w:t xml:space="preserve"> 1 Report</w:t>
+        <w:t>ssessment 1 Report</w:t>
       </w:r>
     </w:p>
     <w:p>
@@ -6361,29 +6323,7 @@
                 <w:szCs w:val="24"/>
                 <w:lang w:val="en-AU"/>
               </w:rPr>
-              <w:t xml:space="preserve">Cleans, merges and </w:t>
-            </w:r>
-            <w:proofErr w:type="gramStart"/>
-            <w:r>
-              <w:rPr>
-                <w:rFonts w:ascii="Times New Roman" w:eastAsia="Times New Roman" w:hAnsi="Times New Roman"/>
-                <w:color w:val="000000" w:themeColor="text1"/>
-                <w:sz w:val="24"/>
-                <w:szCs w:val="24"/>
-                <w:lang w:val="en-AU"/>
-              </w:rPr>
-              <w:t>engineers</w:t>
-            </w:r>
-            <w:proofErr w:type="gramEnd"/>
-            <w:r>
-              <w:rPr>
-                <w:rFonts w:ascii="Times New Roman" w:eastAsia="Times New Roman" w:hAnsi="Times New Roman"/>
-                <w:color w:val="000000" w:themeColor="text1"/>
-                <w:sz w:val="24"/>
-                <w:szCs w:val="24"/>
-                <w:lang w:val="en-AU"/>
-              </w:rPr>
-              <w:t xml:space="preserve"> features (lagged indicators, cyclical month encoding, per-capita normalisation) across the three sources.</w:t>
+              <w:t>Cleans, merges and engineers features (lagged indicators, cyclical month encoding, per-capita normalisation) across the three sources.</w:t>
             </w:r>
           </w:p>
         </w:tc>
@@ -6619,7 +6559,6 @@
               </w:rPr>
               <w:t>Python (</w:t>
             </w:r>
-            <w:proofErr w:type="spellStart"/>
             <w:r>
               <w:rPr>
                 <w:rFonts w:ascii="Times New Roman" w:eastAsia="Times New Roman" w:hAnsi="Times New Roman" w:cs="Times New Roman"/>
@@ -6630,7 +6569,6 @@
               </w:rPr>
               <w:t>Streamlit</w:t>
             </w:r>
-            <w:proofErr w:type="spellEnd"/>
             <w:r>
               <w:rPr>
                 <w:rFonts w:ascii="Times New Roman" w:eastAsia="Times New Roman" w:hAnsi="Times New Roman" w:cs="Times New Roman"/>
@@ -6781,7 +6719,6 @@
                 <w:lang w:val="en-AU"/>
               </w:rPr>
             </w:pPr>
-            <w:proofErr w:type="spellStart"/>
             <w:r>
               <w:rPr>
                 <w:rFonts w:ascii="Times New Roman" w:eastAsia="Times New Roman" w:hAnsi="Times New Roman" w:cs="Times New Roman"/>
@@ -6792,7 +6729,6 @@
               </w:rPr>
               <w:t>Streamlit</w:t>
             </w:r>
-            <w:proofErr w:type="spellEnd"/>
             <w:r>
               <w:rPr>
                 <w:rFonts w:ascii="Times New Roman" w:eastAsia="Times New Roman" w:hAnsi="Times New Roman" w:cs="Times New Roman"/>
@@ -7179,7 +7115,6 @@
         </w:rPr>
         <w:t xml:space="preserve"> </w:t>
       </w:r>
-      <w:proofErr w:type="gramStart"/>
       <w:r>
         <w:rPr>
           <w:rFonts w:ascii="Wingdings" w:eastAsia="Wingdings" w:hAnsi="Wingdings" w:cs="Wingdings"/>
@@ -7194,27 +7129,8 @@
           <w:sz w:val="24"/>
           <w:szCs w:val="24"/>
         </w:rPr>
-        <w:t xml:space="preserve">  Glue</w:t>
-      </w:r>
-      <w:proofErr w:type="gramEnd"/>
-      <w:r>
-        <w:rPr>
-          <w:rFonts w:ascii="Times New Roman" w:eastAsia="Times New Roman" w:hAnsi="Times New Roman"/>
-          <w:sz w:val="24"/>
-          <w:szCs w:val="24"/>
-        </w:rPr>
-        <w:t xml:space="preserve"> Data </w:t>
-      </w:r>
-      <w:proofErr w:type="spellStart"/>
-      <w:r>
-        <w:rPr>
-          <w:rFonts w:ascii="Times New Roman" w:eastAsia="Times New Roman" w:hAnsi="Times New Roman"/>
-          <w:sz w:val="24"/>
-          <w:szCs w:val="24"/>
-        </w:rPr>
-        <w:t>Catalog</w:t>
-      </w:r>
-      <w:proofErr w:type="spellEnd"/>
+        <w:t xml:space="preserve">  Glue Data Catalog</w:t>
+      </w:r>
       <w:r>
         <w:rPr>
           <w:rFonts w:ascii="Times New Roman" w:eastAsia="Times New Roman" w:hAnsi="Times New Roman"/>
@@ -7279,23 +7195,13 @@
         </w:rPr>
         <w:t xml:space="preserve"> </w:t>
       </w:r>
-      <w:proofErr w:type="spellStart"/>
-      <w:r>
-        <w:rPr>
-          <w:rFonts w:ascii="Times New Roman" w:eastAsia="Times New Roman" w:hAnsi="Times New Roman"/>
-          <w:sz w:val="24"/>
-          <w:szCs w:val="24"/>
-        </w:rPr>
-        <w:t>QuickSight</w:t>
-      </w:r>
-      <w:proofErr w:type="spellEnd"/>
-      <w:r>
-        <w:rPr>
-          <w:rFonts w:ascii="Times New Roman" w:eastAsia="Times New Roman" w:hAnsi="Times New Roman"/>
-          <w:sz w:val="24"/>
-          <w:szCs w:val="24"/>
-        </w:rPr>
-        <w:t>, with SageMaker Model Monitor for post-deployment monitoring</w:t>
+      <w:r>
+        <w:rPr>
+          <w:rFonts w:ascii="Times New Roman" w:eastAsia="Times New Roman" w:hAnsi="Times New Roman"/>
+          <w:sz w:val="24"/>
+          <w:szCs w:val="24"/>
+        </w:rPr>
+        <w:t>QuickSight, with SageMaker Model Monitor for post-deployment monitoring</w:t>
       </w:r>
       <w:r>
         <w:rPr>
@@ -7311,16 +7217,7 @@
           <w:sz w:val="24"/>
           <w:szCs w:val="24"/>
         </w:rPr>
-        <w:t>), the group project implements each stage using open-source, non-AWS tools, consistent with the module's guidance to rely on open-</w:t>
-      </w:r>
-      <w:proofErr w:type="gramStart"/>
-      <w:r>
-        <w:rPr>
-          <w:rFonts w:ascii="Times New Roman" w:eastAsia="Times New Roman" w:hAnsi="Times New Roman"/>
-          <w:sz w:val="24"/>
-          <w:szCs w:val="24"/>
-        </w:rPr>
-        <w:t xml:space="preserve">source </w:t>
+        <w:t xml:space="preserve">), the group project implements each stage using open-source, non-AWS tools, consistent with the module's guidance to rely on open-source </w:t>
       </w:r>
       <w:r>
         <w:rPr>
@@ -7337,16 +7234,7 @@
           <w:sz w:val="24"/>
           <w:szCs w:val="24"/>
         </w:rPr>
-        <w:t>tools</w:t>
-      </w:r>
-      <w:proofErr w:type="gramEnd"/>
-      <w:r>
-        <w:rPr>
-          <w:rFonts w:ascii="Times New Roman" w:eastAsia="Times New Roman" w:hAnsi="Times New Roman"/>
-          <w:sz w:val="24"/>
-          <w:szCs w:val="24"/>
-        </w:rPr>
-        <w:t xml:space="preserve"> for the group deliverable.</w:t>
+        <w:t>tools for the group deliverable.</w:t>
       </w:r>
     </w:p>
     <w:p>
@@ -7391,18 +7279,8 @@
           <w:sz w:val="24"/>
           <w:szCs w:val="24"/>
         </w:rPr>
-        <w:t xml:space="preserve"> </w:t>
-      </w:r>
-      <w:proofErr w:type="spellStart"/>
-      <w:r>
-        <w:rPr>
-          <w:rFonts w:ascii="Times New Roman" w:eastAsia="Times New Roman" w:hAnsi="Times New Roman"/>
-          <w:sz w:val="24"/>
-          <w:szCs w:val="24"/>
-        </w:rPr>
-        <w:t>Streamlit</w:t>
-      </w:r>
-      <w:proofErr w:type="spellEnd"/>
+        <w:t xml:space="preserve"> Streamlit</w:t>
+      </w:r>
       <w:r>
         <w:rPr>
           <w:rFonts w:ascii="Times New Roman" w:eastAsia="Times New Roman" w:hAnsi="Times New Roman"/>
@@ -7483,43 +7361,7 @@
           <w:sz w:val="24"/>
           <w:szCs w:val="24"/>
         </w:rPr>
-        <w:t xml:space="preserve">the GitHub-based data store to Amazon S3, pandas-based data processing to AWS Glue ETL, the Analytics/ML stage to Amazon SageMaker for managed training and scheduled deployment, the </w:t>
-      </w:r>
-      <w:proofErr w:type="spellStart"/>
-      <w:r>
-        <w:rPr>
-          <w:rFonts w:ascii="Times New Roman" w:eastAsia="Times New Roman" w:hAnsi="Times New Roman"/>
-          <w:sz w:val="24"/>
-          <w:szCs w:val="24"/>
-        </w:rPr>
-        <w:t>Streamlit</w:t>
-      </w:r>
-      <w:proofErr w:type="spellEnd"/>
-      <w:r>
-        <w:rPr>
-          <w:rFonts w:ascii="Times New Roman" w:eastAsia="Times New Roman" w:hAnsi="Times New Roman"/>
-          <w:sz w:val="24"/>
-          <w:szCs w:val="24"/>
-        </w:rPr>
-        <w:t xml:space="preserve"> dashboard to Amazon </w:t>
-      </w:r>
-      <w:proofErr w:type="spellStart"/>
-      <w:r>
-        <w:rPr>
-          <w:rFonts w:ascii="Times New Roman" w:eastAsia="Times New Roman" w:hAnsi="Times New Roman"/>
-          <w:sz w:val="24"/>
-          <w:szCs w:val="24"/>
-        </w:rPr>
-        <w:t>QuickSight</w:t>
-      </w:r>
-      <w:proofErr w:type="spellEnd"/>
-      <w:r>
-        <w:rPr>
-          <w:rFonts w:ascii="Times New Roman" w:eastAsia="Times New Roman" w:hAnsi="Times New Roman"/>
-          <w:sz w:val="24"/>
-          <w:szCs w:val="24"/>
-        </w:rPr>
-        <w:t>, the Monitor stage to Amazon SageMaker Model Monitor, and the Incremental learning stage to SageMaker's built-in incremental (continuous) training capability. Future enhancements under consideration include real-time or near-real-time data ingestion (replacing manual/batch downloads) and integration with additional predictors such as weather or event-calendar data to improve forecast accuracy.</w:t>
+        <w:t>the GitHub-based data store to Amazon S3, pandas-based data processing to AWS Glue ETL, the Analytics/ML stage to Amazon SageMaker for managed training and scheduled deployment, the Streamlit dashboard to Amazon QuickSight, the Monitor stage to Amazon SageMaker Model Monitor, and the Incremental learning stage to SageMaker's built-in incremental (continuous) training capability. Future enhancements under consideration include real-time or near-real-time data ingestion (replacing manual/batch downloads) and integration with additional predictors such as weather or event-calendar data to improve forecast accuracy.</w:t>
       </w:r>
     </w:p>
     <w:p>
@@ -8000,25 +7842,14 @@
               </w:rPr>
               <w:t xml:space="preserve">GitHub repository with README; </w:t>
             </w:r>
-            <w:proofErr w:type="spellStart"/>
-            <w:r>
-              <w:rPr>
-                <w:rFonts w:ascii="Times New Roman" w:eastAsia="Times New Roman" w:hAnsi="Times New Roman" w:cs="Times New Roman"/>
-                <w:sz w:val="24"/>
-                <w:szCs w:val="24"/>
-                <w:lang w:val="en-AU"/>
-              </w:rPr>
-              <w:t>Streamlit</w:t>
-            </w:r>
-            <w:proofErr w:type="spellEnd"/>
-            <w:r>
-              <w:rPr>
-                <w:rFonts w:ascii="Times New Roman" w:eastAsia="Times New Roman" w:hAnsi="Times New Roman" w:cs="Times New Roman"/>
-                <w:sz w:val="24"/>
-                <w:szCs w:val="24"/>
-                <w:lang w:val="en-AU"/>
-              </w:rPr>
-              <w:t xml:space="preserve"> account set up</w:t>
+            <w:r>
+              <w:rPr>
+                <w:rFonts w:ascii="Times New Roman" w:eastAsia="Times New Roman" w:hAnsi="Times New Roman" w:cs="Times New Roman"/>
+                <w:sz w:val="24"/>
+                <w:szCs w:val="24"/>
+                <w:lang w:val="en-AU"/>
+              </w:rPr>
+              <w:t>Streamlit account set up</w:t>
             </w:r>
             <w:r>
               <w:rPr>
@@ -9369,7 +9200,6 @@
               </w:rPr>
               <w:t xml:space="preserve">Incorporate feedback; finalise </w:t>
             </w:r>
-            <w:proofErr w:type="gramStart"/>
             <w:r>
               <w:rPr>
                 <w:rFonts w:ascii="Times New Roman" w:eastAsia="Times New Roman" w:hAnsi="Times New Roman" w:cs="Times New Roman"/>
@@ -9395,37 +9225,7 @@
                 <w:szCs w:val="24"/>
                 <w:lang w:val="en-AU"/>
               </w:rPr>
-              <w:t xml:space="preserve"> deploy</w:t>
-            </w:r>
-            <w:proofErr w:type="gramEnd"/>
-            <w:r>
-              <w:rPr>
-                <w:rFonts w:ascii="Times New Roman" w:eastAsia="Times New Roman" w:hAnsi="Times New Roman" w:cs="Times New Roman"/>
-                <w:sz w:val="24"/>
-                <w:szCs w:val="24"/>
-                <w:lang w:val="en-AU"/>
-              </w:rPr>
-              <w:t xml:space="preserve"> to </w:t>
-            </w:r>
-            <w:proofErr w:type="spellStart"/>
-            <w:r>
-              <w:rPr>
-                <w:rFonts w:ascii="Times New Roman" w:eastAsia="Times New Roman" w:hAnsi="Times New Roman" w:cs="Times New Roman"/>
-                <w:sz w:val="24"/>
-                <w:szCs w:val="24"/>
-                <w:lang w:val="en-AU"/>
-              </w:rPr>
-              <w:t>Streamlit</w:t>
-            </w:r>
-            <w:proofErr w:type="spellEnd"/>
-            <w:r>
-              <w:rPr>
-                <w:rFonts w:ascii="Times New Roman" w:eastAsia="Times New Roman" w:hAnsi="Times New Roman" w:cs="Times New Roman"/>
-                <w:sz w:val="24"/>
-                <w:szCs w:val="24"/>
-                <w:lang w:val="en-AU"/>
-              </w:rPr>
-              <w:t xml:space="preserve"> Community Cloud; </w:t>
+              <w:t xml:space="preserve"> deploy to Streamlit Community Cloud; </w:t>
             </w:r>
             <w:r>
               <w:rPr>
@@ -10300,7 +10100,6 @@
               </w:rPr>
               <w:t xml:space="preserve">Cleans, merges and </w:t>
             </w:r>
-            <w:proofErr w:type="gramStart"/>
             <w:r>
               <w:rPr>
                 <w:rFonts w:ascii="Times New Roman" w:eastAsia="Times New Roman" w:hAnsi="Times New Roman" w:cs="Times New Roman"/>
@@ -10310,7 +10109,6 @@
               </w:rPr>
               <w:t>engineers</w:t>
             </w:r>
-            <w:proofErr w:type="gramEnd"/>
             <w:r>
               <w:rPr>
                 <w:rFonts w:ascii="Times New Roman" w:eastAsia="Times New Roman" w:hAnsi="Times New Roman" w:cs="Times New Roman"/>
@@ -10485,19 +10283,8 @@
                 <w:szCs w:val="24"/>
                 <w:lang w:val="en-AU"/>
               </w:rPr>
-              <w:t xml:space="preserve">Dashboard &amp; </w:t>
-            </w:r>
-            <w:proofErr w:type="gramStart"/>
-            <w:r>
-              <w:rPr>
-                <w:rFonts w:ascii="Times New Roman" w:eastAsia="Times New Roman" w:hAnsi="Times New Roman" w:cs="Times New Roman"/>
-                <w:sz w:val="24"/>
-                <w:szCs w:val="24"/>
-                <w:lang w:val="en-AU"/>
-              </w:rPr>
-              <w:t>Deploy</w:t>
-            </w:r>
-            <w:proofErr w:type="gramEnd"/>
+              <w:t>Dashboard &amp; Deploy</w:t>
+            </w:r>
           </w:p>
         </w:tc>
         <w:tc>
@@ -10525,47 +10312,7 @@
                 <w:szCs w:val="24"/>
                 <w:lang w:val="en-AU"/>
               </w:rPr>
-              <w:t xml:space="preserve">Builds the </w:t>
-            </w:r>
-            <w:proofErr w:type="spellStart"/>
-            <w:r>
-              <w:rPr>
-                <w:rFonts w:ascii="Times New Roman" w:eastAsia="Times New Roman" w:hAnsi="Times New Roman" w:cs="Times New Roman"/>
-                <w:sz w:val="24"/>
-                <w:szCs w:val="24"/>
-                <w:lang w:val="en-AU"/>
-              </w:rPr>
-              <w:t>Streamlit</w:t>
-            </w:r>
-            <w:proofErr w:type="spellEnd"/>
-            <w:r>
-              <w:rPr>
-                <w:rFonts w:ascii="Times New Roman" w:eastAsia="Times New Roman" w:hAnsi="Times New Roman" w:cs="Times New Roman"/>
-                <w:sz w:val="24"/>
-                <w:szCs w:val="24"/>
-                <w:lang w:val="en-AU"/>
-              </w:rPr>
-              <w:t xml:space="preserve"> dashboard and manages its deployment and redeployment via </w:t>
-            </w:r>
-            <w:proofErr w:type="spellStart"/>
-            <w:r>
-              <w:rPr>
-                <w:rFonts w:ascii="Times New Roman" w:eastAsia="Times New Roman" w:hAnsi="Times New Roman" w:cs="Times New Roman"/>
-                <w:sz w:val="24"/>
-                <w:szCs w:val="24"/>
-                <w:lang w:val="en-AU"/>
-              </w:rPr>
-              <w:t>Streamlit</w:t>
-            </w:r>
-            <w:proofErr w:type="spellEnd"/>
-            <w:r>
-              <w:rPr>
-                <w:rFonts w:ascii="Times New Roman" w:eastAsia="Times New Roman" w:hAnsi="Times New Roman" w:cs="Times New Roman"/>
-                <w:sz w:val="24"/>
-                <w:szCs w:val="24"/>
-                <w:lang w:val="en-AU"/>
-              </w:rPr>
-              <w:t xml:space="preserve"> Community Cloud.</w:t>
+              <w:t>Builds the Streamlit dashboard and manages its deployment and redeployment via Streamlit Community Cloud.</w:t>
             </w:r>
           </w:p>
         </w:tc>
@@ -10682,25 +10429,7 @@
           <w:sz w:val="24"/>
           <w:szCs w:val="24"/>
         </w:rPr>
-        <w:t xml:space="preserve"> from PROMIS to </w:t>
-      </w:r>
-      <w:proofErr w:type="spellStart"/>
-      <w:r>
-        <w:rPr>
-          <w:rFonts w:ascii="Times New Roman" w:eastAsia="Times New Roman" w:hAnsi="Times New Roman"/>
-          <w:sz w:val="24"/>
-          <w:szCs w:val="24"/>
-        </w:rPr>
-        <w:t>SerPro</w:t>
-      </w:r>
-      <w:proofErr w:type="spellEnd"/>
-      <w:r>
-        <w:rPr>
-          <w:rFonts w:ascii="Times New Roman" w:eastAsia="Times New Roman" w:hAnsi="Times New Roman"/>
-          <w:sz w:val="24"/>
-          <w:szCs w:val="24"/>
-        </w:rPr>
-        <w:t xml:space="preserve"> in November 2023 and </w:t>
+        <w:t xml:space="preserve"> from PROMIS to SerPro in November 2023 and </w:t>
       </w:r>
       <w:r>
         <w:rPr>
@@ -11138,25 +10867,7 @@
           <w:sz w:val="24"/>
           <w:szCs w:val="24"/>
         </w:rPr>
-        <w:t xml:space="preserve">And the final risk is misuse or misinterpretation of the forecasts. If predictions are read as statements about </w:t>
-      </w:r>
-      <w:proofErr w:type="gramStart"/>
-      <w:r>
-        <w:rPr>
-          <w:rFonts w:ascii="Times New Roman" w:eastAsia="Times New Roman" w:hAnsi="Times New Roman"/>
-          <w:sz w:val="24"/>
-          <w:szCs w:val="24"/>
-        </w:rPr>
-        <w:t>particular communities</w:t>
-      </w:r>
-      <w:proofErr w:type="gramEnd"/>
-      <w:r>
-        <w:rPr>
-          <w:rFonts w:ascii="Times New Roman" w:eastAsia="Times New Roman" w:hAnsi="Times New Roman"/>
-          <w:sz w:val="24"/>
-          <w:szCs w:val="24"/>
-        </w:rPr>
-        <w:t>, the system could cause harm rather than support safety. Small counts in low-population regions could also make incidents identifiable. Forecasts will therefore be shown only at region and month level, with uncertainty ranges, and small values will be suppressed.</w:t>
+        <w:t>And the final risk is misuse or misinterpretation of the forecasts. If predictions are read as statements about particular communities, the system could cause harm rather than support safety. Small counts in low-population regions could also make incidents identifiable. Forecasts will therefore be shown only at region and month level, with uncertainty ranges, and small values will be suppressed.</w:t>
       </w:r>
     </w:p>
     <w:p>
@@ -11760,43 +11471,7 @@
           <w:sz w:val="24"/>
           <w:szCs w:val="24"/>
         </w:rPr>
-        <w:t xml:space="preserve">Carroll, S. R., Garba, I., Figueroa-Rodríguez, O. L., Holbrook, J., Lovett, R., </w:t>
-      </w:r>
-      <w:proofErr w:type="spellStart"/>
-      <w:r>
-        <w:rPr>
-          <w:rFonts w:ascii="Times New Roman" w:eastAsia="Times New Roman" w:hAnsi="Times New Roman"/>
-          <w:sz w:val="24"/>
-          <w:szCs w:val="24"/>
-        </w:rPr>
-        <w:t>Materechera</w:t>
-      </w:r>
-      <w:proofErr w:type="spellEnd"/>
-      <w:r>
-        <w:rPr>
-          <w:rFonts w:ascii="Times New Roman" w:eastAsia="Times New Roman" w:hAnsi="Times New Roman"/>
-          <w:sz w:val="24"/>
-          <w:szCs w:val="24"/>
-        </w:rPr>
-        <w:t xml:space="preserve">, S., Parsons, M., </w:t>
-      </w:r>
-      <w:proofErr w:type="spellStart"/>
-      <w:r>
-        <w:rPr>
-          <w:rFonts w:ascii="Times New Roman" w:eastAsia="Times New Roman" w:hAnsi="Times New Roman"/>
-          <w:sz w:val="24"/>
-          <w:szCs w:val="24"/>
-        </w:rPr>
-        <w:t>Raseroka</w:t>
-      </w:r>
-      <w:proofErr w:type="spellEnd"/>
-      <w:r>
-        <w:rPr>
-          <w:rFonts w:ascii="Times New Roman" w:eastAsia="Times New Roman" w:hAnsi="Times New Roman"/>
-          <w:sz w:val="24"/>
-          <w:szCs w:val="24"/>
-        </w:rPr>
-        <w:t xml:space="preserve">, K., Rodriguez-Lonebear, D., Rowe, R., Sara, R., Walker, J. D., Anderson, J., &amp; Hudson, M. (2020). The CARE Principles for Indigenous Data Governance. Data Science Journal, 19(1), 1–12. </w:t>
+        <w:t xml:space="preserve">Carroll, S. R., Garba, I., Figueroa-Rodríguez, O. L., Holbrook, J., Lovett, R., Materechera, S., Parsons, M., Raseroka, K., Rodriguez-Lonebear, D., Rowe, R., Sara, R., Walker, J. D., Anderson, J., &amp; Hudson, M. (2020). The CARE Principles for Indigenous Data Governance. Data Science Journal, 19(1), 1–12. </w:t>
       </w:r>
       <w:hyperlink r:id="rId23">
         <w:r>
@@ -11881,57 +11556,15 @@
           <w:sz w:val="24"/>
           <w:szCs w:val="24"/>
         </w:rPr>
-        <w:t xml:space="preserve">NT crime </w:t>
-      </w:r>
-      <w:proofErr w:type="gramStart"/>
-      <w:r>
-        <w:rPr>
-          <w:rFonts w:ascii="Times New Roman" w:eastAsia="Times New Roman" w:hAnsi="Times New Roman"/>
-          <w:i/>
-          <w:iCs/>
-          <w:sz w:val="24"/>
-          <w:szCs w:val="24"/>
-        </w:rPr>
-        <w:t>statistics march</w:t>
-      </w:r>
-      <w:proofErr w:type="gramEnd"/>
-      <w:r>
-        <w:rPr>
-          <w:rFonts w:ascii="Times New Roman" w:eastAsia="Times New Roman" w:hAnsi="Times New Roman"/>
-          <w:i/>
-          <w:iCs/>
-          <w:sz w:val="24"/>
-          <w:szCs w:val="24"/>
-        </w:rPr>
-        <w:t xml:space="preserve"> 2026 - NTG open data portal</w:t>
-      </w:r>
-      <w:r>
-        <w:rPr>
-          <w:rFonts w:ascii="Times New Roman" w:eastAsia="Times New Roman" w:hAnsi="Times New Roman"/>
-          <w:sz w:val="24"/>
-          <w:szCs w:val="24"/>
-        </w:rPr>
-        <w:t xml:space="preserve">. </w:t>
-      </w:r>
-      <w:proofErr w:type="spellStart"/>
-      <w:proofErr w:type="gramStart"/>
-      <w:r>
-        <w:rPr>
-          <w:rFonts w:ascii="Times New Roman" w:eastAsia="Times New Roman" w:hAnsi="Times New Roman"/>
-          <w:sz w:val="24"/>
-          <w:szCs w:val="24"/>
-        </w:rPr>
-        <w:t>Nt.Gov.Au</w:t>
-      </w:r>
-      <w:proofErr w:type="spellEnd"/>
-      <w:proofErr w:type="gramEnd"/>
-      <w:r>
-        <w:rPr>
-          <w:rFonts w:ascii="Times New Roman" w:eastAsia="Times New Roman" w:hAnsi="Times New Roman"/>
-          <w:sz w:val="24"/>
-          <w:szCs w:val="24"/>
-        </w:rPr>
-        <w:t xml:space="preserve">. </w:t>
+        <w:t>NT crime statistics march 2026 - NTG open data portal</w:t>
+      </w:r>
+      <w:r>
+        <w:rPr>
+          <w:rFonts w:ascii="Times New Roman" w:eastAsia="Times New Roman" w:hAnsi="Times New Roman"/>
+          <w:sz w:val="24"/>
+          <w:szCs w:val="24"/>
+        </w:rPr>
+        <w:t xml:space="preserve">. Nt.Gov.Au. </w:t>
       </w:r>
       <w:hyperlink r:id="rId25">
         <w:r>
@@ -12011,29 +11644,7 @@
           <w:sz w:val="24"/>
           <w:szCs w:val="24"/>
         </w:rPr>
-        <w:t xml:space="preserve">Operation </w:t>
-      </w:r>
-      <w:proofErr w:type="spellStart"/>
-      <w:r>
-        <w:rPr>
-          <w:rFonts w:ascii="Times New Roman" w:eastAsia="Times New Roman" w:hAnsi="Times New Roman"/>
-          <w:i/>
-          <w:iCs/>
-          <w:sz w:val="24"/>
-          <w:szCs w:val="24"/>
-        </w:rPr>
-        <w:t>ventura</w:t>
-      </w:r>
-      <w:proofErr w:type="spellEnd"/>
-      <w:r>
-        <w:rPr>
-          <w:rFonts w:ascii="Times New Roman" w:eastAsia="Times New Roman" w:hAnsi="Times New Roman"/>
-          <w:i/>
-          <w:iCs/>
-          <w:sz w:val="24"/>
-          <w:szCs w:val="24"/>
-        </w:rPr>
-        <w:t xml:space="preserve"> | NT police, fire &amp; emergency services</w:t>
+        <w:t>Operation ventura | NT police, fire &amp; emergency services</w:t>
       </w:r>
       <w:r>
         <w:rPr>
@@ -14348,25 +13959,7 @@
           <w:sz w:val="24"/>
           <w:szCs w:val="24"/>
         </w:rPr>
-        <w:t xml:space="preserve">It is retained as </w:t>
-      </w:r>
-      <w:proofErr w:type="spellStart"/>
-      <w:r>
-        <w:rPr>
-          <w:rFonts w:ascii="Times New Roman" w:eastAsia="Times New Roman" w:hAnsi="Times New Roman"/>
-          <w:sz w:val="24"/>
-          <w:szCs w:val="24"/>
-        </w:rPr>
-        <w:t>NaN</w:t>
-      </w:r>
-      <w:proofErr w:type="spellEnd"/>
-      <w:r>
-        <w:rPr>
-          <w:rFonts w:ascii="Times New Roman" w:eastAsia="Times New Roman" w:hAnsi="Times New Roman"/>
-          <w:sz w:val="24"/>
-          <w:szCs w:val="24"/>
-        </w:rPr>
-        <w:t xml:space="preserve"> and never imputed.</w:t>
+        <w:t>It is retained as NaN and never imputed.</w:t>
       </w:r>
     </w:p>
     <w:p>
@@ -14727,23 +14320,13 @@
           <w:szCs w:val="24"/>
         </w:rPr>
       </w:pPr>
-      <w:proofErr w:type="spellStart"/>
-      <w:r>
-        <w:rPr>
-          <w:rFonts w:ascii="Times New Roman" w:eastAsia="Times New Roman" w:hAnsi="Times New Roman"/>
-          <w:sz w:val="24"/>
-          <w:szCs w:val="24"/>
-        </w:rPr>
-        <w:t>Nhulunbuy</w:t>
-      </w:r>
-      <w:proofErr w:type="spellEnd"/>
-      <w:r>
-        <w:rPr>
-          <w:rFonts w:ascii="Times New Roman" w:eastAsia="Times New Roman" w:hAnsi="Times New Roman"/>
-          <w:sz w:val="24"/>
-          <w:szCs w:val="24"/>
-        </w:rPr>
-        <w:t xml:space="preserve"> </w:t>
+      <w:r>
+        <w:rPr>
+          <w:rFonts w:ascii="Times New Roman" w:eastAsia="Times New Roman" w:hAnsi="Times New Roman"/>
+          <w:sz w:val="24"/>
+          <w:szCs w:val="24"/>
+        </w:rPr>
+        <w:t xml:space="preserve">Nhulunbuy </w:t>
       </w:r>
       <w:r>
         <w:rPr>
@@ -15050,25 +14633,7 @@
           <w:sz w:val="24"/>
           <w:szCs w:val="24"/>
         </w:rPr>
-        <w:t xml:space="preserve">Any </w:t>
-      </w:r>
-      <w:proofErr w:type="spellStart"/>
-      <w:r>
-        <w:rPr>
-          <w:rFonts w:ascii="Times New Roman" w:eastAsia="Times New Roman" w:hAnsi="Times New Roman"/>
-          <w:sz w:val="24"/>
-          <w:szCs w:val="24"/>
-        </w:rPr>
-        <w:t>unrecognised</w:t>
-      </w:r>
-      <w:proofErr w:type="spellEnd"/>
-      <w:r>
-        <w:rPr>
-          <w:rFonts w:ascii="Times New Roman" w:eastAsia="Times New Roman" w:hAnsi="Times New Roman"/>
-          <w:sz w:val="24"/>
-          <w:szCs w:val="24"/>
-        </w:rPr>
-        <w:t xml:space="preserve"> SA2 </w:t>
+        <w:t xml:space="preserve">Any unrecognised SA2 </w:t>
       </w:r>
       <w:r>
         <w:rPr>
@@ -15259,23 +14824,13 @@
         </w:rPr>
         <w:t>Data trimmed to the 2015-2025 a</w:t>
       </w:r>
-      <w:proofErr w:type="spellStart"/>
-      <w:r>
-        <w:rPr>
-          <w:rFonts w:ascii="Times New Roman" w:eastAsia="Times New Roman" w:hAnsi="Times New Roman"/>
-          <w:sz w:val="24"/>
-          <w:szCs w:val="24"/>
-        </w:rPr>
-        <w:t>nalysis</w:t>
-      </w:r>
-      <w:proofErr w:type="spellEnd"/>
-      <w:r>
-        <w:rPr>
-          <w:rFonts w:ascii="Times New Roman" w:eastAsia="Times New Roman" w:hAnsi="Times New Roman"/>
-          <w:sz w:val="24"/>
-          <w:szCs w:val="24"/>
-        </w:rPr>
-        <w:t xml:space="preserve"> window </w:t>
+      <w:r>
+        <w:rPr>
+          <w:rFonts w:ascii="Times New Roman" w:eastAsia="Times New Roman" w:hAnsi="Times New Roman"/>
+          <w:sz w:val="24"/>
+          <w:szCs w:val="24"/>
+        </w:rPr>
+        <w:t xml:space="preserve">nalysis window </w:t>
       </w:r>
       <w:r>
         <w:rPr>
@@ -15584,25 +15139,7 @@
           <w:sz w:val="24"/>
           <w:szCs w:val="24"/>
         </w:rPr>
-        <w:t xml:space="preserve">2022 remain </w:t>
-      </w:r>
-      <w:proofErr w:type="spellStart"/>
-      <w:r>
-        <w:rPr>
-          <w:rFonts w:ascii="Times New Roman" w:eastAsia="Times New Roman" w:hAnsi="Times New Roman"/>
-          <w:sz w:val="24"/>
-          <w:szCs w:val="24"/>
-        </w:rPr>
-        <w:t>NaN</w:t>
-      </w:r>
-      <w:proofErr w:type="spellEnd"/>
-      <w:r>
-        <w:rPr>
-          <w:rFonts w:ascii="Times New Roman" w:eastAsia="Times New Roman" w:hAnsi="Times New Roman"/>
-          <w:sz w:val="24"/>
-          <w:szCs w:val="24"/>
-        </w:rPr>
-        <w:t xml:space="preserve"> by design</w:t>
+        <w:t>2022 remain NaN by design</w:t>
       </w:r>
       <w:r>
         <w:rPr>
@@ -15884,18 +15421,8 @@
                 <w:sz w:val="24"/>
                 <w:szCs w:val="24"/>
               </w:rPr>
-              <w:t xml:space="preserve">2022 PAC </w:t>
-            </w:r>
-            <w:proofErr w:type="spellStart"/>
-            <w:r>
-              <w:rPr>
-                <w:rFonts w:ascii="Times New Roman" w:eastAsia="Times New Roman" w:hAnsi="Times New Roman"/>
-                <w:sz w:val="24"/>
-                <w:szCs w:val="24"/>
-              </w:rPr>
-              <w:t>NaN</w:t>
-            </w:r>
-            <w:proofErr w:type="spellEnd"/>
+              <w:t>2022 PAC NaN</w:t>
+            </w:r>
           </w:p>
         </w:tc>
       </w:tr>
@@ -16137,41 +15664,13 @@
                 <w:szCs w:val="24"/>
               </w:rPr>
             </w:pPr>
-            <w:proofErr w:type="spellStart"/>
             <w:r>
               <w:rPr>
                 <w:rFonts w:ascii="Times New Roman" w:eastAsia="Times New Roman" w:hAnsi="Times New Roman"/>
                 <w:sz w:val="24"/>
                 <w:szCs w:val="24"/>
               </w:rPr>
-              <w:t>Assault_offences</w:t>
-            </w:r>
-            <w:proofErr w:type="spellEnd"/>
-            <w:r>
-              <w:rPr>
-                <w:rFonts w:ascii="Times New Roman" w:eastAsia="Times New Roman" w:hAnsi="Times New Roman"/>
-                <w:sz w:val="24"/>
-                <w:szCs w:val="24"/>
-              </w:rPr>
-              <w:t xml:space="preserve"> / </w:t>
-            </w:r>
-            <w:proofErr w:type="spellStart"/>
-            <w:r>
-              <w:rPr>
-                <w:rFonts w:ascii="Times New Roman" w:eastAsia="Times New Roman" w:hAnsi="Times New Roman"/>
-                <w:sz w:val="24"/>
-                <w:szCs w:val="24"/>
-              </w:rPr>
-              <w:t>Total_population</w:t>
-            </w:r>
-            <w:proofErr w:type="spellEnd"/>
-            <w:r>
-              <w:rPr>
-                <w:rFonts w:ascii="Times New Roman" w:eastAsia="Times New Roman" w:hAnsi="Times New Roman"/>
-                <w:sz w:val="24"/>
-                <w:szCs w:val="24"/>
-              </w:rPr>
-              <w:t xml:space="preserve"> x 100,000</w:t>
+              <w:t>Assault_offences / Total_population x 100,000</w:t>
             </w:r>
           </w:p>
         </w:tc>
@@ -16242,7 +15741,6 @@
                 <w:szCs w:val="24"/>
               </w:rPr>
             </w:pPr>
-            <w:proofErr w:type="spellStart"/>
             <w:r>
               <w:rPr>
                 <w:rFonts w:ascii="Times New Roman" w:eastAsia="Times New Roman" w:hAnsi="Times New Roman"/>
@@ -16251,7 +15749,6 @@
               </w:rPr>
               <w:t>Alcohol_per_capita</w:t>
             </w:r>
-            <w:proofErr w:type="spellEnd"/>
           </w:p>
         </w:tc>
         <w:tc>
@@ -16269,34 +15766,14 @@
                 <w:szCs w:val="24"/>
               </w:rPr>
             </w:pPr>
-            <w:proofErr w:type="spellStart"/>
             <w:r>
               <w:rPr>
                 <w:rFonts w:ascii="Times New Roman" w:eastAsia="Times New Roman" w:hAnsi="Times New Roman"/>
                 <w:sz w:val="24"/>
                 <w:szCs w:val="24"/>
               </w:rPr>
-              <w:t>Total_PAC</w:t>
-            </w:r>
-            <w:proofErr w:type="spellEnd"/>
-            <w:r>
-              <w:rPr>
-                <w:rFonts w:ascii="Times New Roman" w:eastAsia="Times New Roman" w:hAnsi="Times New Roman"/>
-                <w:sz w:val="24"/>
-                <w:szCs w:val="24"/>
-              </w:rPr>
-              <w:t xml:space="preserve"> / </w:t>
-            </w:r>
-            <w:proofErr w:type="spellStart"/>
-            <w:r>
-              <w:rPr>
-                <w:rFonts w:ascii="Times New Roman" w:eastAsia="Times New Roman" w:hAnsi="Times New Roman"/>
-                <w:sz w:val="24"/>
-                <w:szCs w:val="24"/>
-              </w:rPr>
-              <w:t>Total_population</w:t>
-            </w:r>
-            <w:proofErr w:type="spellEnd"/>
+              <w:t>Total_PAC / Total_population</w:t>
+            </w:r>
           </w:p>
         </w:tc>
         <w:tc>
@@ -16418,23 +15895,13 @@
           <w:szCs w:val="18"/>
         </w:rPr>
       </w:pPr>
-      <w:proofErr w:type="spellStart"/>
       <w:r>
         <w:rPr>
           <w:rStyle w:val="normaltextrun"/>
           <w:b/>
           <w:bCs/>
         </w:rPr>
-        <w:t>Log_assault_rate</w:t>
-      </w:r>
-      <w:proofErr w:type="spellEnd"/>
-      <w:r>
-        <w:rPr>
-          <w:rStyle w:val="normaltextrun"/>
-          <w:b/>
-          <w:bCs/>
-        </w:rPr>
-        <w:t>:</w:t>
+        <w:t>Log_assault_rate:</w:t>
       </w:r>
     </w:p>
     <w:p>
@@ -16453,49 +15920,7 @@
         <w:rPr>
           <w:rStyle w:val="normaltextrun"/>
         </w:rPr>
-        <w:t xml:space="preserve">Since the crime rate is not normally distributed but rather follows a </w:t>
-      </w:r>
-      <w:proofErr w:type="gramStart"/>
-      <w:r>
-        <w:rPr>
-          <w:rStyle w:val="normaltextrun"/>
-        </w:rPr>
-        <w:t>log</w:t>
-      </w:r>
-      <w:proofErr w:type="gramEnd"/>
-      <w:r>
-        <w:rPr>
-          <w:rStyle w:val="normaltextrun"/>
-        </w:rPr>
-        <w:t>-normal distribution (heavily right-skewed) due to seasonality characteristics. By transforming the assault rate logarithmically, we aim to </w:t>
-      </w:r>
-      <w:proofErr w:type="spellStart"/>
-      <w:r>
-        <w:rPr>
-          <w:rStyle w:val="normaltextrun"/>
-        </w:rPr>
-        <w:t>stabilise</w:t>
-      </w:r>
-      <w:proofErr w:type="spellEnd"/>
-      <w:r>
-        <w:rPr>
-          <w:rStyle w:val="normaltextrun"/>
-        </w:rPr>
-        <w:t> the distribution, making it symmetrical which is essential for good performance of linear regression </w:t>
-      </w:r>
-      <w:proofErr w:type="gramStart"/>
-      <w:r>
-        <w:rPr>
-          <w:rStyle w:val="normaltextrun"/>
-        </w:rPr>
-        <w:t>models(</w:t>
-      </w:r>
-      <w:proofErr w:type="gramEnd"/>
-      <w:r>
-        <w:rPr>
-          <w:rStyle w:val="normaltextrun"/>
-        </w:rPr>
-        <w:t>Limpert et al., 2001)</w:t>
+        <w:t>Since the crime rate is not normally distributed but rather follows a log-normal distribution (heavily right-skewed) due to seasonality characteristics. By transforming the assault rate logarithmically, we aim to stabilise the distribution, making it symmetrical which is essential for good performance of linear regression models(Limpert et al., 2001)</w:t>
       </w:r>
     </w:p>
     <w:p>
@@ -16512,41 +15937,13 @@
           <w:szCs w:val="18"/>
         </w:rPr>
       </w:pPr>
-      <w:proofErr w:type="spellStart"/>
       <w:r>
         <w:rPr>
           <w:rStyle w:val="normaltextrun"/>
           <w:b/>
           <w:bCs/>
         </w:rPr>
-        <w:t>Sin_month</w:t>
-      </w:r>
-      <w:proofErr w:type="spellEnd"/>
-      <w:r>
-        <w:rPr>
-          <w:rStyle w:val="normaltextrun"/>
-          <w:b/>
-          <w:bCs/>
-        </w:rPr>
-        <w:t> and </w:t>
-      </w:r>
-      <w:proofErr w:type="spellStart"/>
-      <w:r>
-        <w:rPr>
-          <w:rStyle w:val="normaltextrun"/>
-          <w:b/>
-          <w:bCs/>
-        </w:rPr>
-        <w:t>cos_month</w:t>
-      </w:r>
-      <w:proofErr w:type="spellEnd"/>
-      <w:r>
-        <w:rPr>
-          <w:rStyle w:val="normaltextrun"/>
-          <w:b/>
-          <w:bCs/>
-        </w:rPr>
-        <w:t>:</w:t>
+        <w:t>Sin_month and cos_month:</w:t>
       </w:r>
     </w:p>
     <w:p>
@@ -16565,21 +15962,7 @@
         <w:rPr>
           <w:rStyle w:val="normaltextrun"/>
         </w:rPr>
-        <w:t>To preserve the cyclic </w:t>
-      </w:r>
-      <w:proofErr w:type="spellStart"/>
-      <w:r>
-        <w:rPr>
-          <w:rStyle w:val="normaltextrun"/>
-        </w:rPr>
-        <w:t>behaviours</w:t>
-      </w:r>
-      <w:proofErr w:type="spellEnd"/>
-      <w:r>
-        <w:rPr>
-          <w:rStyle w:val="normaltextrun"/>
-        </w:rPr>
-        <w:t> of months, sine and cosine functions are applied to represent time since these trigonometric functions pursue cycles between “top” and “bottom” and have a settled cycle length which is perfect for modelling regular cycles such as months (Lindsey and Pavur, 2005)</w:t>
+        <w:t>To preserve the cyclic behaviours of months, sine and cosine functions are applied to represent time since these trigonometric functions pursue cycles between “top” and “bottom” and have a settled cycle length which is perfect for modelling regular cycles such as months (Lindsey and Pavur, 2005)</w:t>
       </w:r>
     </w:p>
     <w:p>
@@ -16638,23 +16021,13 @@
           <w:szCs w:val="18"/>
         </w:rPr>
       </w:pPr>
-      <w:proofErr w:type="spellStart"/>
       <w:r>
         <w:rPr>
           <w:rStyle w:val="normaltextrun"/>
           <w:b/>
           <w:bCs/>
         </w:rPr>
-        <w:t>is_new_year</w:t>
-      </w:r>
-      <w:proofErr w:type="spellEnd"/>
-      <w:r>
-        <w:rPr>
-          <w:rStyle w:val="normaltextrun"/>
-          <w:b/>
-          <w:bCs/>
-        </w:rPr>
-        <w:t>:</w:t>
+        <w:t>is_new_year:</w:t>
       </w:r>
     </w:p>
     <w:p>
@@ -16674,21 +16047,7 @@
         <w:rPr>
           <w:rStyle w:val="normaltextrun"/>
         </w:rPr>
-        <w:t>According to research by Baird </w:t>
-      </w:r>
-      <w:proofErr w:type="gramStart"/>
-      <w:r>
-        <w:rPr>
-          <w:rStyle w:val="normaltextrun"/>
-        </w:rPr>
-        <w:t>et al. ,</w:t>
-      </w:r>
-      <w:proofErr w:type="gramEnd"/>
-      <w:r>
-        <w:rPr>
-          <w:rStyle w:val="normaltextrun"/>
-        </w:rPr>
-        <w:t> (2019), the homicide rate experiences a significant spike on New Year’s Day. Therefore, this feature is added to capture this valuable information.</w:t>
+        <w:t>According to research by Baird et al. , (2019), the homicide rate experiences a significant spike on New Year’s Day. Therefore, this feature is added to capture this valuable information.</w:t>
       </w:r>
     </w:p>
     <w:p>
@@ -17186,27 +16545,7 @@
           <w:szCs w:val="24"/>
           <w:lang w:val="en-AU" w:eastAsia="ja-JP"/>
         </w:rPr>
-        <w:t xml:space="preserve">Applying PCA to the regional age structure allows the model to condense </w:t>
-      </w:r>
-      <w:proofErr w:type="gramStart"/>
-      <w:r>
-        <w:rPr>
-          <w:rFonts w:ascii="Times New Roman" w:eastAsia="Times New Roman" w:hAnsi="Times New Roman" w:cs="Times New Roman"/>
-          <w:sz w:val="24"/>
-          <w:szCs w:val="24"/>
-          <w:lang w:val="en-AU" w:eastAsia="ja-JP"/>
-        </w:rPr>
-        <w:t>a large number of</w:t>
-      </w:r>
-      <w:proofErr w:type="gramEnd"/>
-      <w:r>
-        <w:rPr>
-          <w:rFonts w:ascii="Times New Roman" w:eastAsia="Times New Roman" w:hAnsi="Times New Roman" w:cs="Times New Roman"/>
-          <w:sz w:val="24"/>
-          <w:szCs w:val="24"/>
-          <w:lang w:val="en-AU" w:eastAsia="ja-JP"/>
-        </w:rPr>
-        <w:t xml:space="preserve"> correlated demographic variables into a small set of orthogonal components that capture the dominant patterns in the data. This compression substantially reduces the dimensionality of the feature space, which in turn lowers computational cost, speeds up model training, and minimises the risk of overfitting. Importantly, PCA preserves most of the original variance, meaning that the transformed components retain the essential information needed for prediction while discarding noise and redundancy. As Mishra et al. (2017) highlight, PCA is particularly effective when dealing with demographic or socioeconomic variables that tend to move together, making it a suitable technique for simplifying age</w:t>
+        <w:t>Applying PCA to the regional age structure allows the model to condense a large number of correlated demographic variables into a small set of orthogonal components that capture the dominant patterns in the data. This compression substantially reduces the dimensionality of the feature space, which in turn lowers computational cost, speeds up model training, and minimises the risk of overfitting. Importantly, PCA preserves most of the original variance, meaning that the transformed components retain the essential information needed for prediction while discarding noise and redundancy. As Mishra et al. (2017) highlight, PCA is particularly effective when dealing with demographic or socioeconomic variables that tend to move together, making it a suitable technique for simplifying age</w:t>
       </w:r>
       <w:r>
         <w:rPr>
@@ -17411,23 +16750,7 @@
           <w:rStyle w:val="normaltextrun"/>
           <w:lang w:val="en-AU"/>
         </w:rPr>
-        <w:t xml:space="preserve"> 30. High multicollinear features are known to have a negative effect on the regression model by hampering the interpretability of model predictors and resulting in highly volatile coefficient estimates (</w:t>
-      </w:r>
-      <w:proofErr w:type="spellStart"/>
-      <w:r>
-        <w:rPr>
-          <w:rStyle w:val="normaltextrun"/>
-          <w:lang w:val="en-AU"/>
-        </w:rPr>
-        <w:t>Dertli</w:t>
-      </w:r>
-      <w:proofErr w:type="spellEnd"/>
-      <w:r>
-        <w:rPr>
-          <w:rStyle w:val="normaltextrun"/>
-          <w:lang w:val="en-AU"/>
-        </w:rPr>
-        <w:t> et al., 2024).</w:t>
+        <w:t xml:space="preserve"> 30. High multicollinear features are known to have a negative effect on the regression model by hampering the interpretability of model predictors and resulting in highly volatile coefficient estimates (Dertli et al., 2024).</w:t>
       </w:r>
     </w:p>
     <w:p>
@@ -17509,43 +16832,7 @@
           <w:sz w:val="24"/>
           <w:szCs w:val="24"/>
         </w:rPr>
-        <w:t xml:space="preserve">Across all models tested, Linear Regression delivered the strongest performance, achieving the lowest </w:t>
-      </w:r>
-      <w:proofErr w:type="gramStart"/>
-      <w:r>
-        <w:rPr>
-          <w:rFonts w:ascii="Times New Roman" w:eastAsia="Times New Roman" w:hAnsi="Times New Roman"/>
-          <w:sz w:val="24"/>
-          <w:szCs w:val="24"/>
-        </w:rPr>
-        <w:t>RMSE(</w:t>
-      </w:r>
-      <w:proofErr w:type="gramEnd"/>
-      <w:r>
-        <w:rPr>
-          <w:rFonts w:ascii="Times New Roman" w:eastAsia="Times New Roman" w:hAnsi="Times New Roman"/>
-          <w:sz w:val="24"/>
-          <w:szCs w:val="24"/>
-        </w:rPr>
-        <w:t xml:space="preserve">log) and RMSE on the original scale, indicating that the relationship between predictors and assault rates is predominantly linear and stable. Regularised models (Ridge and Lasso) showed slightly higher error and progressively smaller </w:t>
-      </w:r>
-      <w:proofErr w:type="spellStart"/>
-      <w:r>
-        <w:rPr>
-          <w:rFonts w:ascii="Times New Roman" w:eastAsia="Times New Roman" w:hAnsi="Times New Roman"/>
-          <w:sz w:val="24"/>
-          <w:szCs w:val="24"/>
-        </w:rPr>
-        <w:t>alcohol_per_capita</w:t>
-      </w:r>
-      <w:proofErr w:type="spellEnd"/>
-      <w:r>
-        <w:rPr>
-          <w:rFonts w:ascii="Times New Roman" w:eastAsia="Times New Roman" w:hAnsi="Times New Roman"/>
-          <w:sz w:val="24"/>
-          <w:szCs w:val="24"/>
-        </w:rPr>
-        <w:t xml:space="preserve"> coefficients, suggesting that this variable contributes only modestly once collinearity is controlled. Lasso’s near</w:t>
+        <w:t>Across all models tested, Linear Regression delivered the strongest performance, achieving the lowest RMSE(log) and RMSE on the original scale, indicating that the relationship between predictors and assault rates is predominantly linear and stable. Regularised models (Ridge and Lasso) showed slightly higher error and progressively smaller alcohol_per_capita coefficients, suggesting that this variable contributes only modestly once collinearity is controlled. Lasso’s near</w:t>
       </w:r>
       <w:r>
         <w:rPr>
@@ -17554,25 +16841,7 @@
           <w:szCs w:val="24"/>
         </w:rPr>
         <w:noBreakHyphen/>
-        <w:t xml:space="preserve">zero coefficient further implies that alcohol supply is a weak predictor relative to other socioeconomic factors. </w:t>
-      </w:r>
-      <w:proofErr w:type="spellStart"/>
-      <w:r>
-        <w:rPr>
-          <w:rFonts w:ascii="Times New Roman" w:eastAsia="Times New Roman" w:hAnsi="Times New Roman"/>
-          <w:sz w:val="24"/>
-          <w:szCs w:val="24"/>
-        </w:rPr>
-        <w:t>XGBoost</w:t>
-      </w:r>
-      <w:proofErr w:type="spellEnd"/>
-      <w:r>
-        <w:rPr>
-          <w:rFonts w:ascii="Times New Roman" w:eastAsia="Times New Roman" w:hAnsi="Times New Roman"/>
-          <w:sz w:val="24"/>
-          <w:szCs w:val="24"/>
-        </w:rPr>
-        <w:t xml:space="preserve"> performed worse than the linear models, reinforcing that the dataset does not contain strong nonlinear interactions for tree</w:t>
+        <w:t>zero coefficient further implies that alcohol supply is a weak predictor relative to other socioeconomic factors. XGBoost performed worse than the linear models, reinforcing that the dataset does not contain strong nonlinear interactions for tree</w:t>
       </w:r>
       <w:r>
         <w:rPr>
@@ -17583,7 +16852,6 @@
         <w:noBreakHyphen/>
         <w:t xml:space="preserve">based methods to exploit. Overall, </w:t>
       </w:r>
-      <w:proofErr w:type="spellStart"/>
       <w:r>
         <w:rPr>
           <w:rFonts w:ascii="Times New Roman" w:eastAsia="Times New Roman" w:hAnsi="Times New Roman"/>
@@ -17591,16 +16859,7 @@
           <w:szCs w:val="24"/>
         </w:rPr>
         <w:lastRenderedPageBreak/>
-        <w:t>alcohol_per_capita</w:t>
-      </w:r>
-      <w:proofErr w:type="spellEnd"/>
-      <w:r>
-        <w:rPr>
-          <w:rFonts w:ascii="Times New Roman" w:eastAsia="Times New Roman" w:hAnsi="Times New Roman"/>
-          <w:sz w:val="24"/>
-          <w:szCs w:val="24"/>
-        </w:rPr>
-        <w:t xml:space="preserve"> exhibits a consistent but small positive association with assault rates, and simpler linear models remain the most appropriate for this modelling </w:t>
+        <w:t xml:space="preserve">alcohol_per_capita exhibits a consistent but small positive association with assault rates, and simpler linear models remain the most appropriate for this modelling </w:t>
       </w:r>
       <w:r>
         <w:rPr>
@@ -18193,27 +17452,7 @@
                 <w:szCs w:val="24"/>
                 <w:lang w:val="en-AU"/>
               </w:rPr>
-              <w:t xml:space="preserve">GitHub repository with README; </w:t>
-            </w:r>
-            <w:proofErr w:type="spellStart"/>
-            <w:r>
-              <w:rPr>
-                <w:rFonts w:ascii="Times New Roman" w:eastAsia="Times New Roman" w:hAnsi="Times New Roman" w:cs="Times New Roman"/>
-                <w:sz w:val="24"/>
-                <w:szCs w:val="24"/>
-                <w:lang w:val="en-AU"/>
-              </w:rPr>
-              <w:t>Streamlit</w:t>
-            </w:r>
-            <w:proofErr w:type="spellEnd"/>
-            <w:r>
-              <w:rPr>
-                <w:rFonts w:ascii="Times New Roman" w:eastAsia="Times New Roman" w:hAnsi="Times New Roman" w:cs="Times New Roman"/>
-                <w:sz w:val="24"/>
-                <w:szCs w:val="24"/>
-                <w:lang w:val="en-AU"/>
-              </w:rPr>
-              <w:t xml:space="preserve"> account set up; draft problem statement</w:t>
+              <w:t>GitHub repository with README; Streamlit account set up; draft problem statement</w:t>
             </w:r>
           </w:p>
         </w:tc>
@@ -19649,47 +18888,7 @@
                 <w:szCs w:val="24"/>
                 <w:lang w:val="en-AU"/>
               </w:rPr>
-              <w:t xml:space="preserve">Incorporate feedback; finalise </w:t>
-            </w:r>
-            <w:proofErr w:type="gramStart"/>
-            <w:r>
-              <w:rPr>
-                <w:rFonts w:ascii="Times New Roman" w:eastAsia="Times New Roman" w:hAnsi="Times New Roman" w:cs="Times New Roman"/>
-                <w:sz w:val="24"/>
-                <w:szCs w:val="24"/>
-                <w:lang w:val="en-AU"/>
-              </w:rPr>
-              <w:t>dashboard;  deploy</w:t>
-            </w:r>
-            <w:proofErr w:type="gramEnd"/>
-            <w:r>
-              <w:rPr>
-                <w:rFonts w:ascii="Times New Roman" w:eastAsia="Times New Roman" w:hAnsi="Times New Roman" w:cs="Times New Roman"/>
-                <w:sz w:val="24"/>
-                <w:szCs w:val="24"/>
-                <w:lang w:val="en-AU"/>
-              </w:rPr>
-              <w:t xml:space="preserve"> to </w:t>
-            </w:r>
-            <w:proofErr w:type="spellStart"/>
-            <w:r>
-              <w:rPr>
-                <w:rFonts w:ascii="Times New Roman" w:eastAsia="Times New Roman" w:hAnsi="Times New Roman" w:cs="Times New Roman"/>
-                <w:sz w:val="24"/>
-                <w:szCs w:val="24"/>
-                <w:lang w:val="en-AU"/>
-              </w:rPr>
-              <w:t>Streamlit</w:t>
-            </w:r>
-            <w:proofErr w:type="spellEnd"/>
-            <w:r>
-              <w:rPr>
-                <w:rFonts w:ascii="Times New Roman" w:eastAsia="Times New Roman" w:hAnsi="Times New Roman" w:cs="Times New Roman"/>
-                <w:sz w:val="24"/>
-                <w:szCs w:val="24"/>
-                <w:lang w:val="en-AU"/>
-              </w:rPr>
-              <w:t xml:space="preserve"> Community Cloud; implement monitoring and retraining logic</w:t>
+              <w:t>Incorporate feedback; finalise dashboard;  deploy to Streamlit Community Cloud; implement monitoring and retraining logic</w:t>
             </w:r>
           </w:p>
         </w:tc>
@@ -20174,21 +19373,7 @@
         <w:rPr>
           <w:rStyle w:val="normaltextrun"/>
         </w:rPr>
-        <w:t>Potential risks, including data quality issues, ethical concerns, and technical challenges, will be continuously monitored throughout the project. Mitigation strategies such as data validation procedures, adherence to ethical guidelines, and regular system testing will be implemented to </w:t>
-      </w:r>
-      <w:proofErr w:type="spellStart"/>
-      <w:r>
-        <w:rPr>
-          <w:rStyle w:val="normaltextrun"/>
-        </w:rPr>
-        <w:t>minimise</w:t>
-      </w:r>
-      <w:proofErr w:type="spellEnd"/>
-      <w:r>
-        <w:rPr>
-          <w:rStyle w:val="normaltextrun"/>
-        </w:rPr>
-        <w:t> their impact. Risks will be reviewed periodically, and corrective actions will be taken promptly to ensure project objectives are achieved successfully.</w:t>
+        <w:t>Potential risks, including data quality issues, ethical concerns, and technical challenges, will be continuously monitored throughout the project. Mitigation strategies such as data validation procedures, adherence to ethical guidelines, and regular system testing will be implemented to minimise their impact. Risks will be reviewed periodically, and corrective actions will be taken promptly to ensure project objectives are achieved successfully.</w:t>
       </w:r>
     </w:p>
     <w:p>
@@ -20261,21 +19446,7 @@
         <w:rPr>
           <w:rStyle w:val="normaltextrun"/>
         </w:rPr>
-        <w:t>The project continues to respect Indigenous Data Sovereignty principles by </w:t>
-      </w:r>
-      <w:proofErr w:type="spellStart"/>
-      <w:r>
-        <w:rPr>
-          <w:rStyle w:val="normaltextrun"/>
-        </w:rPr>
-        <w:t>recognising</w:t>
-      </w:r>
-      <w:proofErr w:type="spellEnd"/>
-      <w:r>
-        <w:rPr>
-          <w:rStyle w:val="normaltextrun"/>
-        </w:rPr>
-        <w:t> the rights of Indigenous communities to govern the collection, ownership, and use of data relating to their people and communities.</w:t>
+        <w:t>The project continues to respect Indigenous Data Sovereignty principles by recognising the rights of Indigenous communities to govern the collection, ownership, and use of data relating to their people and communities.</w:t>
       </w:r>
     </w:p>
     <w:p>
@@ -20293,21 +19464,7 @@
         <w:rPr>
           <w:rStyle w:val="normaltextrun"/>
         </w:rPr>
-        <w:t>In addition, all predictive analytics activities seek to comply with ethical standards to </w:t>
-      </w:r>
-      <w:proofErr w:type="spellStart"/>
-      <w:r>
-        <w:rPr>
-          <w:rStyle w:val="normaltextrun"/>
-        </w:rPr>
-        <w:t>minimise</w:t>
-      </w:r>
-      <w:proofErr w:type="spellEnd"/>
-      <w:r>
-        <w:rPr>
-          <w:rStyle w:val="normaltextrun"/>
-        </w:rPr>
-        <w:t> bias, promote transparency, and support fair decision-making. Forecasting</w:t>
+        <w:t>In addition, all predictive analytics activities seek to comply with ethical standards to minimise bias, promote transparency, and support fair decision-making. Forecasting</w:t>
       </w:r>
       <w:r>
         <w:rPr>
@@ -20425,25 +19582,7 @@
           <w:sz w:val="24"/>
           <w:szCs w:val="24"/>
         </w:rPr>
-        <w:t xml:space="preserve">he transition from PROMIS to </w:t>
-      </w:r>
-      <w:proofErr w:type="spellStart"/>
-      <w:r>
-        <w:rPr>
-          <w:rFonts w:ascii="Times New Roman" w:eastAsia="Times New Roman" w:hAnsi="Times New Roman"/>
-          <w:sz w:val="24"/>
-          <w:szCs w:val="24"/>
-        </w:rPr>
-        <w:t>SerPro</w:t>
-      </w:r>
-      <w:proofErr w:type="spellEnd"/>
-      <w:r>
-        <w:rPr>
-          <w:rFonts w:ascii="Times New Roman" w:eastAsia="Times New Roman" w:hAnsi="Times New Roman"/>
-          <w:sz w:val="24"/>
-          <w:szCs w:val="24"/>
-        </w:rPr>
-        <w:t xml:space="preserve"> in November 2023 and </w:t>
+        <w:t xml:space="preserve">he transition from PROMIS to SerPro in November 2023 and </w:t>
       </w:r>
       <w:r>
         <w:rPr>
@@ -20737,25 +19876,7 @@
           <w:sz w:val="24"/>
           <w:szCs w:val="24"/>
         </w:rPr>
-        <w:t xml:space="preserve">And the final risk is misuse or misinterpretation of the forecasts. If predictions are read as statements about </w:t>
-      </w:r>
-      <w:proofErr w:type="gramStart"/>
-      <w:r>
-        <w:rPr>
-          <w:rFonts w:ascii="Times New Roman" w:eastAsia="Times New Roman" w:hAnsi="Times New Roman"/>
-          <w:sz w:val="24"/>
-          <w:szCs w:val="24"/>
-        </w:rPr>
-        <w:t>particular communities</w:t>
-      </w:r>
-      <w:proofErr w:type="gramEnd"/>
-      <w:r>
-        <w:rPr>
-          <w:rFonts w:ascii="Times New Roman" w:eastAsia="Times New Roman" w:hAnsi="Times New Roman"/>
-          <w:sz w:val="24"/>
-          <w:szCs w:val="24"/>
-        </w:rPr>
-        <w:t>, the system could cause harm rather than support safety. Small counts in low-population regions could also make incidents identifiable. Forecasts will therefore be shown only at region and month level, with uncertainty ranges, and small values will be suppressed.</w:t>
+        <w:t>And the final risk is misuse or misinterpretation of the forecasts. If predictions are read as statements about particular communities, the system could cause harm rather than support safety. Small counts in low-population regions could also make incidents identifiable. Forecasts will therefore be shown only at region and month level, with uncertainty ranges, and small values will be suppressed.</w:t>
       </w:r>
     </w:p>
     <w:p>
@@ -21343,43 +20464,7 @@
           <w:sz w:val="24"/>
           <w:szCs w:val="24"/>
         </w:rPr>
-        <w:t xml:space="preserve">Carroll, S. R., Garba, I., Figueroa-Rodríguez, O. L., Holbrook, J., Lovett, R., </w:t>
-      </w:r>
-      <w:proofErr w:type="spellStart"/>
-      <w:r>
-        <w:rPr>
-          <w:rFonts w:ascii="Times New Roman" w:eastAsia="Times New Roman" w:hAnsi="Times New Roman"/>
-          <w:sz w:val="24"/>
-          <w:szCs w:val="24"/>
-        </w:rPr>
-        <w:t>Materechera</w:t>
-      </w:r>
-      <w:proofErr w:type="spellEnd"/>
-      <w:r>
-        <w:rPr>
-          <w:rFonts w:ascii="Times New Roman" w:eastAsia="Times New Roman" w:hAnsi="Times New Roman"/>
-          <w:sz w:val="24"/>
-          <w:szCs w:val="24"/>
-        </w:rPr>
-        <w:t xml:space="preserve">, S., Parsons, M., </w:t>
-      </w:r>
-      <w:proofErr w:type="spellStart"/>
-      <w:r>
-        <w:rPr>
-          <w:rFonts w:ascii="Times New Roman" w:eastAsia="Times New Roman" w:hAnsi="Times New Roman"/>
-          <w:sz w:val="24"/>
-          <w:szCs w:val="24"/>
-        </w:rPr>
-        <w:t>Raseroka</w:t>
-      </w:r>
-      <w:proofErr w:type="spellEnd"/>
-      <w:r>
-        <w:rPr>
-          <w:rFonts w:ascii="Times New Roman" w:eastAsia="Times New Roman" w:hAnsi="Times New Roman"/>
-          <w:sz w:val="24"/>
-          <w:szCs w:val="24"/>
-        </w:rPr>
-        <w:t xml:space="preserve">, K., Rodriguez-Lonebear, D., Rowe, R., Sara, R., Walker, J. D., Anderson, J., &amp; Hudson, M. (2020). The CARE Principles for Indigenous Data Governance. Data Science Journal, 19(1), 1–12. </w:t>
+        <w:t xml:space="preserve">Carroll, S. R., Garba, I., Figueroa-Rodríguez, O. L., Holbrook, J., Lovett, R., Materechera, S., Parsons, M., Raseroka, K., Rodriguez-Lonebear, D., Rowe, R., Sara, R., Walker, J. D., Anderson, J., &amp; Hudson, M. (2020). The CARE Principles for Indigenous Data Governance. Data Science Journal, 19(1), 1–12. </w:t>
       </w:r>
       <w:hyperlink r:id="rId42">
         <w:r>
@@ -21462,25 +20547,7 @@
           <w:sz w:val="24"/>
           <w:szCs w:val="24"/>
         </w:rPr>
-        <w:t xml:space="preserve">NT crime </w:t>
-      </w:r>
-      <w:proofErr w:type="gramStart"/>
-      <w:r>
-        <w:rPr>
-          <w:rFonts w:ascii="Times New Roman" w:eastAsia="Times New Roman" w:hAnsi="Times New Roman"/>
-          <w:sz w:val="24"/>
-          <w:szCs w:val="24"/>
-        </w:rPr>
-        <w:t>statistics march</w:t>
-      </w:r>
-      <w:proofErr w:type="gramEnd"/>
-      <w:r>
-        <w:rPr>
-          <w:rFonts w:ascii="Times New Roman" w:eastAsia="Times New Roman" w:hAnsi="Times New Roman"/>
-          <w:sz w:val="24"/>
-          <w:szCs w:val="24"/>
-        </w:rPr>
-        <w:t xml:space="preserve"> 2026 - NTG open data portal</w:t>
+        <w:t>NT crime statistics march 2026 - NTG open data portal</w:t>
       </w:r>
       <w:r>
         <w:rPr>
@@ -21576,29 +20643,7 @@
           <w:sz w:val="24"/>
           <w:szCs w:val="24"/>
         </w:rPr>
-        <w:t xml:space="preserve">Operation </w:t>
-      </w:r>
-      <w:proofErr w:type="spellStart"/>
-      <w:r>
-        <w:rPr>
-          <w:rFonts w:ascii="Times New Roman" w:eastAsia="Times New Roman" w:hAnsi="Times New Roman"/>
-          <w:i/>
-          <w:iCs/>
-          <w:sz w:val="24"/>
-          <w:szCs w:val="24"/>
-        </w:rPr>
-        <w:t>ventura</w:t>
-      </w:r>
-      <w:proofErr w:type="spellEnd"/>
-      <w:r>
-        <w:rPr>
-          <w:rFonts w:ascii="Times New Roman" w:eastAsia="Times New Roman" w:hAnsi="Times New Roman"/>
-          <w:i/>
-          <w:iCs/>
-          <w:sz w:val="24"/>
-          <w:szCs w:val="24"/>
-        </w:rPr>
-        <w:t xml:space="preserve"> | NT police, fire &amp; emergency services</w:t>
+        <w:t>Operation ventura | NT police, fire &amp; emergency services</w:t>
       </w:r>
       <w:r>
         <w:rPr>
@@ -22051,78 +21096,18 @@
         </w:rPr>
         <w:t>Visualisation:</w:t>
       </w:r>
-      <w:r>
-        <w:rPr>
-          <w:rFonts w:ascii="Times New Roman" w:eastAsia="Times New Roman" w:hAnsi="Times New Roman"/>
-          <w:sz w:val="24"/>
-          <w:szCs w:val="24"/>
-          <w:lang w:val="vi-VN"/>
-        </w:rPr>
-        <w:fldChar w:fldCharType="begin"/>
-      </w:r>
-      <w:r>
-        <w:rPr>
-          <w:rFonts w:ascii="Times New Roman" w:eastAsia="Times New Roman" w:hAnsi="Times New Roman"/>
-          <w:sz w:val="24"/>
-          <w:szCs w:val="24"/>
-          <w:lang w:val="vi-VN"/>
-        </w:rPr>
-        <w:instrText>HYPERLINK "</w:instrText>
-      </w:r>
-      <w:r>
-        <w:rPr>
-          <w:rFonts w:ascii="Times New Roman" w:eastAsia="Times New Roman" w:hAnsi="Times New Roman"/>
-          <w:sz w:val="24"/>
-          <w:szCs w:val="24"/>
-          <w:lang w:val="vi-VN"/>
-        </w:rPr>
-        <w:instrText>https://github.com/HendrickDang/PRT661-DATA-SCIENCE-PRACTICE/commits/main/eda_plots</w:instrText>
-      </w:r>
-      <w:r>
-        <w:rPr>
-          <w:rFonts w:ascii="Times New Roman" w:eastAsia="Times New Roman" w:hAnsi="Times New Roman"/>
-          <w:sz w:val="24"/>
-          <w:szCs w:val="24"/>
-          <w:lang w:val="vi-VN"/>
-        </w:rPr>
-        <w:instrText>"</w:instrText>
-      </w:r>
-      <w:r>
-        <w:rPr>
-          <w:rFonts w:ascii="Times New Roman" w:eastAsia="Times New Roman" w:hAnsi="Times New Roman"/>
-          <w:sz w:val="24"/>
-          <w:szCs w:val="24"/>
-          <w:lang w:val="vi-VN"/>
-        </w:rPr>
-      </w:r>
-      <w:r>
-        <w:rPr>
-          <w:rFonts w:ascii="Times New Roman" w:eastAsia="Times New Roman" w:hAnsi="Times New Roman"/>
-          <w:sz w:val="24"/>
-          <w:szCs w:val="24"/>
-          <w:lang w:val="vi-VN"/>
-        </w:rPr>
-        <w:fldChar w:fldCharType="separate"/>
-      </w:r>
-      <w:r>
-        <w:rPr>
-          <w:rStyle w:val="Hyperlink"/>
-          <w:rFonts w:ascii="Times New Roman" w:eastAsia="Times New Roman" w:hAnsi="Times New Roman"/>
-          <w:sz w:val="24"/>
-          <w:szCs w:val="24"/>
-          <w:lang w:val="vi-VN"/>
-        </w:rPr>
-        <w:t>https://github.com/HendrickDang/PRT661-DATA-SCIENCE-PRACTICE/commits/main/eda_plots</w:t>
-      </w:r>
-      <w:r>
-        <w:rPr>
-          <w:rFonts w:ascii="Times New Roman" w:eastAsia="Times New Roman" w:hAnsi="Times New Roman"/>
-          <w:sz w:val="24"/>
-          <w:szCs w:val="24"/>
-          <w:lang w:val="vi-VN"/>
-        </w:rPr>
-        <w:fldChar w:fldCharType="end"/>
-      </w:r>
+      <w:hyperlink r:id="rId50" w:history="1">
+        <w:r>
+          <w:rPr>
+            <w:rStyle w:val="Hyperlink"/>
+            <w:rFonts w:ascii="Times New Roman" w:eastAsia="Times New Roman" w:hAnsi="Times New Roman"/>
+            <w:sz w:val="24"/>
+            <w:szCs w:val="24"/>
+            <w:lang w:val="vi-VN"/>
+          </w:rPr>
+          <w:t>https://github.com/HendrickDang/PRT661-DATA-SCIENCE-PRACTICE/commits/main/eda_plots</w:t>
+        </w:r>
+      </w:hyperlink>
     </w:p>
     <w:p>
       <w:pPr>
@@ -22147,7 +21132,7 @@
         </w:rPr>
         <w:t>Documentation:</w:t>
       </w:r>
-      <w:hyperlink r:id="rId50" w:history="1">
+      <w:hyperlink r:id="rId51" w:history="1">
         <w:r>
           <w:rPr>
             <w:rStyle w:val="Hyperlink"/>
@@ -22192,7 +21177,7 @@
         </w:rPr>
         <w:t>Code:</w:t>
       </w:r>
-      <w:hyperlink r:id="rId51" w:history="1">
+      <w:hyperlink r:id="rId52" w:history="1">
         <w:r>
           <w:rPr>
             <w:rStyle w:val="Hyperlink"/>
@@ -22389,6 +21374,14 @@
         </w:rPr>
         <w:t xml:space="preserve"> </w:t>
       </w:r>
+      <w:r>
+        <w:rPr>
+          <w:rFonts w:ascii="Times New Roman" w:eastAsia="Times New Roman" w:hAnsi="Times New Roman"/>
+          <w:sz w:val="24"/>
+          <w:szCs w:val="24"/>
+        </w:rPr>
+        <w:t>S385806</w:t>
+      </w:r>
     </w:p>
     <w:p>
       <w:pPr>
@@ -22451,6 +21444,46 @@
           <w:szCs w:val="24"/>
         </w:rPr>
       </w:pPr>
+      <w:r>
+        <w:rPr>
+          <w:noProof/>
+        </w:rPr>
+        <w:drawing>
+          <wp:inline distT="0" distB="0" distL="0" distR="0" wp14:anchorId="5D7B00C0" wp14:editId="4EAA1DAD">
+            <wp:extent cx="5731510" cy="3223895"/>
+            <wp:effectExtent l="0" t="0" r="2540" b="0"/>
+            <wp:docPr id="269368058" name="Picture 1" descr="A screenshot of a computer&#10;&#10;AI-generated content may be incorrect."/>
+            <wp:cNvGraphicFramePr>
+              <a:graphicFrameLocks xmlns:a="http://schemas.openxmlformats.org/drawingml/2006/main" noChangeAspect="1"/>
+            </wp:cNvGraphicFramePr>
+            <a:graphic xmlns:a="http://schemas.openxmlformats.org/drawingml/2006/main">
+              <a:graphicData uri="http://schemas.openxmlformats.org/drawingml/2006/picture">
+                <pic:pic xmlns:pic="http://schemas.openxmlformats.org/drawingml/2006/picture">
+                  <pic:nvPicPr>
+                    <pic:cNvPr id="269368058" name="Picture 1" descr="A screenshot of a computer&#10;&#10;AI-generated content may be incorrect."/>
+                    <pic:cNvPicPr/>
+                  </pic:nvPicPr>
+                  <pic:blipFill>
+                    <a:blip r:embed="rId53"/>
+                    <a:stretch>
+                      <a:fillRect/>
+                    </a:stretch>
+                  </pic:blipFill>
+                  <pic:spPr>
+                    <a:xfrm>
+                      <a:off x="0" y="0"/>
+                      <a:ext cx="5731510" cy="3223895"/>
+                    </a:xfrm>
+                    <a:prstGeom prst="rect">
+                      <a:avLst/>
+                    </a:prstGeom>
+                  </pic:spPr>
+                </pic:pic>
+              </a:graphicData>
+            </a:graphic>
+          </wp:inline>
+        </w:drawing>
+      </w:r>
     </w:p>
     <w:p>
       <w:pPr>
@@ -22485,6 +21518,28 @@
     <w:p>
       <w:pPr>
         <w:pStyle w:val="ListParagraph"/>
+        <w:spacing w:line="276" w:lineRule="auto"/>
+        <w:jc w:val="both"/>
+        <w:rPr>
+          <w:rFonts w:ascii="Times New Roman" w:eastAsia="Times New Roman" w:hAnsi="Times New Roman"/>
+          <w:sz w:val="24"/>
+          <w:szCs w:val="24"/>
+          <w:lang w:val="en-AU"/>
+        </w:rPr>
+      </w:pPr>
+      <w:r>
+        <w:rPr>
+          <w:rFonts w:ascii="Times New Roman" w:eastAsia="Times New Roman" w:hAnsi="Times New Roman"/>
+          <w:sz w:val="24"/>
+          <w:szCs w:val="24"/>
+          <w:lang w:val="en-AU"/>
+        </w:rPr>
+        <w:t>Since Assessment 1, I was responsible for the Ingest and Data Store stage, and for verifying that the pipeline the team built actually runs correctly end-to-end. This included implementing ingest.py to load and validate the six raw datasets with filename fuzzy-matching and manifest-based provenance tracking, compiling the project's missing dependency list after finding the pipeline would not run in a clean environment, and identifying and removing a Windows-specific Unicode crash and a duplicated function definition left over from a merge. I also corrected two silent code-quality defects - a statistically biased VIF calculation and an unsafe eval() call - before re-running the full pipeline to confirm it completes without errors ahead of the technical write-up.</w:t>
+      </w:r>
+    </w:p>
+    <w:p>
+      <w:pPr>
+        <w:pStyle w:val="ListParagraph"/>
         <w:spacing w:before="120" w:after="0" w:line="276" w:lineRule="auto"/>
         <w:ind w:left="426"/>
         <w:contextualSpacing w:val="0"/>
@@ -22537,33 +21592,43 @@
         <w:jc w:val="both"/>
         <w:rPr>
           <w:rFonts w:ascii="Times New Roman" w:eastAsia="Times New Roman" w:hAnsi="Times New Roman"/>
-          <w:b/>
-          <w:bCs/>
-          <w:sz w:val="24"/>
-          <w:szCs w:val="24"/>
-        </w:rPr>
-      </w:pPr>
+          <w:sz w:val="24"/>
+          <w:szCs w:val="24"/>
+          <w:lang w:val="en-AU"/>
+        </w:rPr>
+      </w:pPr>
+      <w:r>
+        <w:rPr>
+          <w:rFonts w:ascii="Times New Roman" w:eastAsia="Times New Roman" w:hAnsi="Times New Roman"/>
+          <w:sz w:val="24"/>
+          <w:szCs w:val="24"/>
+          <w:lang w:val="en-AU"/>
+        </w:rPr>
+        <w:t xml:space="preserve">Owning the ingest stage taught me that "does it run?" must be checked deliberately, not assumed. Defects like missing dependencies, a Windows-only Unicode crash, and a duplicated function definition were invisible on individual machines but would have surfaced during the demonstration or on the marker's machine - catching them early freed up time for modelling and reporting. It also showed me that verification means checking </w:t>
+      </w:r>
+      <w:r>
+        <w:rPr>
+          <w:rFonts w:ascii="Times New Roman" w:eastAsia="Times New Roman" w:hAnsi="Times New Roman"/>
+          <w:sz w:val="24"/>
+          <w:szCs w:val="24"/>
+          <w:lang w:val="en-AU"/>
+        </w:rPr>
+        <w:lastRenderedPageBreak/>
+        <w:t>correctness, not just absence of errors: the VIF calculation and an unsafe eval() call ran without crashing, yet one was statistically biased and the other insecure.</w:t>
+      </w:r>
     </w:p>
     <w:p>
       <w:pPr>
-        <w:pStyle w:val="ListParagraph"/>
-        <w:spacing w:before="120" w:after="0" w:line="276" w:lineRule="auto"/>
-        <w:ind w:left="426"/>
-        <w:contextualSpacing w:val="0"/>
-        <w:jc w:val="both"/>
-        <w:rPr>
-          <w:rFonts w:ascii="Times New Roman" w:eastAsia="Times New Roman" w:hAnsi="Times New Roman"/>
-          <w:b/>
-          <w:bCs/>
-          <w:sz w:val="24"/>
-          <w:szCs w:val="24"/>
-        </w:rPr>
-      </w:pPr>
-      <w:r>
-        <w:rPr>
-          <w:rFonts w:ascii="Times New Roman" w:eastAsia="Times New Roman" w:hAnsi="Times New Roman"/>
-          <w:b/>
-          <w:bCs/>
+        <w:rPr>
+          <w:rFonts w:ascii="Times New Roman" w:eastAsia="Times New Roman" w:hAnsi="Times New Roman" w:cstheme="minorBidi"/>
+          <w:sz w:val="24"/>
+          <w:szCs w:val="24"/>
+          <w:lang w:eastAsia="en-US"/>
+        </w:rPr>
+      </w:pPr>
+      <w:r>
+        <w:rPr>
+          <w:rFonts w:ascii="Times New Roman" w:eastAsia="Times New Roman" w:hAnsi="Times New Roman"/>
           <w:sz w:val="24"/>
           <w:szCs w:val="24"/>
         </w:rPr>
@@ -22722,7 +21787,7 @@
                     </pic:cNvPicPr>
                   </pic:nvPicPr>
                   <pic:blipFill>
-                    <a:blip r:embed="rId52">
+                    <a:blip r:embed="rId54">
                       <a:extLst>
                         <a:ext uri="{28A0092B-C50C-407E-A947-70E740481C1C}">
                           <a14:useLocalDpi xmlns:a14="http://schemas.microsoft.com/office/drawing/2010/main" val="0"/>
@@ -22825,25 +21890,7 @@
           <w:sz w:val="24"/>
           <w:szCs w:val="24"/>
         </w:rPr>
-        <w:t xml:space="preserve">Built evaluation.py: a standalone module providing naive baselines, leakage-free feature selection, rolling-origin </w:t>
-      </w:r>
-      <w:proofErr w:type="spellStart"/>
-      <w:r>
-        <w:rPr>
-          <w:rFonts w:ascii="Times New Roman" w:eastAsia="Times New Roman" w:hAnsi="Times New Roman"/>
-          <w:sz w:val="24"/>
-          <w:szCs w:val="24"/>
-        </w:rPr>
-        <w:t>backtesting</w:t>
-      </w:r>
-      <w:proofErr w:type="spellEnd"/>
-      <w:r>
-        <w:rPr>
-          <w:rFonts w:ascii="Times New Roman" w:eastAsia="Times New Roman" w:hAnsi="Times New Roman"/>
-          <w:sz w:val="24"/>
-          <w:szCs w:val="24"/>
-        </w:rPr>
-        <w:t xml:space="preserve"> at four horizons, prediction intervals and structural-break indicators. </w:t>
+        <w:t xml:space="preserve">Built evaluation.py: a standalone module providing naive baselines, leakage-free feature selection, rolling-origin backtesting at four horizons, prediction intervals and structural-break indicators. </w:t>
       </w:r>
     </w:p>
     <w:p>
@@ -23204,7 +22251,7 @@
                     </pic:cNvPicPr>
                   </pic:nvPicPr>
                   <pic:blipFill>
-                    <a:blip r:embed="rId53">
+                    <a:blip r:embed="rId55">
                       <a:extLst>
                         <a:ext uri="{28A0092B-C50C-407E-A947-70E740481C1C}">
                           <a14:useLocalDpi xmlns:a14="http://schemas.microsoft.com/office/drawing/2010/main" val="0"/>
@@ -23292,25 +22339,7 @@
           <w:sz w:val="24"/>
           <w:szCs w:val="24"/>
         </w:rPr>
-        <w:t xml:space="preserve">In this assessment, I maintain multiple roles, mostly with the technical side of the project. My contribution </w:t>
-      </w:r>
-      <w:proofErr w:type="gramStart"/>
-      <w:r>
-        <w:rPr>
-          <w:rFonts w:ascii="Times New Roman" w:eastAsia="Times New Roman" w:hAnsi="Times New Roman"/>
-          <w:sz w:val="24"/>
-          <w:szCs w:val="24"/>
-        </w:rPr>
-        <w:t>includes:</w:t>
-      </w:r>
-      <w:proofErr w:type="gramEnd"/>
-      <w:r>
-        <w:rPr>
-          <w:rFonts w:ascii="Times New Roman" w:eastAsia="Times New Roman" w:hAnsi="Times New Roman"/>
-          <w:sz w:val="24"/>
-          <w:szCs w:val="24"/>
-        </w:rPr>
-        <w:t xml:space="preserve"> Review the output from the ingesting and preprocessing steps, doing basic testing to see if anomalies exist and also seeking clarification when necessary, making sure that the processed data are ready for the next </w:t>
+        <w:t xml:space="preserve">In this assessment, I maintain multiple roles, mostly with the technical side of the project. My contribution includes: Review the output from the ingesting and preprocessing steps, doing basic testing to see if anomalies exist and also seeking clarification when necessary, making sure that the processed data are ready for the next </w:t>
       </w:r>
       <w:r>
         <w:rPr>
@@ -23446,15 +22475,7 @@
       </w:r>
       <w:r>
         <w:noBreakHyphen/>
-        <w:t xml:space="preserve">solving skills. Working with different machine learning models improved my understanding of model selection, evaluation, and </w:t>
-      </w:r>
-      <w:proofErr w:type="spellStart"/>
-      <w:r>
-        <w:t>optimisation</w:t>
-      </w:r>
-      <w:proofErr w:type="spellEnd"/>
-      <w:r>
-        <w:t>, giving me practical experience applying theory to a real</w:t>
+        <w:t>solving skills. Working with different machine learning models improved my understanding of model selection, evaluation, and optimisation, giving me practical experience applying theory to a real</w:t>
       </w:r>
       <w:r>
         <w:noBreakHyphen/>
@@ -23505,8 +22526,8 @@
       </w:r>
     </w:p>
     <w:sectPr>
-      <w:headerReference w:type="default" r:id="rId54"/>
-      <w:footerReference w:type="default" r:id="rId55"/>
+      <w:headerReference w:type="default" r:id="rId56"/>
+      <w:footerReference w:type="default" r:id="rId57"/>
       <w:pgSz w:w="11906" w:h="16838" w:code="9"/>
       <w:pgMar w:top="1440" w:right="1440" w:bottom="1440" w:left="1440" w:header="709" w:footer="709" w:gutter="0"/>
       <w:pgNumType w:start="0"/>
@@ -23519,7 +22540,7 @@
 </file>
 
 <file path=word/endnotes.xml><?xml version="1.0" encoding="utf-8"?>
-<w:endnotes xmlns:wpc="http://schemas.microsoft.com/office/word/2010/wordprocessingCanvas" xmlns:cx="http://schemas.microsoft.com/office/drawing/2014/chartex" xmlns:cx1="http://schemas.microsoft.com/office/drawing/2015/9/8/chartex" xmlns:cx2="http://schemas.microsoft.com/office/drawing/2015/10/21/chartex" xmlns:cx3="http://schemas.microsoft.com/office/drawing/2016/5/9/chartex" xmlns:cx4="http://schemas.microsoft.com/office/drawing/2016/5/10/chartex" xmlns:cx5="http://schemas.microsoft.com/office/drawing/2016/5/11/chartex" xmlns:cx6="http://schemas.microsoft.com/office/drawing/2016/5/12/chartex" xmlns:cx7="http://schemas.microsoft.com/office/drawing/2016/5/13/chartex" xmlns:cx8="http://schemas.microsoft.com/office/drawing/2016/5/14/chartex" xmlns:mc="http://schemas.openxmlformats.org/markup-compatibility/2006" xmlns:aink="http://schemas.microsoft.com/office/drawing/2016/ink" xmlns:am3d="http://schemas.microsoft.com/office/drawing/2017/model3d" xmlns:o="urn:schemas-microsoft-com:office:office" xmlns:oel="http://schemas.microsoft.com/office/2019/extlst" xmlns:r="http://schemas.openxmlformats.org/officeDocument/2006/relationships" xmlns:m="http://schemas.openxmlformats.org/officeDocument/2006/math" xmlns:v="urn:schemas-microsoft-com:vml" xmlns:wp14="http://schemas.microsoft.com/office/word/2010/wordprocessingDrawing" xmlns:wp="http://schemas.openxmlformats.org/drawingml/2006/wordprocessingDrawing" xmlns:w10="urn:schemas-microsoft-com:office:word" xmlns:w="http://schemas.openxmlformats.org/wordprocessingml/2006/main" xmlns:w14="http://schemas.microsoft.com/office/word/2010/wordml" xmlns:w15="http://schemas.microsoft.com/office/word/2012/wordml" xmlns:w16cei="http://schemas.microsoft.com/office/word/2026/wordml/cei" xmlns:w16cex="http://schemas.microsoft.com/office/word/2018/wordml/cex" xmlns:w16cid="http://schemas.microsoft.com/office/word/2016/wordml/cid" xmlns:w16="http://schemas.microsoft.com/office/word/2018/wordml" xmlns:w16du="http://schemas.microsoft.com/office/word/2023/wordml/word16du" xmlns:w16sdtdh="http://schemas.microsoft.com/office/word/2020/wordml/sdtdatahash" xmlns:w16sdtfl="http://schemas.microsoft.com/office/word/2024/wordml/sdtformatlock" xmlns:w16se="http://schemas.microsoft.com/office/word/2015/wordml/symex" xmlns:wpg="http://schemas.microsoft.com/office/word/2010/wordprocessingGroup" xmlns:wpi="http://schemas.microsoft.com/office/word/2010/wordprocessingInk" xmlns:wne="http://schemas.microsoft.com/office/word/2006/wordml" xmlns:wps="http://schemas.microsoft.com/office/word/2010/wordprocessingShape" mc:Ignorable="w14 w15 w16se w16cid w16 w16cex w16sdtdh w16sdtfl w16du wp14">
+<w:endnotes xmlns:wpc="http://schemas.microsoft.com/office/word/2010/wordprocessingCanvas" xmlns:cx="http://schemas.microsoft.com/office/drawing/2014/chartex" xmlns:cx1="http://schemas.microsoft.com/office/drawing/2015/9/8/chartex" xmlns:cx2="http://schemas.microsoft.com/office/drawing/2015/10/21/chartex" xmlns:cx3="http://schemas.microsoft.com/office/drawing/2016/5/9/chartex" xmlns:cx4="http://schemas.microsoft.com/office/drawing/2016/5/10/chartex" xmlns:cx5="http://schemas.microsoft.com/office/drawing/2016/5/11/chartex" xmlns:cx6="http://schemas.microsoft.com/office/drawing/2016/5/12/chartex" xmlns:cx7="http://schemas.microsoft.com/office/drawing/2016/5/13/chartex" xmlns:cx8="http://schemas.microsoft.com/office/drawing/2016/5/14/chartex" xmlns:mc="http://schemas.openxmlformats.org/markup-compatibility/2006" xmlns:aink="http://schemas.microsoft.com/office/drawing/2016/ink" xmlns:am3d="http://schemas.microsoft.com/office/drawing/2017/model3d" xmlns:o="urn:schemas-microsoft-com:office:office" xmlns:oel="http://schemas.microsoft.com/office/2019/extlst" xmlns:r="http://schemas.openxmlformats.org/officeDocument/2006/relationships" xmlns:m="http://schemas.openxmlformats.org/officeDocument/2006/math" xmlns:v="urn:schemas-microsoft-com:vml" xmlns:wp14="http://schemas.microsoft.com/office/word/2010/wordprocessingDrawing" xmlns:wp="http://schemas.openxmlformats.org/drawingml/2006/wordprocessingDrawing" xmlns:w10="urn:schemas-microsoft-com:office:word" xmlns:w="http://schemas.openxmlformats.org/wordprocessingml/2006/main" xmlns:w14="http://schemas.microsoft.com/office/word/2010/wordml" xmlns:w15="http://schemas.microsoft.com/office/word/2012/wordml" xmlns:w16cex="http://schemas.microsoft.com/office/word/2018/wordml/cex" xmlns:w16cid="http://schemas.microsoft.com/office/word/2016/wordml/cid" xmlns:w16="http://schemas.microsoft.com/office/word/2018/wordml" xmlns:w16du="http://schemas.microsoft.com/office/word/2023/wordml/word16du" xmlns:w16sdtdh="http://schemas.microsoft.com/office/word/2020/wordml/sdtdatahash" xmlns:w16sdtfl="http://schemas.microsoft.com/office/word/2024/wordml/sdtformatlock" xmlns:w16se="http://schemas.microsoft.com/office/word/2015/wordml/symex" xmlns:wpg="http://schemas.microsoft.com/office/word/2010/wordprocessingGroup" xmlns:wpi="http://schemas.microsoft.com/office/word/2010/wordprocessingInk" xmlns:wne="http://schemas.microsoft.com/office/word/2006/wordml" xmlns:wps="http://schemas.microsoft.com/office/word/2010/wordprocessingShape" mc:Ignorable="w14 w15 w16se w16cid w16 w16cex w16sdtdh w16sdtfl w16du wp14">
   <w:endnote w:type="separator" w:id="-1">
     <w:p>
       <w:r>
@@ -23538,7 +22559,7 @@
 </file>
 
 <file path=word/footer1.xml><?xml version="1.0" encoding="utf-8"?>
-<w:ftr xmlns:wpc="http://schemas.microsoft.com/office/word/2010/wordprocessingCanvas" xmlns:cx="http://schemas.microsoft.com/office/drawing/2014/chartex" xmlns:cx1="http://schemas.microsoft.com/office/drawing/2015/9/8/chartex" xmlns:cx2="http://schemas.microsoft.com/office/drawing/2015/10/21/chartex" xmlns:cx3="http://schemas.microsoft.com/office/drawing/2016/5/9/chartex" xmlns:cx4="http://schemas.microsoft.com/office/drawing/2016/5/10/chartex" xmlns:cx5="http://schemas.microsoft.com/office/drawing/2016/5/11/chartex" xmlns:cx6="http://schemas.microsoft.com/office/drawing/2016/5/12/chartex" xmlns:cx7="http://schemas.microsoft.com/office/drawing/2016/5/13/chartex" xmlns:cx8="http://schemas.microsoft.com/office/drawing/2016/5/14/chartex" xmlns:mc="http://schemas.openxmlformats.org/markup-compatibility/2006" xmlns:aink="http://schemas.microsoft.com/office/drawing/2016/ink" xmlns:am3d="http://schemas.microsoft.com/office/drawing/2017/model3d" xmlns:o="urn:schemas-microsoft-com:office:office" xmlns:oel="http://schemas.microsoft.com/office/2019/extlst" xmlns:r="http://schemas.openxmlformats.org/officeDocument/2006/relationships" xmlns:m="http://schemas.openxmlformats.org/officeDocument/2006/math" xmlns:v="urn:schemas-microsoft-com:vml" xmlns:wp14="http://schemas.microsoft.com/office/word/2010/wordprocessingDrawing" xmlns:wp="http://schemas.openxmlformats.org/drawingml/2006/wordprocessingDrawing" xmlns:w10="urn:schemas-microsoft-com:office:word" xmlns:w="http://schemas.openxmlformats.org/wordprocessingml/2006/main" xmlns:w14="http://schemas.microsoft.com/office/word/2010/wordml" xmlns:w15="http://schemas.microsoft.com/office/word/2012/wordml" xmlns:w16cei="http://schemas.microsoft.com/office/word/2026/wordml/cei" xmlns:w16cex="http://schemas.microsoft.com/office/word/2018/wordml/cex" xmlns:w16cid="http://schemas.microsoft.com/office/word/2016/wordml/cid" xmlns:w16="http://schemas.microsoft.com/office/word/2018/wordml" xmlns:w16du="http://schemas.microsoft.com/office/word/2023/wordml/word16du" xmlns:w16sdtdh="http://schemas.microsoft.com/office/word/2020/wordml/sdtdatahash" xmlns:w16sdtfl="http://schemas.microsoft.com/office/word/2024/wordml/sdtformatlock" xmlns:w16se="http://schemas.microsoft.com/office/word/2015/wordml/symex" xmlns:wpg="http://schemas.microsoft.com/office/word/2010/wordprocessingGroup" xmlns:wpi="http://schemas.microsoft.com/office/word/2010/wordprocessingInk" xmlns:wne="http://schemas.microsoft.com/office/word/2006/wordml" xmlns:wps="http://schemas.microsoft.com/office/word/2010/wordprocessingShape" mc:Ignorable="w14 w15 w16se w16cid w16 w16cex w16sdtdh w16sdtfl w16du wp14">
+<w:ftr xmlns:wpc="http://schemas.microsoft.com/office/word/2010/wordprocessingCanvas" xmlns:cx="http://schemas.microsoft.com/office/drawing/2014/chartex" xmlns:cx1="http://schemas.microsoft.com/office/drawing/2015/9/8/chartex" xmlns:cx2="http://schemas.microsoft.com/office/drawing/2015/10/21/chartex" xmlns:cx3="http://schemas.microsoft.com/office/drawing/2016/5/9/chartex" xmlns:cx4="http://schemas.microsoft.com/office/drawing/2016/5/10/chartex" xmlns:cx5="http://schemas.microsoft.com/office/drawing/2016/5/11/chartex" xmlns:cx6="http://schemas.microsoft.com/office/drawing/2016/5/12/chartex" xmlns:cx7="http://schemas.microsoft.com/office/drawing/2016/5/13/chartex" xmlns:cx8="http://schemas.microsoft.com/office/drawing/2016/5/14/chartex" xmlns:mc="http://schemas.openxmlformats.org/markup-compatibility/2006" xmlns:aink="http://schemas.microsoft.com/office/drawing/2016/ink" xmlns:am3d="http://schemas.microsoft.com/office/drawing/2017/model3d" xmlns:o="urn:schemas-microsoft-com:office:office" xmlns:oel="http://schemas.microsoft.com/office/2019/extlst" xmlns:r="http://schemas.openxmlformats.org/officeDocument/2006/relationships" xmlns:m="http://schemas.openxmlformats.org/officeDocument/2006/math" xmlns:v="urn:schemas-microsoft-com:vml" xmlns:wp14="http://schemas.microsoft.com/office/word/2010/wordprocessingDrawing" xmlns:wp="http://schemas.openxmlformats.org/drawingml/2006/wordprocessingDrawing" xmlns:w10="urn:schemas-microsoft-com:office:word" xmlns:w="http://schemas.openxmlformats.org/wordprocessingml/2006/main" xmlns:w14="http://schemas.microsoft.com/office/word/2010/wordml" xmlns:w15="http://schemas.microsoft.com/office/word/2012/wordml" xmlns:w16cex="http://schemas.microsoft.com/office/word/2018/wordml/cex" xmlns:w16cid="http://schemas.microsoft.com/office/word/2016/wordml/cid" xmlns:w16="http://schemas.microsoft.com/office/word/2018/wordml" xmlns:w16du="http://schemas.microsoft.com/office/word/2023/wordml/word16du" xmlns:w16sdtdh="http://schemas.microsoft.com/office/word/2020/wordml/sdtdatahash" xmlns:w16sdtfl="http://schemas.microsoft.com/office/word/2024/wordml/sdtformatlock" xmlns:w16se="http://schemas.microsoft.com/office/word/2015/wordml/symex" xmlns:wpg="http://schemas.microsoft.com/office/word/2010/wordprocessingGroup" xmlns:wpi="http://schemas.microsoft.com/office/word/2010/wordprocessingInk" xmlns:wne="http://schemas.microsoft.com/office/word/2006/wordml" xmlns:wps="http://schemas.microsoft.com/office/word/2010/wordprocessingShape" mc:Ignorable="w14 w15 w16se w16cid w16 w16cex w16sdtdh w16sdtfl w16du wp14">
   <w:p>
     <w:pPr>
       <w:pStyle w:val="Footer"/>
@@ -23569,7 +22590,7 @@
 </file>
 
 <file path=word/footnotes.xml><?xml version="1.0" encoding="utf-8"?>
-<w:footnotes xmlns:wpc="http://schemas.microsoft.com/office/word/2010/wordprocessingCanvas" xmlns:cx="http://schemas.microsoft.com/office/drawing/2014/chartex" xmlns:cx1="http://schemas.microsoft.com/office/drawing/2015/9/8/chartex" xmlns:cx2="http://schemas.microsoft.com/office/drawing/2015/10/21/chartex" xmlns:cx3="http://schemas.microsoft.com/office/drawing/2016/5/9/chartex" xmlns:cx4="http://schemas.microsoft.com/office/drawing/2016/5/10/chartex" xmlns:cx5="http://schemas.microsoft.com/office/drawing/2016/5/11/chartex" xmlns:cx6="http://schemas.microsoft.com/office/drawing/2016/5/12/chartex" xmlns:cx7="http://schemas.microsoft.com/office/drawing/2016/5/13/chartex" xmlns:cx8="http://schemas.microsoft.com/office/drawing/2016/5/14/chartex" xmlns:mc="http://schemas.openxmlformats.org/markup-compatibility/2006" xmlns:aink="http://schemas.microsoft.com/office/drawing/2016/ink" xmlns:am3d="http://schemas.microsoft.com/office/drawing/2017/model3d" xmlns:o="urn:schemas-microsoft-com:office:office" xmlns:oel="http://schemas.microsoft.com/office/2019/extlst" xmlns:r="http://schemas.openxmlformats.org/officeDocument/2006/relationships" xmlns:m="http://schemas.openxmlformats.org/officeDocument/2006/math" xmlns:v="urn:schemas-microsoft-com:vml" xmlns:wp14="http://schemas.microsoft.com/office/word/2010/wordprocessingDrawing" xmlns:wp="http://schemas.openxmlformats.org/drawingml/2006/wordprocessingDrawing" xmlns:w10="urn:schemas-microsoft-com:office:word" xmlns:w="http://schemas.openxmlformats.org/wordprocessingml/2006/main" xmlns:w14="http://schemas.microsoft.com/office/word/2010/wordml" xmlns:w15="http://schemas.microsoft.com/office/word/2012/wordml" xmlns:w16cei="http://schemas.microsoft.com/office/word/2026/wordml/cei" xmlns:w16cex="http://schemas.microsoft.com/office/word/2018/wordml/cex" xmlns:w16cid="http://schemas.microsoft.com/office/word/2016/wordml/cid" xmlns:w16="http://schemas.microsoft.com/office/word/2018/wordml" xmlns:w16du="http://schemas.microsoft.com/office/word/2023/wordml/word16du" xmlns:w16sdtdh="http://schemas.microsoft.com/office/word/2020/wordml/sdtdatahash" xmlns:w16sdtfl="http://schemas.microsoft.com/office/word/2024/wordml/sdtformatlock" xmlns:w16se="http://schemas.microsoft.com/office/word/2015/wordml/symex" xmlns:wpg="http://schemas.microsoft.com/office/word/2010/wordprocessingGroup" xmlns:wpi="http://schemas.microsoft.com/office/word/2010/wordprocessingInk" xmlns:wne="http://schemas.microsoft.com/office/word/2006/wordml" xmlns:wps="http://schemas.microsoft.com/office/word/2010/wordprocessingShape" mc:Ignorable="w14 w15 w16se w16cid w16 w16cex w16sdtdh w16sdtfl w16du wp14">
+<w:footnotes xmlns:wpc="http://schemas.microsoft.com/office/word/2010/wordprocessingCanvas" xmlns:cx="http://schemas.microsoft.com/office/drawing/2014/chartex" xmlns:cx1="http://schemas.microsoft.com/office/drawing/2015/9/8/chartex" xmlns:cx2="http://schemas.microsoft.com/office/drawing/2015/10/21/chartex" xmlns:cx3="http://schemas.microsoft.com/office/drawing/2016/5/9/chartex" xmlns:cx4="http://schemas.microsoft.com/office/drawing/2016/5/10/chartex" xmlns:cx5="http://schemas.microsoft.com/office/drawing/2016/5/11/chartex" xmlns:cx6="http://schemas.microsoft.com/office/drawing/2016/5/12/chartex" xmlns:cx7="http://schemas.microsoft.com/office/drawing/2016/5/13/chartex" xmlns:cx8="http://schemas.microsoft.com/office/drawing/2016/5/14/chartex" xmlns:mc="http://schemas.openxmlformats.org/markup-compatibility/2006" xmlns:aink="http://schemas.microsoft.com/office/drawing/2016/ink" xmlns:am3d="http://schemas.microsoft.com/office/drawing/2017/model3d" xmlns:o="urn:schemas-microsoft-com:office:office" xmlns:oel="http://schemas.microsoft.com/office/2019/extlst" xmlns:r="http://schemas.openxmlformats.org/officeDocument/2006/relationships" xmlns:m="http://schemas.openxmlformats.org/officeDocument/2006/math" xmlns:v="urn:schemas-microsoft-com:vml" xmlns:wp14="http://schemas.microsoft.com/office/word/2010/wordprocessingDrawing" xmlns:wp="http://schemas.openxmlformats.org/drawingml/2006/wordprocessingDrawing" xmlns:w10="urn:schemas-microsoft-com:office:word" xmlns:w="http://schemas.openxmlformats.org/wordprocessingml/2006/main" xmlns:w14="http://schemas.microsoft.com/office/word/2010/wordml" xmlns:w15="http://schemas.microsoft.com/office/word/2012/wordml" xmlns:w16cex="http://schemas.microsoft.com/office/word/2018/wordml/cex" xmlns:w16cid="http://schemas.microsoft.com/office/word/2016/wordml/cid" xmlns:w16="http://schemas.microsoft.com/office/word/2018/wordml" xmlns:w16du="http://schemas.microsoft.com/office/word/2023/wordml/word16du" xmlns:w16sdtdh="http://schemas.microsoft.com/office/word/2020/wordml/sdtdatahash" xmlns:w16sdtfl="http://schemas.microsoft.com/office/word/2024/wordml/sdtformatlock" xmlns:w16se="http://schemas.microsoft.com/office/word/2015/wordml/symex" xmlns:wpg="http://schemas.microsoft.com/office/word/2010/wordprocessingGroup" xmlns:wpi="http://schemas.microsoft.com/office/word/2010/wordprocessingInk" xmlns:wne="http://schemas.microsoft.com/office/word/2006/wordml" xmlns:wps="http://schemas.microsoft.com/office/word/2010/wordprocessingShape" mc:Ignorable="w14 w15 w16se w16cid w16 w16cex w16sdtdh w16sdtfl w16du wp14">
   <w:footnote w:type="separator" w:id="-1">
     <w:p>
       <w:r>
@@ -23588,7 +22609,7 @@
 </file>
 
 <file path=word/header1.xml><?xml version="1.0" encoding="utf-8"?>
-<w:hdr xmlns:wpc="http://schemas.microsoft.com/office/word/2010/wordprocessingCanvas" xmlns:cx="http://schemas.microsoft.com/office/drawing/2014/chartex" xmlns:cx1="http://schemas.microsoft.com/office/drawing/2015/9/8/chartex" xmlns:cx2="http://schemas.microsoft.com/office/drawing/2015/10/21/chartex" xmlns:cx3="http://schemas.microsoft.com/office/drawing/2016/5/9/chartex" xmlns:cx4="http://schemas.microsoft.com/office/drawing/2016/5/10/chartex" xmlns:cx5="http://schemas.microsoft.com/office/drawing/2016/5/11/chartex" xmlns:cx6="http://schemas.microsoft.com/office/drawing/2016/5/12/chartex" xmlns:cx7="http://schemas.microsoft.com/office/drawing/2016/5/13/chartex" xmlns:cx8="http://schemas.microsoft.com/office/drawing/2016/5/14/chartex" xmlns:mc="http://schemas.openxmlformats.org/markup-compatibility/2006" xmlns:aink="http://schemas.microsoft.com/office/drawing/2016/ink" xmlns:am3d="http://schemas.microsoft.com/office/drawing/2017/model3d" xmlns:o="urn:schemas-microsoft-com:office:office" xmlns:oel="http://schemas.microsoft.com/office/2019/extlst" xmlns:r="http://schemas.openxmlformats.org/officeDocument/2006/relationships" xmlns:m="http://schemas.openxmlformats.org/officeDocument/2006/math" xmlns:v="urn:schemas-microsoft-com:vml" xmlns:wp14="http://schemas.microsoft.com/office/word/2010/wordprocessingDrawing" xmlns:wp="http://schemas.openxmlformats.org/drawingml/2006/wordprocessingDrawing" xmlns:w10="urn:schemas-microsoft-com:office:word" xmlns:w="http://schemas.openxmlformats.org/wordprocessingml/2006/main" xmlns:w14="http://schemas.microsoft.com/office/word/2010/wordml" xmlns:w15="http://schemas.microsoft.com/office/word/2012/wordml" xmlns:w16cei="http://schemas.microsoft.com/office/word/2026/wordml/cei" xmlns:w16cex="http://schemas.microsoft.com/office/word/2018/wordml/cex" xmlns:w16cid="http://schemas.microsoft.com/office/word/2016/wordml/cid" xmlns:w16="http://schemas.microsoft.com/office/word/2018/wordml" xmlns:w16du="http://schemas.microsoft.com/office/word/2023/wordml/word16du" xmlns:w16sdtdh="http://schemas.microsoft.com/office/word/2020/wordml/sdtdatahash" xmlns:w16sdtfl="http://schemas.microsoft.com/office/word/2024/wordml/sdtformatlock" xmlns:w16se="http://schemas.microsoft.com/office/word/2015/wordml/symex" xmlns:wpg="http://schemas.microsoft.com/office/word/2010/wordprocessingGroup" xmlns:wpi="http://schemas.microsoft.com/office/word/2010/wordprocessingInk" xmlns:wne="http://schemas.microsoft.com/office/word/2006/wordml" xmlns:wps="http://schemas.microsoft.com/office/word/2010/wordprocessingShape" mc:Ignorable="w14 w15 w16se w16cid w16 w16cex w16sdtdh w16sdtfl w16du wp14">
+<w:hdr xmlns:wpc="http://schemas.microsoft.com/office/word/2010/wordprocessingCanvas" xmlns:cx="http://schemas.microsoft.com/office/drawing/2014/chartex" xmlns:cx1="http://schemas.microsoft.com/office/drawing/2015/9/8/chartex" xmlns:cx2="http://schemas.microsoft.com/office/drawing/2015/10/21/chartex" xmlns:cx3="http://schemas.microsoft.com/office/drawing/2016/5/9/chartex" xmlns:cx4="http://schemas.microsoft.com/office/drawing/2016/5/10/chartex" xmlns:cx5="http://schemas.microsoft.com/office/drawing/2016/5/11/chartex" xmlns:cx6="http://schemas.microsoft.com/office/drawing/2016/5/12/chartex" xmlns:cx7="http://schemas.microsoft.com/office/drawing/2016/5/13/chartex" xmlns:cx8="http://schemas.microsoft.com/office/drawing/2016/5/14/chartex" xmlns:mc="http://schemas.openxmlformats.org/markup-compatibility/2006" xmlns:aink="http://schemas.microsoft.com/office/drawing/2016/ink" xmlns:am3d="http://schemas.microsoft.com/office/drawing/2017/model3d" xmlns:o="urn:schemas-microsoft-com:office:office" xmlns:oel="http://schemas.microsoft.com/office/2019/extlst" xmlns:r="http://schemas.openxmlformats.org/officeDocument/2006/relationships" xmlns:m="http://schemas.openxmlformats.org/officeDocument/2006/math" xmlns:v="urn:schemas-microsoft-com:vml" xmlns:wp14="http://schemas.microsoft.com/office/word/2010/wordprocessingDrawing" xmlns:wp="http://schemas.openxmlformats.org/drawingml/2006/wordprocessingDrawing" xmlns:w10="urn:schemas-microsoft-com:office:word" xmlns:w="http://schemas.openxmlformats.org/wordprocessingml/2006/main" xmlns:w14="http://schemas.microsoft.com/office/word/2010/wordml" xmlns:w15="http://schemas.microsoft.com/office/word/2012/wordml" xmlns:w16cex="http://schemas.microsoft.com/office/word/2018/wordml/cex" xmlns:w16cid="http://schemas.microsoft.com/office/word/2016/wordml/cid" xmlns:w16="http://schemas.microsoft.com/office/word/2018/wordml" xmlns:w16du="http://schemas.microsoft.com/office/word/2023/wordml/word16du" xmlns:w16sdtdh="http://schemas.microsoft.com/office/word/2020/wordml/sdtdatahash" xmlns:w16sdtfl="http://schemas.microsoft.com/office/word/2024/wordml/sdtformatlock" xmlns:w16se="http://schemas.microsoft.com/office/word/2015/wordml/symex" xmlns:wpg="http://schemas.microsoft.com/office/word/2010/wordprocessingGroup" xmlns:wpi="http://schemas.microsoft.com/office/word/2010/wordprocessingInk" xmlns:wne="http://schemas.microsoft.com/office/word/2006/wordml" xmlns:wps="http://schemas.microsoft.com/office/word/2010/wordprocessingShape" mc:Ignorable="w14 w15 w16se w16cid w16 w16cex w16sdtdh w16sdtfl w16du wp14">
   <w:p>
     <w:pPr>
       <w:pStyle w:val="Header"/>
@@ -23699,7 +22720,7 @@
             </wp:anchor>
           </w:drawing>
         </mc:Choice>
-        <mc:Fallback>
+        <mc:Fallback xmlns:w16cei="http://schemas.microsoft.com/office/word/2026/wordml/cei">
           <w:pict>
             <v:line w14:anchorId="304E0020" id="Line 1" o:spid="_x0000_s1026" style="position:absolute;z-index:251658240;visibility:visible;mso-wrap-style:square;mso-width-percent:0;mso-height-percent:0;mso-wrap-distance-left:9pt;mso-wrap-distance-top:0;mso-wrap-distance-right:9pt;mso-wrap-distance-bottom:0;mso-position-horizontal:absolute;mso-position-horizontal-relative:text;mso-position-vertical:absolute;mso-position-vertical-relative:text;mso-width-percent:0;mso-height-percent:0;mso-width-relative:page;mso-height-relative:page" from="-33.75pt,8.05pt" to="453pt,8.05pt" o:gfxdata="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"/>
           </w:pict>
@@ -23723,7 +22744,7 @@
 </file>
 
 <file path=word/numbering.xml><?xml version="1.0" encoding="utf-8"?>
-<w:numbering xmlns:wpc="http://schemas.microsoft.com/office/word/2010/wordprocessingCanvas" xmlns:cx="http://schemas.microsoft.com/office/drawing/2014/chartex" xmlns:cx1="http://schemas.microsoft.com/office/drawing/2015/9/8/chartex" xmlns:cx2="http://schemas.microsoft.com/office/drawing/2015/10/21/chartex" xmlns:cx3="http://schemas.microsoft.com/office/drawing/2016/5/9/chartex" xmlns:cx4="http://schemas.microsoft.com/office/drawing/2016/5/10/chartex" xmlns:cx5="http://schemas.microsoft.com/office/drawing/2016/5/11/chartex" xmlns:cx6="http://schemas.microsoft.com/office/drawing/2016/5/12/chartex" xmlns:cx7="http://schemas.microsoft.com/office/drawing/2016/5/13/chartex" xmlns:cx8="http://schemas.microsoft.com/office/drawing/2016/5/14/chartex" xmlns:mc="http://schemas.openxmlformats.org/markup-compatibility/2006" xmlns:aink="http://schemas.microsoft.com/office/drawing/2016/ink" xmlns:am3d="http://schemas.microsoft.com/office/drawing/2017/model3d" xmlns:o="urn:schemas-microsoft-com:office:office" xmlns:oel="http://schemas.microsoft.com/office/2019/extlst" xmlns:r="http://schemas.openxmlformats.org/officeDocument/2006/relationships" xmlns:m="http://schemas.openxmlformats.org/officeDocument/2006/math" xmlns:v="urn:schemas-microsoft-com:vml" xmlns:wp14="http://schemas.microsoft.com/office/word/2010/wordprocessingDrawing" xmlns:wp="http://schemas.openxmlformats.org/drawingml/2006/wordprocessingDrawing" xmlns:w10="urn:schemas-microsoft-com:office:word" xmlns:w="http://schemas.openxmlformats.org/wordprocessingml/2006/main" xmlns:w14="http://schemas.microsoft.com/office/word/2010/wordml" xmlns:w15="http://schemas.microsoft.com/office/word/2012/wordml" xmlns:w16cei="http://schemas.microsoft.com/office/word/2026/wordml/cei" xmlns:w16cex="http://schemas.microsoft.com/office/word/2018/wordml/cex" xmlns:w16cid="http://schemas.microsoft.com/office/word/2016/wordml/cid" xmlns:w16="http://schemas.microsoft.com/office/word/2018/wordml" xmlns:w16du="http://schemas.microsoft.com/office/word/2023/wordml/word16du" xmlns:w16sdtdh="http://schemas.microsoft.com/office/word/2020/wordml/sdtdatahash" xmlns:w16sdtfl="http://schemas.microsoft.com/office/word/2024/wordml/sdtformatlock" xmlns:w16se="http://schemas.microsoft.com/office/word/2015/wordml/symex" xmlns:wpg="http://schemas.microsoft.com/office/word/2010/wordprocessingGroup" xmlns:wpi="http://schemas.microsoft.com/office/word/2010/wordprocessingInk" xmlns:wne="http://schemas.microsoft.com/office/word/2006/wordml" xmlns:wps="http://schemas.microsoft.com/office/word/2010/wordprocessingShape" mc:Ignorable="w14 w15 w16se w16cid w16 w16cex w16sdtdh w16sdtfl w16du wp14">
+<w:numbering xmlns:wpc="http://schemas.microsoft.com/office/word/2010/wordprocessingCanvas" xmlns:cx="http://schemas.microsoft.com/office/drawing/2014/chartex" xmlns:cx1="http://schemas.microsoft.com/office/drawing/2015/9/8/chartex" xmlns:cx2="http://schemas.microsoft.com/office/drawing/2015/10/21/chartex" xmlns:cx3="http://schemas.microsoft.com/office/drawing/2016/5/9/chartex" xmlns:cx4="http://schemas.microsoft.com/office/drawing/2016/5/10/chartex" xmlns:cx5="http://schemas.microsoft.com/office/drawing/2016/5/11/chartex" xmlns:cx6="http://schemas.microsoft.com/office/drawing/2016/5/12/chartex" xmlns:cx7="http://schemas.microsoft.com/office/drawing/2016/5/13/chartex" xmlns:cx8="http://schemas.microsoft.com/office/drawing/2016/5/14/chartex" xmlns:mc="http://schemas.openxmlformats.org/markup-compatibility/2006" xmlns:aink="http://schemas.microsoft.com/office/drawing/2016/ink" xmlns:am3d="http://schemas.microsoft.com/office/drawing/2017/model3d" xmlns:o="urn:schemas-microsoft-com:office:office" xmlns:oel="http://schemas.microsoft.com/office/2019/extlst" xmlns:r="http://schemas.openxmlformats.org/officeDocument/2006/relationships" xmlns:m="http://schemas.openxmlformats.org/officeDocument/2006/math" xmlns:v="urn:schemas-microsoft-com:vml" xmlns:wp14="http://schemas.microsoft.com/office/word/2010/wordprocessingDrawing" xmlns:wp="http://schemas.openxmlformats.org/drawingml/2006/wordprocessingDrawing" xmlns:w10="urn:schemas-microsoft-com:office:word" xmlns:w="http://schemas.openxmlformats.org/wordprocessingml/2006/main" xmlns:w14="http://schemas.microsoft.com/office/word/2010/wordml" xmlns:w15="http://schemas.microsoft.com/office/word/2012/wordml" xmlns:w16cex="http://schemas.microsoft.com/office/word/2018/wordml/cex" xmlns:w16cid="http://schemas.microsoft.com/office/word/2016/wordml/cid" xmlns:w16="http://schemas.microsoft.com/office/word/2018/wordml" xmlns:w16du="http://schemas.microsoft.com/office/word/2023/wordml/word16du" xmlns:w16sdtdh="http://schemas.microsoft.com/office/word/2020/wordml/sdtdatahash" xmlns:w16sdtfl="http://schemas.microsoft.com/office/word/2024/wordml/sdtformatlock" xmlns:w16se="http://schemas.microsoft.com/office/word/2015/wordml/symex" xmlns:wpg="http://schemas.microsoft.com/office/word/2010/wordprocessingGroup" xmlns:wpi="http://schemas.microsoft.com/office/word/2010/wordprocessingInk" xmlns:wne="http://schemas.microsoft.com/office/word/2006/wordml" xmlns:wps="http://schemas.microsoft.com/office/word/2010/wordprocessingShape" mc:Ignorable="w14 w15 w16se w16cid w16 w16cex w16sdtdh w16sdtfl w16du wp14">
   <w:abstractNum w:abstractNumId="0" w15:restartNumberingAfterBreak="0">
     <w:nsid w:val="00FF922E"/>
     <w:multiLevelType w:val="hybridMultilevel"/>
@@ -30363,15 +29384,6 @@
 </file>
 
 <file path=customXml/item1.xml><?xml version="1.0" encoding="utf-8"?>
-<?mso-contentType ?>
-<FormTemplates xmlns="http://schemas.microsoft.com/sharepoint/v3/contenttype/forms">
-  <Display>DocumentLibraryForm</Display>
-  <Edit>DocumentLibraryForm</Edit>
-  <New>DocumentLibraryForm</New>
-</FormTemplates>
-</file>
-
-<file path=customXml/item2.xml><?xml version="1.0" encoding="utf-8"?>
 <ct:contentTypeSchema xmlns:ct="http://schemas.microsoft.com/office/2006/metadata/contentType" xmlns:ma="http://schemas.microsoft.com/office/2006/metadata/properties/metaAttributes" ct:_="" ma:_="" ma:contentTypeName="Document" ma:contentTypeID="0x010100922A3CA1EE6E4B44833A16005451862E" ma:contentTypeVersion="3" ma:contentTypeDescription="Create a new document." ma:contentTypeScope="" ma:versionID="b712dade4bf8bf57d4a0cdac4d020ae4">
   <xsd:schema xmlns:xsd="http://www.w3.org/2001/XMLSchema" xmlns:xs="http://www.w3.org/2001/XMLSchema" xmlns:p="http://schemas.microsoft.com/office/2006/metadata/properties" xmlns:ns2="92f6da62-8f25-40d3-824c-47c5f6f94bd6" targetNamespace="http://schemas.microsoft.com/office/2006/metadata/properties" ma:root="true" ma:fieldsID="f6f8642a0533a95cbf7fc7bbc8c1e153" ns2:_="">
     <xsd:import namespace="92f6da62-8f25-40d3-824c-47c5f6f94bd6"/>
@@ -30509,25 +29521,26 @@
 </ct:contentTypeSchema>
 </file>
 
+<file path=customXml/item2.xml><?xml version="1.0" encoding="utf-8"?>
+<?mso-contentType ?>
+<FormTemplates xmlns="http://schemas.microsoft.com/sharepoint/v3/contenttype/forms">
+  <Display>DocumentLibraryForm</Display>
+  <Edit>DocumentLibraryForm</Edit>
+  <New>DocumentLibraryForm</New>
+</FormTemplates>
+</file>
+
 <file path=customXml/item3.xml><?xml version="1.0" encoding="utf-8"?>
+<b:Sources xmlns:b="http://schemas.openxmlformats.org/officeDocument/2006/bibliography" xmlns="http://schemas.openxmlformats.org/officeDocument/2006/bibliography" SelectedStyle="\APASixthEditionOfficeOnline.xsl" StyleName="APA" Version="6"/>
+</file>
+
+<file path=customXml/item4.xml><?xml version="1.0" encoding="utf-8"?>
 <p:properties xmlns:p="http://schemas.microsoft.com/office/2006/metadata/properties" xmlns:xsi="http://www.w3.org/2001/XMLSchema-instance" xmlns:pc="http://schemas.microsoft.com/office/infopath/2007/PartnerControls">
   <documentManagement/>
 </p:properties>
 </file>
 
-<file path=customXml/item4.xml><?xml version="1.0" encoding="utf-8"?>
-<b:Sources xmlns:b="http://schemas.openxmlformats.org/officeDocument/2006/bibliography" xmlns="http://schemas.openxmlformats.org/officeDocument/2006/bibliography" SelectedStyle="\APASixthEditionOfficeOnline.xsl" StyleName="APA" Version="6"/>
-</file>
-
 <file path=customXml/itemProps1.xml><?xml version="1.0" encoding="utf-8"?>
-<ds:datastoreItem xmlns:ds="http://schemas.openxmlformats.org/officeDocument/2006/customXml" ds:itemID="{82A9BB68-56B4-4822-B6B7-DB471576EB1F}">
-  <ds:schemaRefs>
-    <ds:schemaRef ds:uri="http://schemas.microsoft.com/sharepoint/v3/contenttype/forms"/>
-  </ds:schemaRefs>
-</ds:datastoreItem>
-</file>
-
-<file path=customXml/itemProps2.xml><?xml version="1.0" encoding="utf-8"?>
 <ds:datastoreItem xmlns:ds="http://schemas.openxmlformats.org/officeDocument/2006/customXml" ds:itemID="{69960CE0-24F5-4ADF-A12F-FE193FFA9C43}">
   <ds:schemaRefs>
     <ds:schemaRef ds:uri="http://schemas.microsoft.com/office/2006/metadata/contentType"/>
@@ -30545,19 +29558,27 @@
 </ds:datastoreItem>
 </file>
 
+<file path=customXml/itemProps2.xml><?xml version="1.0" encoding="utf-8"?>
+<ds:datastoreItem xmlns:ds="http://schemas.openxmlformats.org/officeDocument/2006/customXml" ds:itemID="{82A9BB68-56B4-4822-B6B7-DB471576EB1F}">
+  <ds:schemaRefs>
+    <ds:schemaRef ds:uri="http://schemas.microsoft.com/sharepoint/v3/contenttype/forms"/>
+  </ds:schemaRefs>
+</ds:datastoreItem>
+</file>
+
 <file path=customXml/itemProps3.xml><?xml version="1.0" encoding="utf-8"?>
+<ds:datastoreItem xmlns:ds="http://schemas.openxmlformats.org/officeDocument/2006/customXml" ds:itemID="{E3DA75CE-018A-4AF1-8B5C-BF0FBFE76924}">
+  <ds:schemaRefs>
+    <ds:schemaRef ds:uri="http://schemas.openxmlformats.org/officeDocument/2006/bibliography"/>
+  </ds:schemaRefs>
+</ds:datastoreItem>
+</file>
+
+<file path=customXml/itemProps4.xml><?xml version="1.0" encoding="utf-8"?>
 <ds:datastoreItem xmlns:ds="http://schemas.openxmlformats.org/officeDocument/2006/customXml" ds:itemID="{B2E31085-3E06-4A9F-9730-20A04C85DF24}">
   <ds:schemaRefs>
     <ds:schemaRef ds:uri="http://schemas.microsoft.com/office/2006/metadata/properties"/>
     <ds:schemaRef ds:uri="http://schemas.microsoft.com/office/infopath/2007/PartnerControls"/>
   </ds:schemaRefs>
 </ds:datastoreItem>
-</file>
-
-<file path=customXml/itemProps4.xml><?xml version="1.0" encoding="utf-8"?>
-<ds:datastoreItem xmlns:ds="http://schemas.openxmlformats.org/officeDocument/2006/customXml" ds:itemID="{E3DA75CE-018A-4AF1-8B5C-BF0FBFE76924}">
-  <ds:schemaRefs>
-    <ds:schemaRef ds:uri="http://schemas.openxmlformats.org/officeDocument/2006/bibliography"/>
-  </ds:schemaRefs>
-</ds:datastoreItem>
 </file>
</xml_diff>

<commit_message>
Update evaluation progress, 5Vs, Data acquisition and storage
</commit_message>
<xml_diff>
--- a/documents/Assignment 2.docx
+++ b/documents/Assignment 2.docx
@@ -312,7 +312,29 @@
               <w:sz w:val="28"/>
               <w:szCs w:val="28"/>
             </w:rPr>
-            <w:t>Lecturer: Dr Thuseethan Selvarajah</w:t>
+            <w:t xml:space="preserve">Lecturer: Dr </w:t>
+          </w:r>
+          <w:proofErr w:type="spellStart"/>
+          <w:r>
+            <w:rPr>
+              <w:rFonts w:ascii="Times New Roman" w:hAnsi="Times New Roman"/>
+              <w:b/>
+              <w:bCs/>
+              <w:sz w:val="28"/>
+              <w:szCs w:val="28"/>
+            </w:rPr>
+            <w:t>Thuseethan</w:t>
+          </w:r>
+          <w:proofErr w:type="spellEnd"/>
+          <w:r>
+            <w:rPr>
+              <w:rFonts w:ascii="Times New Roman" w:hAnsi="Times New Roman"/>
+              <w:b/>
+              <w:bCs/>
+              <w:sz w:val="28"/>
+              <w:szCs w:val="28"/>
+            </w:rPr>
+            <w:t xml:space="preserve"> Selvarajah</w:t>
           </w:r>
         </w:p>
         <w:p>
@@ -367,13 +389,23 @@
             </w:rPr>
           </w:pPr>
           <w:bookmarkStart w:id="0" w:name="OLE_LINK2"/>
+          <w:proofErr w:type="spellStart"/>
           <w:r>
             <w:rPr>
               <w:rFonts w:ascii="Times New Roman" w:eastAsiaTheme="minorEastAsia" w:hAnsi="Times New Roman"/>
               <w:sz w:val="28"/>
               <w:szCs w:val="28"/>
             </w:rPr>
-            <w:t>Thi Xuan Thanh Tran</w:t>
+            <w:t>Thi</w:t>
+          </w:r>
+          <w:proofErr w:type="spellEnd"/>
+          <w:r>
+            <w:rPr>
+              <w:rFonts w:ascii="Times New Roman" w:eastAsiaTheme="minorEastAsia" w:hAnsi="Times New Roman"/>
+              <w:sz w:val="28"/>
+              <w:szCs w:val="28"/>
+            </w:rPr>
+            <w:t xml:space="preserve"> Xuan Thanh Tran</w:t>
           </w:r>
           <w:r>
             <w:rPr>
@@ -515,6 +547,7 @@
               <w:szCs w:val="24"/>
             </w:rPr>
           </w:pPr>
+          <w:proofErr w:type="gramStart"/>
           <w:r>
             <w:rPr>
               <w:rFonts w:ascii="Times New Roman" w:eastAsia="Aptos" w:hAnsi="Times New Roman"/>
@@ -555,6 +588,7 @@
             </w:rPr>
             <w:t>September</w:t>
           </w:r>
+          <w:proofErr w:type="gramEnd"/>
           <w:r>
             <w:rPr>
               <w:rFonts w:ascii="Times New Roman" w:eastAsia="Aptos" w:hAnsi="Times New Roman"/>
@@ -2277,6 +2311,7 @@
         <w:lastRenderedPageBreak/>
         <w:t>SECTION 1 – A</w:t>
       </w:r>
+      <w:proofErr w:type="spellStart"/>
       <w:r>
         <w:rPr>
           <w:rFonts w:ascii="Times New Roman" w:eastAsia="Times New Roman" w:hAnsi="Times New Roman" w:cs="Times New Roman"/>
@@ -2287,7 +2322,20 @@
           <w:szCs w:val="24"/>
           <w:lang w:val="en-AU"/>
         </w:rPr>
-        <w:t>ssessment 1 Report</w:t>
+        <w:t>ssessment</w:t>
+      </w:r>
+      <w:proofErr w:type="spellEnd"/>
+      <w:r>
+        <w:rPr>
+          <w:rFonts w:ascii="Times New Roman" w:eastAsia="Times New Roman" w:hAnsi="Times New Roman" w:cs="Times New Roman"/>
+          <w:b/>
+          <w:bCs/>
+          <w:color w:val="1F497D" w:themeColor="text2"/>
+          <w:sz w:val="24"/>
+          <w:szCs w:val="24"/>
+          <w:lang w:val="en-AU"/>
+        </w:rPr>
+        <w:t xml:space="preserve"> 1 Report</w:t>
       </w:r>
     </w:p>
     <w:p>
@@ -2407,7 +2455,27 @@
           <w:szCs w:val="24"/>
           <w:lang w:val="en-AU"/>
         </w:rPr>
-        <w:t xml:space="preserve"> a secure and automated data pipeline covering acquisition, storage, and processing of NT crime datasets along with relevant datasets; </w:t>
+        <w:t xml:space="preserve"> a secure and automated data pipeline covering acquisition, storage, and processing of NT crime datasets along with relevant </w:t>
+      </w:r>
+      <w:proofErr w:type="gramStart"/>
+      <w:r>
+        <w:rPr>
+          <w:rFonts w:ascii="Times New Roman" w:eastAsia="Times New Roman" w:hAnsi="Times New Roman" w:cs="Times New Roman"/>
+          <w:sz w:val="24"/>
+          <w:szCs w:val="24"/>
+          <w:lang w:val="en-AU"/>
+        </w:rPr>
+        <w:t>datasets;</w:t>
+      </w:r>
+      <w:proofErr w:type="gramEnd"/>
+      <w:r>
+        <w:rPr>
+          <w:rFonts w:ascii="Times New Roman" w:eastAsia="Times New Roman" w:hAnsi="Times New Roman" w:cs="Times New Roman"/>
+          <w:sz w:val="24"/>
+          <w:szCs w:val="24"/>
+          <w:lang w:val="en-AU"/>
+        </w:rPr>
+        <w:t xml:space="preserve"> </w:t>
       </w:r>
     </w:p>
     <w:p>
@@ -6323,7 +6391,29 @@
                 <w:szCs w:val="24"/>
                 <w:lang w:val="en-AU"/>
               </w:rPr>
-              <w:t>Cleans, merges and engineers features (lagged indicators, cyclical month encoding, per-capita normalisation) across the three sources.</w:t>
+              <w:t xml:space="preserve">Cleans, merges and </w:t>
+            </w:r>
+            <w:proofErr w:type="gramStart"/>
+            <w:r>
+              <w:rPr>
+                <w:rFonts w:ascii="Times New Roman" w:eastAsia="Times New Roman" w:hAnsi="Times New Roman"/>
+                <w:color w:val="000000" w:themeColor="text1"/>
+                <w:sz w:val="24"/>
+                <w:szCs w:val="24"/>
+                <w:lang w:val="en-AU"/>
+              </w:rPr>
+              <w:t>engineers</w:t>
+            </w:r>
+            <w:proofErr w:type="gramEnd"/>
+            <w:r>
+              <w:rPr>
+                <w:rFonts w:ascii="Times New Roman" w:eastAsia="Times New Roman" w:hAnsi="Times New Roman"/>
+                <w:color w:val="000000" w:themeColor="text1"/>
+                <w:sz w:val="24"/>
+                <w:szCs w:val="24"/>
+                <w:lang w:val="en-AU"/>
+              </w:rPr>
+              <w:t xml:space="preserve"> features (lagged indicators, cyclical month encoding, per-capita normalisation) across the three sources.</w:t>
             </w:r>
           </w:p>
         </w:tc>
@@ -6559,6 +6649,7 @@
               </w:rPr>
               <w:t>Python (</w:t>
             </w:r>
+            <w:proofErr w:type="spellStart"/>
             <w:r>
               <w:rPr>
                 <w:rFonts w:ascii="Times New Roman" w:eastAsia="Times New Roman" w:hAnsi="Times New Roman" w:cs="Times New Roman"/>
@@ -6569,6 +6660,7 @@
               </w:rPr>
               <w:t>Streamlit</w:t>
             </w:r>
+            <w:proofErr w:type="spellEnd"/>
             <w:r>
               <w:rPr>
                 <w:rFonts w:ascii="Times New Roman" w:eastAsia="Times New Roman" w:hAnsi="Times New Roman" w:cs="Times New Roman"/>
@@ -6719,6 +6811,7 @@
                 <w:lang w:val="en-AU"/>
               </w:rPr>
             </w:pPr>
+            <w:proofErr w:type="spellStart"/>
             <w:r>
               <w:rPr>
                 <w:rFonts w:ascii="Times New Roman" w:eastAsia="Times New Roman" w:hAnsi="Times New Roman" w:cs="Times New Roman"/>
@@ -6729,6 +6822,7 @@
               </w:rPr>
               <w:t>Streamlit</w:t>
             </w:r>
+            <w:proofErr w:type="spellEnd"/>
             <w:r>
               <w:rPr>
                 <w:rFonts w:ascii="Times New Roman" w:eastAsia="Times New Roman" w:hAnsi="Times New Roman" w:cs="Times New Roman"/>
@@ -7129,8 +7223,18 @@
           <w:sz w:val="24"/>
           <w:szCs w:val="24"/>
         </w:rPr>
-        <w:t xml:space="preserve">  Glue Data Catalog</w:t>
-      </w:r>
+        <w:t xml:space="preserve">  Glue Data </w:t>
+      </w:r>
+      <w:proofErr w:type="spellStart"/>
+      <w:r>
+        <w:rPr>
+          <w:rFonts w:ascii="Times New Roman" w:eastAsia="Times New Roman" w:hAnsi="Times New Roman"/>
+          <w:sz w:val="24"/>
+          <w:szCs w:val="24"/>
+        </w:rPr>
+        <w:t>Catalog</w:t>
+      </w:r>
+      <w:proofErr w:type="spellEnd"/>
       <w:r>
         <w:rPr>
           <w:rFonts w:ascii="Times New Roman" w:eastAsia="Times New Roman" w:hAnsi="Times New Roman"/>
@@ -7195,13 +7299,23 @@
         </w:rPr>
         <w:t xml:space="preserve"> </w:t>
       </w:r>
-      <w:r>
-        <w:rPr>
-          <w:rFonts w:ascii="Times New Roman" w:eastAsia="Times New Roman" w:hAnsi="Times New Roman"/>
-          <w:sz w:val="24"/>
-          <w:szCs w:val="24"/>
-        </w:rPr>
-        <w:t>QuickSight, with SageMaker Model Monitor for post-deployment monitoring</w:t>
+      <w:proofErr w:type="spellStart"/>
+      <w:r>
+        <w:rPr>
+          <w:rFonts w:ascii="Times New Roman" w:eastAsia="Times New Roman" w:hAnsi="Times New Roman"/>
+          <w:sz w:val="24"/>
+          <w:szCs w:val="24"/>
+        </w:rPr>
+        <w:t>QuickSight</w:t>
+      </w:r>
+      <w:proofErr w:type="spellEnd"/>
+      <w:r>
+        <w:rPr>
+          <w:rFonts w:ascii="Times New Roman" w:eastAsia="Times New Roman" w:hAnsi="Times New Roman"/>
+          <w:sz w:val="24"/>
+          <w:szCs w:val="24"/>
+        </w:rPr>
+        <w:t>, with SageMaker Model Monitor for post-deployment monitoring</w:t>
       </w:r>
       <w:r>
         <w:rPr>
@@ -7279,8 +7393,18 @@
           <w:sz w:val="24"/>
           <w:szCs w:val="24"/>
         </w:rPr>
-        <w:t xml:space="preserve"> Streamlit</w:t>
-      </w:r>
+        <w:t xml:space="preserve"> </w:t>
+      </w:r>
+      <w:proofErr w:type="spellStart"/>
+      <w:r>
+        <w:rPr>
+          <w:rFonts w:ascii="Times New Roman" w:eastAsia="Times New Roman" w:hAnsi="Times New Roman"/>
+          <w:sz w:val="24"/>
+          <w:szCs w:val="24"/>
+        </w:rPr>
+        <w:t>Streamlit</w:t>
+      </w:r>
+      <w:proofErr w:type="spellEnd"/>
       <w:r>
         <w:rPr>
           <w:rFonts w:ascii="Times New Roman" w:eastAsia="Times New Roman" w:hAnsi="Times New Roman"/>
@@ -7361,7 +7485,43 @@
           <w:sz w:val="24"/>
           <w:szCs w:val="24"/>
         </w:rPr>
-        <w:t>the GitHub-based data store to Amazon S3, pandas-based data processing to AWS Glue ETL, the Analytics/ML stage to Amazon SageMaker for managed training and scheduled deployment, the Streamlit dashboard to Amazon QuickSight, the Monitor stage to Amazon SageMaker Model Monitor, and the Incremental learning stage to SageMaker's built-in incremental (continuous) training capability. Future enhancements under consideration include real-time or near-real-time data ingestion (replacing manual/batch downloads) and integration with additional predictors such as weather or event-calendar data to improve forecast accuracy.</w:t>
+        <w:t xml:space="preserve">the GitHub-based data store to Amazon S3, pandas-based data processing to AWS Glue ETL, the Analytics/ML stage to Amazon SageMaker for managed training and scheduled deployment, the </w:t>
+      </w:r>
+      <w:proofErr w:type="spellStart"/>
+      <w:r>
+        <w:rPr>
+          <w:rFonts w:ascii="Times New Roman" w:eastAsia="Times New Roman" w:hAnsi="Times New Roman"/>
+          <w:sz w:val="24"/>
+          <w:szCs w:val="24"/>
+        </w:rPr>
+        <w:t>Streamlit</w:t>
+      </w:r>
+      <w:proofErr w:type="spellEnd"/>
+      <w:r>
+        <w:rPr>
+          <w:rFonts w:ascii="Times New Roman" w:eastAsia="Times New Roman" w:hAnsi="Times New Roman"/>
+          <w:sz w:val="24"/>
+          <w:szCs w:val="24"/>
+        </w:rPr>
+        <w:t xml:space="preserve"> dashboard to Amazon </w:t>
+      </w:r>
+      <w:proofErr w:type="spellStart"/>
+      <w:r>
+        <w:rPr>
+          <w:rFonts w:ascii="Times New Roman" w:eastAsia="Times New Roman" w:hAnsi="Times New Roman"/>
+          <w:sz w:val="24"/>
+          <w:szCs w:val="24"/>
+        </w:rPr>
+        <w:t>QuickSight</w:t>
+      </w:r>
+      <w:proofErr w:type="spellEnd"/>
+      <w:r>
+        <w:rPr>
+          <w:rFonts w:ascii="Times New Roman" w:eastAsia="Times New Roman" w:hAnsi="Times New Roman"/>
+          <w:sz w:val="24"/>
+          <w:szCs w:val="24"/>
+        </w:rPr>
+        <w:t>, the Monitor stage to Amazon SageMaker Model Monitor, and the Incremental learning stage to SageMaker's built-in incremental (continuous) training capability. Future enhancements under consideration include real-time or near-real-time data ingestion (replacing manual/batch downloads) and integration with additional predictors such as weather or event-calendar data to improve forecast accuracy.</w:t>
       </w:r>
     </w:p>
     <w:p>
@@ -7842,14 +8002,25 @@
               </w:rPr>
               <w:t xml:space="preserve">GitHub repository with README; </w:t>
             </w:r>
-            <w:r>
-              <w:rPr>
-                <w:rFonts w:ascii="Times New Roman" w:eastAsia="Times New Roman" w:hAnsi="Times New Roman" w:cs="Times New Roman"/>
-                <w:sz w:val="24"/>
-                <w:szCs w:val="24"/>
-                <w:lang w:val="en-AU"/>
-              </w:rPr>
-              <w:t>Streamlit account set up</w:t>
+            <w:proofErr w:type="spellStart"/>
+            <w:r>
+              <w:rPr>
+                <w:rFonts w:ascii="Times New Roman" w:eastAsia="Times New Roman" w:hAnsi="Times New Roman" w:cs="Times New Roman"/>
+                <w:sz w:val="24"/>
+                <w:szCs w:val="24"/>
+                <w:lang w:val="en-AU"/>
+              </w:rPr>
+              <w:t>Streamlit</w:t>
+            </w:r>
+            <w:proofErr w:type="spellEnd"/>
+            <w:r>
+              <w:rPr>
+                <w:rFonts w:ascii="Times New Roman" w:eastAsia="Times New Roman" w:hAnsi="Times New Roman" w:cs="Times New Roman"/>
+                <w:sz w:val="24"/>
+                <w:szCs w:val="24"/>
+                <w:lang w:val="en-AU"/>
+              </w:rPr>
+              <w:t xml:space="preserve"> account set up</w:t>
             </w:r>
             <w:r>
               <w:rPr>
@@ -7976,7 +8147,27 @@
                 <w:szCs w:val="24"/>
                 <w:lang w:val="en-AU"/>
               </w:rPr>
-              <w:t>Architecture diagram; project management board populated; confirmed data sources</w:t>
+              <w:t xml:space="preserve">Architecture </w:t>
+            </w:r>
+            <w:proofErr w:type="gramStart"/>
+            <w:r>
+              <w:rPr>
+                <w:rFonts w:ascii="Times New Roman" w:eastAsia="Times New Roman" w:hAnsi="Times New Roman" w:cs="Times New Roman"/>
+                <w:sz w:val="24"/>
+                <w:szCs w:val="24"/>
+                <w:lang w:val="en-AU"/>
+              </w:rPr>
+              <w:t>diagram;</w:t>
+            </w:r>
+            <w:proofErr w:type="gramEnd"/>
+            <w:r>
+              <w:rPr>
+                <w:rFonts w:ascii="Times New Roman" w:eastAsia="Times New Roman" w:hAnsi="Times New Roman" w:cs="Times New Roman"/>
+                <w:sz w:val="24"/>
+                <w:szCs w:val="24"/>
+                <w:lang w:val="en-AU"/>
+              </w:rPr>
+              <w:t xml:space="preserve"> project management board populated; confirmed data sources</w:t>
             </w:r>
           </w:p>
         </w:tc>
@@ -9200,6 +9391,7 @@
               </w:rPr>
               <w:t xml:space="preserve">Incorporate feedback; finalise </w:t>
             </w:r>
+            <w:proofErr w:type="gramStart"/>
             <w:r>
               <w:rPr>
                 <w:rFonts w:ascii="Times New Roman" w:eastAsia="Times New Roman" w:hAnsi="Times New Roman" w:cs="Times New Roman"/>
@@ -9225,7 +9417,37 @@
                 <w:szCs w:val="24"/>
                 <w:lang w:val="en-AU"/>
               </w:rPr>
-              <w:t xml:space="preserve"> deploy to Streamlit Community Cloud; </w:t>
+              <w:t xml:space="preserve"> deploy</w:t>
+            </w:r>
+            <w:proofErr w:type="gramEnd"/>
+            <w:r>
+              <w:rPr>
+                <w:rFonts w:ascii="Times New Roman" w:eastAsia="Times New Roman" w:hAnsi="Times New Roman" w:cs="Times New Roman"/>
+                <w:sz w:val="24"/>
+                <w:szCs w:val="24"/>
+                <w:lang w:val="en-AU"/>
+              </w:rPr>
+              <w:t xml:space="preserve"> to </w:t>
+            </w:r>
+            <w:proofErr w:type="spellStart"/>
+            <w:r>
+              <w:rPr>
+                <w:rFonts w:ascii="Times New Roman" w:eastAsia="Times New Roman" w:hAnsi="Times New Roman" w:cs="Times New Roman"/>
+                <w:sz w:val="24"/>
+                <w:szCs w:val="24"/>
+                <w:lang w:val="en-AU"/>
+              </w:rPr>
+              <w:t>Streamlit</w:t>
+            </w:r>
+            <w:proofErr w:type="spellEnd"/>
+            <w:r>
+              <w:rPr>
+                <w:rFonts w:ascii="Times New Roman" w:eastAsia="Times New Roman" w:hAnsi="Times New Roman" w:cs="Times New Roman"/>
+                <w:sz w:val="24"/>
+                <w:szCs w:val="24"/>
+                <w:lang w:val="en-AU"/>
+              </w:rPr>
+              <w:t xml:space="preserve"> Community Cloud; </w:t>
             </w:r>
             <w:r>
               <w:rPr>
@@ -9263,16 +9485,36 @@
                 <w:szCs w:val="24"/>
                 <w:lang w:val="en-AU"/>
               </w:rPr>
-              <w:t>Deployed dashboard</w:t>
-            </w:r>
-            <w:r>
-              <w:rPr>
-                <w:rFonts w:ascii="Times New Roman" w:eastAsia="Times New Roman" w:hAnsi="Times New Roman" w:cs="Times New Roman"/>
-                <w:sz w:val="24"/>
-                <w:szCs w:val="24"/>
-                <w:lang w:val="en-AU"/>
-              </w:rPr>
-              <w:t>; monitoring stage implemented</w:t>
+              <w:t xml:space="preserve">Deployed </w:t>
+            </w:r>
+            <w:proofErr w:type="gramStart"/>
+            <w:r>
+              <w:rPr>
+                <w:rFonts w:ascii="Times New Roman" w:eastAsia="Times New Roman" w:hAnsi="Times New Roman" w:cs="Times New Roman"/>
+                <w:sz w:val="24"/>
+                <w:szCs w:val="24"/>
+                <w:lang w:val="en-AU"/>
+              </w:rPr>
+              <w:t>dashboard</w:t>
+            </w:r>
+            <w:r>
+              <w:rPr>
+                <w:rFonts w:ascii="Times New Roman" w:eastAsia="Times New Roman" w:hAnsi="Times New Roman" w:cs="Times New Roman"/>
+                <w:sz w:val="24"/>
+                <w:szCs w:val="24"/>
+                <w:lang w:val="en-AU"/>
+              </w:rPr>
+              <w:t>;</w:t>
+            </w:r>
+            <w:proofErr w:type="gramEnd"/>
+            <w:r>
+              <w:rPr>
+                <w:rFonts w:ascii="Times New Roman" w:eastAsia="Times New Roman" w:hAnsi="Times New Roman" w:cs="Times New Roman"/>
+                <w:sz w:val="24"/>
+                <w:szCs w:val="24"/>
+                <w:lang w:val="en-AU"/>
+              </w:rPr>
+              <w:t xml:space="preserve"> monitoring stage implemented</w:t>
             </w:r>
           </w:p>
         </w:tc>
@@ -10116,7 +10358,27 @@
                 <w:szCs w:val="24"/>
                 <w:lang w:val="en-AU"/>
               </w:rPr>
-              <w:t xml:space="preserve"> features across the three data sources; implements post-deployment drift-checking scripts</w:t>
+              <w:t xml:space="preserve"> </w:t>
+            </w:r>
+            <w:proofErr w:type="gramStart"/>
+            <w:r>
+              <w:rPr>
+                <w:rFonts w:ascii="Times New Roman" w:eastAsia="Times New Roman" w:hAnsi="Times New Roman" w:cs="Times New Roman"/>
+                <w:sz w:val="24"/>
+                <w:szCs w:val="24"/>
+                <w:lang w:val="en-AU"/>
+              </w:rPr>
+              <w:t>features</w:t>
+            </w:r>
+            <w:proofErr w:type="gramEnd"/>
+            <w:r>
+              <w:rPr>
+                <w:rFonts w:ascii="Times New Roman" w:eastAsia="Times New Roman" w:hAnsi="Times New Roman" w:cs="Times New Roman"/>
+                <w:sz w:val="24"/>
+                <w:szCs w:val="24"/>
+                <w:lang w:val="en-AU"/>
+              </w:rPr>
+              <w:t xml:space="preserve"> across the three data sources; implements post-deployment drift-checking scripts</w:t>
             </w:r>
           </w:p>
         </w:tc>
@@ -10283,8 +10545,19 @@
                 <w:szCs w:val="24"/>
                 <w:lang w:val="en-AU"/>
               </w:rPr>
-              <w:t>Dashboard &amp; Deploy</w:t>
-            </w:r>
+              <w:t xml:space="preserve">Dashboard &amp; </w:t>
+            </w:r>
+            <w:proofErr w:type="gramStart"/>
+            <w:r>
+              <w:rPr>
+                <w:rFonts w:ascii="Times New Roman" w:eastAsia="Times New Roman" w:hAnsi="Times New Roman" w:cs="Times New Roman"/>
+                <w:sz w:val="24"/>
+                <w:szCs w:val="24"/>
+                <w:lang w:val="en-AU"/>
+              </w:rPr>
+              <w:t>Deploy</w:t>
+            </w:r>
+            <w:proofErr w:type="gramEnd"/>
           </w:p>
         </w:tc>
         <w:tc>
@@ -10312,7 +10585,47 @@
                 <w:szCs w:val="24"/>
                 <w:lang w:val="en-AU"/>
               </w:rPr>
-              <w:t>Builds the Streamlit dashboard and manages its deployment and redeployment via Streamlit Community Cloud.</w:t>
+              <w:t xml:space="preserve">Builds the </w:t>
+            </w:r>
+            <w:proofErr w:type="spellStart"/>
+            <w:r>
+              <w:rPr>
+                <w:rFonts w:ascii="Times New Roman" w:eastAsia="Times New Roman" w:hAnsi="Times New Roman" w:cs="Times New Roman"/>
+                <w:sz w:val="24"/>
+                <w:szCs w:val="24"/>
+                <w:lang w:val="en-AU"/>
+              </w:rPr>
+              <w:t>Streamlit</w:t>
+            </w:r>
+            <w:proofErr w:type="spellEnd"/>
+            <w:r>
+              <w:rPr>
+                <w:rFonts w:ascii="Times New Roman" w:eastAsia="Times New Roman" w:hAnsi="Times New Roman" w:cs="Times New Roman"/>
+                <w:sz w:val="24"/>
+                <w:szCs w:val="24"/>
+                <w:lang w:val="en-AU"/>
+              </w:rPr>
+              <w:t xml:space="preserve"> dashboard and manages its deployment and redeployment via </w:t>
+            </w:r>
+            <w:proofErr w:type="spellStart"/>
+            <w:r>
+              <w:rPr>
+                <w:rFonts w:ascii="Times New Roman" w:eastAsia="Times New Roman" w:hAnsi="Times New Roman" w:cs="Times New Roman"/>
+                <w:sz w:val="24"/>
+                <w:szCs w:val="24"/>
+                <w:lang w:val="en-AU"/>
+              </w:rPr>
+              <w:t>Streamlit</w:t>
+            </w:r>
+            <w:proofErr w:type="spellEnd"/>
+            <w:r>
+              <w:rPr>
+                <w:rFonts w:ascii="Times New Roman" w:eastAsia="Times New Roman" w:hAnsi="Times New Roman" w:cs="Times New Roman"/>
+                <w:sz w:val="24"/>
+                <w:szCs w:val="24"/>
+                <w:lang w:val="en-AU"/>
+              </w:rPr>
+              <w:t xml:space="preserve"> Community Cloud.</w:t>
             </w:r>
           </w:p>
         </w:tc>
@@ -10429,7 +10742,25 @@
           <w:sz w:val="24"/>
           <w:szCs w:val="24"/>
         </w:rPr>
-        <w:t xml:space="preserve"> from PROMIS to SerPro in November 2023 and </w:t>
+        <w:t xml:space="preserve"> from PROMIS to </w:t>
+      </w:r>
+      <w:proofErr w:type="spellStart"/>
+      <w:r>
+        <w:rPr>
+          <w:rFonts w:ascii="Times New Roman" w:eastAsia="Times New Roman" w:hAnsi="Times New Roman"/>
+          <w:sz w:val="24"/>
+          <w:szCs w:val="24"/>
+        </w:rPr>
+        <w:t>SerPro</w:t>
+      </w:r>
+      <w:proofErr w:type="spellEnd"/>
+      <w:r>
+        <w:rPr>
+          <w:rFonts w:ascii="Times New Roman" w:eastAsia="Times New Roman" w:hAnsi="Times New Roman"/>
+          <w:sz w:val="24"/>
+          <w:szCs w:val="24"/>
+        </w:rPr>
+        <w:t xml:space="preserve"> in November 2023 and </w:t>
       </w:r>
       <w:r>
         <w:rPr>
@@ -10867,7 +11198,25 @@
           <w:sz w:val="24"/>
           <w:szCs w:val="24"/>
         </w:rPr>
-        <w:t>And the final risk is misuse or misinterpretation of the forecasts. If predictions are read as statements about particular communities, the system could cause harm rather than support safety. Small counts in low-population regions could also make incidents identifiable. Forecasts will therefore be shown only at region and month level, with uncertainty ranges, and small values will be suppressed.</w:t>
+        <w:t xml:space="preserve">And the final risk is misuse or misinterpretation of the forecasts. If predictions are read as statements about </w:t>
+      </w:r>
+      <w:proofErr w:type="gramStart"/>
+      <w:r>
+        <w:rPr>
+          <w:rFonts w:ascii="Times New Roman" w:eastAsia="Times New Roman" w:hAnsi="Times New Roman"/>
+          <w:sz w:val="24"/>
+          <w:szCs w:val="24"/>
+        </w:rPr>
+        <w:t>particular communities</w:t>
+      </w:r>
+      <w:proofErr w:type="gramEnd"/>
+      <w:r>
+        <w:rPr>
+          <w:rFonts w:ascii="Times New Roman" w:eastAsia="Times New Roman" w:hAnsi="Times New Roman"/>
+          <w:sz w:val="24"/>
+          <w:szCs w:val="24"/>
+        </w:rPr>
+        <w:t>, the system could cause harm rather than support safety. Small counts in low-population regions could also make incidents identifiable. Forecasts will therefore be shown only at region and month level, with uncertainty ranges, and small values will be suppressed.</w:t>
       </w:r>
     </w:p>
     <w:p>
@@ -11471,7 +11820,43 @@
           <w:sz w:val="24"/>
           <w:szCs w:val="24"/>
         </w:rPr>
-        <w:t xml:space="preserve">Carroll, S. R., Garba, I., Figueroa-Rodríguez, O. L., Holbrook, J., Lovett, R., Materechera, S., Parsons, M., Raseroka, K., Rodriguez-Lonebear, D., Rowe, R., Sara, R., Walker, J. D., Anderson, J., &amp; Hudson, M. (2020). The CARE Principles for Indigenous Data Governance. Data Science Journal, 19(1), 1–12. </w:t>
+        <w:t xml:space="preserve">Carroll, S. R., Garba, I., Figueroa-Rodríguez, O. L., Holbrook, J., Lovett, R., </w:t>
+      </w:r>
+      <w:proofErr w:type="spellStart"/>
+      <w:r>
+        <w:rPr>
+          <w:rFonts w:ascii="Times New Roman" w:eastAsia="Times New Roman" w:hAnsi="Times New Roman"/>
+          <w:sz w:val="24"/>
+          <w:szCs w:val="24"/>
+        </w:rPr>
+        <w:t>Materechera</w:t>
+      </w:r>
+      <w:proofErr w:type="spellEnd"/>
+      <w:r>
+        <w:rPr>
+          <w:rFonts w:ascii="Times New Roman" w:eastAsia="Times New Roman" w:hAnsi="Times New Roman"/>
+          <w:sz w:val="24"/>
+          <w:szCs w:val="24"/>
+        </w:rPr>
+        <w:t xml:space="preserve">, S., Parsons, M., </w:t>
+      </w:r>
+      <w:proofErr w:type="spellStart"/>
+      <w:r>
+        <w:rPr>
+          <w:rFonts w:ascii="Times New Roman" w:eastAsia="Times New Roman" w:hAnsi="Times New Roman"/>
+          <w:sz w:val="24"/>
+          <w:szCs w:val="24"/>
+        </w:rPr>
+        <w:t>Raseroka</w:t>
+      </w:r>
+      <w:proofErr w:type="spellEnd"/>
+      <w:r>
+        <w:rPr>
+          <w:rFonts w:ascii="Times New Roman" w:eastAsia="Times New Roman" w:hAnsi="Times New Roman"/>
+          <w:sz w:val="24"/>
+          <w:szCs w:val="24"/>
+        </w:rPr>
+        <w:t xml:space="preserve">, K., Rodriguez-Lonebear, D., Rowe, R., Sara, R., Walker, J. D., Anderson, J., &amp; Hudson, M. (2020). The CARE Principles for Indigenous Data Governance. Data Science Journal, 19(1), 1–12. </w:t>
       </w:r>
       <w:hyperlink r:id="rId23">
         <w:r>
@@ -11556,15 +11941,57 @@
           <w:sz w:val="24"/>
           <w:szCs w:val="24"/>
         </w:rPr>
-        <w:t>NT crime statistics march 2026 - NTG open data portal</w:t>
-      </w:r>
-      <w:r>
-        <w:rPr>
-          <w:rFonts w:ascii="Times New Roman" w:eastAsia="Times New Roman" w:hAnsi="Times New Roman"/>
-          <w:sz w:val="24"/>
-          <w:szCs w:val="24"/>
-        </w:rPr>
-        <w:t xml:space="preserve">. Nt.Gov.Au. </w:t>
+        <w:t xml:space="preserve">NT crime </w:t>
+      </w:r>
+      <w:proofErr w:type="gramStart"/>
+      <w:r>
+        <w:rPr>
+          <w:rFonts w:ascii="Times New Roman" w:eastAsia="Times New Roman" w:hAnsi="Times New Roman"/>
+          <w:i/>
+          <w:iCs/>
+          <w:sz w:val="24"/>
+          <w:szCs w:val="24"/>
+        </w:rPr>
+        <w:t>statistics march</w:t>
+      </w:r>
+      <w:proofErr w:type="gramEnd"/>
+      <w:r>
+        <w:rPr>
+          <w:rFonts w:ascii="Times New Roman" w:eastAsia="Times New Roman" w:hAnsi="Times New Roman"/>
+          <w:i/>
+          <w:iCs/>
+          <w:sz w:val="24"/>
+          <w:szCs w:val="24"/>
+        </w:rPr>
+        <w:t xml:space="preserve"> 2026 - NTG open data portal</w:t>
+      </w:r>
+      <w:r>
+        <w:rPr>
+          <w:rFonts w:ascii="Times New Roman" w:eastAsia="Times New Roman" w:hAnsi="Times New Roman"/>
+          <w:sz w:val="24"/>
+          <w:szCs w:val="24"/>
+        </w:rPr>
+        <w:t xml:space="preserve">. </w:t>
+      </w:r>
+      <w:proofErr w:type="spellStart"/>
+      <w:proofErr w:type="gramStart"/>
+      <w:r>
+        <w:rPr>
+          <w:rFonts w:ascii="Times New Roman" w:eastAsia="Times New Roman" w:hAnsi="Times New Roman"/>
+          <w:sz w:val="24"/>
+          <w:szCs w:val="24"/>
+        </w:rPr>
+        <w:t>Nt.Gov.Au</w:t>
+      </w:r>
+      <w:proofErr w:type="spellEnd"/>
+      <w:proofErr w:type="gramEnd"/>
+      <w:r>
+        <w:rPr>
+          <w:rFonts w:ascii="Times New Roman" w:eastAsia="Times New Roman" w:hAnsi="Times New Roman"/>
+          <w:sz w:val="24"/>
+          <w:szCs w:val="24"/>
+        </w:rPr>
+        <w:t xml:space="preserve">. </w:t>
       </w:r>
       <w:hyperlink r:id="rId25">
         <w:r>
@@ -11644,7 +12071,29 @@
           <w:sz w:val="24"/>
           <w:szCs w:val="24"/>
         </w:rPr>
-        <w:t>Operation ventura | NT police, fire &amp; emergency services</w:t>
+        <w:t xml:space="preserve">Operation </w:t>
+      </w:r>
+      <w:proofErr w:type="spellStart"/>
+      <w:r>
+        <w:rPr>
+          <w:rFonts w:ascii="Times New Roman" w:eastAsia="Times New Roman" w:hAnsi="Times New Roman"/>
+          <w:i/>
+          <w:iCs/>
+          <w:sz w:val="24"/>
+          <w:szCs w:val="24"/>
+        </w:rPr>
+        <w:t>ventura</w:t>
+      </w:r>
+      <w:proofErr w:type="spellEnd"/>
+      <w:r>
+        <w:rPr>
+          <w:rFonts w:ascii="Times New Roman" w:eastAsia="Times New Roman" w:hAnsi="Times New Roman"/>
+          <w:i/>
+          <w:iCs/>
+          <w:sz w:val="24"/>
+          <w:szCs w:val="24"/>
+        </w:rPr>
+        <w:t xml:space="preserve"> | NT police, fire &amp; emergency services</w:t>
       </w:r>
       <w:r>
         <w:rPr>
@@ -12145,8 +12594,19 @@
                 <w:szCs w:val="24"/>
                 <w:lang w:val="en-US" w:eastAsia="en-US"/>
               </w:rPr>
-              <w:t>: naive baselines, leakage-free CV, rolling-origin backtest</w:t>
-            </w:r>
+              <w:t xml:space="preserve">: naive baselines, leakage-free CV, rolling-origin </w:t>
+            </w:r>
+            <w:proofErr w:type="spellStart"/>
+            <w:r>
+              <w:rPr>
+                <w:rFonts w:ascii="Times New Roman" w:eastAsia="Times New Roman" w:hAnsi="Times New Roman"/>
+                <w:sz w:val="24"/>
+                <w:szCs w:val="24"/>
+                <w:lang w:val="en-US" w:eastAsia="en-US"/>
+              </w:rPr>
+              <w:t>backtest</w:t>
+            </w:r>
+            <w:proofErr w:type="spellEnd"/>
           </w:p>
         </w:tc>
         <w:tc>
@@ -12170,8 +12630,19 @@
                 <w:szCs w:val="24"/>
                 <w:lang w:val="en-US" w:eastAsia="en-US"/>
               </w:rPr>
-              <w:t>Responds directly to A1 feedback on validation rigour</w:t>
-            </w:r>
+              <w:t xml:space="preserve">Responds directly to A1 feedback on validation </w:t>
+            </w:r>
+            <w:proofErr w:type="spellStart"/>
+            <w:r>
+              <w:rPr>
+                <w:rFonts w:ascii="Times New Roman" w:eastAsia="Times New Roman" w:hAnsi="Times New Roman"/>
+                <w:sz w:val="24"/>
+                <w:szCs w:val="24"/>
+                <w:lang w:val="en-US" w:eastAsia="en-US"/>
+              </w:rPr>
+              <w:t>rigour</w:t>
+            </w:r>
+            <w:proofErr w:type="spellEnd"/>
           </w:p>
         </w:tc>
       </w:tr>
@@ -12296,13 +12767,23 @@
                 <w:szCs w:val="24"/>
               </w:rPr>
             </w:pPr>
+            <w:proofErr w:type="spellStart"/>
             <w:r>
               <w:rPr>
                 <w:rFonts w:ascii="Times New Roman" w:eastAsiaTheme="minorEastAsia" w:hAnsi="Times New Roman"/>
                 <w:sz w:val="24"/>
                 <w:szCs w:val="24"/>
               </w:rPr>
-              <w:t xml:space="preserve">Thi Xuan Thanh Tran (Emma) </w:t>
+              <w:t>Thi</w:t>
+            </w:r>
+            <w:proofErr w:type="spellEnd"/>
+            <w:r>
+              <w:rPr>
+                <w:rFonts w:ascii="Times New Roman" w:eastAsiaTheme="minorEastAsia" w:hAnsi="Times New Roman"/>
+                <w:sz w:val="24"/>
+                <w:szCs w:val="24"/>
+              </w:rPr>
+              <w:t xml:space="preserve"> Xuan Thanh Tran (Emma) </w:t>
             </w:r>
           </w:p>
         </w:tc>
@@ -13022,7 +13503,27 @@
           <w:szCs w:val="24"/>
           <w:lang w:val="en-US" w:eastAsia="en-US"/>
         </w:rPr>
-        <w:t>Validation checks — empty dataframes, duplicated columns, fully-null columns flagged before proceeding.</w:t>
+        <w:t xml:space="preserve">Validation checks — empty </w:t>
+      </w:r>
+      <w:proofErr w:type="spellStart"/>
+      <w:r>
+        <w:rPr>
+          <w:rFonts w:ascii="Times New Roman" w:eastAsia="Times New Roman" w:hAnsi="Times New Roman"/>
+          <w:sz w:val="24"/>
+          <w:szCs w:val="24"/>
+          <w:lang w:val="en-US" w:eastAsia="en-US"/>
+        </w:rPr>
+        <w:t>dataframes</w:t>
+      </w:r>
+      <w:proofErr w:type="spellEnd"/>
+      <w:r>
+        <w:rPr>
+          <w:rFonts w:ascii="Times New Roman" w:eastAsia="Times New Roman" w:hAnsi="Times New Roman"/>
+          <w:sz w:val="24"/>
+          <w:szCs w:val="24"/>
+          <w:lang w:val="en-US" w:eastAsia="en-US"/>
+        </w:rPr>
+        <w:t>, duplicated columns, fully-null columns flagged before proceeding.</w:t>
       </w:r>
     </w:p>
     <w:p>
@@ -13046,7 +13547,29 @@
           <w:szCs w:val="24"/>
           <w:lang w:val="en-US" w:eastAsia="en-US"/>
         </w:rPr>
-        <w:t>Provenance tracking — each run writes to dataset/raw/ plus a manifest.json recording row/column counts and warnings.</w:t>
+        <w:t xml:space="preserve">Provenance tracking — each run writes to dataset/raw/ plus a </w:t>
+      </w:r>
+      <w:proofErr w:type="spellStart"/>
+      <w:proofErr w:type="gramStart"/>
+      <w:r>
+        <w:rPr>
+          <w:rFonts w:ascii="Times New Roman" w:eastAsia="Times New Roman" w:hAnsi="Times New Roman"/>
+          <w:sz w:val="24"/>
+          <w:szCs w:val="24"/>
+          <w:lang w:val="en-US" w:eastAsia="en-US"/>
+        </w:rPr>
+        <w:t>manifest.json</w:t>
+      </w:r>
+      <w:proofErr w:type="spellEnd"/>
+      <w:proofErr w:type="gramEnd"/>
+      <w:r>
+        <w:rPr>
+          <w:rFonts w:ascii="Times New Roman" w:eastAsia="Times New Roman" w:hAnsi="Times New Roman"/>
+          <w:sz w:val="24"/>
+          <w:szCs w:val="24"/>
+          <w:lang w:val="en-US" w:eastAsia="en-US"/>
+        </w:rPr>
+        <w:t xml:space="preserve"> recording row/column counts and warnings.</w:t>
       </w:r>
     </w:p>
     <w:p>
@@ -13066,7 +13589,27 @@
           <w:szCs w:val="24"/>
           <w:lang w:val="en-US" w:eastAsia="en-US"/>
         </w:rPr>
-        <w:t>Storage follows a three-stage convention: dataset/source/ → dataset/raw/ (ingest.py) → dataset/processed/ (data_processing.py, Section 2). GitHub was chosen for version-controlled history and individually-attributable commits (Section 6) at no cost.</w:t>
+        <w:t xml:space="preserve">Storage follows a three-stage convention: dataset/source/ → dataset/raw/ (ingest.py) → dataset/processed/ (data_processing.py, Section 2). GitHub was chosen for version-controlled history and </w:t>
+      </w:r>
+      <w:proofErr w:type="gramStart"/>
+      <w:r>
+        <w:rPr>
+          <w:rFonts w:ascii="Times New Roman" w:eastAsia="Times New Roman" w:hAnsi="Times New Roman"/>
+          <w:sz w:val="24"/>
+          <w:szCs w:val="24"/>
+          <w:lang w:val="en-US" w:eastAsia="en-US"/>
+        </w:rPr>
+        <w:t>individually-attributable</w:t>
+      </w:r>
+      <w:proofErr w:type="gramEnd"/>
+      <w:r>
+        <w:rPr>
+          <w:rFonts w:ascii="Times New Roman" w:eastAsia="Times New Roman" w:hAnsi="Times New Roman"/>
+          <w:sz w:val="24"/>
+          <w:szCs w:val="24"/>
+          <w:lang w:val="en-US" w:eastAsia="en-US"/>
+        </w:rPr>
+        <w:t xml:space="preserve"> commits (Section 6) at no cost.</w:t>
       </w:r>
     </w:p>
     <w:p>
@@ -13110,7 +13653,27 @@
           <w:szCs w:val="24"/>
           <w:lang w:val="en-US" w:eastAsia="en-US"/>
         </w:rPr>
-        <w:t>Scale doesn't warrant it — current volume (~72,000 rows across all sources) doesn't need the concurrent-access or indexing capabilities a relational database provides.</w:t>
+        <w:t xml:space="preserve">Scale doesn't warrant </w:t>
+      </w:r>
+      <w:proofErr w:type="gramStart"/>
+      <w:r>
+        <w:rPr>
+          <w:rFonts w:ascii="Times New Roman" w:eastAsia="Times New Roman" w:hAnsi="Times New Roman"/>
+          <w:sz w:val="24"/>
+          <w:szCs w:val="24"/>
+          <w:lang w:val="en-US" w:eastAsia="en-US"/>
+        </w:rPr>
+        <w:t>it —</w:t>
+      </w:r>
+      <w:proofErr w:type="gramEnd"/>
+      <w:r>
+        <w:rPr>
+          <w:rFonts w:ascii="Times New Roman" w:eastAsia="Times New Roman" w:hAnsi="Times New Roman"/>
+          <w:sz w:val="24"/>
+          <w:szCs w:val="24"/>
+          <w:lang w:val="en-US" w:eastAsia="en-US"/>
+        </w:rPr>
+        <w:t xml:space="preserve"> current volume (~72,000 rows across all sources) doesn't need the concurrent-access or indexing capabilities a relational database provides.</w:t>
       </w:r>
     </w:p>
     <w:p>
@@ -13134,7 +13697,27 @@
           <w:szCs w:val="24"/>
           <w:lang w:val="en-US" w:eastAsia="en-US"/>
         </w:rPr>
-        <w:t>Functionality already exists — the joins and aggregations a SQL layer would offer are already handled by the existing ingest.py/data_processing.py scripts; adding one would duplicate rather than extend capability.</w:t>
+        <w:t xml:space="preserve">Functionality already exists — the </w:t>
+      </w:r>
+      <w:proofErr w:type="gramStart"/>
+      <w:r>
+        <w:rPr>
+          <w:rFonts w:ascii="Times New Roman" w:eastAsia="Times New Roman" w:hAnsi="Times New Roman"/>
+          <w:sz w:val="24"/>
+          <w:szCs w:val="24"/>
+          <w:lang w:val="en-US" w:eastAsia="en-US"/>
+        </w:rPr>
+        <w:t>joins</w:t>
+      </w:r>
+      <w:proofErr w:type="gramEnd"/>
+      <w:r>
+        <w:rPr>
+          <w:rFonts w:ascii="Times New Roman" w:eastAsia="Times New Roman" w:hAnsi="Times New Roman"/>
+          <w:sz w:val="24"/>
+          <w:szCs w:val="24"/>
+          <w:lang w:val="en-US" w:eastAsia="en-US"/>
+        </w:rPr>
+        <w:t xml:space="preserve"> and aggregations a SQL layer would offer are already handled by the existing ingest.py/data_processing.py scripts; adding one would duplicate rather than extend capability.</w:t>
       </w:r>
     </w:p>
     <w:p>
@@ -13158,7 +13741,27 @@
           <w:szCs w:val="24"/>
           <w:lang w:val="en-US" w:eastAsia="en-US"/>
         </w:rPr>
-        <w:t>Timing risk — refactoring the already-tested Ingest, Processing, and Engineering stages (Section 3.5) mid-semester could destabilise working code during the weeks reserved for modelling and dashboard delivery (Table 3).</w:t>
+        <w:t xml:space="preserve">Timing risk — refactoring the already-tested Ingest, Processing, and Engineering stages (Section 3.5) mid-semester could </w:t>
+      </w:r>
+      <w:proofErr w:type="spellStart"/>
+      <w:r>
+        <w:rPr>
+          <w:rFonts w:ascii="Times New Roman" w:eastAsia="Times New Roman" w:hAnsi="Times New Roman"/>
+          <w:sz w:val="24"/>
+          <w:szCs w:val="24"/>
+          <w:lang w:val="en-US" w:eastAsia="en-US"/>
+        </w:rPr>
+        <w:t>destabilise</w:t>
+      </w:r>
+      <w:proofErr w:type="spellEnd"/>
+      <w:r>
+        <w:rPr>
+          <w:rFonts w:ascii="Times New Roman" w:eastAsia="Times New Roman" w:hAnsi="Times New Roman"/>
+          <w:sz w:val="24"/>
+          <w:szCs w:val="24"/>
+          <w:lang w:val="en-US" w:eastAsia="en-US"/>
+        </w:rPr>
+        <w:t xml:space="preserve"> working code during the weeks reserved for modelling and dashboard delivery (Table 3).</w:t>
       </w:r>
     </w:p>
     <w:p>
@@ -13302,6 +13905,7 @@
                 <w:lang w:val="en-US" w:eastAsia="en-US"/>
               </w:rPr>
             </w:pPr>
+            <w:proofErr w:type="spellStart"/>
             <w:r>
               <w:rPr>
                 <w:rFonts w:ascii="Calibri" w:eastAsia="Times New Roman" w:hAnsi="Calibri" w:cs="Calibri"/>
@@ -13314,6 +13918,7 @@
               </w:rPr>
               <w:t>Characterisation</w:t>
             </w:r>
+            <w:proofErr w:type="spellEnd"/>
           </w:p>
         </w:tc>
       </w:tr>
@@ -13597,6 +14202,7 @@
                 <w:lang w:val="en-US" w:eastAsia="en-US"/>
               </w:rPr>
             </w:pPr>
+            <w:proofErr w:type="spellStart"/>
             <w:r>
               <w:rPr>
                 <w:rFonts w:ascii="Calibri" w:eastAsia="Times New Roman" w:hAnsi="Calibri" w:cs="Calibri"/>
@@ -13605,7 +14211,18 @@
                 <w:szCs w:val="22"/>
                 <w:lang w:val="en-US" w:eastAsia="en-US"/>
               </w:rPr>
-              <w:t>PROMIS→SerPro recording change (Nov 2023), category-label mismatch between crime files, missing Nov 2023, alcohol data from 2023 only, mismatched region boundaries (7 police vs 6 NTG regions)</w:t>
+              <w:t>PROMIS→SerPro</w:t>
+            </w:r>
+            <w:proofErr w:type="spellEnd"/>
+            <w:r>
+              <w:rPr>
+                <w:rFonts w:ascii="Calibri" w:eastAsia="Times New Roman" w:hAnsi="Calibri" w:cs="Calibri"/>
+                <w:color w:val="000000"/>
+                <w:sz w:val="22"/>
+                <w:szCs w:val="22"/>
+                <w:lang w:val="en-US" w:eastAsia="en-US"/>
+              </w:rPr>
+              <w:t xml:space="preserve"> recording change (Nov 2023), category-label mismatch between crime files, missing Nov 2023, alcohol data from 2023 only, mismatched region boundaries (7 police vs 6 NTG regions)</w:t>
             </w:r>
           </w:p>
         </w:tc>
@@ -13678,7 +14295,29 @@
                 <w:szCs w:val="22"/>
                 <w:lang w:val="en-US" w:eastAsia="en-US"/>
               </w:rPr>
-              <w:t>Crime = forecasting target; population = per-capita normalisation; alcohol = candidate predictor (alcohol–violence link)</w:t>
+              <w:t xml:space="preserve">Crime = forecasting target; population = per-capita </w:t>
+            </w:r>
+            <w:proofErr w:type="spellStart"/>
+            <w:r>
+              <w:rPr>
+                <w:rFonts w:ascii="Calibri" w:eastAsia="Times New Roman" w:hAnsi="Calibri" w:cs="Calibri"/>
+                <w:color w:val="000000"/>
+                <w:sz w:val="22"/>
+                <w:szCs w:val="22"/>
+                <w:lang w:val="en-US" w:eastAsia="en-US"/>
+              </w:rPr>
+              <w:t>normalisation</w:t>
+            </w:r>
+            <w:proofErr w:type="spellEnd"/>
+            <w:r>
+              <w:rPr>
+                <w:rFonts w:ascii="Calibri" w:eastAsia="Times New Roman" w:hAnsi="Calibri" w:cs="Calibri"/>
+                <w:color w:val="000000"/>
+                <w:sz w:val="22"/>
+                <w:szCs w:val="22"/>
+                <w:lang w:val="en-US" w:eastAsia="en-US"/>
+              </w:rPr>
+              <w:t>; alcohol = candidate predictor (alcohol–violence link)</w:t>
             </w:r>
           </w:p>
         </w:tc>
@@ -14875,7 +15514,25 @@
           <w:sz w:val="24"/>
           <w:szCs w:val="24"/>
         </w:rPr>
-        <w:t>It is retained as NaN and never imputed.</w:t>
+        <w:t xml:space="preserve">It is retained as </w:t>
+      </w:r>
+      <w:proofErr w:type="spellStart"/>
+      <w:r>
+        <w:rPr>
+          <w:rFonts w:ascii="Times New Roman" w:eastAsia="Times New Roman" w:hAnsi="Times New Roman"/>
+          <w:sz w:val="24"/>
+          <w:szCs w:val="24"/>
+        </w:rPr>
+        <w:t>NaN</w:t>
+      </w:r>
+      <w:proofErr w:type="spellEnd"/>
+      <w:r>
+        <w:rPr>
+          <w:rFonts w:ascii="Times New Roman" w:eastAsia="Times New Roman" w:hAnsi="Times New Roman"/>
+          <w:sz w:val="24"/>
+          <w:szCs w:val="24"/>
+        </w:rPr>
+        <w:t xml:space="preserve"> and never imputed.</w:t>
       </w:r>
     </w:p>
     <w:p>
@@ -15235,13 +15892,23 @@
           <w:szCs w:val="24"/>
         </w:rPr>
       </w:pPr>
-      <w:r>
-        <w:rPr>
-          <w:rFonts w:ascii="Times New Roman" w:eastAsia="Times New Roman" w:hAnsi="Times New Roman"/>
-          <w:sz w:val="24"/>
-          <w:szCs w:val="24"/>
-        </w:rPr>
-        <w:t xml:space="preserve">Nhulunbuy </w:t>
+      <w:proofErr w:type="spellStart"/>
+      <w:r>
+        <w:rPr>
+          <w:rFonts w:ascii="Times New Roman" w:eastAsia="Times New Roman" w:hAnsi="Times New Roman"/>
+          <w:sz w:val="24"/>
+          <w:szCs w:val="24"/>
+        </w:rPr>
+        <w:t>Nhulunbuy</w:t>
+      </w:r>
+      <w:proofErr w:type="spellEnd"/>
+      <w:r>
+        <w:rPr>
+          <w:rFonts w:ascii="Times New Roman" w:eastAsia="Times New Roman" w:hAnsi="Times New Roman"/>
+          <w:sz w:val="24"/>
+          <w:szCs w:val="24"/>
+        </w:rPr>
+        <w:t xml:space="preserve"> </w:t>
       </w:r>
       <w:r>
         <w:rPr>
@@ -15390,7 +16057,25 @@
           <w:sz w:val="24"/>
           <w:szCs w:val="24"/>
         </w:rPr>
-        <w:t>_REGION) maps 16 SA2 values to their parent NTG region</w:t>
+        <w:t xml:space="preserve">_REGION) </w:t>
+      </w:r>
+      <w:proofErr w:type="gramStart"/>
+      <w:r>
+        <w:rPr>
+          <w:rFonts w:ascii="Times New Roman" w:eastAsia="Times New Roman" w:hAnsi="Times New Roman"/>
+          <w:sz w:val="24"/>
+          <w:szCs w:val="24"/>
+        </w:rPr>
+        <w:t>maps</w:t>
+      </w:r>
+      <w:proofErr w:type="gramEnd"/>
+      <w:r>
+        <w:rPr>
+          <w:rFonts w:ascii="Times New Roman" w:eastAsia="Times New Roman" w:hAnsi="Times New Roman"/>
+          <w:sz w:val="24"/>
+          <w:szCs w:val="24"/>
+        </w:rPr>
+        <w:t xml:space="preserve"> 16 SA2 values to their parent NTG region</w:t>
       </w:r>
       <w:r>
         <w:rPr>
@@ -15548,7 +16233,25 @@
           <w:sz w:val="24"/>
           <w:szCs w:val="24"/>
         </w:rPr>
-        <w:t xml:space="preserve">Any unrecognised SA2 </w:t>
+        <w:t xml:space="preserve">Any </w:t>
+      </w:r>
+      <w:proofErr w:type="spellStart"/>
+      <w:r>
+        <w:rPr>
+          <w:rFonts w:ascii="Times New Roman" w:eastAsia="Times New Roman" w:hAnsi="Times New Roman"/>
+          <w:sz w:val="24"/>
+          <w:szCs w:val="24"/>
+        </w:rPr>
+        <w:t>unrecognised</w:t>
+      </w:r>
+      <w:proofErr w:type="spellEnd"/>
+      <w:r>
+        <w:rPr>
+          <w:rFonts w:ascii="Times New Roman" w:eastAsia="Times New Roman" w:hAnsi="Times New Roman"/>
+          <w:sz w:val="24"/>
+          <w:szCs w:val="24"/>
+        </w:rPr>
+        <w:t xml:space="preserve"> SA2 </w:t>
       </w:r>
       <w:r>
         <w:rPr>
@@ -15708,8 +16411,9 @@
           <w:szCs w:val="24"/>
           <w:lang w:val="vi-VN"/>
         </w:rPr>
-        <w:t xml:space="preserve"> summed across all</w:t>
-      </w:r>
+        <w:t xml:space="preserve"> </w:t>
+      </w:r>
+      <w:proofErr w:type="spellStart"/>
       <w:r>
         <w:rPr>
           <w:rFonts w:ascii="Times New Roman" w:eastAsia="Times New Roman" w:hAnsi="Times New Roman"/>
@@ -15717,7 +16421,297 @@
           <w:szCs w:val="24"/>
           <w:lang w:val="vi-VN"/>
         </w:rPr>
-        <w:t xml:space="preserve"> demographic breakdowns for each Region x Year combination. Status column dropped after validation.</w:t>
+        <w:t>summed</w:t>
+      </w:r>
+      <w:proofErr w:type="spellEnd"/>
+      <w:r>
+        <w:rPr>
+          <w:rFonts w:ascii="Times New Roman" w:eastAsia="Times New Roman" w:hAnsi="Times New Roman"/>
+          <w:sz w:val="24"/>
+          <w:szCs w:val="24"/>
+          <w:lang w:val="vi-VN"/>
+        </w:rPr>
+        <w:t xml:space="preserve"> </w:t>
+      </w:r>
+      <w:proofErr w:type="spellStart"/>
+      <w:r>
+        <w:rPr>
+          <w:rFonts w:ascii="Times New Roman" w:eastAsia="Times New Roman" w:hAnsi="Times New Roman"/>
+          <w:sz w:val="24"/>
+          <w:szCs w:val="24"/>
+          <w:lang w:val="vi-VN"/>
+        </w:rPr>
+        <w:t>across</w:t>
+      </w:r>
+      <w:proofErr w:type="spellEnd"/>
+      <w:r>
+        <w:rPr>
+          <w:rFonts w:ascii="Times New Roman" w:eastAsia="Times New Roman" w:hAnsi="Times New Roman"/>
+          <w:sz w:val="24"/>
+          <w:szCs w:val="24"/>
+          <w:lang w:val="vi-VN"/>
+        </w:rPr>
+        <w:t xml:space="preserve"> </w:t>
+      </w:r>
+      <w:proofErr w:type="spellStart"/>
+      <w:r>
+        <w:rPr>
+          <w:rFonts w:ascii="Times New Roman" w:eastAsia="Times New Roman" w:hAnsi="Times New Roman"/>
+          <w:sz w:val="24"/>
+          <w:szCs w:val="24"/>
+          <w:lang w:val="vi-VN"/>
+        </w:rPr>
+        <w:t>all</w:t>
+      </w:r>
+      <w:proofErr w:type="spellEnd"/>
+      <w:r>
+        <w:rPr>
+          <w:rFonts w:ascii="Times New Roman" w:eastAsia="Times New Roman" w:hAnsi="Times New Roman"/>
+          <w:sz w:val="24"/>
+          <w:szCs w:val="24"/>
+          <w:lang w:val="vi-VN"/>
+        </w:rPr>
+        <w:t xml:space="preserve"> </w:t>
+      </w:r>
+      <w:proofErr w:type="spellStart"/>
+      <w:r>
+        <w:rPr>
+          <w:rFonts w:ascii="Times New Roman" w:eastAsia="Times New Roman" w:hAnsi="Times New Roman"/>
+          <w:sz w:val="24"/>
+          <w:szCs w:val="24"/>
+          <w:lang w:val="vi-VN"/>
+        </w:rPr>
+        <w:t>demographic</w:t>
+      </w:r>
+      <w:proofErr w:type="spellEnd"/>
+      <w:r>
+        <w:rPr>
+          <w:rFonts w:ascii="Times New Roman" w:eastAsia="Times New Roman" w:hAnsi="Times New Roman"/>
+          <w:sz w:val="24"/>
+          <w:szCs w:val="24"/>
+          <w:lang w:val="vi-VN"/>
+        </w:rPr>
+        <w:t xml:space="preserve"> </w:t>
+      </w:r>
+      <w:proofErr w:type="spellStart"/>
+      <w:r>
+        <w:rPr>
+          <w:rFonts w:ascii="Times New Roman" w:eastAsia="Times New Roman" w:hAnsi="Times New Roman"/>
+          <w:sz w:val="24"/>
+          <w:szCs w:val="24"/>
+          <w:lang w:val="vi-VN"/>
+        </w:rPr>
+        <w:t>breakdowns</w:t>
+      </w:r>
+      <w:proofErr w:type="spellEnd"/>
+      <w:r>
+        <w:rPr>
+          <w:rFonts w:ascii="Times New Roman" w:eastAsia="Times New Roman" w:hAnsi="Times New Roman"/>
+          <w:sz w:val="24"/>
+          <w:szCs w:val="24"/>
+          <w:lang w:val="vi-VN"/>
+        </w:rPr>
+        <w:t xml:space="preserve"> </w:t>
+      </w:r>
+      <w:proofErr w:type="spellStart"/>
+      <w:r>
+        <w:rPr>
+          <w:rFonts w:ascii="Times New Roman" w:eastAsia="Times New Roman" w:hAnsi="Times New Roman"/>
+          <w:sz w:val="24"/>
+          <w:szCs w:val="24"/>
+          <w:lang w:val="vi-VN"/>
+        </w:rPr>
+        <w:t>for</w:t>
+      </w:r>
+      <w:proofErr w:type="spellEnd"/>
+      <w:r>
+        <w:rPr>
+          <w:rFonts w:ascii="Times New Roman" w:eastAsia="Times New Roman" w:hAnsi="Times New Roman"/>
+          <w:sz w:val="24"/>
+          <w:szCs w:val="24"/>
+          <w:lang w:val="vi-VN"/>
+        </w:rPr>
+        <w:t xml:space="preserve"> </w:t>
+      </w:r>
+      <w:proofErr w:type="spellStart"/>
+      <w:r>
+        <w:rPr>
+          <w:rFonts w:ascii="Times New Roman" w:eastAsia="Times New Roman" w:hAnsi="Times New Roman"/>
+          <w:sz w:val="24"/>
+          <w:szCs w:val="24"/>
+          <w:lang w:val="vi-VN"/>
+        </w:rPr>
+        <w:t>each</w:t>
+      </w:r>
+      <w:proofErr w:type="spellEnd"/>
+      <w:r>
+        <w:rPr>
+          <w:rFonts w:ascii="Times New Roman" w:eastAsia="Times New Roman" w:hAnsi="Times New Roman"/>
+          <w:sz w:val="24"/>
+          <w:szCs w:val="24"/>
+          <w:lang w:val="vi-VN"/>
+        </w:rPr>
+        <w:t xml:space="preserve"> </w:t>
+      </w:r>
+      <w:proofErr w:type="spellStart"/>
+      <w:r>
+        <w:rPr>
+          <w:rFonts w:ascii="Times New Roman" w:eastAsia="Times New Roman" w:hAnsi="Times New Roman"/>
+          <w:sz w:val="24"/>
+          <w:szCs w:val="24"/>
+          <w:lang w:val="vi-VN"/>
+        </w:rPr>
+        <w:t>Region</w:t>
+      </w:r>
+      <w:proofErr w:type="spellEnd"/>
+      <w:r>
+        <w:rPr>
+          <w:rFonts w:ascii="Times New Roman" w:eastAsia="Times New Roman" w:hAnsi="Times New Roman"/>
+          <w:sz w:val="24"/>
+          <w:szCs w:val="24"/>
+          <w:lang w:val="vi-VN"/>
+        </w:rPr>
+        <w:t xml:space="preserve"> x </w:t>
+      </w:r>
+      <w:proofErr w:type="spellStart"/>
+      <w:r>
+        <w:rPr>
+          <w:rFonts w:ascii="Times New Roman" w:eastAsia="Times New Roman" w:hAnsi="Times New Roman"/>
+          <w:sz w:val="24"/>
+          <w:szCs w:val="24"/>
+          <w:lang w:val="vi-VN"/>
+        </w:rPr>
+        <w:t>Year</w:t>
+      </w:r>
+      <w:proofErr w:type="spellEnd"/>
+      <w:r>
+        <w:rPr>
+          <w:rFonts w:ascii="Times New Roman" w:eastAsia="Times New Roman" w:hAnsi="Times New Roman"/>
+          <w:sz w:val="24"/>
+          <w:szCs w:val="24"/>
+          <w:lang w:val="vi-VN"/>
+        </w:rPr>
+        <w:t xml:space="preserve"> </w:t>
+      </w:r>
+      <w:proofErr w:type="spellStart"/>
+      <w:r>
+        <w:rPr>
+          <w:rFonts w:ascii="Times New Roman" w:eastAsia="Times New Roman" w:hAnsi="Times New Roman"/>
+          <w:sz w:val="24"/>
+          <w:szCs w:val="24"/>
+          <w:lang w:val="vi-VN"/>
+        </w:rPr>
+        <w:t>combination</w:t>
+      </w:r>
+      <w:proofErr w:type="spellEnd"/>
+      <w:r>
+        <w:rPr>
+          <w:rFonts w:ascii="Times New Roman" w:eastAsia="Times New Roman" w:hAnsi="Times New Roman"/>
+          <w:sz w:val="24"/>
+          <w:szCs w:val="24"/>
+          <w:lang w:val="vi-VN"/>
+        </w:rPr>
+        <w:t xml:space="preserve">. </w:t>
+      </w:r>
+      <w:proofErr w:type="spellStart"/>
+      <w:r>
+        <w:rPr>
+          <w:rFonts w:ascii="Times New Roman" w:eastAsia="Times New Roman" w:hAnsi="Times New Roman"/>
+          <w:sz w:val="24"/>
+          <w:szCs w:val="24"/>
+          <w:lang w:val="vi-VN"/>
+        </w:rPr>
+        <w:t>Status</w:t>
+      </w:r>
+      <w:proofErr w:type="spellEnd"/>
+      <w:r>
+        <w:rPr>
+          <w:rFonts w:ascii="Times New Roman" w:eastAsia="Times New Roman" w:hAnsi="Times New Roman"/>
+          <w:sz w:val="24"/>
+          <w:szCs w:val="24"/>
+          <w:lang w:val="vi-VN"/>
+        </w:rPr>
+        <w:t xml:space="preserve"> </w:t>
+      </w:r>
+      <w:proofErr w:type="spellStart"/>
+      <w:r>
+        <w:rPr>
+          <w:rFonts w:ascii="Times New Roman" w:eastAsia="Times New Roman" w:hAnsi="Times New Roman"/>
+          <w:sz w:val="24"/>
+          <w:szCs w:val="24"/>
+          <w:lang w:val="vi-VN"/>
+        </w:rPr>
+        <w:t>column</w:t>
+      </w:r>
+      <w:proofErr w:type="spellEnd"/>
+      <w:r>
+        <w:rPr>
+          <w:rFonts w:ascii="Times New Roman" w:eastAsia="Times New Roman" w:hAnsi="Times New Roman"/>
+          <w:sz w:val="24"/>
+          <w:szCs w:val="24"/>
+          <w:lang w:val="vi-VN"/>
+        </w:rPr>
+        <w:t xml:space="preserve"> </w:t>
+      </w:r>
+      <w:proofErr w:type="spellStart"/>
+      <w:r>
+        <w:rPr>
+          <w:rFonts w:ascii="Times New Roman" w:eastAsia="Times New Roman" w:hAnsi="Times New Roman"/>
+          <w:sz w:val="24"/>
+          <w:szCs w:val="24"/>
+          <w:lang w:val="vi-VN"/>
+        </w:rPr>
+        <w:t>dropped</w:t>
+      </w:r>
+      <w:proofErr w:type="spellEnd"/>
+      <w:r>
+        <w:rPr>
+          <w:rFonts w:ascii="Times New Roman" w:eastAsia="Times New Roman" w:hAnsi="Times New Roman"/>
+          <w:sz w:val="24"/>
+          <w:szCs w:val="24"/>
+          <w:lang w:val="vi-VN"/>
+        </w:rPr>
+        <w:t xml:space="preserve"> </w:t>
+      </w:r>
+      <w:proofErr w:type="spellStart"/>
+      <w:r>
+        <w:rPr>
+          <w:rFonts w:ascii="Times New Roman" w:eastAsia="Times New Roman" w:hAnsi="Times New Roman"/>
+          <w:sz w:val="24"/>
+          <w:szCs w:val="24"/>
+          <w:lang w:val="vi-VN"/>
+        </w:rPr>
+        <w:t>after</w:t>
+      </w:r>
+      <w:proofErr w:type="spellEnd"/>
+      <w:r>
+        <w:rPr>
+          <w:rFonts w:ascii="Times New Roman" w:eastAsia="Times New Roman" w:hAnsi="Times New Roman"/>
+          <w:sz w:val="24"/>
+          <w:szCs w:val="24"/>
+          <w:lang w:val="vi-VN"/>
+        </w:rPr>
+        <w:t xml:space="preserve"> </w:t>
+      </w:r>
+      <w:proofErr w:type="spellStart"/>
+      <w:r>
+        <w:rPr>
+          <w:rFonts w:ascii="Times New Roman" w:eastAsia="Times New Roman" w:hAnsi="Times New Roman"/>
+          <w:sz w:val="24"/>
+          <w:szCs w:val="24"/>
+          <w:lang w:val="vi-VN"/>
+        </w:rPr>
+        <w:t>validation</w:t>
+      </w:r>
+      <w:proofErr w:type="spellEnd"/>
+      <w:r>
+        <w:rPr>
+          <w:rFonts w:ascii="Times New Roman" w:eastAsia="Times New Roman" w:hAnsi="Times New Roman"/>
+          <w:sz w:val="24"/>
+          <w:szCs w:val="24"/>
+          <w:lang w:val="vi-VN"/>
+        </w:rPr>
+        <w:t>.</w:t>
       </w:r>
     </w:p>
     <w:p>
@@ -15730,6 +16724,7 @@
           <w:szCs w:val="24"/>
         </w:rPr>
       </w:pPr>
+      <w:proofErr w:type="spellStart"/>
       <w:r>
         <w:rPr>
           <w:rFonts w:ascii="Times New Roman" w:eastAsia="Times New Roman" w:hAnsi="Times New Roman"/>
@@ -15737,15 +16732,55 @@
           <w:szCs w:val="24"/>
           <w:lang w:val="vi-VN"/>
         </w:rPr>
-        <w:t>Data trimmed to the 2015-2025 a</w:t>
-      </w:r>
-      <w:r>
-        <w:rPr>
-          <w:rFonts w:ascii="Times New Roman" w:eastAsia="Times New Roman" w:hAnsi="Times New Roman"/>
-          <w:sz w:val="24"/>
-          <w:szCs w:val="24"/>
-        </w:rPr>
-        <w:t xml:space="preserve">nalysis window </w:t>
+        <w:t>Data</w:t>
+      </w:r>
+      <w:proofErr w:type="spellEnd"/>
+      <w:r>
+        <w:rPr>
+          <w:rFonts w:ascii="Times New Roman" w:eastAsia="Times New Roman" w:hAnsi="Times New Roman"/>
+          <w:sz w:val="24"/>
+          <w:szCs w:val="24"/>
+          <w:lang w:val="vi-VN"/>
+        </w:rPr>
+        <w:t xml:space="preserve"> </w:t>
+      </w:r>
+      <w:proofErr w:type="spellStart"/>
+      <w:r>
+        <w:rPr>
+          <w:rFonts w:ascii="Times New Roman" w:eastAsia="Times New Roman" w:hAnsi="Times New Roman"/>
+          <w:sz w:val="24"/>
+          <w:szCs w:val="24"/>
+          <w:lang w:val="vi-VN"/>
+        </w:rPr>
+        <w:t>trimmed</w:t>
+      </w:r>
+      <w:proofErr w:type="spellEnd"/>
+      <w:r>
+        <w:rPr>
+          <w:rFonts w:ascii="Times New Roman" w:eastAsia="Times New Roman" w:hAnsi="Times New Roman"/>
+          <w:sz w:val="24"/>
+          <w:szCs w:val="24"/>
+          <w:lang w:val="vi-VN"/>
+        </w:rPr>
+        <w:t xml:space="preserve"> to the 2015-2025 a</w:t>
+      </w:r>
+      <w:proofErr w:type="spellStart"/>
+      <w:r>
+        <w:rPr>
+          <w:rFonts w:ascii="Times New Roman" w:eastAsia="Times New Roman" w:hAnsi="Times New Roman"/>
+          <w:sz w:val="24"/>
+          <w:szCs w:val="24"/>
+        </w:rPr>
+        <w:t>nalysis</w:t>
+      </w:r>
+      <w:proofErr w:type="spellEnd"/>
+      <w:r>
+        <w:rPr>
+          <w:rFonts w:ascii="Times New Roman" w:eastAsia="Times New Roman" w:hAnsi="Times New Roman"/>
+          <w:sz w:val="24"/>
+          <w:szCs w:val="24"/>
+        </w:rPr>
+        <w:t xml:space="preserve"> window </w:t>
       </w:r>
       <w:r>
         <w:rPr>
@@ -16054,7 +17089,25 @@
           <w:sz w:val="24"/>
           <w:szCs w:val="24"/>
         </w:rPr>
-        <w:t>2022 remain NaN by design</w:t>
+        <w:t xml:space="preserve">2022 remain </w:t>
+      </w:r>
+      <w:proofErr w:type="spellStart"/>
+      <w:r>
+        <w:rPr>
+          <w:rFonts w:ascii="Times New Roman" w:eastAsia="Times New Roman" w:hAnsi="Times New Roman"/>
+          <w:sz w:val="24"/>
+          <w:szCs w:val="24"/>
+        </w:rPr>
+        <w:t>NaN</w:t>
+      </w:r>
+      <w:proofErr w:type="spellEnd"/>
+      <w:r>
+        <w:rPr>
+          <w:rFonts w:ascii="Times New Roman" w:eastAsia="Times New Roman" w:hAnsi="Times New Roman"/>
+          <w:sz w:val="24"/>
+          <w:szCs w:val="24"/>
+        </w:rPr>
+        <w:t xml:space="preserve"> by design</w:t>
       </w:r>
       <w:r>
         <w:rPr>
@@ -16103,6 +17156,7 @@
                 <w:lang w:val="vi-VN"/>
               </w:rPr>
             </w:pPr>
+            <w:proofErr w:type="spellStart"/>
             <w:r>
               <w:rPr>
                 <w:rFonts w:ascii="Times New Roman" w:eastAsia="Times New Roman" w:hAnsi="Times New Roman"/>
@@ -16114,6 +17168,7 @@
               </w:rPr>
               <w:t>Property</w:t>
             </w:r>
+            <w:proofErr w:type="spellEnd"/>
           </w:p>
         </w:tc>
         <w:tc>
@@ -16134,6 +17189,7 @@
                 <w:lang w:val="vi-VN"/>
               </w:rPr>
             </w:pPr>
+            <w:proofErr w:type="spellStart"/>
             <w:r>
               <w:rPr>
                 <w:rFonts w:ascii="Times New Roman" w:eastAsia="Times New Roman" w:hAnsi="Times New Roman"/>
@@ -16145,6 +17201,7 @@
               </w:rPr>
               <w:t>Value</w:t>
             </w:r>
+            <w:proofErr w:type="spellEnd"/>
           </w:p>
         </w:tc>
       </w:tr>
@@ -16165,6 +17222,7 @@
                 <w:lang w:val="vi-VN"/>
               </w:rPr>
             </w:pPr>
+            <w:proofErr w:type="spellStart"/>
             <w:r>
               <w:rPr>
                 <w:rFonts w:ascii="Times New Roman" w:eastAsia="Times New Roman" w:hAnsi="Times New Roman"/>
@@ -16172,8 +17230,29 @@
                 <w:szCs w:val="24"/>
                 <w:lang w:val="vi-VN"/>
               </w:rPr>
-              <w:t>Output file</w:t>
-            </w:r>
+              <w:t>Output</w:t>
+            </w:r>
+            <w:proofErr w:type="spellEnd"/>
+            <w:r>
+              <w:rPr>
+                <w:rFonts w:ascii="Times New Roman" w:eastAsia="Times New Roman" w:hAnsi="Times New Roman"/>
+                <w:sz w:val="24"/>
+                <w:szCs w:val="24"/>
+                <w:lang w:val="vi-VN"/>
+              </w:rPr>
+              <w:t xml:space="preserve"> </w:t>
+            </w:r>
+            <w:proofErr w:type="spellStart"/>
+            <w:r>
+              <w:rPr>
+                <w:rFonts w:ascii="Times New Roman" w:eastAsia="Times New Roman" w:hAnsi="Times New Roman"/>
+                <w:sz w:val="24"/>
+                <w:szCs w:val="24"/>
+                <w:lang w:val="vi-VN"/>
+              </w:rPr>
+              <w:t>file</w:t>
+            </w:r>
+            <w:proofErr w:type="spellEnd"/>
           </w:p>
         </w:tc>
         <w:tc>
@@ -16336,8 +17415,18 @@
                 <w:sz w:val="24"/>
                 <w:szCs w:val="24"/>
               </w:rPr>
-              <w:t>2022 PAC NaN</w:t>
-            </w:r>
+              <w:t xml:space="preserve">2022 PAC </w:t>
+            </w:r>
+            <w:proofErr w:type="spellStart"/>
+            <w:r>
+              <w:rPr>
+                <w:rFonts w:ascii="Times New Roman" w:eastAsia="Times New Roman" w:hAnsi="Times New Roman"/>
+                <w:sz w:val="24"/>
+                <w:szCs w:val="24"/>
+              </w:rPr>
+              <w:t>NaN</w:t>
+            </w:r>
+            <w:proofErr w:type="spellEnd"/>
           </w:p>
         </w:tc>
       </w:tr>
@@ -16389,6 +17478,7 @@
           <w:szCs w:val="24"/>
         </w:rPr>
       </w:pPr>
+      <w:proofErr w:type="spellStart"/>
       <w:r>
         <w:rPr>
           <w:rFonts w:ascii="Times New Roman" w:eastAsia="Times New Roman" w:hAnsi="Times New Roman"/>
@@ -16399,6 +17489,7 @@
         <w:lastRenderedPageBreak/>
         <w:t>Raw</w:t>
       </w:r>
+      <w:proofErr w:type="spellEnd"/>
       <w:r>
         <w:rPr>
           <w:rFonts w:ascii="Times New Roman" w:eastAsia="Times New Roman" w:hAnsi="Times New Roman"/>
@@ -16579,13 +17670,41 @@
                 <w:szCs w:val="24"/>
               </w:rPr>
             </w:pPr>
+            <w:proofErr w:type="spellStart"/>
             <w:r>
               <w:rPr>
                 <w:rFonts w:ascii="Times New Roman" w:eastAsia="Times New Roman" w:hAnsi="Times New Roman"/>
                 <w:sz w:val="24"/>
                 <w:szCs w:val="24"/>
               </w:rPr>
-              <w:t>Assault_offences / Total_population x 100,000</w:t>
+              <w:t>Assault_offences</w:t>
+            </w:r>
+            <w:proofErr w:type="spellEnd"/>
+            <w:r>
+              <w:rPr>
+                <w:rFonts w:ascii="Times New Roman" w:eastAsia="Times New Roman" w:hAnsi="Times New Roman"/>
+                <w:sz w:val="24"/>
+                <w:szCs w:val="24"/>
+              </w:rPr>
+              <w:t xml:space="preserve"> / </w:t>
+            </w:r>
+            <w:proofErr w:type="spellStart"/>
+            <w:r>
+              <w:rPr>
+                <w:rFonts w:ascii="Times New Roman" w:eastAsia="Times New Roman" w:hAnsi="Times New Roman"/>
+                <w:sz w:val="24"/>
+                <w:szCs w:val="24"/>
+              </w:rPr>
+              <w:t>Total_population</w:t>
+            </w:r>
+            <w:proofErr w:type="spellEnd"/>
+            <w:r>
+              <w:rPr>
+                <w:rFonts w:ascii="Times New Roman" w:eastAsia="Times New Roman" w:hAnsi="Times New Roman"/>
+                <w:sz w:val="24"/>
+                <w:szCs w:val="24"/>
+              </w:rPr>
+              <w:t xml:space="preserve"> x 100,000</w:t>
             </w:r>
           </w:p>
         </w:tc>
@@ -16656,6 +17775,7 @@
                 <w:szCs w:val="24"/>
               </w:rPr>
             </w:pPr>
+            <w:proofErr w:type="spellStart"/>
             <w:r>
               <w:rPr>
                 <w:rFonts w:ascii="Times New Roman" w:eastAsia="Times New Roman" w:hAnsi="Times New Roman"/>
@@ -16664,6 +17784,7 @@
               </w:rPr>
               <w:t>Alcohol_per_capita</w:t>
             </w:r>
+            <w:proofErr w:type="spellEnd"/>
           </w:p>
         </w:tc>
         <w:tc>
@@ -16681,14 +17802,34 @@
                 <w:szCs w:val="24"/>
               </w:rPr>
             </w:pPr>
+            <w:proofErr w:type="spellStart"/>
             <w:r>
               <w:rPr>
                 <w:rFonts w:ascii="Times New Roman" w:eastAsia="Times New Roman" w:hAnsi="Times New Roman"/>
                 <w:sz w:val="24"/>
                 <w:szCs w:val="24"/>
               </w:rPr>
-              <w:t>Total_PAC / Total_population</w:t>
-            </w:r>
+              <w:t>Total_PAC</w:t>
+            </w:r>
+            <w:proofErr w:type="spellEnd"/>
+            <w:r>
+              <w:rPr>
+                <w:rFonts w:ascii="Times New Roman" w:eastAsia="Times New Roman" w:hAnsi="Times New Roman"/>
+                <w:sz w:val="24"/>
+                <w:szCs w:val="24"/>
+              </w:rPr>
+              <w:t xml:space="preserve"> / </w:t>
+            </w:r>
+            <w:proofErr w:type="spellStart"/>
+            <w:r>
+              <w:rPr>
+                <w:rFonts w:ascii="Times New Roman" w:eastAsia="Times New Roman" w:hAnsi="Times New Roman"/>
+                <w:sz w:val="24"/>
+                <w:szCs w:val="24"/>
+              </w:rPr>
+              <w:t>Total_population</w:t>
+            </w:r>
+            <w:proofErr w:type="spellEnd"/>
           </w:p>
         </w:tc>
         <w:tc>
@@ -16810,13 +17951,23 @@
           <w:szCs w:val="18"/>
         </w:rPr>
       </w:pPr>
+      <w:proofErr w:type="spellStart"/>
       <w:r>
         <w:rPr>
           <w:rStyle w:val="normaltextrun"/>
           <w:b/>
           <w:bCs/>
         </w:rPr>
-        <w:t>Log_assault_rate:</w:t>
+        <w:t>Log_assault_rate</w:t>
+      </w:r>
+      <w:proofErr w:type="spellEnd"/>
+      <w:r>
+        <w:rPr>
+          <w:rStyle w:val="normaltextrun"/>
+          <w:b/>
+          <w:bCs/>
+        </w:rPr>
+        <w:t>:</w:t>
       </w:r>
     </w:p>
     <w:p>
@@ -16835,7 +17986,49 @@
         <w:rPr>
           <w:rStyle w:val="normaltextrun"/>
         </w:rPr>
-        <w:t>Since the crime rate is not normally distributed but rather follows a log-normal distribution (heavily right-skewed) due to seasonality characteristics. By transforming the assault rate logarithmically, we aim to stabilise the distribution, making it symmetrical which is essential for good performance of linear regression models(Limpert et al., 2001)</w:t>
+        <w:t xml:space="preserve">Since the crime rate is not normally distributed but rather follows a </w:t>
+      </w:r>
+      <w:proofErr w:type="gramStart"/>
+      <w:r>
+        <w:rPr>
+          <w:rStyle w:val="normaltextrun"/>
+        </w:rPr>
+        <w:t>log</w:t>
+      </w:r>
+      <w:proofErr w:type="gramEnd"/>
+      <w:r>
+        <w:rPr>
+          <w:rStyle w:val="normaltextrun"/>
+        </w:rPr>
+        <w:t>-normal distribution (heavily right-skewed) due to seasonality characteristics. By transforming the assault rate logarithmically, we aim to </w:t>
+      </w:r>
+      <w:proofErr w:type="spellStart"/>
+      <w:r>
+        <w:rPr>
+          <w:rStyle w:val="normaltextrun"/>
+        </w:rPr>
+        <w:t>stabilise</w:t>
+      </w:r>
+      <w:proofErr w:type="spellEnd"/>
+      <w:r>
+        <w:rPr>
+          <w:rStyle w:val="normaltextrun"/>
+        </w:rPr>
+        <w:t> the distribution, making it symmetrical which is essential for good performance of linear regression </w:t>
+      </w:r>
+      <w:proofErr w:type="gramStart"/>
+      <w:r>
+        <w:rPr>
+          <w:rStyle w:val="normaltextrun"/>
+        </w:rPr>
+        <w:t>models(</w:t>
+      </w:r>
+      <w:proofErr w:type="gramEnd"/>
+      <w:r>
+        <w:rPr>
+          <w:rStyle w:val="normaltextrun"/>
+        </w:rPr>
+        <w:t>Limpert et al., 2001)</w:t>
       </w:r>
     </w:p>
     <w:p>
@@ -16852,13 +18045,41 @@
           <w:szCs w:val="18"/>
         </w:rPr>
       </w:pPr>
+      <w:proofErr w:type="spellStart"/>
       <w:r>
         <w:rPr>
           <w:rStyle w:val="normaltextrun"/>
           <w:b/>
           <w:bCs/>
         </w:rPr>
-        <w:t>Sin_month and cos_month:</w:t>
+        <w:t>Sin_month</w:t>
+      </w:r>
+      <w:proofErr w:type="spellEnd"/>
+      <w:r>
+        <w:rPr>
+          <w:rStyle w:val="normaltextrun"/>
+          <w:b/>
+          <w:bCs/>
+        </w:rPr>
+        <w:t> and </w:t>
+      </w:r>
+      <w:proofErr w:type="spellStart"/>
+      <w:r>
+        <w:rPr>
+          <w:rStyle w:val="normaltextrun"/>
+          <w:b/>
+          <w:bCs/>
+        </w:rPr>
+        <w:t>cos_month</w:t>
+      </w:r>
+      <w:proofErr w:type="spellEnd"/>
+      <w:r>
+        <w:rPr>
+          <w:rStyle w:val="normaltextrun"/>
+          <w:b/>
+          <w:bCs/>
+        </w:rPr>
+        <w:t>:</w:t>
       </w:r>
     </w:p>
     <w:p>
@@ -16877,7 +18098,21 @@
         <w:rPr>
           <w:rStyle w:val="normaltextrun"/>
         </w:rPr>
-        <w:t>To preserve the cyclic behaviours of months, sine and cosine functions are applied to represent time since these trigonometric functions pursue cycles between “top” and “bottom” and have a settled cycle length which is perfect for modelling regular cycles such as months (Lindsey and Pavur, 2005)</w:t>
+        <w:t>To preserve the cyclic </w:t>
+      </w:r>
+      <w:proofErr w:type="spellStart"/>
+      <w:r>
+        <w:rPr>
+          <w:rStyle w:val="normaltextrun"/>
+        </w:rPr>
+        <w:t>behaviours</w:t>
+      </w:r>
+      <w:proofErr w:type="spellEnd"/>
+      <w:r>
+        <w:rPr>
+          <w:rStyle w:val="normaltextrun"/>
+        </w:rPr>
+        <w:t> of months, sine and cosine functions are applied to represent time since these trigonometric functions pursue cycles between “top” and “bottom” and have a settled cycle length which is perfect for modelling regular cycles such as months (Lindsey and Pavur, 2005)</w:t>
       </w:r>
     </w:p>
     <w:p>
@@ -16936,13 +18171,23 @@
           <w:szCs w:val="18"/>
         </w:rPr>
       </w:pPr>
+      <w:proofErr w:type="spellStart"/>
       <w:r>
         <w:rPr>
           <w:rStyle w:val="normaltextrun"/>
           <w:b/>
           <w:bCs/>
         </w:rPr>
-        <w:t>is_new_year:</w:t>
+        <w:t>is_new_year</w:t>
+      </w:r>
+      <w:proofErr w:type="spellEnd"/>
+      <w:r>
+        <w:rPr>
+          <w:rStyle w:val="normaltextrun"/>
+          <w:b/>
+          <w:bCs/>
+        </w:rPr>
+        <w:t>:</w:t>
       </w:r>
     </w:p>
     <w:p>
@@ -16962,7 +18207,21 @@
         <w:rPr>
           <w:rStyle w:val="normaltextrun"/>
         </w:rPr>
-        <w:t>According to research by Baird et al. , (2019), the homicide rate experiences a significant spike on New Year’s Day. Therefore, this feature is added to capture this valuable information.</w:t>
+        <w:t>According to research by Baird </w:t>
+      </w:r>
+      <w:proofErr w:type="gramStart"/>
+      <w:r>
+        <w:rPr>
+          <w:rStyle w:val="normaltextrun"/>
+        </w:rPr>
+        <w:t>et al. ,</w:t>
+      </w:r>
+      <w:proofErr w:type="gramEnd"/>
+      <w:r>
+        <w:rPr>
+          <w:rStyle w:val="normaltextrun"/>
+        </w:rPr>
+        <w:t> (2019), the homicide rate experiences a significant spike on New Year’s Day. Therefore, this feature is added to capture this valuable information.</w:t>
       </w:r>
     </w:p>
     <w:p>
@@ -17466,7 +18725,27 @@
           <w:szCs w:val="24"/>
           <w:lang w:val="en-AU" w:eastAsia="ja-JP"/>
         </w:rPr>
-        <w:t xml:space="preserve">Applying PCA to the regional age structure allows the model to condense a large number of correlated demographic variables into a small set of orthogonal components that capture the dominant patterns in the data. This compression substantially reduces the dimensionality of the feature space, which in turn lowers computational cost, speeds up model training, and minimises the risk of overfitting. Importantly, PCA preserves most of the original variance, meaning that the transformed components retain the essential information needed for prediction </w:t>
+        <w:t xml:space="preserve">Applying PCA to the regional age structure allows the model to condense </w:t>
+      </w:r>
+      <w:proofErr w:type="gramStart"/>
+      <w:r>
+        <w:rPr>
+          <w:rFonts w:ascii="Times New Roman" w:eastAsia="Times New Roman" w:hAnsi="Times New Roman" w:cs="Times New Roman"/>
+          <w:sz w:val="24"/>
+          <w:szCs w:val="24"/>
+          <w:lang w:val="en-AU" w:eastAsia="ja-JP"/>
+        </w:rPr>
+        <w:t>a large number of</w:t>
+      </w:r>
+      <w:proofErr w:type="gramEnd"/>
+      <w:r>
+        <w:rPr>
+          <w:rFonts w:ascii="Times New Roman" w:eastAsia="Times New Roman" w:hAnsi="Times New Roman" w:cs="Times New Roman"/>
+          <w:sz w:val="24"/>
+          <w:szCs w:val="24"/>
+          <w:lang w:val="en-AU" w:eastAsia="ja-JP"/>
+        </w:rPr>
+        <w:t xml:space="preserve"> correlated demographic variables into a small set of orthogonal components that capture the dominant patterns in the data. This compression substantially reduces the dimensionality of the feature space, which in turn lowers computational cost, speeds up model training, and minimises the risk of overfitting. Importantly, PCA preserves most of the original variance, meaning that the transformed components retain the essential information needed for prediction </w:t>
       </w:r>
       <w:r>
         <w:rPr>
@@ -17680,7 +18959,23 @@
           <w:rStyle w:val="normaltextrun"/>
           <w:lang w:val="en-AU"/>
         </w:rPr>
-        <w:t xml:space="preserve"> 30. High multicollinear features are known to have a negative effect on the regression model by hampering the interpretability of model predictors and resulting in highly volatile coefficient estimates (Dertli et al., 2024).</w:t>
+        <w:t xml:space="preserve"> 30. High multicollinear features are known to have a negative effect on the regression model by hampering the interpretability of model predictors and resulting in highly volatile coefficient estimates (</w:t>
+      </w:r>
+      <w:proofErr w:type="spellStart"/>
+      <w:r>
+        <w:rPr>
+          <w:rStyle w:val="normaltextrun"/>
+          <w:lang w:val="en-AU"/>
+        </w:rPr>
+        <w:t>Dertli</w:t>
+      </w:r>
+      <w:proofErr w:type="spellEnd"/>
+      <w:r>
+        <w:rPr>
+          <w:rStyle w:val="normaltextrun"/>
+          <w:lang w:val="en-AU"/>
+        </w:rPr>
+        <w:t> et al., 2024).</w:t>
       </w:r>
     </w:p>
     <w:p>
@@ -17762,7 +19057,25 @@
           <w:sz w:val="24"/>
           <w:szCs w:val="24"/>
         </w:rPr>
-        <w:t xml:space="preserve">Across all models tested, Linear Regression delivered the strongest performance, achieving the lowest RMSE(log) and RMSE on the original scale, indicating that the relationship between predictors and assault rates is predominantly linear and stable. Regularised models (Ridge and </w:t>
+        <w:t xml:space="preserve">Across all models tested, Linear Regression delivered the strongest performance, achieving the lowest </w:t>
+      </w:r>
+      <w:proofErr w:type="gramStart"/>
+      <w:r>
+        <w:rPr>
+          <w:rFonts w:ascii="Times New Roman" w:eastAsia="Times New Roman" w:hAnsi="Times New Roman"/>
+          <w:sz w:val="24"/>
+          <w:szCs w:val="24"/>
+        </w:rPr>
+        <w:t>RMSE(</w:t>
+      </w:r>
+      <w:proofErr w:type="gramEnd"/>
+      <w:r>
+        <w:rPr>
+          <w:rFonts w:ascii="Times New Roman" w:eastAsia="Times New Roman" w:hAnsi="Times New Roman"/>
+          <w:sz w:val="24"/>
+          <w:szCs w:val="24"/>
+        </w:rPr>
+        <w:t xml:space="preserve">log) and RMSE on the original scale, indicating that the relationship between predictors and assault rates is predominantly linear and stable. Regularised models (Ridge and </w:t>
       </w:r>
       <w:r>
         <w:rPr>
@@ -17771,7 +19084,25 @@
           <w:szCs w:val="24"/>
         </w:rPr>
         <w:lastRenderedPageBreak/>
-        <w:t>Lasso) showed slightly higher error and progressively smaller alcohol_per_capita coefficients, suggesting that this variable contributes only modestly once collinearity is controlled. Lasso’s near</w:t>
+        <w:t xml:space="preserve">Lasso) showed slightly higher error and progressively smaller </w:t>
+      </w:r>
+      <w:proofErr w:type="spellStart"/>
+      <w:r>
+        <w:rPr>
+          <w:rFonts w:ascii="Times New Roman" w:eastAsia="Times New Roman" w:hAnsi="Times New Roman"/>
+          <w:sz w:val="24"/>
+          <w:szCs w:val="24"/>
+        </w:rPr>
+        <w:t>alcohol_per_capita</w:t>
+      </w:r>
+      <w:proofErr w:type="spellEnd"/>
+      <w:r>
+        <w:rPr>
+          <w:rFonts w:ascii="Times New Roman" w:eastAsia="Times New Roman" w:hAnsi="Times New Roman"/>
+          <w:sz w:val="24"/>
+          <w:szCs w:val="24"/>
+        </w:rPr>
+        <w:t xml:space="preserve"> coefficients, suggesting that this variable contributes only modestly once collinearity is controlled. Lasso’s near</w:t>
       </w:r>
       <w:r>
         <w:rPr>
@@ -17780,7 +19111,25 @@
           <w:szCs w:val="24"/>
         </w:rPr>
         <w:noBreakHyphen/>
-        <w:t>zero coefficient further implies that alcohol supply is a weak predictor relative to other socioeconomic factors. XGBoost performed worse than the linear models, reinforcing that the dataset does not contain strong nonlinear interactions for tree</w:t>
+        <w:t xml:space="preserve">zero coefficient further implies that alcohol supply is a weak predictor relative to other socioeconomic factors. </w:t>
+      </w:r>
+      <w:proofErr w:type="spellStart"/>
+      <w:r>
+        <w:rPr>
+          <w:rFonts w:ascii="Times New Roman" w:eastAsia="Times New Roman" w:hAnsi="Times New Roman"/>
+          <w:sz w:val="24"/>
+          <w:szCs w:val="24"/>
+        </w:rPr>
+        <w:t>XGBoost</w:t>
+      </w:r>
+      <w:proofErr w:type="spellEnd"/>
+      <w:r>
+        <w:rPr>
+          <w:rFonts w:ascii="Times New Roman" w:eastAsia="Times New Roman" w:hAnsi="Times New Roman"/>
+          <w:sz w:val="24"/>
+          <w:szCs w:val="24"/>
+        </w:rPr>
+        <w:t xml:space="preserve"> performed worse than the linear models, reinforcing that the dataset does not contain strong nonlinear interactions for tree</w:t>
       </w:r>
       <w:r>
         <w:rPr>
@@ -17789,7 +19138,25 @@
           <w:szCs w:val="24"/>
         </w:rPr>
         <w:noBreakHyphen/>
-        <w:t xml:space="preserve">based methods to exploit. Overall, alcohol_per_capita exhibits a consistent but small positive association with assault rates, and simpler linear models remain the most appropriate for this modelling </w:t>
+        <w:t xml:space="preserve">based methods to exploit. Overall, </w:t>
+      </w:r>
+      <w:proofErr w:type="spellStart"/>
+      <w:r>
+        <w:rPr>
+          <w:rFonts w:ascii="Times New Roman" w:eastAsia="Times New Roman" w:hAnsi="Times New Roman"/>
+          <w:sz w:val="24"/>
+          <w:szCs w:val="24"/>
+        </w:rPr>
+        <w:t>alcohol_per_capita</w:t>
+      </w:r>
+      <w:proofErr w:type="spellEnd"/>
+      <w:r>
+        <w:rPr>
+          <w:rFonts w:ascii="Times New Roman" w:eastAsia="Times New Roman" w:hAnsi="Times New Roman"/>
+          <w:sz w:val="24"/>
+          <w:szCs w:val="24"/>
+        </w:rPr>
+        <w:t xml:space="preserve"> exhibits a consistent but small positive association with assault rates, and simpler linear models remain the most appropriate for this modelling </w:t>
       </w:r>
       <w:r>
         <w:rPr>
@@ -17942,7 +19309,27 @@
           <w:szCs w:val="24"/>
           <w:lang w:val="en-US" w:eastAsia="en-US"/>
         </w:rPr>
-        <w:t xml:space="preserve">Ingest &amp; Data Store (Will) — </w:t>
+        <w:t>Ingest &amp; Data Store (</w:t>
+      </w:r>
+      <w:proofErr w:type="gramStart"/>
+      <w:r>
+        <w:rPr>
+          <w:rFonts w:ascii="Times New Roman" w:eastAsia="Times New Roman" w:hAnsi="Times New Roman"/>
+          <w:sz w:val="24"/>
+          <w:szCs w:val="24"/>
+          <w:lang w:val="en-US" w:eastAsia="en-US"/>
+        </w:rPr>
+        <w:t>Will) —</w:t>
+      </w:r>
+      <w:proofErr w:type="gramEnd"/>
+      <w:r>
+        <w:rPr>
+          <w:rFonts w:ascii="Times New Roman" w:eastAsia="Times New Roman" w:hAnsi="Times New Roman"/>
+          <w:sz w:val="24"/>
+          <w:szCs w:val="24"/>
+          <w:lang w:val="en-US" w:eastAsia="en-US"/>
+        </w:rPr>
+        <w:t xml:space="preserve"> </w:t>
       </w:r>
       <w:r>
         <w:rPr>
@@ -17986,7 +19373,27 @@
           <w:szCs w:val="24"/>
           <w:lang w:val="en-US" w:eastAsia="en-US"/>
         </w:rPr>
-        <w:t xml:space="preserve">Data Processing (Emma) — </w:t>
+        <w:t>Data Processing (</w:t>
+      </w:r>
+      <w:proofErr w:type="gramStart"/>
+      <w:r>
+        <w:rPr>
+          <w:rFonts w:ascii="Times New Roman" w:eastAsia="Times New Roman" w:hAnsi="Times New Roman"/>
+          <w:sz w:val="24"/>
+          <w:szCs w:val="24"/>
+          <w:lang w:val="en-US" w:eastAsia="en-US"/>
+        </w:rPr>
+        <w:t>Emma) —</w:t>
+      </w:r>
+      <w:proofErr w:type="gramEnd"/>
+      <w:r>
+        <w:rPr>
+          <w:rFonts w:ascii="Times New Roman" w:eastAsia="Times New Roman" w:hAnsi="Times New Roman"/>
+          <w:sz w:val="24"/>
+          <w:szCs w:val="24"/>
+          <w:lang w:val="en-US" w:eastAsia="en-US"/>
+        </w:rPr>
+        <w:t xml:space="preserve"> </w:t>
       </w:r>
       <w:r>
         <w:rPr>
@@ -18030,7 +19437,27 @@
           <w:szCs w:val="24"/>
           <w:lang w:val="en-US" w:eastAsia="en-US"/>
         </w:rPr>
-        <w:t xml:space="preserve">Data Engineering (Will/Emma) — </w:t>
+        <w:t>Data Engineering (Will/</w:t>
+      </w:r>
+      <w:proofErr w:type="gramStart"/>
+      <w:r>
+        <w:rPr>
+          <w:rFonts w:ascii="Times New Roman" w:eastAsia="Times New Roman" w:hAnsi="Times New Roman"/>
+          <w:sz w:val="24"/>
+          <w:szCs w:val="24"/>
+          <w:lang w:val="en-US" w:eastAsia="en-US"/>
+        </w:rPr>
+        <w:t>Emma) —</w:t>
+      </w:r>
+      <w:proofErr w:type="gramEnd"/>
+      <w:r>
+        <w:rPr>
+          <w:rFonts w:ascii="Times New Roman" w:eastAsia="Times New Roman" w:hAnsi="Times New Roman"/>
+          <w:sz w:val="24"/>
+          <w:szCs w:val="24"/>
+          <w:lang w:val="en-US" w:eastAsia="en-US"/>
+        </w:rPr>
+        <w:t xml:space="preserve"> </w:t>
       </w:r>
       <w:r>
         <w:rPr>
@@ -18050,7 +19477,27 @@
           <w:szCs w:val="24"/>
           <w:lang w:val="en-US" w:eastAsia="en-US"/>
         </w:rPr>
-        <w:t xml:space="preserve"> Per-capita normalisation, cyclical/lagged features, temporal train/test split (Section 3.3).</w:t>
+        <w:t xml:space="preserve"> Per-capita </w:t>
+      </w:r>
+      <w:proofErr w:type="spellStart"/>
+      <w:r>
+        <w:rPr>
+          <w:rFonts w:ascii="Times New Roman" w:eastAsia="Times New Roman" w:hAnsi="Times New Roman"/>
+          <w:sz w:val="24"/>
+          <w:szCs w:val="24"/>
+          <w:lang w:val="en-US" w:eastAsia="en-US"/>
+        </w:rPr>
+        <w:t>normalisation</w:t>
+      </w:r>
+      <w:proofErr w:type="spellEnd"/>
+      <w:r>
+        <w:rPr>
+          <w:rFonts w:ascii="Times New Roman" w:eastAsia="Times New Roman" w:hAnsi="Times New Roman"/>
+          <w:sz w:val="24"/>
+          <w:szCs w:val="24"/>
+          <w:lang w:val="en-US" w:eastAsia="en-US"/>
+        </w:rPr>
+        <w:t>, cyclical/lagged features, temporal train/test split (Section 3.3).</w:t>
       </w:r>
     </w:p>
     <w:p>
@@ -18074,7 +19521,27 @@
           <w:szCs w:val="24"/>
           <w:lang w:val="en-US" w:eastAsia="en-US"/>
         </w:rPr>
-        <w:t xml:space="preserve">Analytics/ML (Hendrick) — </w:t>
+        <w:t>Analytics/ML (</w:t>
+      </w:r>
+      <w:proofErr w:type="gramStart"/>
+      <w:r>
+        <w:rPr>
+          <w:rFonts w:ascii="Times New Roman" w:eastAsia="Times New Roman" w:hAnsi="Times New Roman"/>
+          <w:sz w:val="24"/>
+          <w:szCs w:val="24"/>
+          <w:lang w:val="en-US" w:eastAsia="en-US"/>
+        </w:rPr>
+        <w:t>Hendrick) —</w:t>
+      </w:r>
+      <w:proofErr w:type="gramEnd"/>
+      <w:r>
+        <w:rPr>
+          <w:rFonts w:ascii="Times New Roman" w:eastAsia="Times New Roman" w:hAnsi="Times New Roman"/>
+          <w:sz w:val="24"/>
+          <w:szCs w:val="24"/>
+          <w:lang w:val="en-US" w:eastAsia="en-US"/>
+        </w:rPr>
+        <w:t xml:space="preserve"> </w:t>
       </w:r>
       <w:r>
         <w:rPr>
@@ -18110,7 +19577,47 @@
           <w:szCs w:val="24"/>
           <w:lang w:val="en-US" w:eastAsia="en-US"/>
         </w:rPr>
-        <w:t>) adds naive baselines, leakage-free feature selection, rolling-origin backtesting, and empirical prediction intervals, responding directly to the Assessment 1 feedback on validation rigour (Section 4, Hendrick).</w:t>
+        <w:t xml:space="preserve">) adds naive baselines, leakage-free feature selection, rolling-origin </w:t>
+      </w:r>
+      <w:proofErr w:type="spellStart"/>
+      <w:r>
+        <w:rPr>
+          <w:rFonts w:ascii="Times New Roman" w:eastAsia="Times New Roman" w:hAnsi="Times New Roman"/>
+          <w:sz w:val="24"/>
+          <w:szCs w:val="24"/>
+          <w:lang w:val="en-US" w:eastAsia="en-US"/>
+        </w:rPr>
+        <w:t>backtesting</w:t>
+      </w:r>
+      <w:proofErr w:type="spellEnd"/>
+      <w:r>
+        <w:rPr>
+          <w:rFonts w:ascii="Times New Roman" w:eastAsia="Times New Roman" w:hAnsi="Times New Roman"/>
+          <w:sz w:val="24"/>
+          <w:szCs w:val="24"/>
+          <w:lang w:val="en-US" w:eastAsia="en-US"/>
+        </w:rPr>
+        <w:t xml:space="preserve">, and empirical prediction intervals, responding directly to the Assessment 1 feedback on validation </w:t>
+      </w:r>
+      <w:proofErr w:type="spellStart"/>
+      <w:r>
+        <w:rPr>
+          <w:rFonts w:ascii="Times New Roman" w:eastAsia="Times New Roman" w:hAnsi="Times New Roman"/>
+          <w:sz w:val="24"/>
+          <w:szCs w:val="24"/>
+          <w:lang w:val="en-US" w:eastAsia="en-US"/>
+        </w:rPr>
+        <w:t>rigour</w:t>
+      </w:r>
+      <w:proofErr w:type="spellEnd"/>
+      <w:r>
+        <w:rPr>
+          <w:rFonts w:ascii="Times New Roman" w:eastAsia="Times New Roman" w:hAnsi="Times New Roman"/>
+          <w:sz w:val="24"/>
+          <w:szCs w:val="24"/>
+          <w:lang w:val="en-US" w:eastAsia="en-US"/>
+        </w:rPr>
+        <w:t xml:space="preserve"> (Section 4, Hendrick).</w:t>
       </w:r>
     </w:p>
     <w:p>
@@ -18654,7 +20161,27 @@
                 <w:szCs w:val="24"/>
                 <w:lang w:val="en-AU"/>
               </w:rPr>
-              <w:t>GitHub repository with README; Streamlit account set up; draft problem statement</w:t>
+              <w:t xml:space="preserve">GitHub repository with README; </w:t>
+            </w:r>
+            <w:proofErr w:type="spellStart"/>
+            <w:r>
+              <w:rPr>
+                <w:rFonts w:ascii="Times New Roman" w:eastAsia="Times New Roman" w:hAnsi="Times New Roman" w:cs="Times New Roman"/>
+                <w:sz w:val="24"/>
+                <w:szCs w:val="24"/>
+                <w:lang w:val="en-AU"/>
+              </w:rPr>
+              <w:t>Streamlit</w:t>
+            </w:r>
+            <w:proofErr w:type="spellEnd"/>
+            <w:r>
+              <w:rPr>
+                <w:rFonts w:ascii="Times New Roman" w:eastAsia="Times New Roman" w:hAnsi="Times New Roman" w:cs="Times New Roman"/>
+                <w:sz w:val="24"/>
+                <w:szCs w:val="24"/>
+                <w:lang w:val="en-AU"/>
+              </w:rPr>
+              <w:t xml:space="preserve"> account set up; draft problem statement</w:t>
             </w:r>
           </w:p>
         </w:tc>
@@ -18801,7 +20328,27 @@
                 <w:szCs w:val="24"/>
                 <w:lang w:val="en-AU"/>
               </w:rPr>
-              <w:t>Architecture diagram; project management board populated; confirmed data sources</w:t>
+              <w:t xml:space="preserve">Architecture </w:t>
+            </w:r>
+            <w:proofErr w:type="gramStart"/>
+            <w:r>
+              <w:rPr>
+                <w:rFonts w:ascii="Times New Roman" w:eastAsia="Times New Roman" w:hAnsi="Times New Roman" w:cs="Times New Roman"/>
+                <w:sz w:val="24"/>
+                <w:szCs w:val="24"/>
+                <w:lang w:val="en-AU"/>
+              </w:rPr>
+              <w:t>diagram;</w:t>
+            </w:r>
+            <w:proofErr w:type="gramEnd"/>
+            <w:r>
+              <w:rPr>
+                <w:rFonts w:ascii="Times New Roman" w:eastAsia="Times New Roman" w:hAnsi="Times New Roman" w:cs="Times New Roman"/>
+                <w:sz w:val="24"/>
+                <w:szCs w:val="24"/>
+                <w:lang w:val="en-AU"/>
+              </w:rPr>
+              <w:t xml:space="preserve"> project management board populated; confirmed data sources</w:t>
             </w:r>
           </w:p>
         </w:tc>
@@ -20115,7 +21662,47 @@
                 <w:szCs w:val="24"/>
                 <w:lang w:val="en-AU"/>
               </w:rPr>
-              <w:t>Incorporate feedback; finalise dashboard;  deploy to Streamlit Community Cloud; implement monitoring and retraining logic</w:t>
+              <w:t xml:space="preserve">Incorporate feedback; finalise </w:t>
+            </w:r>
+            <w:proofErr w:type="gramStart"/>
+            <w:r>
+              <w:rPr>
+                <w:rFonts w:ascii="Times New Roman" w:eastAsia="Times New Roman" w:hAnsi="Times New Roman" w:cs="Times New Roman"/>
+                <w:sz w:val="24"/>
+                <w:szCs w:val="24"/>
+                <w:lang w:val="en-AU"/>
+              </w:rPr>
+              <w:t>dashboard;  deploy</w:t>
+            </w:r>
+            <w:proofErr w:type="gramEnd"/>
+            <w:r>
+              <w:rPr>
+                <w:rFonts w:ascii="Times New Roman" w:eastAsia="Times New Roman" w:hAnsi="Times New Roman" w:cs="Times New Roman"/>
+                <w:sz w:val="24"/>
+                <w:szCs w:val="24"/>
+                <w:lang w:val="en-AU"/>
+              </w:rPr>
+              <w:t xml:space="preserve"> to </w:t>
+            </w:r>
+            <w:proofErr w:type="spellStart"/>
+            <w:r>
+              <w:rPr>
+                <w:rFonts w:ascii="Times New Roman" w:eastAsia="Times New Roman" w:hAnsi="Times New Roman" w:cs="Times New Roman"/>
+                <w:sz w:val="24"/>
+                <w:szCs w:val="24"/>
+                <w:lang w:val="en-AU"/>
+              </w:rPr>
+              <w:t>Streamlit</w:t>
+            </w:r>
+            <w:proofErr w:type="spellEnd"/>
+            <w:r>
+              <w:rPr>
+                <w:rFonts w:ascii="Times New Roman" w:eastAsia="Times New Roman" w:hAnsi="Times New Roman" w:cs="Times New Roman"/>
+                <w:sz w:val="24"/>
+                <w:szCs w:val="24"/>
+                <w:lang w:val="en-AU"/>
+              </w:rPr>
+              <w:t xml:space="preserve"> Community Cloud; implement monitoring and retraining logic</w:t>
             </w:r>
           </w:p>
         </w:tc>
@@ -20144,7 +21731,27 @@
                 <w:szCs w:val="24"/>
                 <w:lang w:val="en-AU"/>
               </w:rPr>
-              <w:t>Deployed dashboard; monitoring stage implemented</w:t>
+              <w:t xml:space="preserve">Deployed </w:t>
+            </w:r>
+            <w:proofErr w:type="gramStart"/>
+            <w:r>
+              <w:rPr>
+                <w:rFonts w:ascii="Times New Roman" w:eastAsia="Times New Roman" w:hAnsi="Times New Roman" w:cs="Times New Roman"/>
+                <w:sz w:val="24"/>
+                <w:szCs w:val="24"/>
+                <w:lang w:val="en-AU"/>
+              </w:rPr>
+              <w:t>dashboard;</w:t>
+            </w:r>
+            <w:proofErr w:type="gramEnd"/>
+            <w:r>
+              <w:rPr>
+                <w:rFonts w:ascii="Times New Roman" w:eastAsia="Times New Roman" w:hAnsi="Times New Roman" w:cs="Times New Roman"/>
+                <w:sz w:val="24"/>
+                <w:szCs w:val="24"/>
+                <w:lang w:val="en-AU"/>
+              </w:rPr>
+              <w:t xml:space="preserve"> monitoring stage implemented</w:t>
             </w:r>
           </w:p>
         </w:tc>
@@ -20599,7 +22206,21 @@
         <w:rPr>
           <w:rStyle w:val="normaltextrun"/>
         </w:rPr>
-        <w:t>Potential risks, including data quality issues, ethical concerns, and technical challenges, will be continuously monitored throughout the project. Mitigation strategies such as data validation procedures, adherence to ethical guidelines, and regular system testing will be implemented to minimise their impact. Risks will be reviewed periodically, and corrective actions will be taken promptly to ensure project objectives are achieved successfully.</w:t>
+        <w:t>Potential risks, including data quality issues, ethical concerns, and technical challenges, will be continuously monitored throughout the project. Mitigation strategies such as data validation procedures, adherence to ethical guidelines, and regular system testing will be implemented to </w:t>
+      </w:r>
+      <w:proofErr w:type="spellStart"/>
+      <w:r>
+        <w:rPr>
+          <w:rStyle w:val="normaltextrun"/>
+        </w:rPr>
+        <w:t>minimise</w:t>
+      </w:r>
+      <w:proofErr w:type="spellEnd"/>
+      <w:r>
+        <w:rPr>
+          <w:rStyle w:val="normaltextrun"/>
+        </w:rPr>
+        <w:t> their impact. Risks will be reviewed periodically, and corrective actions will be taken promptly to ensure project objectives are achieved successfully.</w:t>
       </w:r>
     </w:p>
     <w:p>
@@ -20673,7 +22294,21 @@
           <w:rStyle w:val="normaltextrun"/>
         </w:rPr>
         <w:lastRenderedPageBreak/>
-        <w:t>The project continues to respect Indigenous Data Sovereignty principles by recognising the rights of Indigenous communities to govern the collection, ownership, and use of data relating to their people and communities.</w:t>
+        <w:t>The project continues to respect Indigenous Data Sovereignty principles by </w:t>
+      </w:r>
+      <w:proofErr w:type="spellStart"/>
+      <w:r>
+        <w:rPr>
+          <w:rStyle w:val="normaltextrun"/>
+        </w:rPr>
+        <w:t>recognising</w:t>
+      </w:r>
+      <w:proofErr w:type="spellEnd"/>
+      <w:r>
+        <w:rPr>
+          <w:rStyle w:val="normaltextrun"/>
+        </w:rPr>
+        <w:t> the rights of Indigenous communities to govern the collection, ownership, and use of data relating to their people and communities.</w:t>
       </w:r>
     </w:p>
     <w:p>
@@ -20691,7 +22326,21 @@
         <w:rPr>
           <w:rStyle w:val="normaltextrun"/>
         </w:rPr>
-        <w:t>In addition, all predictive analytics activities seek to comply with ethical standards to minimise bias, promote transparency, and support fair decision-making. Forecasting</w:t>
+        <w:t>In addition, all predictive analytics activities seek to comply with ethical standards to </w:t>
+      </w:r>
+      <w:proofErr w:type="spellStart"/>
+      <w:r>
+        <w:rPr>
+          <w:rStyle w:val="normaltextrun"/>
+        </w:rPr>
+        <w:t>minimise</w:t>
+      </w:r>
+      <w:proofErr w:type="spellEnd"/>
+      <w:r>
+        <w:rPr>
+          <w:rStyle w:val="normaltextrun"/>
+        </w:rPr>
+        <w:t> bias, promote transparency, and support fair decision-making. Forecasting</w:t>
       </w:r>
       <w:r>
         <w:rPr>
@@ -20809,7 +22458,25 @@
           <w:sz w:val="24"/>
           <w:szCs w:val="24"/>
         </w:rPr>
-        <w:t xml:space="preserve">he transition from PROMIS to SerPro in November 2023 and </w:t>
+        <w:t xml:space="preserve">he transition from PROMIS to </w:t>
+      </w:r>
+      <w:proofErr w:type="spellStart"/>
+      <w:r>
+        <w:rPr>
+          <w:rFonts w:ascii="Times New Roman" w:eastAsia="Times New Roman" w:hAnsi="Times New Roman"/>
+          <w:sz w:val="24"/>
+          <w:szCs w:val="24"/>
+        </w:rPr>
+        <w:t>SerPro</w:t>
+      </w:r>
+      <w:proofErr w:type="spellEnd"/>
+      <w:r>
+        <w:rPr>
+          <w:rFonts w:ascii="Times New Roman" w:eastAsia="Times New Roman" w:hAnsi="Times New Roman"/>
+          <w:sz w:val="24"/>
+          <w:szCs w:val="24"/>
+        </w:rPr>
+        <w:t xml:space="preserve"> in November 2023 and </w:t>
       </w:r>
       <w:r>
         <w:rPr>
@@ -21102,7 +22769,25 @@
           <w:sz w:val="24"/>
           <w:szCs w:val="24"/>
         </w:rPr>
-        <w:t>And the final risk is misuse or misinterpretation of the forecasts. If predictions are read as statements about particular communities, the system could cause harm rather than support safety. Small counts in low-population regions could also make incidents identifiable. Forecasts will therefore be shown only at region and month level, with uncertainty ranges, and small values will be suppressed.</w:t>
+        <w:t xml:space="preserve">And the final risk is misuse or misinterpretation of the forecasts. If predictions are read as statements about </w:t>
+      </w:r>
+      <w:proofErr w:type="gramStart"/>
+      <w:r>
+        <w:rPr>
+          <w:rFonts w:ascii="Times New Roman" w:eastAsia="Times New Roman" w:hAnsi="Times New Roman"/>
+          <w:sz w:val="24"/>
+          <w:szCs w:val="24"/>
+        </w:rPr>
+        <w:t>particular communities</w:t>
+      </w:r>
+      <w:proofErr w:type="gramEnd"/>
+      <w:r>
+        <w:rPr>
+          <w:rFonts w:ascii="Times New Roman" w:eastAsia="Times New Roman" w:hAnsi="Times New Roman"/>
+          <w:sz w:val="24"/>
+          <w:szCs w:val="24"/>
+        </w:rPr>
+        <w:t>, the system could cause harm rather than support safety. Small counts in low-population regions could also make incidents identifiable. Forecasts will therefore be shown only at region and month level, with uncertainty ranges, and small values will be suppressed.</w:t>
       </w:r>
     </w:p>
     <w:p>
@@ -21444,6 +23129,7 @@
         </w:rPr>
       </w:pPr>
       <w:bookmarkStart w:id="21" w:name="OLE_LINK8"/>
+      <w:proofErr w:type="spellStart"/>
       <w:r>
         <w:rPr>
           <w:b/>
@@ -21451,7 +23137,17 @@
           <w:highlight w:val="yellow"/>
           <w:lang w:val="vi-VN"/>
         </w:rPr>
-        <w:t xml:space="preserve">Evaluation </w:t>
+        <w:t>Evaluation</w:t>
+      </w:r>
+      <w:proofErr w:type="spellEnd"/>
+      <w:r>
+        <w:rPr>
+          <w:b/>
+          <w:bCs/>
+          <w:highlight w:val="yellow"/>
+          <w:lang w:val="vi-VN"/>
+        </w:rPr>
+        <w:t xml:space="preserve"> </w:t>
       </w:r>
       <w:r>
         <w:rPr>
@@ -21479,7 +23175,25 @@
           <w:sz w:val="24"/>
           <w:szCs w:val="24"/>
         </w:rPr>
-        <w:t>Progress against the Assessment 1 feedback is mixed. The modelling side has been substantially addressed — the 5 Vs characterisation (Section 3.1), naive baselines, and leakage-free validation (evaluation.py, Section 4) directly respond to the feedback, though Section 3.4.5 still needs updating to reflect these results. The storage-architecture concern (Section 3.1) and governance/Jira-process concerns remain only partially resolved.</w:t>
+        <w:t xml:space="preserve">Progress against the Assessment 1 feedback is mixed. The modelling side has been substantially addressed — the 5 Vs </w:t>
+      </w:r>
+      <w:proofErr w:type="spellStart"/>
+      <w:r>
+        <w:rPr>
+          <w:rFonts w:ascii="Times New Roman" w:eastAsia="Times New Roman" w:hAnsi="Times New Roman"/>
+          <w:sz w:val="24"/>
+          <w:szCs w:val="24"/>
+        </w:rPr>
+        <w:t>characterisation</w:t>
+      </w:r>
+      <w:proofErr w:type="spellEnd"/>
+      <w:r>
+        <w:rPr>
+          <w:rFonts w:ascii="Times New Roman" w:eastAsia="Times New Roman" w:hAnsi="Times New Roman"/>
+          <w:sz w:val="24"/>
+          <w:szCs w:val="24"/>
+        </w:rPr>
+        <w:t xml:space="preserve"> (Section 3.1), naive baselines, and leakage-free validation (evaluation.py, Section 4) directly respond to the feedback, though Section 3.4.5 still needs updating to reflect these results. The storage-architecture concern (Section 3.1) and governance/Jira-process concerns remain only partially resolved.</w:t>
       </w:r>
     </w:p>
     <w:p>
@@ -21603,7 +23317,47 @@
           <w:szCs w:val="24"/>
           <w:lang w:val="en-US" w:eastAsia="en-US"/>
         </w:rPr>
-        <w:t>Two undeclared dependencies (xgboost, openpyxl) that broke the pipeline on any machine but the original developer's</w:t>
+        <w:t>Two undeclared dependencies (</w:t>
+      </w:r>
+      <w:proofErr w:type="spellStart"/>
+      <w:r>
+        <w:rPr>
+          <w:rFonts w:ascii="Times New Roman" w:eastAsia="Times New Roman" w:hAnsi="Times New Roman"/>
+          <w:sz w:val="24"/>
+          <w:szCs w:val="24"/>
+          <w:lang w:val="en-US" w:eastAsia="en-US"/>
+        </w:rPr>
+        <w:t>xgboost</w:t>
+      </w:r>
+      <w:proofErr w:type="spellEnd"/>
+      <w:r>
+        <w:rPr>
+          <w:rFonts w:ascii="Times New Roman" w:eastAsia="Times New Roman" w:hAnsi="Times New Roman"/>
+          <w:sz w:val="24"/>
+          <w:szCs w:val="24"/>
+          <w:lang w:val="en-US" w:eastAsia="en-US"/>
+        </w:rPr>
+        <w:t xml:space="preserve">, </w:t>
+      </w:r>
+      <w:proofErr w:type="spellStart"/>
+      <w:r>
+        <w:rPr>
+          <w:rFonts w:ascii="Times New Roman" w:eastAsia="Times New Roman" w:hAnsi="Times New Roman"/>
+          <w:sz w:val="24"/>
+          <w:szCs w:val="24"/>
+          <w:lang w:val="en-US" w:eastAsia="en-US"/>
+        </w:rPr>
+        <w:t>openpyxl</w:t>
+      </w:r>
+      <w:proofErr w:type="spellEnd"/>
+      <w:r>
+        <w:rPr>
+          <w:rFonts w:ascii="Times New Roman" w:eastAsia="Times New Roman" w:hAnsi="Times New Roman"/>
+          <w:sz w:val="24"/>
+          <w:szCs w:val="24"/>
+          <w:lang w:val="en-US" w:eastAsia="en-US"/>
+        </w:rPr>
+        <w:t>) that broke the pipeline on any machine but the original developer's</w:t>
       </w:r>
     </w:p>
     <w:p>
@@ -21627,7 +23381,47 @@
           <w:szCs w:val="24"/>
           <w:lang w:val="en-US" w:eastAsia="en-US"/>
         </w:rPr>
-        <w:t>A Windows-only Unicode crash inside a print() statement</w:t>
+        <w:t xml:space="preserve">A Windows-only Unicode </w:t>
+      </w:r>
+      <w:proofErr w:type="gramStart"/>
+      <w:r>
+        <w:rPr>
+          <w:rFonts w:ascii="Times New Roman" w:eastAsia="Times New Roman" w:hAnsi="Times New Roman"/>
+          <w:sz w:val="24"/>
+          <w:szCs w:val="24"/>
+          <w:lang w:val="en-US" w:eastAsia="en-US"/>
+        </w:rPr>
+        <w:t>crash</w:t>
+      </w:r>
+      <w:proofErr w:type="gramEnd"/>
+      <w:r>
+        <w:rPr>
+          <w:rFonts w:ascii="Times New Roman" w:eastAsia="Times New Roman" w:hAnsi="Times New Roman"/>
+          <w:sz w:val="24"/>
+          <w:szCs w:val="24"/>
+          <w:lang w:val="en-US" w:eastAsia="en-US"/>
+        </w:rPr>
+        <w:t xml:space="preserve"> inside a </w:t>
+      </w:r>
+      <w:proofErr w:type="gramStart"/>
+      <w:r>
+        <w:rPr>
+          <w:rFonts w:ascii="Times New Roman" w:eastAsia="Times New Roman" w:hAnsi="Times New Roman"/>
+          <w:sz w:val="24"/>
+          <w:szCs w:val="24"/>
+          <w:lang w:val="en-US" w:eastAsia="en-US"/>
+        </w:rPr>
+        <w:t>print(</w:t>
+      </w:r>
+      <w:proofErr w:type="gramEnd"/>
+      <w:r>
+        <w:rPr>
+          <w:rFonts w:ascii="Times New Roman" w:eastAsia="Times New Roman" w:hAnsi="Times New Roman"/>
+          <w:sz w:val="24"/>
+          <w:szCs w:val="24"/>
+          <w:lang w:val="en-US" w:eastAsia="en-US"/>
+        </w:rPr>
+        <w:t>) statement</w:t>
       </w:r>
     </w:p>
     <w:p>
@@ -21675,7 +23469,27 @@
           <w:szCs w:val="24"/>
           <w:lang w:val="en-US" w:eastAsia="en-US"/>
         </w:rPr>
-        <w:t>A biased VIF calculation (missing its constant term) and an unsafe eval() call</w:t>
+        <w:t xml:space="preserve">A biased VIF calculation (missing its constant term) and an unsafe </w:t>
+      </w:r>
+      <w:proofErr w:type="gramStart"/>
+      <w:r>
+        <w:rPr>
+          <w:rFonts w:ascii="Times New Roman" w:eastAsia="Times New Roman" w:hAnsi="Times New Roman"/>
+          <w:sz w:val="24"/>
+          <w:szCs w:val="24"/>
+          <w:lang w:val="en-US" w:eastAsia="en-US"/>
+        </w:rPr>
+        <w:t>eval(</w:t>
+      </w:r>
+      <w:proofErr w:type="gramEnd"/>
+      <w:r>
+        <w:rPr>
+          <w:rFonts w:ascii="Times New Roman" w:eastAsia="Times New Roman" w:hAnsi="Times New Roman"/>
+          <w:sz w:val="24"/>
+          <w:szCs w:val="24"/>
+          <w:lang w:val="en-US" w:eastAsia="en-US"/>
+        </w:rPr>
+        <w:t>) call</w:t>
       </w:r>
     </w:p>
     <w:p>
@@ -21737,7 +23551,78 @@
           <w:szCs w:val="24"/>
           <w:lang w:val="en-US" w:eastAsia="en-US"/>
         </w:rPr>
-        <w:t xml:space="preserve"> The team commits pipeline outputs (eda_plots/, regression_plots/, dataset/raw/, dataset/processed/) to GitHub rather than .gitignore-excluding them, so markers can inspect results without re-running the pipeline — trading occasional merge conflicts on regenerated images for the reproducibility the module's GitHub expectations call for.</w:t>
+        <w:t xml:space="preserve"> The team commits pipeline outputs (</w:t>
+      </w:r>
+      <w:proofErr w:type="spellStart"/>
+      <w:r>
+        <w:rPr>
+          <w:rFonts w:ascii="Times New Roman" w:eastAsia="Times New Roman" w:hAnsi="Times New Roman"/>
+          <w:sz w:val="24"/>
+          <w:szCs w:val="24"/>
+          <w:lang w:val="en-US" w:eastAsia="en-US"/>
+        </w:rPr>
+        <w:t>eda_plots</w:t>
+      </w:r>
+      <w:proofErr w:type="spellEnd"/>
+      <w:r>
+        <w:rPr>
+          <w:rFonts w:ascii="Times New Roman" w:eastAsia="Times New Roman" w:hAnsi="Times New Roman"/>
+          <w:sz w:val="24"/>
+          <w:szCs w:val="24"/>
+          <w:lang w:val="en-US" w:eastAsia="en-US"/>
+        </w:rPr>
+        <w:t xml:space="preserve">/, </w:t>
+      </w:r>
+      <w:proofErr w:type="spellStart"/>
+      <w:r>
+        <w:rPr>
+          <w:rFonts w:ascii="Times New Roman" w:eastAsia="Times New Roman" w:hAnsi="Times New Roman"/>
+          <w:sz w:val="24"/>
+          <w:szCs w:val="24"/>
+          <w:lang w:val="en-US" w:eastAsia="en-US"/>
+        </w:rPr>
+        <w:t>regression_plots</w:t>
+      </w:r>
+      <w:proofErr w:type="spellEnd"/>
+      <w:r>
+        <w:rPr>
+          <w:rFonts w:ascii="Times New Roman" w:eastAsia="Times New Roman" w:hAnsi="Times New Roman"/>
+          <w:sz w:val="24"/>
+          <w:szCs w:val="24"/>
+          <w:lang w:val="en-US" w:eastAsia="en-US"/>
+        </w:rPr>
+        <w:t xml:space="preserve">/, dataset/raw/, dataset/processed/) to GitHub rather </w:t>
+      </w:r>
+      <w:proofErr w:type="gramStart"/>
+      <w:r>
+        <w:rPr>
+          <w:rFonts w:ascii="Times New Roman" w:eastAsia="Times New Roman" w:hAnsi="Times New Roman"/>
+          <w:sz w:val="24"/>
+          <w:szCs w:val="24"/>
+          <w:lang w:val="en-US" w:eastAsia="en-US"/>
+        </w:rPr>
+        <w:t>than .</w:t>
+      </w:r>
+      <w:proofErr w:type="spellStart"/>
+      <w:r>
+        <w:rPr>
+          <w:rFonts w:ascii="Times New Roman" w:eastAsia="Times New Roman" w:hAnsi="Times New Roman"/>
+          <w:sz w:val="24"/>
+          <w:szCs w:val="24"/>
+          <w:lang w:val="en-US" w:eastAsia="en-US"/>
+        </w:rPr>
+        <w:t>gitignore</w:t>
+      </w:r>
+      <w:proofErr w:type="spellEnd"/>
+      <w:proofErr w:type="gramEnd"/>
+      <w:r>
+        <w:rPr>
+          <w:rFonts w:ascii="Times New Roman" w:eastAsia="Times New Roman" w:hAnsi="Times New Roman"/>
+          <w:sz w:val="24"/>
+          <w:szCs w:val="24"/>
+          <w:lang w:val="en-US" w:eastAsia="en-US"/>
+        </w:rPr>
+        <w:t>-excluding them, so markers can inspect results without re-running the pipeline — trading occasional merge conflicts on regenerated images for the reproducibility the module's GitHub expectations call for.</w:t>
       </w:r>
     </w:p>
     <w:p>
@@ -21936,7 +23821,43 @@
           <w:sz w:val="24"/>
           <w:szCs w:val="24"/>
         </w:rPr>
-        <w:t xml:space="preserve">Carroll, S. R., Garba, I., Figueroa-Rodríguez, O. L., Holbrook, J., Lovett, R., Materechera, S., Parsons, M., Raseroka, K., Rodriguez-Lonebear, D., Rowe, R., Sara, R., Walker, J. D., Anderson, J., &amp; Hudson, M. (2020). The CARE Principles for Indigenous Data Governance. Data Science Journal, 19(1), 1–12. </w:t>
+        <w:t xml:space="preserve">Carroll, S. R., Garba, I., Figueroa-Rodríguez, O. L., Holbrook, J., Lovett, R., </w:t>
+      </w:r>
+      <w:proofErr w:type="spellStart"/>
+      <w:r>
+        <w:rPr>
+          <w:rFonts w:ascii="Times New Roman" w:eastAsia="Times New Roman" w:hAnsi="Times New Roman"/>
+          <w:sz w:val="24"/>
+          <w:szCs w:val="24"/>
+        </w:rPr>
+        <w:t>Materechera</w:t>
+      </w:r>
+      <w:proofErr w:type="spellEnd"/>
+      <w:r>
+        <w:rPr>
+          <w:rFonts w:ascii="Times New Roman" w:eastAsia="Times New Roman" w:hAnsi="Times New Roman"/>
+          <w:sz w:val="24"/>
+          <w:szCs w:val="24"/>
+        </w:rPr>
+        <w:t xml:space="preserve">, S., Parsons, M., </w:t>
+      </w:r>
+      <w:proofErr w:type="spellStart"/>
+      <w:r>
+        <w:rPr>
+          <w:rFonts w:ascii="Times New Roman" w:eastAsia="Times New Roman" w:hAnsi="Times New Roman"/>
+          <w:sz w:val="24"/>
+          <w:szCs w:val="24"/>
+        </w:rPr>
+        <w:t>Raseroka</w:t>
+      </w:r>
+      <w:proofErr w:type="spellEnd"/>
+      <w:r>
+        <w:rPr>
+          <w:rFonts w:ascii="Times New Roman" w:eastAsia="Times New Roman" w:hAnsi="Times New Roman"/>
+          <w:sz w:val="24"/>
+          <w:szCs w:val="24"/>
+        </w:rPr>
+        <w:t xml:space="preserve">, K., Rodriguez-Lonebear, D., Rowe, R., Sara, R., Walker, J. D., Anderson, J., &amp; Hudson, M. (2020). The CARE Principles for Indigenous Data Governance. Data Science Journal, 19(1), 1–12. </w:t>
       </w:r>
       <w:hyperlink r:id="rId42">
         <w:r>
@@ -22019,7 +23940,25 @@
           <w:sz w:val="24"/>
           <w:szCs w:val="24"/>
         </w:rPr>
-        <w:t>NT crime statistics march 2026 - NTG open data portal</w:t>
+        <w:t xml:space="preserve">NT crime </w:t>
+      </w:r>
+      <w:proofErr w:type="gramStart"/>
+      <w:r>
+        <w:rPr>
+          <w:rFonts w:ascii="Times New Roman" w:eastAsia="Times New Roman" w:hAnsi="Times New Roman"/>
+          <w:sz w:val="24"/>
+          <w:szCs w:val="24"/>
+        </w:rPr>
+        <w:t>statistics march</w:t>
+      </w:r>
+      <w:proofErr w:type="gramEnd"/>
+      <w:r>
+        <w:rPr>
+          <w:rFonts w:ascii="Times New Roman" w:eastAsia="Times New Roman" w:hAnsi="Times New Roman"/>
+          <w:sz w:val="24"/>
+          <w:szCs w:val="24"/>
+        </w:rPr>
+        <w:t xml:space="preserve"> 2026 - NTG open data portal</w:t>
       </w:r>
       <w:r>
         <w:rPr>
@@ -22115,7 +24054,29 @@
           <w:sz w:val="24"/>
           <w:szCs w:val="24"/>
         </w:rPr>
-        <w:t>Operation ventura | NT police, fire &amp; emergency services</w:t>
+        <w:t xml:space="preserve">Operation </w:t>
+      </w:r>
+      <w:proofErr w:type="spellStart"/>
+      <w:r>
+        <w:rPr>
+          <w:rFonts w:ascii="Times New Roman" w:eastAsia="Times New Roman" w:hAnsi="Times New Roman"/>
+          <w:i/>
+          <w:iCs/>
+          <w:sz w:val="24"/>
+          <w:szCs w:val="24"/>
+        </w:rPr>
+        <w:t>ventura</w:t>
+      </w:r>
+      <w:proofErr w:type="spellEnd"/>
+      <w:r>
+        <w:rPr>
+          <w:rFonts w:ascii="Times New Roman" w:eastAsia="Times New Roman" w:hAnsi="Times New Roman"/>
+          <w:i/>
+          <w:iCs/>
+          <w:sz w:val="24"/>
+          <w:szCs w:val="24"/>
+        </w:rPr>
+        <w:t xml:space="preserve"> | NT police, fire &amp; emergency services</w:t>
       </w:r>
       <w:r>
         <w:rPr>
@@ -22299,13 +24260,23 @@
         </w:rPr>
         <w:t xml:space="preserve"> </w:t>
       </w:r>
+      <w:proofErr w:type="spellStart"/>
       <w:r>
         <w:rPr>
           <w:rFonts w:ascii="Times New Roman" w:eastAsiaTheme="minorEastAsia" w:hAnsi="Times New Roman"/>
           <w:sz w:val="24"/>
           <w:szCs w:val="24"/>
         </w:rPr>
-        <w:t>Thi Xuan Thanh Tran (Emma)</w:t>
+        <w:t>Thi</w:t>
+      </w:r>
+      <w:proofErr w:type="spellEnd"/>
+      <w:r>
+        <w:rPr>
+          <w:rFonts w:ascii="Times New Roman" w:eastAsiaTheme="minorEastAsia" w:hAnsi="Times New Roman"/>
+          <w:sz w:val="24"/>
+          <w:szCs w:val="24"/>
+        </w:rPr>
+        <w:t xml:space="preserve"> Xuan Thanh Tran (Emma)</w:t>
       </w:r>
     </w:p>
     <w:p>
@@ -22525,6 +24496,7 @@
         <w:t>cleaning, standardising, and merging the three source datasets (crime, population, alcohol supply) into a single analysis-ready panel. Alongside this, I contributed to team coordination through Jira task management, GitHub maintenance, report writing, and reviewing teammates' work against assignment requirements.</w:t>
       </w:r>
     </w:p>
+    <w:bookmarkStart w:id="23" w:name="OLE_LINK10"/>
     <w:p>
       <w:pPr>
         <w:spacing w:line="276" w:lineRule="auto"/>
@@ -22533,18 +24505,29 @@
           <w:lang w:val="vi-VN"/>
         </w:rPr>
       </w:pPr>
-      <w:hyperlink r:id="rId49" w:history="1">
-        <w:r>
-          <w:rPr>
-            <w:rStyle w:val="Hyperlink"/>
-            <w:rFonts w:ascii="Times New Roman" w:eastAsia="Times New Roman" w:hAnsi="Times New Roman"/>
-            <w:sz w:val="24"/>
-            <w:szCs w:val="24"/>
-          </w:rPr>
-          <w:t>https://github.com/HendrickDang/PRT661-DATA-SCIENCE-PRACTICE/commits?author=EmmaTran56</w:t>
-        </w:r>
-      </w:hyperlink>
+      <w:r>
+        <w:fldChar w:fldCharType="begin"/>
+      </w:r>
+      <w:r>
+        <w:instrText>HYPERLINK "https://github.com/HendrickDang/PRT661-DATA-SCIENCE-PRACTICE/commits?author=EmmaTran56"</w:instrText>
+      </w:r>
+      <w:r>
+        <w:fldChar w:fldCharType="separate"/>
+      </w:r>
+      <w:r>
+        <w:rPr>
+          <w:rStyle w:val="Hyperlink"/>
+          <w:rFonts w:ascii="Times New Roman" w:eastAsia="Times New Roman" w:hAnsi="Times New Roman"/>
+          <w:sz w:val="24"/>
+          <w:szCs w:val="24"/>
+        </w:rPr>
+        <w:t>https://github.com/HendrickDang/PRT661-DATA-SCIENCE-PRACTICE/commits?author=EmmaTran56</w:t>
+      </w:r>
+      <w:r>
+        <w:fldChar w:fldCharType="end"/>
+      </w:r>
     </w:p>
+    <w:bookmarkEnd w:id="23"/>
     <w:p>
       <w:pPr>
         <w:pStyle w:val="ListParagraph"/>
@@ -22568,18 +24551,30 @@
         </w:rPr>
         <w:t>Visualisation:</w:t>
       </w:r>
-      <w:hyperlink r:id="rId50" w:history="1">
-        <w:r>
-          <w:rPr>
-            <w:rStyle w:val="Hyperlink"/>
-            <w:rFonts w:ascii="Times New Roman" w:eastAsia="Times New Roman" w:hAnsi="Times New Roman"/>
-            <w:sz w:val="24"/>
-            <w:szCs w:val="24"/>
-            <w:lang w:val="vi-VN"/>
-          </w:rPr>
-          <w:t>https://github.com/HendrickDang/PRT661-DATA-SCIENCE-PRACTICE/commits/main/eda_plots</w:t>
-        </w:r>
-      </w:hyperlink>
+      <w:bookmarkStart w:id="24" w:name="OLE_LINK11"/>
+      <w:r>
+        <w:fldChar w:fldCharType="begin"/>
+      </w:r>
+      <w:r>
+        <w:instrText>HYPERLINK "https://github.com/HendrickDang/PRT661-DATA-SCIENCE-PRACTICE/commits/main/eda_plots"</w:instrText>
+      </w:r>
+      <w:r>
+        <w:fldChar w:fldCharType="separate"/>
+      </w:r>
+      <w:r>
+        <w:rPr>
+          <w:rStyle w:val="Hyperlink"/>
+          <w:rFonts w:ascii="Times New Roman" w:eastAsia="Times New Roman" w:hAnsi="Times New Roman"/>
+          <w:sz w:val="24"/>
+          <w:szCs w:val="24"/>
+          <w:lang w:val="vi-VN"/>
+        </w:rPr>
+        <w:t>https://github.com/HendrickDang/PRT661-DATA-SCIENCE-PRACTICE/commits/main/eda_plots</w:t>
+      </w:r>
+      <w:r>
+        <w:fldChar w:fldCharType="end"/>
+      </w:r>
+      <w:bookmarkEnd w:id="24"/>
     </w:p>
     <w:p>
       <w:pPr>
@@ -22595,6 +24590,7 @@
           <w:lang w:val="en-AU"/>
         </w:rPr>
       </w:pPr>
+      <w:bookmarkStart w:id="25" w:name="OLE_LINK12"/>
       <w:r>
         <w:rPr>
           <w:rFonts w:ascii="Times New Roman" w:eastAsia="Times New Roman" w:hAnsi="Times New Roman"/>
@@ -22604,7 +24600,7 @@
         </w:rPr>
         <w:t>Documentation:</w:t>
       </w:r>
-      <w:hyperlink r:id="rId51" w:history="1">
+      <w:hyperlink r:id="rId49" w:history="1">
         <w:r>
           <w:rPr>
             <w:rStyle w:val="Hyperlink"/>
@@ -22626,6 +24622,7 @@
         <w:t xml:space="preserve"> </w:t>
       </w:r>
     </w:p>
+    <w:bookmarkEnd w:id="25"/>
     <w:p>
       <w:pPr>
         <w:pStyle w:val="ListParagraph"/>
@@ -22649,7 +24646,7 @@
         </w:rPr>
         <w:t>Code:</w:t>
       </w:r>
-      <w:hyperlink r:id="rId52" w:history="1">
+      <w:hyperlink r:id="rId50" w:history="1">
         <w:r>
           <w:rPr>
             <w:rStyle w:val="Hyperlink"/>
@@ -22960,7 +24957,7 @@
                     <pic:cNvPicPr/>
                   </pic:nvPicPr>
                   <pic:blipFill>
-                    <a:blip r:embed="rId53"/>
+                    <a:blip r:embed="rId51"/>
                     <a:stretch>
                       <a:fillRect/>
                     </a:stretch>
@@ -23030,8 +25027,147 @@
           <w:szCs w:val="24"/>
           <w:lang w:val="en-AU"/>
         </w:rPr>
-        <w:t>Since Assessment 1, I was responsible for the Ingest and Data Store stage, and for verifying that the pipeline the team built actually runs correctly end-to-end. This included implementing ingest.py to load and validate the six raw datasets with filename fuzzy-matching and manifest-based provenance tracking, compiling the project's missing dependency list after finding the pipeline would not run in a clean environment, and identifying and removing a Windows-specific Unicode crash and a duplicated function definition left over from a merge. I also corrected two silent code-quality defects - a statistically biased VIF calculation and an unsafe eval() call - before re-running the full pipeline to confirm it completes without errors ahead of the technical write-up.</w:t>
-      </w:r>
+        <w:t xml:space="preserve">Since Assessment 1, I was responsible for the Ingest and Data Store stage, and for verifying that the pipeline the team built </w:t>
+      </w:r>
+      <w:proofErr w:type="gramStart"/>
+      <w:r>
+        <w:rPr>
+          <w:rFonts w:ascii="Times New Roman" w:eastAsia="Times New Roman" w:hAnsi="Times New Roman"/>
+          <w:sz w:val="24"/>
+          <w:szCs w:val="24"/>
+          <w:lang w:val="en-AU"/>
+        </w:rPr>
+        <w:t>actually runs</w:t>
+      </w:r>
+      <w:proofErr w:type="gramEnd"/>
+      <w:r>
+        <w:rPr>
+          <w:rFonts w:ascii="Times New Roman" w:eastAsia="Times New Roman" w:hAnsi="Times New Roman"/>
+          <w:sz w:val="24"/>
+          <w:szCs w:val="24"/>
+          <w:lang w:val="en-AU"/>
+        </w:rPr>
+        <w:t xml:space="preserve"> correctly end-to-end. This included implementing ingest.py to load and validate the six raw datasets with filename fuzzy-matching and manifest-based provenance tracking, compiling the project's missing dependency list after finding the pipeline would not run in a clean environment, and identifying and removing a Windows-specific Unicode crash and a duplicated function definition left over from a merge. I also corrected two silent code-quality defects - a statistically biased VIF calculation and an unsafe </w:t>
+      </w:r>
+      <w:proofErr w:type="gramStart"/>
+      <w:r>
+        <w:rPr>
+          <w:rFonts w:ascii="Times New Roman" w:eastAsia="Times New Roman" w:hAnsi="Times New Roman"/>
+          <w:sz w:val="24"/>
+          <w:szCs w:val="24"/>
+          <w:lang w:val="en-AU"/>
+        </w:rPr>
+        <w:t>eval(</w:t>
+      </w:r>
+      <w:proofErr w:type="gramEnd"/>
+      <w:r>
+        <w:rPr>
+          <w:rFonts w:ascii="Times New Roman" w:eastAsia="Times New Roman" w:hAnsi="Times New Roman"/>
+          <w:sz w:val="24"/>
+          <w:szCs w:val="24"/>
+          <w:lang w:val="en-AU"/>
+        </w:rPr>
+        <w:t>) call - before re-running the full pipeline to confirm it completes without errors ahead of the technical write-up.</w:t>
+      </w:r>
+    </w:p>
+    <w:p>
+      <w:pPr>
+        <w:pStyle w:val="ListParagraph"/>
+        <w:spacing w:line="276" w:lineRule="auto"/>
+        <w:jc w:val="both"/>
+        <w:rPr>
+          <w:rFonts w:ascii="Times New Roman" w:eastAsia="Times New Roman" w:hAnsi="Times New Roman"/>
+          <w:sz w:val="24"/>
+          <w:szCs w:val="24"/>
+          <w:lang w:val="en-AU"/>
+        </w:rPr>
+      </w:pPr>
+    </w:p>
+    <w:p>
+      <w:pPr>
+        <w:pStyle w:val="ListParagraph"/>
+        <w:spacing w:line="276" w:lineRule="auto"/>
+        <w:jc w:val="both"/>
+        <w:rPr>
+          <w:rFonts w:ascii="Times New Roman" w:eastAsia="Times New Roman" w:hAnsi="Times New Roman"/>
+          <w:sz w:val="24"/>
+          <w:szCs w:val="24"/>
+          <w:lang w:val="en-AU"/>
+        </w:rPr>
+      </w:pPr>
+      <w:r>
+        <w:rPr>
+          <w:rFonts w:ascii="Times New Roman" w:eastAsia="Times New Roman" w:hAnsi="Times New Roman"/>
+          <w:sz w:val="24"/>
+          <w:szCs w:val="24"/>
+          <w:lang w:val="en-AU"/>
+        </w:rPr>
+        <w:t>Github:</w:t>
+      </w:r>
+      <w:hyperlink r:id="rId52" w:history="1">
+        <w:r>
+          <w:rPr>
+            <w:rStyle w:val="Hyperlink"/>
+            <w:rFonts w:ascii="Times New Roman" w:eastAsia="Times New Roman" w:hAnsi="Times New Roman"/>
+            <w:sz w:val="24"/>
+            <w:szCs w:val="24"/>
+            <w:lang w:val="en-AU"/>
+          </w:rPr>
+          <w:t>https://github.com/HendrickDang/PRT661-DATA-SCIENCE-PRACTICE/commits?author=ngocanh8585</w:t>
+        </w:r>
+      </w:hyperlink>
+    </w:p>
+    <w:p>
+      <w:pPr>
+        <w:pStyle w:val="ListParagraph"/>
+        <w:rPr>
+          <w:rFonts w:ascii="Times New Roman" w:eastAsia="Times New Roman" w:hAnsi="Times New Roman"/>
+          <w:sz w:val="24"/>
+          <w:szCs w:val="24"/>
+        </w:rPr>
+      </w:pPr>
+      <w:r>
+        <w:rPr>
+          <w:rFonts w:ascii="Times New Roman" w:eastAsia="Times New Roman" w:hAnsi="Times New Roman"/>
+          <w:sz w:val="24"/>
+          <w:szCs w:val="24"/>
+          <w:lang w:val="vi-VN"/>
+        </w:rPr>
+        <w:t>Documentation:</w:t>
+      </w:r>
+      <w:hyperlink r:id="rId53" w:history="1">
+        <w:r>
+          <w:rPr>
+            <w:rStyle w:val="Hyperlink"/>
+            <w:rFonts w:ascii="Times New Roman" w:eastAsia="Times New Roman" w:hAnsi="Times New Roman"/>
+            <w:sz w:val="24"/>
+            <w:szCs w:val="24"/>
+            <w:lang w:val="vi-VN"/>
+          </w:rPr>
+          <w:t>https://github.com/HendrickDang/PRT661-DATA-SCIENCE-PRACTICE/commits/main/documents</w:t>
+        </w:r>
+      </w:hyperlink>
+      <w:r>
+        <w:rPr>
+          <w:rFonts w:ascii="Times New Roman" w:eastAsia="Times New Roman" w:hAnsi="Times New Roman"/>
+          <w:sz w:val="24"/>
+          <w:szCs w:val="24"/>
+        </w:rPr>
+        <w:t xml:space="preserve"> </w:t>
+      </w:r>
+    </w:p>
+    <w:p>
+      <w:pPr>
+        <w:pStyle w:val="ListParagraph"/>
+        <w:spacing w:line="276" w:lineRule="auto"/>
+        <w:jc w:val="both"/>
+        <w:rPr>
+          <w:rFonts w:ascii="Times New Roman" w:eastAsia="Times New Roman" w:hAnsi="Times New Roman"/>
+          <w:sz w:val="24"/>
+          <w:szCs w:val="24"/>
+          <w:lang w:val="en-AU"/>
+        </w:rPr>
+      </w:pPr>
     </w:p>
     <w:p>
       <w:pPr>
@@ -23100,8 +25236,10 @@
           <w:szCs w:val="24"/>
           <w:lang w:val="en-AU"/>
         </w:rPr>
-        <w:t xml:space="preserve">Owning the ingest stage taught me that "does it run?" must be checked deliberately, not assumed. Defects like missing dependencies, a Windows-only Unicode crash, and a duplicated function definition were invisible on individual machines but would have surfaced during the demonstration or on the marker's machine - catching them early freed up time for modelling and reporting. It also showed me that verification means checking </w:t>
-      </w:r>
+        <w:lastRenderedPageBreak/>
+        <w:t xml:space="preserve">Owning the ingest stage taught me that "does it run?" must be checked deliberately, not assumed. Defects like missing dependencies, a Windows-only Unicode crash, and a duplicated function definition were invisible on individual machines but would have surfaced during the demonstration or on the marker's machine - catching them early freed up time for modelling and reporting. It also showed me that verification means checking correctness, not just absence of errors: the VIF calculation and an unsafe </w:t>
+      </w:r>
+      <w:proofErr w:type="gramStart"/>
       <w:r>
         <w:rPr>
           <w:rFonts w:ascii="Times New Roman" w:eastAsia="Times New Roman" w:hAnsi="Times New Roman"/>
@@ -23109,8 +25247,17 @@
           <w:szCs w:val="24"/>
           <w:lang w:val="en-AU"/>
         </w:rPr>
-        <w:lastRenderedPageBreak/>
-        <w:t>correctness, not just absence of errors: the VIF calculation and an unsafe eval() call ran without crashing, yet one was statistically biased and the other insecure.</w:t>
+        <w:t>eval(</w:t>
+      </w:r>
+      <w:proofErr w:type="gramEnd"/>
+      <w:r>
+        <w:rPr>
+          <w:rFonts w:ascii="Times New Roman" w:eastAsia="Times New Roman" w:hAnsi="Times New Roman"/>
+          <w:sz w:val="24"/>
+          <w:szCs w:val="24"/>
+          <w:lang w:val="en-AU"/>
+        </w:rPr>
+        <w:t>) call ran without crashing, yet one was statistically biased and the other insecure.</w:t>
       </w:r>
     </w:p>
     <w:p>
@@ -23386,7 +25533,25 @@
           <w:sz w:val="24"/>
           <w:szCs w:val="24"/>
         </w:rPr>
-        <w:t xml:space="preserve">Built evaluation.py: a standalone module providing naive baselines, leakage-free feature selection, rolling-origin backtesting at four horizons, prediction intervals and structural-break indicators. </w:t>
+        <w:t xml:space="preserve">Built evaluation.py: a standalone module providing naive baselines, leakage-free feature selection, rolling-origin </w:t>
+      </w:r>
+      <w:proofErr w:type="spellStart"/>
+      <w:r>
+        <w:rPr>
+          <w:rFonts w:ascii="Times New Roman" w:eastAsia="Times New Roman" w:hAnsi="Times New Roman"/>
+          <w:sz w:val="24"/>
+          <w:szCs w:val="24"/>
+        </w:rPr>
+        <w:t>backtesting</w:t>
+      </w:r>
+      <w:proofErr w:type="spellEnd"/>
+      <w:r>
+        <w:rPr>
+          <w:rFonts w:ascii="Times New Roman" w:eastAsia="Times New Roman" w:hAnsi="Times New Roman"/>
+          <w:sz w:val="24"/>
+          <w:szCs w:val="24"/>
+        </w:rPr>
+        <w:t xml:space="preserve"> at four horizons, prediction intervals and structural-break indicators. </w:t>
       </w:r>
     </w:p>
     <w:p>
@@ -23971,7 +26136,15 @@
       </w:r>
       <w:r>
         <w:noBreakHyphen/>
-        <w:t>solving skills. Working with different machine learning models improved my understanding of model selection, evaluation, and optimisation, giving me practical experience applying theory to a real</w:t>
+        <w:t xml:space="preserve">solving skills. Working with different machine learning models improved my understanding of model selection, evaluation, and </w:t>
+      </w:r>
+      <w:proofErr w:type="spellStart"/>
+      <w:r>
+        <w:t>optimisation</w:t>
+      </w:r>
+      <w:proofErr w:type="spellEnd"/>
+      <w:r>
+        <w:t>, giving me practical experience applying theory to a real</w:t>
       </w:r>
       <w:r>
         <w:noBreakHyphen/>

</xml_diff>

<commit_message>
SCRUM-XX: restore Section 4.6, add contribution summary entry, fix table numbering
</commit_message>
<xml_diff>
--- a/documents/Assignment 2.docx
+++ b/documents/Assignment 2.docx
@@ -15956,12 +15956,18 @@
               <w:jc w:val="both"/>
               <w:rPr>
                 <w:rFonts w:ascii="Times New Roman" w:eastAsiaTheme="minorEastAsia" w:hAnsi="Times New Roman"/>
-                <w:b/>
-                <w:bCs/>
-                <w:sz w:val="24"/>
-                <w:szCs w:val="24"/>
-              </w:rPr>
-            </w:pPr>
+                <w:sz w:val="24"/>
+                <w:szCs w:val="24"/>
+              </w:rPr>
+            </w:pPr>
+            <w:r>
+              <w:rPr>
+                <w:rFonts w:ascii="Times New Roman" w:eastAsiaTheme="minorEastAsia" w:hAnsi="Times New Roman"/>
+                <w:sz w:val="24"/>
+                <w:szCs w:val="24"/>
+              </w:rPr>
+              <w:t>Analytics and Machine Learning stage: defined the forecast task specification, validation design and leakage controls; built evaluation.py adding naive baselines, rolling-origin backtesting at four horizons and empirical prediction intervals; specified drift thresholds and retraining rules.</w:t>
+            </w:r>
           </w:p>
         </w:tc>
       </w:tr>
@@ -35613,6 +35619,175 @@
         </w:rPr>
         <w:t xml:space="preserve"> </w:t>
       </w:r>
+      <w:r>
+        <w:rPr>
+          <w:rFonts w:ascii="Times New Roman" w:eastAsia="Times New Roman" w:hAnsi="Times New Roman"/>
+          <w:sz w:val="24"/>
+          <w:szCs w:val="24"/>
+          <w:lang w:val="en-AU"/>
+        </w:rPr>
+        <w:t xml:space="preserve"> </w:t>
+      </w:r>
+    </w:p>
+    <w:p>
+      <w:pPr>
+        <w:pStyle w:val="ListParagraph"/>
+        <w:spacing w:after="0" w:line="276" w:lineRule="auto"/>
+        <w:ind w:left="0"/>
+        <w:contextualSpacing w:val="0"/>
+        <w:jc w:val="both"/>
+        <w:rPr>
+          <w:rFonts w:ascii="Times New Roman" w:eastAsia="Times New Roman" w:hAnsi="Times New Roman"/>
+          <w:sz w:val="24"/>
+          <w:szCs w:val="24"/>
+          <w:lang w:val="en-AU"/>
+        </w:rPr>
+      </w:pPr>
+      <w:r>
+        <w:rPr>
+          <w:rFonts w:ascii="Times New Roman" w:eastAsia="Times New Roman" w:hAnsi="Times New Roman"/>
+          <w:sz w:val="24"/>
+          <w:szCs w:val="24"/>
+          <w:lang w:val="en-AU"/>
+        </w:rPr>
+        <w:t>Evaluation</w:t>
+      </w:r>
+      <w:r>
+        <w:rPr>
+          <w:rFonts w:ascii="Times New Roman" w:eastAsia="Times New Roman" w:hAnsi="Times New Roman"/>
+          <w:sz w:val="24"/>
+          <w:szCs w:val="24"/>
+          <w:lang w:val="en-AU"/>
+        </w:rPr>
+        <w:t>:</w:t>
+      </w:r>
+      <w:hyperlink r:id="rId56" w:history="1">
+        <w:r>
+          <w:rPr>
+            <w:rStyle w:val="Hyperlink"/>
+            <w:rFonts w:ascii="Times New Roman" w:eastAsia="Times New Roman" w:hAnsi="Times New Roman"/>
+            <w:sz w:val="24"/>
+            <w:szCs w:val="24"/>
+            <w:lang w:val="en-AU"/>
+          </w:rPr>
+          <w:t>https://github.com/HendrickDang/PRT661-DATA-SCIENCE-PRACTICE/commits/main/</w:t>
+        </w:r>
+        <w:r>
+          <w:rPr>
+            <w:rStyle w:val="Hyperlink"/>
+            <w:rFonts w:ascii="Times New Roman" w:eastAsia="Times New Roman" w:hAnsi="Times New Roman"/>
+            <w:sz w:val="24"/>
+            <w:szCs w:val="24"/>
+            <w:lang w:val="en-AU"/>
+          </w:rPr>
+          <w:t>evaluati</w:t>
+        </w:r>
+        <w:r>
+          <w:rPr>
+            <w:rStyle w:val="Hyperlink"/>
+            <w:rFonts w:ascii="Times New Roman" w:eastAsia="Times New Roman" w:hAnsi="Times New Roman"/>
+            <w:sz w:val="24"/>
+            <w:szCs w:val="24"/>
+            <w:lang w:val="en-AU"/>
+          </w:rPr>
+          <w:t>o</w:t>
+        </w:r>
+        <w:r>
+          <w:rPr>
+            <w:rStyle w:val="Hyperlink"/>
+            <w:rFonts w:ascii="Times New Roman" w:eastAsia="Times New Roman" w:hAnsi="Times New Roman"/>
+            <w:sz w:val="24"/>
+            <w:szCs w:val="24"/>
+            <w:lang w:val="en-AU"/>
+          </w:rPr>
+          <w:t>n.py</w:t>
+        </w:r>
+      </w:hyperlink>
+      <w:r>
+        <w:rPr>
+          <w:rFonts w:ascii="Times New Roman" w:eastAsia="Times New Roman" w:hAnsi="Times New Roman"/>
+          <w:sz w:val="24"/>
+          <w:szCs w:val="24"/>
+          <w:lang w:val="en-AU"/>
+        </w:rPr>
+        <w:t xml:space="preserve"> </w:t>
+      </w:r>
+    </w:p>
+    <w:p>
+      <w:pPr>
+        <w:pStyle w:val="ListParagraph"/>
+        <w:spacing w:after="0" w:line="276" w:lineRule="auto"/>
+        <w:ind w:left="0"/>
+        <w:contextualSpacing w:val="0"/>
+        <w:jc w:val="both"/>
+        <w:rPr>
+          <w:rFonts w:ascii="Times New Roman" w:eastAsia="Times New Roman" w:hAnsi="Times New Roman"/>
+          <w:sz w:val="24"/>
+          <w:szCs w:val="24"/>
+          <w:lang w:val="en-AU"/>
+        </w:rPr>
+      </w:pPr>
+      <w:r>
+        <w:rPr>
+          <w:rFonts w:ascii="Times New Roman" w:eastAsia="Times New Roman" w:hAnsi="Times New Roman"/>
+          <w:sz w:val="24"/>
+          <w:szCs w:val="24"/>
+          <w:lang w:val="en-AU"/>
+        </w:rPr>
+        <w:t>Backtest:</w:t>
+      </w:r>
+      <w:hyperlink r:id="rId57" w:history="1">
+        <w:r>
+          <w:rPr>
+            <w:rStyle w:val="Hyperlink"/>
+            <w:rFonts w:ascii="Times New Roman" w:eastAsia="Times New Roman" w:hAnsi="Times New Roman"/>
+            <w:sz w:val="24"/>
+            <w:szCs w:val="24"/>
+            <w:lang w:val="en-AU"/>
+          </w:rPr>
+          <w:t>https://github.com/Hen</w:t>
+        </w:r>
+        <w:r>
+          <w:rPr>
+            <w:rStyle w:val="Hyperlink"/>
+            <w:rFonts w:ascii="Times New Roman" w:eastAsia="Times New Roman" w:hAnsi="Times New Roman"/>
+            <w:sz w:val="24"/>
+            <w:szCs w:val="24"/>
+            <w:lang w:val="en-AU"/>
+          </w:rPr>
+          <w:t>d</w:t>
+        </w:r>
+        <w:r>
+          <w:rPr>
+            <w:rStyle w:val="Hyperlink"/>
+            <w:rFonts w:ascii="Times New Roman" w:eastAsia="Times New Roman" w:hAnsi="Times New Roman"/>
+            <w:sz w:val="24"/>
+            <w:szCs w:val="24"/>
+            <w:lang w:val="en-AU"/>
+          </w:rPr>
+          <w:t>rickDang/PRT661-DATA-SCIENCE-PRACTICE/commits/main/O</w:t>
+        </w:r>
+        <w:r>
+          <w:rPr>
+            <w:rStyle w:val="Hyperlink"/>
+            <w:rFonts w:ascii="Times New Roman" w:eastAsia="Times New Roman" w:hAnsi="Times New Roman"/>
+            <w:sz w:val="24"/>
+            <w:szCs w:val="24"/>
+            <w:lang w:val="en-AU"/>
+          </w:rPr>
+          <w:t>u</w:t>
+        </w:r>
+        <w:r>
+          <w:rPr>
+            <w:rStyle w:val="Hyperlink"/>
+            <w:rFonts w:ascii="Times New Roman" w:eastAsia="Times New Roman" w:hAnsi="Times New Roman"/>
+            <w:sz w:val="24"/>
+            <w:szCs w:val="24"/>
+            <w:lang w:val="en-AU"/>
+          </w:rPr>
+          <w:t>tputs</w:t>
+        </w:r>
+      </w:hyperlink>
     </w:p>
     <w:p>
       <w:pPr>
@@ -35664,15 +35839,6 @@
         </w:rPr>
         <w:t>A model comparison only means something against a benchmark. Assessment 1 compared regression models against each other; once a 12-month moving average was added, it beat every model at every horizon. Reporting that was less comfortable than reporting a win, but more defensible. The second lesson was leakage: both cases I found produced plausible output, which is why they were easy to miss.</w:t>
       </w:r>
-    </w:p>
-    <w:p>
-      <w:pPr>
-        <w:rPr>
-          <w:rFonts w:ascii="Times New Roman" w:hAnsi="Times New Roman"/>
-          <w:sz w:val="24"/>
-          <w:szCs w:val="24"/>
-        </w:rPr>
-      </w:pPr>
       <w:r>
         <w:rPr>
           <w:rFonts w:ascii="Times New Roman" w:hAnsi="Times New Roman"/>
@@ -35841,7 +36007,7 @@
                     <pic:cNvPicPr/>
                   </pic:nvPicPr>
                   <pic:blipFill>
-                    <a:blip r:embed="rId56"/>
+                    <a:blip r:embed="rId58"/>
                     <a:stretch>
                       <a:fillRect/>
                     </a:stretch>
@@ -35941,7 +36107,7 @@
         </w:rPr>
         <w:t xml:space="preserve">GitHub commits: </w:t>
       </w:r>
-      <w:hyperlink r:id="rId57" w:history="1">
+      <w:hyperlink r:id="rId59" w:history="1">
         <w:r>
           <w:rPr>
             <w:rStyle w:val="Hyperlink"/>
@@ -35977,7 +36143,7 @@
         </w:rPr>
         <w:t xml:space="preserve">Documentation: </w:t>
       </w:r>
-      <w:hyperlink r:id="rId58" w:history="1">
+      <w:hyperlink r:id="rId60" w:history="1">
         <w:r>
           <w:rPr>
             <w:rStyle w:val="Hyperlink"/>
@@ -36075,8 +36241,8 @@
       <w:bookmarkEnd w:id="0"/>
     </w:p>
     <w:sectPr>
-      <w:headerReference w:type="default" r:id="rId59"/>
-      <w:footerReference w:type="default" r:id="rId60"/>
+      <w:headerReference w:type="default" r:id="rId61"/>
+      <w:footerReference w:type="default" r:id="rId62"/>
       <w:pgSz w:w="11906" w:h="16838" w:code="9"/>
       <w:pgMar w:top="1440" w:right="1440" w:bottom="1440" w:left="1440" w:header="709" w:footer="709" w:gutter="0"/>
       <w:pgNumType w:start="0"/>
@@ -39234,7 +39400,6 @@
   <w:style w:type="character" w:default="1" w:styleId="DefaultParagraphFont">
     <w:name w:val="Default Paragraph Font"/>
     <w:uiPriority w:val="1"/>
-    <w:semiHidden/>
     <w:unhideWhenUsed/>
   </w:style>
   <w:style w:type="table" w:default="1" w:styleId="TableNormal">
@@ -40161,18 +40326,18 @@
 </file>
 
 <file path=customXml/item3.xml><?xml version="1.0" encoding="utf-8"?>
-<p:properties xmlns:p="http://schemas.microsoft.com/office/2006/metadata/properties" xmlns:xsi="http://www.w3.org/2001/XMLSchema-instance" xmlns:pc="http://schemas.microsoft.com/office/infopath/2007/PartnerControls">
-  <documentManagement/>
-</p:properties>
-</file>
-
-<file path=customXml/item4.xml><?xml version="1.0" encoding="utf-8"?>
 <?mso-contentType ?>
 <FormTemplates xmlns="http://schemas.microsoft.com/sharepoint/v3/contenttype/forms">
   <Display>DocumentLibraryForm</Display>
   <Edit>DocumentLibraryForm</Edit>
   <New>DocumentLibraryForm</New>
 </FormTemplates>
+</file>
+
+<file path=customXml/item4.xml><?xml version="1.0" encoding="utf-8"?>
+<p:properties xmlns:p="http://schemas.microsoft.com/office/2006/metadata/properties" xmlns:xsi="http://www.w3.org/2001/XMLSchema-instance" xmlns:pc="http://schemas.microsoft.com/office/infopath/2007/PartnerControls">
+  <documentManagement/>
+</p:properties>
 </file>
 
 <file path=customXml/itemProps1.xml><?xml version="1.0" encoding="utf-8"?>
@@ -40202,18 +40367,18 @@
 </file>
 
 <file path=customXml/itemProps3.xml><?xml version="1.0" encoding="utf-8"?>
+<ds:datastoreItem xmlns:ds="http://schemas.openxmlformats.org/officeDocument/2006/customXml" ds:itemID="{82A9BB68-56B4-4822-B6B7-DB471576EB1F}">
+  <ds:schemaRefs>
+    <ds:schemaRef ds:uri="http://schemas.microsoft.com/sharepoint/v3/contenttype/forms"/>
+  </ds:schemaRefs>
+</ds:datastoreItem>
+</file>
+
+<file path=customXml/itemProps4.xml><?xml version="1.0" encoding="utf-8"?>
 <ds:datastoreItem xmlns:ds="http://schemas.openxmlformats.org/officeDocument/2006/customXml" ds:itemID="{B2E31085-3E06-4A9F-9730-20A04C85DF24}">
   <ds:schemaRefs>
     <ds:schemaRef ds:uri="http://schemas.microsoft.com/office/2006/metadata/properties"/>
     <ds:schemaRef ds:uri="http://schemas.microsoft.com/office/infopath/2007/PartnerControls"/>
   </ds:schemaRefs>
 </ds:datastoreItem>
-</file>
-
-<file path=customXml/itemProps4.xml><?xml version="1.0" encoding="utf-8"?>
-<ds:datastoreItem xmlns:ds="http://schemas.openxmlformats.org/officeDocument/2006/customXml" ds:itemID="{82A9BB68-56B4-4822-B6B7-DB471576EB1F}">
-  <ds:schemaRefs>
-    <ds:schemaRef ds:uri="http://schemas.microsoft.com/sharepoint/v3/contenttype/forms"/>
-  </ds:schemaRefs>
-</ds:datastoreItem>
 </file>
</xml_diff>